<commit_message>
Add fable 65 (Lion and Donkey) as a fourth analysis chapter
New chapter 6 with structure, biblical inlays, poetics and moral
analysis; conclusion renumbered to chapter 7; corpus table, chapter 2
survey, introduction and appendix D updated. TOC page numbers are now
computed relative to the introduction page and the TOC fits one page.

Co-Authored-By: Claude Fable 5.1 <noreply@anthropic.com>
Claude-Session: https://claude.ai/code/session_01LePeB11iN6PJ4Nt39a92mY
</commit_message>
<xml_diff>
--- a/seminar/seminar-donkey-fables.docx
+++ b/seminar/seminar-donkey-fables.docx
@@ -209,7 +209,7 @@
           <w:tab w:val="right" w:pos="9072" w:leader="dot"/>
         </w:tabs>
         <w:bidi/>
-        <w:spacing w:after="60" w:before="120" w:line="360"/>
+        <w:spacing w:after="0" w:before="100" w:line="276"/>
         <w:jc w:val="start"/>
       </w:pPr>
       <w:r>
@@ -241,7 +241,7 @@
           <w:tab w:val="right" w:pos="9072" w:leader="dot"/>
         </w:tabs>
         <w:bidi/>
-        <w:spacing w:after="60" w:before="120" w:line="360"/>
+        <w:spacing w:after="0" w:before="100" w:line="276"/>
         <w:jc w:val="start"/>
       </w:pPr>
       <w:r>
@@ -273,7 +273,7 @@
           <w:tab w:val="right" w:pos="9072" w:leader="dot"/>
         </w:tabs>
         <w:bidi/>
-        <w:spacing w:after="0" w:before="0" w:line="360"/>
+        <w:spacing w:after="0" w:before="0" w:line="276"/>
         <w:ind w:start="567"/>
         <w:jc w:val="start"/>
       </w:pPr>
@@ -306,7 +306,7 @@
           <w:tab w:val="right" w:pos="9072" w:leader="dot"/>
         </w:tabs>
         <w:bidi/>
-        <w:spacing w:after="0" w:before="0" w:line="360"/>
+        <w:spacing w:after="0" w:before="0" w:line="276"/>
         <w:ind w:start="567"/>
         <w:jc w:val="start"/>
       </w:pPr>
@@ -339,7 +339,7 @@
           <w:tab w:val="right" w:pos="9072" w:leader="dot"/>
         </w:tabs>
         <w:bidi/>
-        <w:spacing w:after="0" w:before="0" w:line="360"/>
+        <w:spacing w:after="0" w:before="0" w:line="276"/>
         <w:ind w:start="567"/>
         <w:jc w:val="start"/>
       </w:pPr>
@@ -372,7 +372,7 @@
           <w:tab w:val="right" w:pos="9072" w:leader="dot"/>
         </w:tabs>
         <w:bidi/>
-        <w:spacing w:after="0" w:before="0" w:line="360"/>
+        <w:spacing w:after="0" w:before="0" w:line="276"/>
         <w:ind w:start="567"/>
         <w:jc w:val="start"/>
       </w:pPr>
@@ -405,7 +405,7 @@
           <w:tab w:val="right" w:pos="9072" w:leader="dot"/>
         </w:tabs>
         <w:bidi/>
-        <w:spacing w:after="60" w:before="120" w:line="360"/>
+        <w:spacing w:after="0" w:before="100" w:line="276"/>
         <w:jc w:val="start"/>
       </w:pPr>
       <w:r>
@@ -437,7 +437,7 @@
           <w:tab w:val="right" w:pos="9072" w:leader="dot"/>
         </w:tabs>
         <w:bidi/>
-        <w:spacing w:after="0" w:before="0" w:line="360"/>
+        <w:spacing w:after="0" w:before="0" w:line="276"/>
         <w:ind w:start="567"/>
         <w:jc w:val="start"/>
       </w:pPr>
@@ -470,7 +470,7 @@
           <w:tab w:val="right" w:pos="9072" w:leader="dot"/>
         </w:tabs>
         <w:bidi/>
-        <w:spacing w:after="0" w:before="0" w:line="360"/>
+        <w:spacing w:after="0" w:before="0" w:line="276"/>
         <w:ind w:start="567"/>
         <w:jc w:val="start"/>
       </w:pPr>
@@ -503,7 +503,7 @@
           <w:tab w:val="right" w:pos="9072" w:leader="dot"/>
         </w:tabs>
         <w:bidi/>
-        <w:spacing w:after="0" w:before="0" w:line="360"/>
+        <w:spacing w:after="0" w:before="0" w:line="276"/>
         <w:ind w:start="567"/>
         <w:jc w:val="start"/>
       </w:pPr>
@@ -536,7 +536,7 @@
           <w:tab w:val="right" w:pos="9072" w:leader="dot"/>
         </w:tabs>
         <w:bidi/>
-        <w:spacing w:after="0" w:before="0" w:line="360"/>
+        <w:spacing w:after="0" w:before="0" w:line="276"/>
         <w:ind w:start="567"/>
         <w:jc w:val="start"/>
       </w:pPr>
@@ -551,7 +551,7 @@
           <w:szCs w:val="24"/>
           <w:rtl/>
         </w:rPr>
-        <w:t xml:space="preserve">2.4 שלושת המשלים הנבחרים: סקירה ונמשל</w:t>
+        <w:t xml:space="preserve">2.4 ארבעת המשלים הנבחרים: סקירה ונמשל</w:t>
       </w:r>
       <w:r>
         <w:rPr>
@@ -569,7 +569,7 @@
           <w:tab w:val="right" w:pos="9072" w:leader="dot"/>
         </w:tabs>
         <w:bidi/>
-        <w:spacing w:after="60" w:before="120" w:line="360"/>
+        <w:spacing w:after="0" w:before="100" w:line="276"/>
         <w:jc w:val="start"/>
       </w:pPr>
       <w:r>
@@ -592,7 +592,7 @@
           <w:szCs w:val="24"/>
           <w:rtl/>
         </w:rPr>
-        <w:t xml:space="preserve">	8</w:t>
+        <w:t xml:space="preserve">	9</w:t>
       </w:r>
     </w:p>
     <w:p>
@@ -601,7 +601,7 @@
           <w:tab w:val="right" w:pos="9072" w:leader="dot"/>
         </w:tabs>
         <w:bidi/>
-        <w:spacing w:after="0" w:before="0" w:line="360"/>
+        <w:spacing w:after="0" w:before="0" w:line="276"/>
         <w:ind w:start="567"/>
         <w:jc w:val="start"/>
       </w:pPr>
@@ -625,7 +625,7 @@
           <w:szCs w:val="24"/>
           <w:rtl/>
         </w:rPr>
-        <w:t xml:space="preserve">	8</w:t>
+        <w:t xml:space="preserve">	9</w:t>
       </w:r>
     </w:p>
     <w:p>
@@ -634,7 +634,7 @@
           <w:tab w:val="right" w:pos="9072" w:leader="dot"/>
         </w:tabs>
         <w:bidi/>
-        <w:spacing w:after="0" w:before="0" w:line="360"/>
+        <w:spacing w:after="0" w:before="0" w:line="276"/>
         <w:ind w:start="567"/>
         <w:jc w:val="start"/>
       </w:pPr>
@@ -658,7 +658,7 @@
           <w:szCs w:val="24"/>
           <w:rtl/>
         </w:rPr>
-        <w:t xml:space="preserve">	8</w:t>
+        <w:t xml:space="preserve">	9</w:t>
       </w:r>
     </w:p>
     <w:p>
@@ -667,7 +667,7 @@
           <w:tab w:val="right" w:pos="9072" w:leader="dot"/>
         </w:tabs>
         <w:bidi/>
-        <w:spacing w:after="0" w:before="0" w:line="360"/>
+        <w:spacing w:after="0" w:before="0" w:line="276"/>
         <w:ind w:start="567"/>
         <w:jc w:val="start"/>
       </w:pPr>
@@ -691,7 +691,7 @@
           <w:szCs w:val="24"/>
           <w:rtl/>
         </w:rPr>
-        <w:t xml:space="preserve">	9</w:t>
+        <w:t xml:space="preserve">	10</w:t>
       </w:r>
     </w:p>
     <w:p>
@@ -700,7 +700,7 @@
           <w:tab w:val="right" w:pos="9072" w:leader="dot"/>
         </w:tabs>
         <w:bidi/>
-        <w:spacing w:after="0" w:before="0" w:line="360"/>
+        <w:spacing w:after="0" w:before="0" w:line="276"/>
         <w:ind w:start="567"/>
         <w:jc w:val="start"/>
       </w:pPr>
@@ -724,7 +724,7 @@
           <w:szCs w:val="24"/>
           <w:rtl/>
         </w:rPr>
-        <w:t xml:space="preserve">	10</w:t>
+        <w:t xml:space="preserve">	11</w:t>
       </w:r>
     </w:p>
     <w:p>
@@ -733,7 +733,7 @@
           <w:tab w:val="right" w:pos="9072" w:leader="dot"/>
         </w:tabs>
         <w:bidi/>
-        <w:spacing w:after="60" w:before="120" w:line="360"/>
+        <w:spacing w:after="0" w:before="100" w:line="276"/>
         <w:jc w:val="start"/>
       </w:pPr>
       <w:r>
@@ -756,7 +756,7 @@
           <w:szCs w:val="24"/>
           <w:rtl/>
         </w:rPr>
-        <w:t xml:space="preserve">	11</w:t>
+        <w:t xml:space="preserve">	12</w:t>
       </w:r>
     </w:p>
     <w:p>
@@ -765,7 +765,7 @@
           <w:tab w:val="right" w:pos="9072" w:leader="dot"/>
         </w:tabs>
         <w:bidi/>
-        <w:spacing w:after="0" w:before="0" w:line="360"/>
+        <w:spacing w:after="0" w:before="0" w:line="276"/>
         <w:ind w:start="567"/>
         <w:jc w:val="start"/>
       </w:pPr>
@@ -789,7 +789,7 @@
           <w:szCs w:val="24"/>
           <w:rtl/>
         </w:rPr>
-        <w:t xml:space="preserve">	11</w:t>
+        <w:t xml:space="preserve">	12</w:t>
       </w:r>
     </w:p>
     <w:p>
@@ -798,7 +798,7 @@
           <w:tab w:val="right" w:pos="9072" w:leader="dot"/>
         </w:tabs>
         <w:bidi/>
-        <w:spacing w:after="0" w:before="0" w:line="360"/>
+        <w:spacing w:after="0" w:before="0" w:line="276"/>
         <w:ind w:start="567"/>
         <w:jc w:val="start"/>
       </w:pPr>
@@ -822,7 +822,7 @@
           <w:szCs w:val="24"/>
           <w:rtl/>
         </w:rPr>
-        <w:t xml:space="preserve">	11</w:t>
+        <w:t xml:space="preserve">	12</w:t>
       </w:r>
     </w:p>
     <w:p>
@@ -831,7 +831,7 @@
           <w:tab w:val="right" w:pos="9072" w:leader="dot"/>
         </w:tabs>
         <w:bidi/>
-        <w:spacing w:after="0" w:before="0" w:line="360"/>
+        <w:spacing w:after="0" w:before="0" w:line="276"/>
         <w:ind w:start="567"/>
         <w:jc w:val="start"/>
       </w:pPr>
@@ -855,7 +855,7 @@
           <w:szCs w:val="24"/>
           <w:rtl/>
         </w:rPr>
-        <w:t xml:space="preserve">	12</w:t>
+        <w:t xml:space="preserve">	13</w:t>
       </w:r>
     </w:p>
     <w:p>
@@ -864,7 +864,7 @@
           <w:tab w:val="right" w:pos="9072" w:leader="dot"/>
         </w:tabs>
         <w:bidi/>
-        <w:spacing w:after="0" w:before="0" w:line="360"/>
+        <w:spacing w:after="0" w:before="0" w:line="276"/>
         <w:ind w:start="567"/>
         <w:jc w:val="start"/>
       </w:pPr>
@@ -888,7 +888,7 @@
           <w:szCs w:val="24"/>
           <w:rtl/>
         </w:rPr>
-        <w:t xml:space="preserve">	13</w:t>
+        <w:t xml:space="preserve">	14</w:t>
       </w:r>
     </w:p>
     <w:p>
@@ -897,7 +897,7 @@
           <w:tab w:val="right" w:pos="9072" w:leader="dot"/>
         </w:tabs>
         <w:bidi/>
-        <w:spacing w:after="60" w:before="120" w:line="360"/>
+        <w:spacing w:after="0" w:before="100" w:line="276"/>
         <w:jc w:val="start"/>
       </w:pPr>
       <w:r>
@@ -920,7 +920,7 @@
           <w:szCs w:val="24"/>
           <w:rtl/>
         </w:rPr>
-        <w:t xml:space="preserve">	14</w:t>
+        <w:t xml:space="preserve">	15</w:t>
       </w:r>
     </w:p>
     <w:p>
@@ -929,7 +929,7 @@
           <w:tab w:val="right" w:pos="9072" w:leader="dot"/>
         </w:tabs>
         <w:bidi/>
-        <w:spacing w:after="0" w:before="0" w:line="360"/>
+        <w:spacing w:after="0" w:before="0" w:line="276"/>
         <w:ind w:start="567"/>
         <w:jc w:val="start"/>
       </w:pPr>
@@ -953,7 +953,7 @@
           <w:szCs w:val="24"/>
           <w:rtl/>
         </w:rPr>
-        <w:t xml:space="preserve">	14</w:t>
+        <w:t xml:space="preserve">	15</w:t>
       </w:r>
     </w:p>
     <w:p>
@@ -962,7 +962,7 @@
           <w:tab w:val="right" w:pos="9072" w:leader="dot"/>
         </w:tabs>
         <w:bidi/>
-        <w:spacing w:after="0" w:before="0" w:line="360"/>
+        <w:spacing w:after="0" w:before="0" w:line="276"/>
         <w:ind w:start="567"/>
         <w:jc w:val="start"/>
       </w:pPr>
@@ -986,7 +986,7 @@
           <w:szCs w:val="24"/>
           <w:rtl/>
         </w:rPr>
-        <w:t xml:space="preserve">	14</w:t>
+        <w:t xml:space="preserve">	15</w:t>
       </w:r>
     </w:p>
     <w:p>
@@ -995,7 +995,7 @@
           <w:tab w:val="right" w:pos="9072" w:leader="dot"/>
         </w:tabs>
         <w:bidi/>
-        <w:spacing w:after="0" w:before="0" w:line="360"/>
+        <w:spacing w:after="0" w:before="0" w:line="276"/>
         <w:ind w:start="567"/>
         <w:jc w:val="start"/>
       </w:pPr>
@@ -1019,7 +1019,7 @@
           <w:szCs w:val="24"/>
           <w:rtl/>
         </w:rPr>
-        <w:t xml:space="preserve">	15</w:t>
+        <w:t xml:space="preserve">	16</w:t>
       </w:r>
     </w:p>
     <w:p>
@@ -1028,7 +1028,7 @@
           <w:tab w:val="right" w:pos="9072" w:leader="dot"/>
         </w:tabs>
         <w:bidi/>
-        <w:spacing w:after="0" w:before="0" w:line="360"/>
+        <w:spacing w:after="0" w:before="0" w:line="276"/>
         <w:ind w:start="567"/>
         <w:jc w:val="start"/>
       </w:pPr>
@@ -1052,7 +1052,7 @@
           <w:szCs w:val="24"/>
           <w:rtl/>
         </w:rPr>
-        <w:t xml:space="preserve">	15</w:t>
+        <w:t xml:space="preserve">	16</w:t>
       </w:r>
     </w:p>
     <w:p>
@@ -1061,7 +1061,7 @@
           <w:tab w:val="right" w:pos="9072" w:leader="dot"/>
         </w:tabs>
         <w:bidi/>
-        <w:spacing w:after="60" w:before="120" w:line="360"/>
+        <w:spacing w:after="0" w:before="100" w:line="276"/>
         <w:jc w:val="start"/>
       </w:pPr>
       <w:r>
@@ -1075,16 +1075,16 @@
           <w:szCs w:val="24"/>
           <w:rtl/>
         </w:rPr>
-        <w:t xml:space="preserve">פרק 6: סיכום ומסקנות</w:t>
-      </w:r>
-      <w:r>
-        <w:rPr>
-          <w:rFonts w:ascii="Times New Roman" w:cs="David" w:eastAsia="David" w:hAnsi="Times New Roman"/>
-          <w:sz w:val="24"/>
-          <w:szCs w:val="24"/>
-          <w:rtl/>
-        </w:rPr>
-        <w:t xml:space="preserve">	17</w:t>
+        <w:t xml:space="preserve">פרק 6: "אריה וחמור" (משל סה): ניתוח</w:t>
+      </w:r>
+      <w:r>
+        <w:rPr>
+          <w:rFonts w:ascii="Times New Roman" w:cs="David" w:eastAsia="David" w:hAnsi="Times New Roman"/>
+          <w:sz w:val="24"/>
+          <w:szCs w:val="24"/>
+          <w:rtl/>
+        </w:rPr>
+        <w:t xml:space="preserve">	18</w:t>
       </w:r>
     </w:p>
     <w:p>
@@ -1093,30 +1093,31 @@
           <w:tab w:val="right" w:pos="9072" w:leader="dot"/>
         </w:tabs>
         <w:bidi/>
-        <w:spacing w:after="60" w:before="120" w:line="360"/>
+        <w:spacing w:after="0" w:before="0" w:line="276"/>
+        <w:ind w:start="567"/>
         <w:jc w:val="start"/>
       </w:pPr>
       <w:r>
         <w:rPr>
           <w:rFonts w:ascii="Times New Roman" w:cs="David" w:eastAsia="David" w:hAnsi="Times New Roman"/>
-          <w:b/>
-          <w:bCs/>
-          <w:i w:val="false"/>
-          <w:iCs w:val="false"/>
-          <w:sz w:val="24"/>
-          <w:szCs w:val="24"/>
-          <w:rtl/>
-        </w:rPr>
-        <w:t xml:space="preserve">ביבליוגרפיה</w:t>
-      </w:r>
-      <w:r>
-        <w:rPr>
-          <w:rFonts w:ascii="Times New Roman" w:cs="David" w:eastAsia="David" w:hAnsi="Times New Roman"/>
-          <w:sz w:val="24"/>
-          <w:szCs w:val="24"/>
-          <w:rtl/>
-        </w:rPr>
-        <w:t xml:space="preserve">	19</w:t>
+          <w:b w:val="false"/>
+          <w:bCs w:val="false"/>
+          <w:i w:val="false"/>
+          <w:iCs w:val="false"/>
+          <w:sz w:val="24"/>
+          <w:szCs w:val="24"/>
+          <w:rtl/>
+        </w:rPr>
+        <w:t xml:space="preserve">6.1 מבנה המשל ומהלך העלילה</w:t>
+      </w:r>
+      <w:r>
+        <w:rPr>
+          <w:rFonts w:ascii="Times New Roman" w:cs="David" w:eastAsia="David" w:hAnsi="Times New Roman"/>
+          <w:sz w:val="24"/>
+          <w:szCs w:val="24"/>
+          <w:rtl/>
+        </w:rPr>
+        <w:t xml:space="preserve">	18</w:t>
       </w:r>
     </w:p>
     <w:p>
@@ -1125,30 +1126,31 @@
           <w:tab w:val="right" w:pos="9072" w:leader="dot"/>
         </w:tabs>
         <w:bidi/>
-        <w:spacing w:after="60" w:before="120" w:line="360"/>
+        <w:spacing w:after="0" w:before="0" w:line="276"/>
+        <w:ind w:start="567"/>
         <w:jc w:val="start"/>
       </w:pPr>
       <w:r>
         <w:rPr>
           <w:rFonts w:ascii="Times New Roman" w:cs="David" w:eastAsia="David" w:hAnsi="Times New Roman"/>
-          <w:b/>
-          <w:bCs/>
-          <w:i w:val="false"/>
-          <w:iCs w:val="false"/>
-          <w:sz w:val="24"/>
-          <w:szCs w:val="24"/>
-          <w:rtl/>
-        </w:rPr>
-        <w:t xml:space="preserve">נספחים: המשלים הנדונים</w:t>
-      </w:r>
-      <w:r>
-        <w:rPr>
-          <w:rFonts w:ascii="Times New Roman" w:cs="David" w:eastAsia="David" w:hAnsi="Times New Roman"/>
-          <w:sz w:val="24"/>
-          <w:szCs w:val="24"/>
-          <w:rtl/>
-        </w:rPr>
-        <w:t xml:space="preserve">	21</w:t>
+          <w:b w:val="false"/>
+          <w:bCs w:val="false"/>
+          <w:i w:val="false"/>
+          <w:iCs w:val="false"/>
+          <w:sz w:val="24"/>
+          <w:szCs w:val="24"/>
+          <w:rtl/>
+        </w:rPr>
+        <w:t xml:space="preserve">6.2 השיבוצים</w:t>
+      </w:r>
+      <w:r>
+        <w:rPr>
+          <w:rFonts w:ascii="Times New Roman" w:cs="David" w:eastAsia="David" w:hAnsi="Times New Roman"/>
+          <w:sz w:val="24"/>
+          <w:szCs w:val="24"/>
+          <w:rtl/>
+        </w:rPr>
+        <w:t xml:space="preserve">	18</w:t>
       </w:r>
     </w:p>
     <w:p>
@@ -1157,7 +1159,7 @@
           <w:tab w:val="right" w:pos="9072" w:leader="dot"/>
         </w:tabs>
         <w:bidi/>
-        <w:spacing w:after="0" w:before="0" w:line="360"/>
+        <w:spacing w:after="0" w:before="0" w:line="276"/>
         <w:ind w:start="567"/>
         <w:jc w:val="start"/>
       </w:pPr>
@@ -1172,16 +1174,16 @@
           <w:szCs w:val="24"/>
           <w:rtl/>
         </w:rPr>
-        <w:t xml:space="preserve">נספח א: חמור, דבורים וצרעה</w:t>
-      </w:r>
-      <w:r>
-        <w:rPr>
-          <w:rFonts w:ascii="Times New Roman" w:cs="David" w:eastAsia="David" w:hAnsi="Times New Roman"/>
-          <w:sz w:val="24"/>
-          <w:szCs w:val="24"/>
-          <w:rtl/>
-        </w:rPr>
-        <w:t xml:space="preserve">	21</w:t>
+        <w:t xml:space="preserve">6.3 הפואטיקה של המשל</w:t>
+      </w:r>
+      <w:r>
+        <w:rPr>
+          <w:rFonts w:ascii="Times New Roman" w:cs="David" w:eastAsia="David" w:hAnsi="Times New Roman"/>
+          <w:sz w:val="24"/>
+          <w:szCs w:val="24"/>
+          <w:rtl/>
+        </w:rPr>
+        <w:t xml:space="preserve">	20</w:t>
       </w:r>
     </w:p>
     <w:p>
@@ -1190,7 +1192,7 @@
           <w:tab w:val="right" w:pos="9072" w:leader="dot"/>
         </w:tabs>
         <w:bidi/>
-        <w:spacing w:after="0" w:before="0" w:line="360"/>
+        <w:spacing w:after="0" w:before="0" w:line="276"/>
         <w:ind w:start="567"/>
         <w:jc w:val="start"/>
       </w:pPr>
@@ -1205,16 +1207,16 @@
           <w:szCs w:val="24"/>
           <w:rtl/>
         </w:rPr>
-        <w:t xml:space="preserve">נספח ב: משל מז: חמור בעור ארי</w:t>
-      </w:r>
-      <w:r>
-        <w:rPr>
-          <w:rFonts w:ascii="Times New Roman" w:cs="David" w:eastAsia="David" w:hAnsi="Times New Roman"/>
-          <w:sz w:val="24"/>
-          <w:szCs w:val="24"/>
-          <w:rtl/>
-        </w:rPr>
-        <w:t xml:space="preserve">	21</w:t>
+        <w:t xml:space="preserve">6.4 הקשר בין המשל לנמשל</w:t>
+      </w:r>
+      <w:r>
+        <w:rPr>
+          <w:rFonts w:ascii="Times New Roman" w:cs="David" w:eastAsia="David" w:hAnsi="Times New Roman"/>
+          <w:sz w:val="24"/>
+          <w:szCs w:val="24"/>
+          <w:rtl/>
+        </w:rPr>
+        <w:t xml:space="preserve">	20</w:t>
       </w:r>
     </w:p>
     <w:p>
@@ -1223,7 +1225,103 @@
           <w:tab w:val="right" w:pos="9072" w:leader="dot"/>
         </w:tabs>
         <w:bidi/>
-        <w:spacing w:after="0" w:before="0" w:line="360"/>
+        <w:spacing w:after="0" w:before="100" w:line="276"/>
+        <w:jc w:val="start"/>
+      </w:pPr>
+      <w:r>
+        <w:rPr>
+          <w:rFonts w:ascii="Times New Roman" w:cs="David" w:eastAsia="David" w:hAnsi="Times New Roman"/>
+          <w:b/>
+          <w:bCs/>
+          <w:i w:val="false"/>
+          <w:iCs w:val="false"/>
+          <w:sz w:val="24"/>
+          <w:szCs w:val="24"/>
+          <w:rtl/>
+        </w:rPr>
+        <w:t xml:space="preserve">פרק 7: סיכום ומסקנות</w:t>
+      </w:r>
+      <w:r>
+        <w:rPr>
+          <w:rFonts w:ascii="Times New Roman" w:cs="David" w:eastAsia="David" w:hAnsi="Times New Roman"/>
+          <w:sz w:val="24"/>
+          <w:szCs w:val="24"/>
+          <w:rtl/>
+        </w:rPr>
+        <w:t xml:space="preserve">	21</w:t>
+      </w:r>
+    </w:p>
+    <w:p>
+      <w:pPr>
+        <w:tabs>
+          <w:tab w:val="right" w:pos="9072" w:leader="dot"/>
+        </w:tabs>
+        <w:bidi/>
+        <w:spacing w:after="0" w:before="100" w:line="276"/>
+        <w:jc w:val="start"/>
+      </w:pPr>
+      <w:r>
+        <w:rPr>
+          <w:rFonts w:ascii="Times New Roman" w:cs="David" w:eastAsia="David" w:hAnsi="Times New Roman"/>
+          <w:b/>
+          <w:bCs/>
+          <w:i w:val="false"/>
+          <w:iCs w:val="false"/>
+          <w:sz w:val="24"/>
+          <w:szCs w:val="24"/>
+          <w:rtl/>
+        </w:rPr>
+        <w:t xml:space="preserve">ביבליוגרפיה</w:t>
+      </w:r>
+      <w:r>
+        <w:rPr>
+          <w:rFonts w:ascii="Times New Roman" w:cs="David" w:eastAsia="David" w:hAnsi="Times New Roman"/>
+          <w:sz w:val="24"/>
+          <w:szCs w:val="24"/>
+          <w:rtl/>
+        </w:rPr>
+        <w:t xml:space="preserve">	23</w:t>
+      </w:r>
+    </w:p>
+    <w:p>
+      <w:pPr>
+        <w:tabs>
+          <w:tab w:val="right" w:pos="9072" w:leader="dot"/>
+        </w:tabs>
+        <w:bidi/>
+        <w:spacing w:after="0" w:before="100" w:line="276"/>
+        <w:jc w:val="start"/>
+      </w:pPr>
+      <w:r>
+        <w:rPr>
+          <w:rFonts w:ascii="Times New Roman" w:cs="David" w:eastAsia="David" w:hAnsi="Times New Roman"/>
+          <w:b/>
+          <w:bCs/>
+          <w:i w:val="false"/>
+          <w:iCs w:val="false"/>
+          <w:sz w:val="24"/>
+          <w:szCs w:val="24"/>
+          <w:rtl/>
+        </w:rPr>
+        <w:t xml:space="preserve">נספחים: המשלים הנדונים</w:t>
+      </w:r>
+      <w:r>
+        <w:rPr>
+          <w:rFonts w:ascii="Times New Roman" w:cs="David" w:eastAsia="David" w:hAnsi="Times New Roman"/>
+          <w:sz w:val="24"/>
+          <w:szCs w:val="24"/>
+          <w:rtl/>
+        </w:rPr>
+        <w:t xml:space="preserve">	25</w:t>
+      </w:r>
+    </w:p>
+    <w:p>
+      <w:pPr>
+        <w:tabs>
+          <w:tab w:val="right" w:pos="9072" w:leader="dot"/>
+        </w:tabs>
+        <w:bidi/>
+        <w:spacing w:after="0" w:before="0" w:line="276"/>
         <w:ind w:start="567"/>
         <w:jc w:val="start"/>
       </w:pPr>
@@ -1238,6 +1336,72 @@
           <w:szCs w:val="24"/>
           <w:rtl/>
         </w:rPr>
+        <w:t xml:space="preserve">נספח א: חמור, דבורים וצרעה</w:t>
+      </w:r>
+      <w:r>
+        <w:rPr>
+          <w:rFonts w:ascii="Times New Roman" w:cs="David" w:eastAsia="David" w:hAnsi="Times New Roman"/>
+          <w:sz w:val="24"/>
+          <w:szCs w:val="24"/>
+          <w:rtl/>
+        </w:rPr>
+        <w:t xml:space="preserve">	25</w:t>
+      </w:r>
+    </w:p>
+    <w:p>
+      <w:pPr>
+        <w:tabs>
+          <w:tab w:val="right" w:pos="9072" w:leader="dot"/>
+        </w:tabs>
+        <w:bidi/>
+        <w:spacing w:after="0" w:before="0" w:line="276"/>
+        <w:ind w:start="567"/>
+        <w:jc w:val="start"/>
+      </w:pPr>
+      <w:r>
+        <w:rPr>
+          <w:rFonts w:ascii="Times New Roman" w:cs="David" w:eastAsia="David" w:hAnsi="Times New Roman"/>
+          <w:b w:val="false"/>
+          <w:bCs w:val="false"/>
+          <w:i w:val="false"/>
+          <w:iCs w:val="false"/>
+          <w:sz w:val="24"/>
+          <w:szCs w:val="24"/>
+          <w:rtl/>
+        </w:rPr>
+        <w:t xml:space="preserve">נספח ב: משל מז: חמור בעור ארי</w:t>
+      </w:r>
+      <w:r>
+        <w:rPr>
+          <w:rFonts w:ascii="Times New Roman" w:cs="David" w:eastAsia="David" w:hAnsi="Times New Roman"/>
+          <w:sz w:val="24"/>
+          <w:szCs w:val="24"/>
+          <w:rtl/>
+        </w:rPr>
+        <w:t xml:space="preserve">	25</w:t>
+      </w:r>
+    </w:p>
+    <w:p>
+      <w:pPr>
+        <w:tabs>
+          <w:tab w:val="right" w:pos="9072" w:leader="dot"/>
+        </w:tabs>
+        <w:bidi/>
+        <w:spacing w:after="0" w:before="0" w:line="276"/>
+        <w:ind w:start="567"/>
+        <w:jc w:val="start"/>
+      </w:pPr>
+      <w:r>
+        <w:rPr>
+          <w:rFonts w:ascii="Times New Roman" w:cs="David" w:eastAsia="David" w:hAnsi="Times New Roman"/>
+          <w:b w:val="false"/>
+          <w:bCs w:val="false"/>
+          <w:i w:val="false"/>
+          <w:iCs w:val="false"/>
+          <w:sz w:val="24"/>
+          <w:szCs w:val="24"/>
+          <w:rtl/>
+        </w:rPr>
         <w:t xml:space="preserve">נספח ג: משל יד: חמור, כלב ואדם</w:t>
       </w:r>
       <w:r>
@@ -1247,7 +1411,40 @@
           <w:szCs w:val="24"/>
           <w:rtl/>
         </w:rPr>
-        <w:t xml:space="preserve">	22</w:t>
+        <w:t xml:space="preserve">	26</w:t>
+      </w:r>
+    </w:p>
+    <w:p>
+      <w:pPr>
+        <w:tabs>
+          <w:tab w:val="right" w:pos="9072" w:leader="dot"/>
+        </w:tabs>
+        <w:bidi/>
+        <w:spacing w:after="0" w:before="0" w:line="276"/>
+        <w:ind w:start="567"/>
+        <w:jc w:val="start"/>
+      </w:pPr>
+      <w:r>
+        <w:rPr>
+          <w:rFonts w:ascii="Times New Roman" w:cs="David" w:eastAsia="David" w:hAnsi="Times New Roman"/>
+          <w:b w:val="false"/>
+          <w:bCs w:val="false"/>
+          <w:i w:val="false"/>
+          <w:iCs w:val="false"/>
+          <w:sz w:val="24"/>
+          <w:szCs w:val="24"/>
+          <w:rtl/>
+        </w:rPr>
+        <w:t xml:space="preserve">נספח ד: משל סה: אריה וחמור</w:t>
+      </w:r>
+      <w:r>
+        <w:rPr>
+          <w:rFonts w:ascii="Times New Roman" w:cs="David" w:eastAsia="David" w:hAnsi="Times New Roman"/>
+          <w:sz w:val="24"/>
+          <w:szCs w:val="24"/>
+          <w:rtl/>
+        </w:rPr>
+        <w:t xml:space="preserve">	26</w:t>
       </w:r>
     </w:p>
     <w:p>
@@ -1315,7 +1512,7 @@
           <w:szCs w:val="24"/>
           <w:rtl/>
         </w:rPr>
-        <w:t xml:space="preserve">העבודה מתמקדת בשלושה משלים מתוך "משלי שועלים" לרבי ברכיה הנקדן, שחי באנגליה ובצפון צרפת בסוף המאה השתים עשרה ובראשית המאה השלוש עשרה: "חמור, דבורים וצרעה", "חמור בעור ארי" (משל מז) ו"חמור, כלב ואדם" (משל יד).</w:t>
+        <w:t xml:space="preserve">העבודה מתמקדת בארבעה משלים מתוך "משלי שועלים" לרבי ברכיה הנקדן, שחי באנגליה ובצפון צרפת בסוף המאה השתים עשרה ובראשית המאה השלוש עשרה: "חמור, דבורים וצרעה", "חמור בעור ארי" (משל מז), "חמור, כלב ואדם" (משל יד) ו"אריה וחמור" (משל סה).</w:t>
       </w:r>
       <w:r>
         <w:rPr>
@@ -1332,7 +1529,7 @@
           <w:szCs w:val="24"/>
           <w:rtl/>
         </w:rPr>
-        <w:t xml:space="preserve"> בשלושתם החמור הוא הגיבור, ובשלושתם הוא נכשל. שאלת המחקר כפולה: מהי התכונה שהחמור מייצג אצל ברכיה, וכיצד בונה המחבר את הקשר בין סיפור המשל ובין הנמשל באמצעות שיבוצים מן המקרא ומספרות חז"ל.</w:t>
+        <w:t xml:space="preserve"> בארבעתם החמור הוא הגיבור, ובארבעתם הוא נכשל. שאלת המחקר כפולה: מהי התכונה שהחמור מייצג אצל ברכיה, וכיצד בונה המחבר את הקשר בין סיפור המשל ובין הנמשל באמצעות שיבוצים מן המקרא ומספרות חז"ל.</w:t>
       </w:r>
     </w:p>
     <w:p>
@@ -1350,7 +1547,7 @@
           <w:szCs w:val="24"/>
           <w:rtl/>
         </w:rPr>
-        <w:t xml:space="preserve">הטענה המרכזית של העבודה היא שהחמור של ברכיה אינו בראש ובראשונה טיפש, אלא מי שאינו יודע את מקומו. בכל אחד מן המשלים החמור מנסה להיות משהו אחר ממה שהוא: שליט שאינו חושש מן הקטן ממנו, אריה, כלב מחמד. הכישלון בא מבחוץ, כמכה, ומחזיר אותו אל האבוס. ברכיה מעצב את הרעיון הזה לא רק בעלילה אלא בשכבת השיבוצים, שמעמידה מאחורי החמור שורה של דמויות מקראיות שגאוותן נשברה: רחבעם, אמציה, אדוניה, נגיד צור, ארז הלבנון של יחזקאל. הקורא שמזהה את הפסוק יודע כיצד ייגמר המשל עוד לפני שהסיפור מגיע לסופו.</w:t>
+        <w:t xml:space="preserve">הטענה המרכזית של העבודה היא שהחמור של ברכיה אינו בראש ובראשונה טיפש, אלא מי שאינו יודע את מקומו. בכל אחד מן המשלים החמור מנסה להיות משהו אחר ממה שהוא: שליט שאינו חושש מן הקטן ממנו, אריה, כלב מחמד, משנה למלך. הכישלון בא מבחוץ, כמכה, ומחזיר אותו אל האבוס. ברכיה מעצב את הרעיון הזה לא רק בעלילה אלא בשכבת השיבוצים, שמעמידה מאחורי החמור שורה של דמויות מקראיות שגאוותן נשברה: רחבעם, אמציה, אדוניה, המן, נגיד צור, ארז הלבנון של יחזקאל. הקורא שמזהה את הפסוק יודע כיצד ייגמר המשל עוד לפני שהסיפור מגיע לסופו.</w:t>
       </w:r>
     </w:p>
     <w:p>
@@ -1368,7 +1565,7 @@
           <w:szCs w:val="24"/>
           <w:rtl/>
         </w:rPr>
-        <w:t xml:space="preserve">מבנה העבודה: פרק 1 סוקר את החמור מן הבחינה הזואולוגית, במקורות היהודיים ובמקורות הכלליים, ומציג את קורפוס משלי החמור בימי הביניים. פרק 2 עוסק ביוצר, בספר ובהקדמתו, וסוקר את שלושת המשלים הנבחרים ואת הנמשל של כל אחד מהם. פרקים 3 עד 5 מנתחים כל משל בנפרד: מבנהו, השיבוצים שבו, הפואטיקה שלו והקשר בין המשל לנמשל. פרק 6 מסכם ומשיב על שאלת המחקר. בנספח מובאים שלושת המשלים במלואם.</w:t>
+        <w:t xml:space="preserve">מבנה העבודה: פרק 1 סוקר את החמור מן הבחינה הזואולוגית, במקורות היהודיים ובמקורות הכלליים, ומציג את קורפוס משלי החמור בימי הביניים. פרק 2 עוסק ביוצר, בספר ובהקדמתו, וסוקר את ארבעת המשלים הנבחרים ואת הנמשל של כל אחד מהם. פרקים 3 עד 6 מנתחים כל משל בנפרד: מבנהו, השיבוצים שבו, הפואטיקה שלו והקשר בין המשל לנמשל. פרק 7 מסכם ומשיב על שאלת המחקר. בנספחים מובאים ארבעת המשלים במלואם.</w:t>
       </w:r>
     </w:p>
     <w:p>
@@ -1517,7 +1714,7 @@
           <w:szCs w:val="24"/>
           <w:rtl/>
         </w:rPr>
-        <w:t xml:space="preserve">כמה מתכונותיו הגופניות של החמור מזינות ישירות את דימויו בספרות. אוזניו הארוכות, שתפקידן שמיעה וויסות חום, הפכו לסימן ההיכר שלו, וגם לסימן שמסגיר אותו כשהוא מנסה להתחפש. קולו, הנעירה, חזק וצורם ונשמע למרחק. הוא חיה קשוחה, מסתפקת במעט מים ומזון, נושאת משא כבד ביחס לגודלה ובעלת סף כאב גבוה. הנטייה שלו לעצור ולסרב לזוז כשהוא חש סכנה, שהאדם מפרש אותה כעקשנות, היא התנהגות הגנתית של בעל חיים שאינו יכול לברוח במהירות כמו הסוס. גם החיכוך בעצים ובסלעים, שמופיע במשל הצרעה, הוא התנהגות טבעית של החמור להסרת טפילים מעורו. שלוש התכונות, האוזניים, הקול והגוף המגושם והכבד, הן בדיוק התכונות שברכיה מפעיל בשלושת המשלים.</w:t>
+        <w:t xml:space="preserve">כמה מתכונותיו הגופניות של החמור מזינות ישירות את דימויו בספרות. אוזניו הארוכות, שתפקידן שמיעה וויסות חום, הפכו לסימן ההיכר שלו, וגם לסימן שמסגיר אותו כשהוא מנסה להתחפש. קולו, הנעירה, חזק וצורם ונשמע למרחק. הוא חיה קשוחה, מסתפקת במעט מים ומזון, נושאת משא כבד ביחס לגודלה ובעלת סף כאב גבוה. הנטייה שלו לעצור ולסרב לזוז כשהוא חש סכנה, שהאדם מפרש אותה כעקשנות, היא התנהגות הגנתית של בעל חיים שאינו יכול לברוח במהירות כמו הסוס. גם החיכוך בעצים ובסלעים, שמופיע במשל הצרעה, הוא התנהגות טבעית של החמור להסרת טפילים מעורו. שלוש התכונות, האוזניים, הקול והגוף המגושם והכבד, הן בדיוק התכונות שברכיה מפעיל בארבעת המשלים.</w:t>
       </w:r>
     </w:p>
     <w:p>
@@ -1669,7 +1866,7 @@
           <w:szCs w:val="24"/>
           <w:rtl/>
         </w:rPr>
-        <w:t xml:space="preserve">בקורפוס האיזופי החמור הוא אחד הגיבורים השכיחים, וכמעט תמיד הוא לקוי בשיפוט. במפתח פרי, המפתח המקובל למשלי איזופוס, מופיעים בין השאר: החמור והכלבלב (פרי 91), שבו החמור המקנא מנסה לקפוץ על אדוניו כמו הכלב ומוכה; החמור נושא המלח (פרי 180), שלמד שהמלח נמס במים וטבע כשניסה את התחבולה עם ספוגים; החמור נושא פסל האל (פרי 182), שחשב שהעוברים משתחווים לו; והחמור בעור האריה (פרי 188, וגרסה נוספת פרי 358), שנחשף בגלל אוזניו או קולו.</w:t>
+        <w:t xml:space="preserve">בקורפוס האיזופי החמור הוא אחד הגיבורים השכיחים, וכמעט תמיד הוא לקוי בשיפוט. במפתח פרי, המפתח המקובל למשלי איזופוס, מופיעים בין השאר: החמור והכלבלב (פרי 91), שבו החמור המקנא מנסה לקפוץ על אדוניו כמו הכלב ומוכה; החמור נושא המלח (פרי 180), שלמד שהמלח נמס במים וטבע כשניסה את התחבולה עם ספוגים; החמור נושא פסל האל (פרי 182), שחשב שהעוברים משתחווים לו; החמור בעור האריה (פרי 188, וגרסה נוספת פרי 358), שנחשף בגלל אוזניו או קולו; והאריה והחמור היוצאים לצוד (פרי 151, אצל פדרוס א, יא), שבו החמור נוער כדי להבריח את החיות אל האריה, ואחר כך שואל אם קולו מצא חן, והאריה משיב שאילולא ידע מי הוא היה בורח גם הוא.</w:t>
       </w:r>
       <w:r>
         <w:rPr>
@@ -1686,7 +1883,7 @@
           <w:szCs w:val="24"/>
           <w:rtl/>
         </w:rPr>
-        <w:t xml:space="preserve"> במשלים אלה החמור מייצג את מי שמעריך את עצמו בטעות: הוא חושב שהכבוד שניתן לפסל ניתן לו, שהאהבה שניתנת לכלב תינתן גם לו, ושהעור יהפוך אותו לאריה. שניים מן המשלים האלה הם המקורות הישירים של משלים יד ו-מז אצל ברכיה, ומשל עור האריה הגיע אליו כנראה דרך אביאנוס (משל 5) ולא ישירות מן היוונית.</w:t>
+        <w:t xml:space="preserve"> במשלים אלה החמור מייצג את מי שמעריך את עצמו בטעות: הוא חושב שהכבוד שניתן לפסל ניתן לו, שהאהבה שניתנת לכלב תינתן גם לו, ושהעור יהפוך אותו לאריה. שלושה מן המשלים האלה הם המקורות הישירים של משלים יד, מז ו-סה אצל ברכיה, ומשל עור האריה הגיע אליו כנראה דרך אביאנוס (משל 5) ולא ישירות מן היוונית.</w:t>
       </w:r>
       <w:r>
         <w:rPr>
@@ -1710,7 +1907,7 @@
           <w:szCs w:val="24"/>
           <w:rtl/>
         </w:rPr>
-        <w:t xml:space="preserve">במפתחות הבינלאומיים של סיפורי העם שני הטיפוסים רשומים: </w:t>
+        <w:t xml:space="preserve">במפתחות הבינלאומיים של סיפורי העם שניים מן הטיפוסים רשומים: </w:t>
       </w:r>
       <w:r>
         <w:rPr>
@@ -1859,7 +2056,7 @@
           <w:szCs w:val="24"/>
           <w:rtl/>
         </w:rPr>
-        <w:t xml:space="preserve">בעל חיים קטן מנצח בעל חיים גדול".</w:t>
+        <w:t xml:space="preserve">בעל חיים קטן מנצח בעל חיים גדול", ובמשל הציד המשותף מוטיב הציד בשותפות עם האריה, שסופו תמיד רע לשותף החלש.</w:t>
       </w:r>
       <w:r>
         <w:rPr>
@@ -1991,7 +2188,7 @@
           <w:szCs w:val="24"/>
           <w:rtl/>
         </w:rPr>
-        <w:t xml:space="preserve">הטבלה שלהלן מרכזת את משלי החמור שנסקרו, את תוכנם בקצרה ואת התכונה שהחמור מייצג בכל אחד מהם. השורות האחרונות הן שלושת המשלים של ברכיה שינותחו בפרקים 3 עד 5.</w:t>
+        <w:t xml:space="preserve">הטבלה שלהלן מרכזת את משלי החמור שנסקרו, את תוכנם בקצרה ואת התכונה שהחמור מייצג בכל אחד מהם. השורות האחרונות הן ארבעת המשלים של ברכיה שינותחו בפרקים 3 עד 6.</w:t>
       </w:r>
     </w:p>
     <w:tbl>
@@ -2513,6 +2710,164 @@
                 <w:rtl/>
               </w:rPr>
               <w:t xml:space="preserve">התחזות, גאווה</w:t>
+            </w:r>
+          </w:p>
+        </w:tc>
+      </w:tr>
+      <w:tr>
+        <w:trPr>
+          <w:cantSplit/>
+          <w:tblHeader w:val="false"/>
+        </w:trPr>
+        <w:tc>
+          <w:tcPr>
+            <w:tcW w:type="dxa" w:w="1700"/>
+            <w:tcBorders>
+              <w:top w:val="single" w:color="888888" w:sz="4"/>
+              <w:left w:val="single" w:color="888888" w:sz="4"/>
+              <w:bottom w:val="single" w:color="888888" w:sz="4"/>
+              <w:right w:val="single" w:color="888888" w:sz="4"/>
+            </w:tcBorders>
+            <w:tcMar>
+              <w:top w:type="dxa" w:w="60"/>
+              <w:left w:type="dxa" w:w="80"/>
+              <w:bottom w:type="dxa" w:w="60"/>
+              <w:right w:type="dxa" w:w="80"/>
+            </w:tcMar>
+            <w:vAlign w:val="center"/>
+          </w:tcPr>
+          <w:p>
+            <w:pPr>
+              <w:bidi/>
+              <w:spacing w:after="0" w:line="276"/>
+              <w:jc w:val="start"/>
+            </w:pPr>
+            <w:r>
+              <w:rPr>
+                <w:rFonts w:ascii="Times New Roman" w:cs="David" w:eastAsia="David" w:hAnsi="Times New Roman"/>
+                <w:b w:val="false"/>
+                <w:bCs w:val="false"/>
+                <w:i w:val="false"/>
+                <w:iCs w:val="false"/>
+                <w:sz w:val="20"/>
+                <w:szCs w:val="20"/>
+                <w:rtl/>
+              </w:rPr>
+              <w:t xml:space="preserve">האריה והחמור יוצאים לצוד</w:t>
+            </w:r>
+          </w:p>
+        </w:tc>
+        <w:tc>
+          <w:tcPr>
+            <w:tcW w:type="dxa" w:w="1900"/>
+            <w:tcBorders>
+              <w:top w:val="single" w:color="888888" w:sz="4"/>
+              <w:left w:val="single" w:color="888888" w:sz="4"/>
+              <w:bottom w:val="single" w:color="888888" w:sz="4"/>
+              <w:right w:val="single" w:color="888888" w:sz="4"/>
+            </w:tcBorders>
+            <w:tcMar>
+              <w:top w:type="dxa" w:w="60"/>
+              <w:left w:type="dxa" w:w="80"/>
+              <w:bottom w:type="dxa" w:w="60"/>
+              <w:right w:type="dxa" w:w="80"/>
+            </w:tcMar>
+            <w:vAlign w:val="center"/>
+          </w:tcPr>
+          <w:p>
+            <w:pPr>
+              <w:bidi/>
+              <w:spacing w:after="0" w:line="276"/>
+              <w:jc w:val="start"/>
+            </w:pPr>
+            <w:r>
+              <w:rPr>
+                <w:rFonts w:ascii="Times New Roman" w:cs="David" w:eastAsia="David" w:hAnsi="Times New Roman"/>
+                <w:b w:val="false"/>
+                <w:bCs w:val="false"/>
+                <w:i w:val="false"/>
+                <w:iCs w:val="false"/>
+                <w:sz w:val="20"/>
+                <w:szCs w:val="20"/>
+                <w:rtl/>
+              </w:rPr>
+              <w:t xml:space="preserve">איזופוס, פרי 151; פדרוס א, יא</w:t>
+            </w:r>
+          </w:p>
+        </w:tc>
+        <w:tc>
+          <w:tcPr>
+            <w:tcW w:type="dxa" w:w="3472"/>
+            <w:tcBorders>
+              <w:top w:val="single" w:color="888888" w:sz="4"/>
+              <w:left w:val="single" w:color="888888" w:sz="4"/>
+              <w:bottom w:val="single" w:color="888888" w:sz="4"/>
+              <w:right w:val="single" w:color="888888" w:sz="4"/>
+            </w:tcBorders>
+            <w:tcMar>
+              <w:top w:type="dxa" w:w="60"/>
+              <w:left w:type="dxa" w:w="80"/>
+              <w:bottom w:type="dxa" w:w="60"/>
+              <w:right w:type="dxa" w:w="80"/>
+            </w:tcMar>
+            <w:vAlign w:val="center"/>
+          </w:tcPr>
+          <w:p>
+            <w:pPr>
+              <w:bidi/>
+              <w:spacing w:after="0" w:line="276"/>
+              <w:jc w:val="start"/>
+            </w:pPr>
+            <w:r>
+              <w:rPr>
+                <w:rFonts w:ascii="Times New Roman" w:cs="David" w:eastAsia="David" w:hAnsi="Times New Roman"/>
+                <w:b w:val="false"/>
+                <w:bCs w:val="false"/>
+                <w:i w:val="false"/>
+                <w:iCs w:val="false"/>
+                <w:sz w:val="20"/>
+                <w:szCs w:val="20"/>
+                <w:rtl/>
+              </w:rPr>
+              <w:t xml:space="preserve">החמור נוער והחיות נסות אל האריה. כששואל אם קולו יפה, האריה עונה שרק מי שאינו מכירו נבהל ממנו.</w:t>
+            </w:r>
+          </w:p>
+        </w:tc>
+        <w:tc>
+          <w:tcPr>
+            <w:tcW w:type="dxa" w:w="2000"/>
+            <w:tcBorders>
+              <w:top w:val="single" w:color="888888" w:sz="4"/>
+              <w:left w:val="single" w:color="888888" w:sz="4"/>
+              <w:bottom w:val="single" w:color="888888" w:sz="4"/>
+              <w:right w:val="single" w:color="888888" w:sz="4"/>
+            </w:tcBorders>
+            <w:tcMar>
+              <w:top w:type="dxa" w:w="60"/>
+              <w:left w:type="dxa" w:w="80"/>
+              <w:bottom w:type="dxa" w:w="60"/>
+              <w:right w:type="dxa" w:w="80"/>
+            </w:tcMar>
+            <w:vAlign w:val="center"/>
+          </w:tcPr>
+          <w:p>
+            <w:pPr>
+              <w:bidi/>
+              <w:spacing w:after="0" w:line="276"/>
+              <w:jc w:val="start"/>
+            </w:pPr>
+            <w:r>
+              <w:rPr>
+                <w:rFonts w:ascii="Times New Roman" w:cs="David" w:eastAsia="David" w:hAnsi="Times New Roman"/>
+                <w:b w:val="false"/>
+                <w:bCs w:val="false"/>
+                <w:i w:val="false"/>
+                <w:iCs w:val="false"/>
+                <w:sz w:val="20"/>
+                <w:szCs w:val="20"/>
+                <w:rtl/>
+              </w:rPr>
+              <w:t xml:space="preserve">התפארות בקול ריק</w:t>
             </w:r>
           </w:p>
         </w:tc>
@@ -3623,6 +3978,164 @@
           </w:p>
         </w:tc>
       </w:tr>
+      <w:tr>
+        <w:trPr>
+          <w:cantSplit/>
+          <w:tblHeader w:val="false"/>
+        </w:trPr>
+        <w:tc>
+          <w:tcPr>
+            <w:tcW w:type="dxa" w:w="1700"/>
+            <w:tcBorders>
+              <w:top w:val="single" w:color="888888" w:sz="4"/>
+              <w:left w:val="single" w:color="888888" w:sz="4"/>
+              <w:bottom w:val="single" w:color="888888" w:sz="4"/>
+              <w:right w:val="single" w:color="888888" w:sz="4"/>
+            </w:tcBorders>
+            <w:tcMar>
+              <w:top w:type="dxa" w:w="60"/>
+              <w:left w:type="dxa" w:w="80"/>
+              <w:bottom w:type="dxa" w:w="60"/>
+              <w:right w:type="dxa" w:w="80"/>
+            </w:tcMar>
+            <w:vAlign w:val="center"/>
+          </w:tcPr>
+          <w:p>
+            <w:pPr>
+              <w:bidi/>
+              <w:spacing w:after="0" w:line="276"/>
+              <w:jc w:val="start"/>
+            </w:pPr>
+            <w:r>
+              <w:rPr>
+                <w:rFonts w:ascii="Times New Roman" w:cs="David" w:eastAsia="David" w:hAnsi="Times New Roman"/>
+                <w:b w:val="false"/>
+                <w:bCs w:val="false"/>
+                <w:i w:val="false"/>
+                <w:iCs w:val="false"/>
+                <w:sz w:val="20"/>
+                <w:szCs w:val="20"/>
+                <w:rtl/>
+              </w:rPr>
+              <w:t xml:space="preserve">אריה וחמור (סה)</w:t>
+            </w:r>
+          </w:p>
+        </w:tc>
+        <w:tc>
+          <w:tcPr>
+            <w:tcW w:type="dxa" w:w="1900"/>
+            <w:tcBorders>
+              <w:top w:val="single" w:color="888888" w:sz="4"/>
+              <w:left w:val="single" w:color="888888" w:sz="4"/>
+              <w:bottom w:val="single" w:color="888888" w:sz="4"/>
+              <w:right w:val="single" w:color="888888" w:sz="4"/>
+            </w:tcBorders>
+            <w:tcMar>
+              <w:top w:type="dxa" w:w="60"/>
+              <w:left w:type="dxa" w:w="80"/>
+              <w:bottom w:type="dxa" w:w="60"/>
+              <w:right w:type="dxa" w:w="80"/>
+            </w:tcMar>
+            <w:vAlign w:val="center"/>
+          </w:tcPr>
+          <w:p>
+            <w:pPr>
+              <w:bidi/>
+              <w:spacing w:after="0" w:line="276"/>
+              <w:jc w:val="start"/>
+            </w:pPr>
+            <w:r>
+              <w:rPr>
+                <w:rFonts w:ascii="Times New Roman" w:cs="David" w:eastAsia="David" w:hAnsi="Times New Roman"/>
+                <w:b w:val="false"/>
+                <w:bCs w:val="false"/>
+                <w:i w:val="false"/>
+                <w:iCs w:val="false"/>
+                <w:sz w:val="20"/>
+                <w:szCs w:val="20"/>
+                <w:rtl/>
+              </w:rPr>
+              <w:t xml:space="preserve">ברכיה הנקדן</w:t>
+            </w:r>
+          </w:p>
+        </w:tc>
+        <w:tc>
+          <w:tcPr>
+            <w:tcW w:type="dxa" w:w="3472"/>
+            <w:tcBorders>
+              <w:top w:val="single" w:color="888888" w:sz="4"/>
+              <w:left w:val="single" w:color="888888" w:sz="4"/>
+              <w:bottom w:val="single" w:color="888888" w:sz="4"/>
+              <w:right w:val="single" w:color="888888" w:sz="4"/>
+            </w:tcBorders>
+            <w:tcMar>
+              <w:top w:type="dxa" w:w="60"/>
+              <w:left w:type="dxa" w:w="80"/>
+              <w:bottom w:type="dxa" w:w="60"/>
+              <w:right w:type="dxa" w:w="80"/>
+            </w:tcMar>
+            <w:vAlign w:val="center"/>
+          </w:tcPr>
+          <w:p>
+            <w:pPr>
+              <w:bidi/>
+              <w:spacing w:after="0" w:line="276"/>
+              <w:jc w:val="start"/>
+            </w:pPr>
+            <w:r>
+              <w:rPr>
+                <w:rFonts w:ascii="Times New Roman" w:cs="David" w:eastAsia="David" w:hAnsi="Times New Roman"/>
+                <w:b w:val="false"/>
+                <w:bCs w:val="false"/>
+                <w:i w:val="false"/>
+                <w:iCs w:val="false"/>
+                <w:sz w:val="20"/>
+                <w:szCs w:val="20"/>
+                <w:rtl/>
+              </w:rPr>
+              <w:t xml:space="preserve">האריה מקרב את החמור לציד. החמור סבור שהוא משנה למלך, מתפאר בקולו, והאריה משיב לו בבוז.</w:t>
+            </w:r>
+          </w:p>
+        </w:tc>
+        <w:tc>
+          <w:tcPr>
+            <w:tcW w:type="dxa" w:w="2000"/>
+            <w:tcBorders>
+              <w:top w:val="single" w:color="888888" w:sz="4"/>
+              <w:left w:val="single" w:color="888888" w:sz="4"/>
+              <w:bottom w:val="single" w:color="888888" w:sz="4"/>
+              <w:right w:val="single" w:color="888888" w:sz="4"/>
+            </w:tcBorders>
+            <w:tcMar>
+              <w:top w:type="dxa" w:w="60"/>
+              <w:left w:type="dxa" w:w="80"/>
+              <w:bottom w:type="dxa" w:w="60"/>
+              <w:right w:type="dxa" w:w="80"/>
+            </w:tcMar>
+            <w:vAlign w:val="center"/>
+          </w:tcPr>
+          <w:p>
+            <w:pPr>
+              <w:bidi/>
+              <w:spacing w:after="0" w:line="276"/>
+              <w:jc w:val="start"/>
+            </w:pPr>
+            <w:r>
+              <w:rPr>
+                <w:rFonts w:ascii="Times New Roman" w:cs="David" w:eastAsia="David" w:hAnsi="Times New Roman"/>
+                <w:b w:val="false"/>
+                <w:bCs w:val="false"/>
+                <w:i w:val="false"/>
+                <w:iCs w:val="false"/>
+                <w:sz w:val="20"/>
+                <w:szCs w:val="20"/>
+                <w:rtl/>
+              </w:rPr>
+              <w:t xml:space="preserve">גאוות הקול, שכחת השפלות</w:t>
+            </w:r>
+          </w:p>
+        </w:tc>
+      </w:tr>
     </w:tbl>
     <w:p>
       <w:pPr>
@@ -3843,7 +4356,7 @@
           <w:szCs w:val="24"/>
           <w:rtl/>
         </w:rPr>
-        <w:t xml:space="preserve">המבנה של כל משל קבוע ברובו. הוא נפתח בחרוז מוסרי קצר, שהוא מעין כותרת רעיונית. אחריו בא גוף הסיפור בפרוזה מחורזת. "והמשל" הוא הנמשל, שבו מפרש המחבר את הסיפור על בני אדם. במשלים רבים באה גם חתימה בשיר שקול קצר הפותח ב"ואשא משלי ואומר". שניים משלושת המשלים הנדונים בעבודה מכילים את כל ארבעת החלקים; במשל הצרעה אין שיר חותם. הסגנון הוא פרוזה מחורזת שכמעט כל צלע שלה נשענת על שיבוץ, כלומר על שילוב לשון המקרא בתוך משפט חדש, לעיתים תוך שינוי משמעות. דן פגיס תיאר את השיבוץ כאמצעי מרכזי בפואטיקה העברית של ימי הביניים, שבו הקורא המשכיל מזהה את הפסוק ונהנה מן הפער בין ההקשר המקורי ובין ההקשר החדש.</w:t>
+        <w:t xml:space="preserve">המבנה של כל משל קבוע ברובו. הוא נפתח בחרוז מוסרי קצר, שהוא מעין כותרת רעיונית. אחריו בא גוף הסיפור בפרוזה מחורזת. "והמשל" הוא הנמשל, שבו מפרש המחבר את הסיפור על בני אדם. במשלים רבים באה גם חתימה בשיר שקול קצר הפותח ב"ואשא משלי ואומר". שניים מארבעת המשלים הנדונים בעבודה מכילים את כל ארבעת החלקים; במשל הצרעה ובמשל סה אין שיר חותם. הסגנון הוא פרוזה מחורזת שכמעט כל צלע שלה נשענת על שיבוץ, כלומר על שילוב לשון המקרא בתוך משפט חדש, לעיתים תוך שינוי משמעות. דן פגיס תיאר את השיבוץ כאמצעי מרכזי בפואטיקה העברית של ימי הביניים, שבו הקורא המשכיל מזהה את הפסוק ונהנה מן הפער בין ההקשר המקורי ובין ההקשר החדש.</w:t>
       </w:r>
       <w:r>
         <w:rPr>
@@ -3917,7 +4430,7 @@
           <w:szCs w:val="24"/>
           <w:rtl/>
         </w:rPr>
-        <w:t xml:space="preserve"> הוא מודה שהמשלים מצויים בכל לשון, אך טוען שהוא הוסיף עליהם ותיקנם. שתי נקודות בהקדמה חשובות לענייננו. הראשונה היא ההצדקה הדתית של הז'אנר: ברכיה נשען על שלמה, שאף הוא "וידבר על הבהמה ועל העוף" (מלכים א ה, יג), ועל משלי החכמים. השנייה היא הנימה החברתית: הרעה שבדור היא בעיקר גאוותם של מי שעלו לגדולה שלא בזכות. שלושת משלי החמור שנבחרו לעבודה עוסקים בדיוק בכך, ואפשר לקרוא אותם כיישום של ההקדמה.</w:t>
+        <w:t xml:space="preserve"> הוא מודה שהמשלים מצויים בכל לשון, אך טוען שהוא הוסיף עליהם ותיקנם. שתי נקודות בהקדמה חשובות לענייננו. הראשונה היא ההצדקה הדתית של הז'אנר: ברכיה נשען על שלמה, שאף הוא "וידבר על הבהמה ועל העוף" (מלכים א ה, יג), ועל משלי החכמים. השנייה היא הנימה החברתית: הרעה שבדור היא בעיקר גאוותם של מי שעלו לגדולה שלא בזכות. ארבעת משלי החמור שנבחרו לעבודה עוסקים בדיוק בכך, ואפשר לקרוא אותם כיישום של ההקדמה.</w:t>
       </w:r>
     </w:p>
     <w:p>
@@ -3939,7 +4452,7 @@
           <w:szCs w:val="28"/>
           <w:rtl/>
         </w:rPr>
-        <w:t xml:space="preserve">2.4 שלושת המשלים הנבחרים: סקירה ונמשל</w:t>
+        <w:t xml:space="preserve">2.4 ארבעת המשלים הנבחרים: סקירה ונמשל</w:t>
       </w:r>
     </w:p>
     <w:p>
@@ -3994,6 +4507,24 @@
           <w:rtl/>
         </w:rPr>
         <w:t xml:space="preserve">"חמור, כלב ואדם" (משל יד). כלב קטן חי בבית פקיד, אוכל מפתו ושוכב בחיקו. החמור שבבית מקנא ומחליט לעשות כמוהו: הוא רץ אל אדוניו, מלקק אותו, מחבק אותו ברגליו ונוער עליו עד שהוא מפיל אותו מכיסאו. האדון זועק, וכל בני הבית מכים את החמור ורודפים אותו עד אבוסו. הנמשל: איש גבה לב שרוצה למשול ונופל פתאום. החמור מייצג קנאה ואי־ידיעת מקומו, וברכיה חותם בהזכרת שאול, שיצא לחפש אתונות ומצא מלוכה.</w:t>
+      </w:r>
+    </w:p>
+    <w:p>
+      <w:pPr>
+        <w:bidi/>
+        <w:spacing w:after="120" w:before="0" w:line="360"/>
+        <w:jc w:val="both"/>
+      </w:pPr>
+      <w:r>
+        <w:rPr>
+          <w:rFonts w:ascii="Times New Roman" w:cs="David" w:eastAsia="David" w:hAnsi="Times New Roman"/>
+          <w:i w:val="false"/>
+          <w:iCs w:val="false"/>
+          <w:sz w:val="24"/>
+          <w:szCs w:val="24"/>
+          <w:rtl/>
+        </w:rPr>
+        <w:t xml:space="preserve">"אריה וחמור" (משל סה). האריה קורא לחמור להראות לו את יקר תפארת גדולתו ולוקח אותו לציד. החמור מתגאה בלבו שהמלך בחר בו וכבר רואה את עצמו משנה למלך. הוא מבטיח להפחיד את הבהמות בקולו, והאריה מחלק ביניהם את התפקידים: החמור ישאג והאריה יטרוף. הנעירה מבריחה את הצאן והבקר, האריה טורף ושובע, ומצווה על החמור להפסיק. ליד הנבלה החמור מתפאר בקולו וברעמתו ומבקש להתמנות לצייד קבוע. האריה משיב: מי שמכיר את מוצאו אינו נבהל מקולו, ובזוי וקשה עורף כמוהו לא יצוד טרף ללביא; עוד יאמרו גוריו איך טרף בצאן ולא שבר את החמור. הנמשל: איש נכבד שמקרב אליו בזוי ונקלה, והבזוי מתגאה ואינו מכיר את שפלותו, ולשונו מדברת גדולות. תשובת החכם לכסיל היא שתיקה. החמור מייצג התפארות בקול ריק ושכחת השפלות.</w:t>
       </w:r>
     </w:p>
     <w:p>
@@ -4979,7 +5510,29 @@
           <w:szCs w:val="32"/>
           <w:rtl/>
         </w:rPr>
-        <w:t xml:space="preserve">פרק 6: סיכום ומסקנות</w:t>
+        <w:t xml:space="preserve">פרק 6: "אריה וחמור" (משל סה): ניתוח</w:t>
+      </w:r>
+    </w:p>
+    <w:p>
+      <w:pPr>
+        <w:pStyle w:val="Heading2"/>
+        <w:keepNext/>
+        <w:bidi/>
+        <w:spacing w:after="120" w:before="240" w:line="360"/>
+        <w:jc w:val="start"/>
+      </w:pPr>
+      <w:r>
+        <w:rPr>
+          <w:rFonts w:ascii="Times New Roman" w:cs="David" w:eastAsia="David" w:hAnsi="Times New Roman"/>
+          <w:b/>
+          <w:bCs/>
+          <w:i w:val="false"/>
+          <w:iCs w:val="false"/>
+          <w:sz w:val="28"/>
+          <w:szCs w:val="28"/>
+          <w:rtl/>
+        </w:rPr>
+        <w:t xml:space="preserve">6.1 מבנה המשל ומהלך העלילה</w:t>
       </w:r>
     </w:p>
     <w:p>
@@ -4997,7 +5550,24 @@
           <w:szCs w:val="24"/>
           <w:rtl/>
         </w:rPr>
-        <w:t xml:space="preserve">העבודה שאלה מהי התכונה שהחמור מייצג במשליו של ברכיה הנקדן, וכיצד נבנה הקשר בין המשל לנמשל. לשלושת המשלים שלושה חרוזים פותחים שונים: זלזול בקטן, גאווה בלי חוכמה, קנאה. אבל בשלושתם החמור עושה אותו הדבר: הוא מנסה להיות מה שאינו. שליט שאינו חושש מצרעה, אריה, כלב חיק. בשלושתם הכישלון בא מן הגוף, מן האוזן שאי אפשר לסתום, מן האוזניים שמציצות מעור האריה, מן הגוף הכבד שנופל על האדון. ובשלושתם הסוף הוא חזרה למקום: עבדות, משא כפול, אבוס. החמור של ברכיה אינו הכסיל של איזופוס. הוא מי שאינו יודע את מקומו, וברכיה מרחיק לכת ומסביר, דרך השיבוצים, שאי־ידיעת המקום היא חטא: "לא ידע" של ישעיהו, "דע מאין באת" של עקביא.</w:t>
+        <w:t xml:space="preserve">החרוז הפותח, "איש אשר מכיר מקומו / תגלה ערותו ולבו בל עמו", מציב את "המקום" במרכז, ובכך מקשר את המשל למשל הצרעה ולמשל הכלב. בנוסח שנמסר בכיתה החרוז קשה: "מכיר מקומו" ואחריו "תגלה ערותו", ואילו ההיגיון והנמשל, "ולא יכיר את שפלותו", מחייבים שלילה. ייתכן שיש לקרוא "אשר אינו מכיר מקומו", וייתכן שהחרוז אירוני. יש לבדוק את הנוסח במהדורת הברמן.</w:t>
+      </w:r>
+      <w:r>
+        <w:rPr>
+          <w:rStyle w:val="FootnoteReference"/>
+        </w:rPr>
+        <w:footnoteReference w:id="21"/>
+      </w:r>
+      <w:r>
+        <w:rPr>
+          <w:rFonts w:ascii="Times New Roman" w:cs="David" w:eastAsia="David" w:hAnsi="Times New Roman"/>
+          <w:i w:val="false"/>
+          <w:iCs w:val="false"/>
+          <w:sz w:val="24"/>
+          <w:szCs w:val="24"/>
+          <w:rtl/>
+        </w:rPr>
+        <w:t xml:space="preserve"> "ולבו בל עמו" לקוח ממשלי כג, ז, "ולבו בל עמך", על הצר עין שמארח ולבו אינו עם אורחו, ו"תגלה ערותו" מהדהד את ישעיהו מז, ג, "תגל ערותך", על בת בבל שירדה מכיסאה.</w:t>
       </w:r>
     </w:p>
     <w:p>
@@ -5015,7 +5585,7 @@
           <w:szCs w:val="24"/>
           <w:rtl/>
         </w:rPr>
-        <w:t xml:space="preserve">הקשר בין המשל לנמשל נבנה בשלוש דרכים. הראשונה גלויה: הנמשל מתרגם את סיפור החיות ללשון החברה, לגדול ולקטן, לבן בלי שם ולמכבדיו, לאיש שרוצה למשול. השנייה היא השיבוץ, וזו הדרך העיקרית. הפסוקים שברכיה שם בפי החמור ובפי סובביו מציבים מאחוריו דמויות מקראיות שסופן ידוע: אמציה שאמר "נתראה פנים", רחבעם שאמר "קטני עבה ממתני", אדוניה שאמר "אני אמלך", נגיד צור, אדום, ארז אשור, בנות ציון נטויות הגרון. הקורא המשכיל קורא את הסוף בפסוק לפני שהסיפור מגיע אליו, והנמשל רק מאשר. במובן זה השיבוץ אצל ברכיה הוא אמצעי של הטרמה, לא של קישוט. השלישית היא השיר החותם, שמוסיף על הנמשל דוגמה מקראית מפורשת, שאול ואתונותיו, ובכך קושר את משל החיות למשל שלמה ולסיפור המקראי.</w:t>
+        <w:t xml:space="preserve">העלילה בנויה בחמש תנועות. הראשונה היא ההזמנה והגאווה: האריה קורא לחמור להראות לו את גדולתו, והחמור מפרש את ההזמנה כמינוי, "ועתה יקראו לי משנה למלך". השנייה היא חלוקת התפקידים: החמור מציע את קולו, והאריה מחלק, "אתה תשאג ואני אטרוף". השלישית היא הציד: הנעירה, המנוסה, הטריפה, והפקודה להשתיק. הרביעית היא הבקשה: ליד הנבלה החמור מתפאר בקולו וברעמתו ומבקש קביעות. החמישית היא התשובה: האריה מגדיר את החמור, "בזוי ושפל וקשה ערף", ומסיים באיום מרומז, שגוריו עוד ילעגו לו על שטרף בצאן ולא שבר את החמור. המשל נגמר בדברי האריה, ואין בו שיר חותם. גורל החמור אינו מסופר, אבל המשפט האחרון אומר אותו למי שמכיר את המקור.</w:t>
       </w:r>
     </w:p>
     <w:p>
@@ -5033,7 +5603,35 @@
           <w:szCs w:val="24"/>
           <w:rtl/>
         </w:rPr>
-        <w:t xml:space="preserve">העבודה העלתה גם ממצא שלא צפיתי בתחילתה. במשל מז ובמשל יד מסתתר מתחת לנמשל החברתי רובד תיאולוגי: האדון מדבר בלשון הנביאים, החמור "הולך בקרי" ו"לוקח כפליים", ובני הבית מכים אותו במילים שנאמרו לשטן על איוב. הנמשל אינו מזכיר דבר מכל זה. ברכיה כותב אפוא בשתי שכבות: שכבה לכל קורא, שבה גאווה נענשת, ושכבה למי שיודע את הפסוקים, שבה מרד באדון הוא מרד בסדר שקבע האדון העליון. אפשר לקשור זאת להקדמת הספר, שבה תלונתו של ברכיה על דורו היא בו זמנית חברתית ודתית.</w:t>
+        <w:t xml:space="preserve">לעומת המקור, פדרוס א, יא, ברכיה שינה שני דברים. הוא הוסיף את המונולוג הפנימי של החמור בראשית המשל, שהופך את הגאווה מתגובה רגעית לתכונה, והוא הוסיף לתשובת האריה את הסיום המאיים. אצל פדרוס האריה עונה בהומור, "אילולא ידעתי מי אתה הייתי בורח גם אני"; אצל ברכיה ההומור נשאר, "מקולך לא יענה ומהמונך לא יחת", אבל אחריו בא הבוז ואחריו האיום.</w:t>
+      </w:r>
+      <w:r>
+        <w:rPr>
+          <w:rStyle w:val="FootnoteReference"/>
+        </w:rPr>
+        <w:footnoteReference w:id="22"/>
+      </w:r>
+    </w:p>
+    <w:p>
+      <w:pPr>
+        <w:pStyle w:val="Heading2"/>
+        <w:keepNext/>
+        <w:bidi/>
+        <w:spacing w:after="120" w:before="240" w:line="360"/>
+        <w:jc w:val="start"/>
+      </w:pPr>
+      <w:r>
+        <w:rPr>
+          <w:rFonts w:ascii="Times New Roman" w:cs="David" w:eastAsia="David" w:hAnsi="Times New Roman"/>
+          <w:b/>
+          <w:bCs/>
+          <w:i w:val="false"/>
+          <w:iCs w:val="false"/>
+          <w:sz w:val="28"/>
+          <w:szCs w:val="28"/>
+          <w:rtl/>
+        </w:rPr>
+        <w:t xml:space="preserve">6.2 השיבוצים</w:t>
       </w:r>
     </w:p>
     <w:p>
@@ -5051,7 +5649,7 @@
           <w:szCs w:val="24"/>
           <w:rtl/>
         </w:rPr>
-        <w:t xml:space="preserve">ממצא נוסף נוגע לאוזן. בשלושת המשלים האוזן של החמור היא מרכז: צרעה נכנסת בה, היא מציצה מעור האריה, והחמור מלקק את אדוניו "סביב אזניו". והאריה אומר לחמור "האזן". החמור, שסימנו הגופני הוא האוזן הגדולה, הוא בעל החיים שאינו שומע. ישעיהו אמר שהחמור יודע ועמי לא התבונן; ברכיה, שהיה נקדן ואיש של פסוקים, לוקח את החמור היודע של ישעיהו ועושה אותו לעם שאינו מתבונן.</w:t>
+        <w:t xml:space="preserve">הפתיחה כולה שאולה ממגילת אסתר. "יקר תפארת גדולתו" הוא מן המשתה של אחשורוש, "את עשר כבוד מלכותו ואת יקר תפארת גדלתו" (אסתר א, ד). ומחשבת החמור, "למי יחפץ המלך לעשות יקר יותר ממני", היא מילה במילה מחשבתו של המן: "ויאמר המן בלבו למי יחפץ המלך לעשות יקר יותר ממני" (אסתר ו, ו). גם "ויתגאה החמור בלבו לאמר" מקביל ל"ויאמר המן בלבו". המן חשב שהכבוד מיועד לו ונאלץ להוליך את מרדכי ברחוב, ומיד אחר כך נתלה. ואילו "משנה למלך" הוא תוארו של מרדכי בסוף המגילה (אסתר י, ג). החמור רואה את עצמו מרדכי, והפסוק שברכיה שם בלבו עושה אותו המן. הקורא יודע מן הרגע הראשון שהמינוי לא יבוא, ומה בא במקומו.</w:t>
       </w:r>
     </w:p>
     <w:p>
@@ -5069,7 +5667,7 @@
           <w:szCs w:val="24"/>
           <w:rtl/>
         </w:rPr>
-        <w:t xml:space="preserve">מבחינת ההשוואה למקורות, המסקנה היא שברכיה שינה את התכונה. החמור האיזופי טיפש; החמור של ברכיה גאה. זה עולה בקנה אחד עם מה שהראה שורצבוים על דרכו של ברכיה להוסיף לכל משל ממד מוסרי, ועם מה שיסיף מתאר כדרכו של המשל העברי לקבע לכל חיה תכונה אחת. אלא שאצל ברכיה התכונה אינה מקובעת אלא מנומקת: החמור גאה מפני שאינו יודע מי הוא.</w:t>
+        <w:t xml:space="preserve">דברי ההתפארות של החמור עשויים מלשונות שנאמרו על האל. "מקולי יחפזון וינוסו מגערתי" הוא תהלים קד, ז, "מן גערתך ינוסון מן קול רעמך יחפזון", על המים שברחו מפני הבורא. "ואוריד לארץ נצחם" הוא ישעיהו סג, ו, מנאום הנקמה של ה' באדום. "ואלה המשפטים אשר תשים לפניהם" הוא שמות כא, א, פתיחת פרשת משפטים, ובפי החמור הפסוק שבו ה' נותן את החוקים למשה נעשה הצעה לאריה לקבוע חוקים לבהמות. "נגביר שפתנו אתנו מי אדון לנו" הוא תהלים יב, ה, מזמור על "לשון מדברת גדלות", ואותו מזמור חוזר בנמשל. "הלוא דברי ייטיבו עם הישר הולך" הוא מיכה ב, ז, מילה במילה. גם תשובת האריה הראשונה נעשית מלשון האל: "אתה תשגיא פעלך" הוא איוב לו, כד, ו"ובקול כמוני תרעם" הוא מן השאלה שה' שואל את איוב מן הסערה: "ואם זרוע כאל לך ובקול כמהו תרעם" (איוב מ, ט). האריה מציע לחמור לרעום בקול כמוהו, במילים שבהן האל לועג לאיוב שאין לו זרוע כאל. ההצעה היא לעג מן הרגע הראשון, והחמור אינו שומע אותו.</w:t>
       </w:r>
     </w:p>
     <w:p>
@@ -5087,7 +5685,332 @@
           <w:szCs w:val="24"/>
           <w:rtl/>
         </w:rPr>
-        <w:t xml:space="preserve">העבודה מוגבלת בכמה מובנים, וכל אחד מהם פותח כיוון להמשך. נותחו שלושה משלים בלבד, ובמשלי שועלים יש חמורים נוספים. ההשוואה למארי דה פראנס נעשתה על פי תוכן ולא על פי הטקסט הצרפתי, ובדיקה צמודה של הנוסח יכולה להראות מה בדיוק שינה ברכיה. ולבסוף, השימוש החוזר ביחזקאל לא בשני נמשלים מעלה שאלה רחבה יותר: האם יש לברכיה "פסוקי בית" קבועים לכל תכונה, שחוזרים לאורך הספר. בדיקה של כלל הנמשלים בספר לפי מקורותיהם המקראיים היא המחקר הבא שהעבודה הזאת מציעה.</w:t>
+        <w:t xml:space="preserve">בשלב הציד מופיע שוב שמות ט. "ורב מהיות קולות" הוא בקשת פרעה ממשה בשעת הברד: "העתירו אל ה' ורב מהית קלת אלהים וברד" (שמות ט, כח). האריה מבקש מן החמור להפסיק את הנעירה במילים שבהן פרעה ביקש להפסיק את הרעמים. זה השימוש השני של ברכיה במכת הברד במשלי החמור, אחרי משל מז, וגם כאן היא משמשת לתאר קול חמור ככוח טבע. "ויהי לחרדת המחנה" הוא שמואל א יד, טו, על המהומה במחנה פלשתים, ו"מגמת פניהם" הוא חבקוק א, ט.</w:t>
+      </w:r>
+    </w:p>
+    <w:p>
+      <w:pPr>
+        <w:bidi/>
+        <w:spacing w:after="120" w:before="0" w:line="360"/>
+        <w:jc w:val="both"/>
+      </w:pPr>
+      <w:r>
+        <w:rPr>
+          <w:rFonts w:ascii="Times New Roman" w:cs="David" w:eastAsia="David" w:hAnsi="Times New Roman"/>
+          <w:i w:val="false"/>
+          <w:iCs w:val="false"/>
+          <w:sz w:val="24"/>
+          <w:szCs w:val="24"/>
+          <w:rtl/>
+        </w:rPr>
+        <w:t xml:space="preserve">ההתפארות ליד הנבלה עשויה מתיאור סוס המלחמה בנאום ה' לאיוב: "התלביש צוארו רעמה... הוד נחרו אימה" (איוב לט, יט-כ). החמור אומר "הלא שמעת הוד נחרי / וראית כי רעמה לבוש צוארי". הוא לוקח לעצמו את תיאור הסוס, בעל החיים היחיד שהאל עצמו מתפאר בו, ובאותה מילה, "רעמה", יש גם רעמת האריה וגם הרעם שהאריה הזמין אותו לרעום. "והיה כזה יום מחר" הוא ישעיהו נו, יב, מדברי הסובאים, ו"לא מהם ולא מהמהם" הוא יחזקאל ז, יא. ואילו האריה משיב בפסוק שנאמר על האריה עצמו: "כאשר יהגה האריה והכפיר על טרפו אשר יקרא עליו מלא רעים, מקולם לא יחת ומהמונם לא יענה" (ישעיהו לא, ד). האריה של ישעיהו אינו נבהל מהמון הרועים הצועקים עליו; האריה של ברכיה אינו נבהל מן החמור, ומודיע לו שכך גם כל מי שמכיר את מוצאו. "בזוי" הוא עובדיה א, ב, "בזוי אתה מאד", על אדום, שכבר שימש במשל מז. "קשה ערף" הוא כינויו של ישראל בחטא העגל (שמות לב, ט), ושוב מופיע העגל בשולי משל חמור. "התצוד ללביא טרף" הוא איוב לח, לט, מילה במילה, מן השאלות שה' שואל את איוב: האריה שואל את החמור את מה שהאל שאל את האדם. "בני שכולי" הוא ישעיהו מט, כ, "עוד יאמרו באזניך בני שכליך".</w:t>
+      </w:r>
+    </w:p>
+    <w:p>
+      <w:pPr>
+        <w:bidi/>
+        <w:spacing w:after="120" w:before="0" w:line="360"/>
+        <w:jc w:val="both"/>
+      </w:pPr>
+      <w:r>
+        <w:rPr>
+          <w:rFonts w:ascii="Times New Roman" w:cs="David" w:eastAsia="David" w:hAnsi="Times New Roman"/>
+          <w:i w:val="false"/>
+          <w:iCs w:val="false"/>
+          <w:sz w:val="24"/>
+          <w:szCs w:val="24"/>
+          <w:rtl/>
+        </w:rPr>
+        <w:t xml:space="preserve">הסיום כולו נשען על סיפור אחד: איש האלוהים מיהודה, שהאריה הרגו בדרך, "וחמור ואריה עמדים אצל הנבלה", ו"לא אכל האריה את הנבלה ולא שבר את החמור" (מלכים א יג, כד-כח). ברכיה מצטט את התמונה, "והחמור והאריה עומדים אצל הנבלה", ואת הפסוק, "ולא שברת את החמור". בסיפור המקראי הימנעות האריה מן החמור היא נס, אות לכך שהאריה שליח. אצל ברכיה גורי האריה ילעגו לאביהם על אותו נס בדיוק, "איך טרפת בצאן ולא שברת את החמור". הנס הפך לחרפה, ומכאן שהאריה יתקן אותה. סופו של החמור אינו כתוב, אבל הפסוק כותב אותו.</w:t>
+      </w:r>
+    </w:p>
+    <w:p>
+      <w:pPr>
+        <w:bidi/>
+        <w:spacing w:after="120" w:before="0" w:line="360"/>
+        <w:jc w:val="both"/>
+      </w:pPr>
+      <w:r>
+        <w:rPr>
+          <w:rFonts w:ascii="Times New Roman" w:cs="David" w:eastAsia="David" w:hAnsi="Times New Roman"/>
+          <w:i w:val="false"/>
+          <w:iCs w:val="false"/>
+          <w:sz w:val="24"/>
+          <w:szCs w:val="24"/>
+          <w:rtl/>
+        </w:rPr>
+        <w:t xml:space="preserve">הנמשל מצטט את תהלים יב, ד, "לשון מדברת גדלות", ואת ישעיהו י, יג, "בחכמתי כי נבנותי", מנאום הגאווה של מלך אשור. אשור, שהיה ארז הלבנון בנמשלים של משל הצרעה ומשל מז, הוא כאן הלשון המתפארת. המשפט החותם, "שתיקת הכסיל היא תשובתו", אינו פסוק אלא פתגם חכמה, קרוב למשלי יז, כח, "גם אויל מחריש חכם יחשב", ולפתגמים של ספרות המוסר בימי הביניים.</w:t>
+      </w:r>
+      <w:r>
+        <w:rPr>
+          <w:rStyle w:val="FootnoteReference"/>
+        </w:rPr>
+        <w:footnoteReference w:id="23"/>
+      </w:r>
+    </w:p>
+    <w:p>
+      <w:pPr>
+        <w:pStyle w:val="Heading2"/>
+        <w:keepNext/>
+        <w:bidi/>
+        <w:spacing w:after="120" w:before="240" w:line="360"/>
+        <w:jc w:val="start"/>
+      </w:pPr>
+      <w:r>
+        <w:rPr>
+          <w:rFonts w:ascii="Times New Roman" w:cs="David" w:eastAsia="David" w:hAnsi="Times New Roman"/>
+          <w:b/>
+          <w:bCs/>
+          <w:i w:val="false"/>
+          <w:iCs w:val="false"/>
+          <w:sz w:val="28"/>
+          <w:szCs w:val="28"/>
+          <w:rtl/>
+        </w:rPr>
+        <w:t xml:space="preserve">6.3 הפואטיקה של המשל</w:t>
+      </w:r>
+    </w:p>
+    <w:p>
+      <w:pPr>
+        <w:bidi/>
+        <w:spacing w:after="120" w:before="0" w:line="360"/>
+        <w:jc w:val="both"/>
+      </w:pPr>
+      <w:r>
+        <w:rPr>
+          <w:rFonts w:ascii="Times New Roman" w:cs="David" w:eastAsia="David" w:hAnsi="Times New Roman"/>
+          <w:i w:val="false"/>
+          <w:iCs w:val="false"/>
+          <w:sz w:val="24"/>
+          <w:szCs w:val="24"/>
+          <w:rtl/>
+        </w:rPr>
+        <w:t xml:space="preserve">המשל עוסק בקול, וכל מה שיש לחמור הוא קולו. האריה מגדיר זאת בחלוקת התפקידים, "אתה תשאג ואני אטרוף", והחלוקה עצמה היא החרוז: שאג מול טרף, אחז מול ערף. הקול נשאר קול, והטרף נשאר של הטורף. ברכיה בונה על כך רשת של מילים משורש שמ"ע: "שמני אל משמעתו", "להשמיע במרום קולך", "המון קולך השמיעם", "אל תשמיע עוד קולך", "הלא שמעת", "שמעני אדוני המלך". החמור רוצה להישמע, ובסוף האריה אומר לו שמי שמכיר אותו "מקולך לא יענה". השמיעה חוזרת כאן בהיפוך: במשל הצרעה החמור לא היה יכול לשמוע, וכאן איש אינו רוצה לשמוע אותו.</w:t>
+      </w:r>
+    </w:p>
+    <w:p>
+      <w:pPr>
+        <w:bidi/>
+        <w:spacing w:after="120" w:before="0" w:line="360"/>
+        <w:jc w:val="both"/>
+      </w:pPr>
+      <w:r>
+        <w:rPr>
+          <w:rFonts w:ascii="Times New Roman" w:cs="David" w:eastAsia="David" w:hAnsi="Times New Roman"/>
+          <w:i w:val="false"/>
+          <w:iCs w:val="false"/>
+          <w:sz w:val="24"/>
+          <w:szCs w:val="24"/>
+          <w:rtl/>
+        </w:rPr>
+        <w:t xml:space="preserve">האמצעי המרכזי הוא הפער בין שני רבדים של דיבור. החמור מדבר בלשון האל, בפסוקים של הבריאה, של הנקמה ושל מתן החוקים, והאריה עונה לו בשאלות שהאל שאל את איוב. ההגזמה של החמור נמדדת בפסוקיו: הוא מייחס לעצמו את "מן גערתך ינוסון" ואת "ואלה המשפטים". תשובת האריה קצרה, ובה שתי הגדרות ושאלה אחת: "בזוי ושפל וקשה ערף / התצוד ללביא טרף". השאלה הרטורית של איוב לח, שבמקור מזכירה לאדם שאינו יכול לצוד לאריה, מזכירה לחמור אותו הדבר. גם כאן, כמו במשל מז, המשלב הנבואי נותן לתשובה תוקף שאין למשל האיזופי.</w:t>
+      </w:r>
+    </w:p>
+    <w:p>
+      <w:pPr>
+        <w:bidi/>
+        <w:spacing w:after="120" w:before="0" w:line="360"/>
+        <w:jc w:val="both"/>
+      </w:pPr>
+      <w:r>
+        <w:rPr>
+          <w:rFonts w:ascii="Times New Roman" w:cs="David" w:eastAsia="David" w:hAnsi="Times New Roman"/>
+          <w:i w:val="false"/>
+          <w:iCs w:val="false"/>
+          <w:sz w:val="24"/>
+          <w:szCs w:val="24"/>
+          <w:rtl/>
+        </w:rPr>
+        <w:t xml:space="preserve">אמצעי שלישי הוא האירוניה של המונולוג הפנימי. החמור מפרש הזמנה כמינוי, "אותי בחר אין זר אתו", ואת ההזמנה לצעוק כהוכחה שהוא נחוץ. הקורא רואה את הפרשנות מתנפחת מן ההזמנה הראשונה ועד "משנה למלך", ורואה בו זמנית את הפסוק של המן שתלוי מעליה. ברכיה אינו מפרש. הוא מניח את "למי יחפץ המלך" ומשאיר לקורא לזכור מה קרה למי שחשב כך.</w:t>
+      </w:r>
+    </w:p>
+    <w:p>
+      <w:pPr>
+        <w:pStyle w:val="Heading2"/>
+        <w:keepNext/>
+        <w:bidi/>
+        <w:spacing w:after="120" w:before="240" w:line="360"/>
+        <w:jc w:val="start"/>
+      </w:pPr>
+      <w:r>
+        <w:rPr>
+          <w:rFonts w:ascii="Times New Roman" w:cs="David" w:eastAsia="David" w:hAnsi="Times New Roman"/>
+          <w:b/>
+          <w:bCs/>
+          <w:i w:val="false"/>
+          <w:iCs w:val="false"/>
+          <w:sz w:val="28"/>
+          <w:szCs w:val="28"/>
+          <w:rtl/>
+        </w:rPr>
+        <w:t xml:space="preserve">6.4 הקשר בין המשל לנמשל</w:t>
+      </w:r>
+    </w:p>
+    <w:p>
+      <w:pPr>
+        <w:bidi/>
+        <w:spacing w:after="120" w:before="0" w:line="360"/>
+        <w:jc w:val="both"/>
+      </w:pPr>
+      <w:r>
+        <w:rPr>
+          <w:rFonts w:ascii="Times New Roman" w:cs="David" w:eastAsia="David" w:hAnsi="Times New Roman"/>
+          <w:i w:val="false"/>
+          <w:iCs w:val="false"/>
+          <w:sz w:val="24"/>
+          <w:szCs w:val="24"/>
+          <w:rtl/>
+        </w:rPr>
+        <w:t xml:space="preserve">הנמשל שונה משלושת הנמשלים הקודמים בנקודה אחת חשובה: הוא פותח בנכבד ולא בבזוי. "והמשל באיש נכבד אשר יקרב בזוי ונקלה", ורק אחר כך בא הבזוי המתגאה. האחריות מונחת קודם על מי שקירב. במשל זה האריה, שקרא לחמור, שהזמין אותו לרעום, ושבסוף מתבייש בו. הקשר בין המשל לנמשל הדוק: כמו במשל, גם בנמשל הגאווה "תצמח ותגלה" מתוך הקרבה, וכמו במשל, סופה בלשון מדברת גדולות, "כזאת וכזאת עשיתי". החמור אכן אומר "כזאת וכזאת": "ואפחיד הבהמות ואוריד לארץ נצחם".</w:t>
+      </w:r>
+    </w:p>
+    <w:p>
+      <w:pPr>
+        <w:bidi/>
+        <w:spacing w:after="120" w:before="0" w:line="360"/>
+        <w:jc w:val="both"/>
+      </w:pPr>
+      <w:r>
+        <w:rPr>
+          <w:rFonts w:ascii="Times New Roman" w:cs="David" w:eastAsia="David" w:hAnsi="Times New Roman"/>
+          <w:i w:val="false"/>
+          <w:iCs w:val="false"/>
+          <w:sz w:val="24"/>
+          <w:szCs w:val="24"/>
+          <w:rtl/>
+        </w:rPr>
+        <w:t xml:space="preserve">אבל יש פער אחד בין המשל לנמשל, והוא מעניין. הנמשל מסתיים בהמלצה על שתיקה: "שתיקת הכסיל היא תשובתו". האריה של המשל אינו שותק. הוא עונה, ותשובתו היא בוז ואיום. אפשר לומר שברכיה מציע בנמשל את מה שהאריה היה צריך לעשות, ואפשר לומר שבמשל האריה מגלם את הנכבד שטעה פעמיים: קירב את הבזוי ואחר כך ענה לו. כך או כך, הנמשל מוסיף על המשל שיפוט מוסרי גם על החזק, וזה חידוש לעומת המקור הלטיני, שבו האריה צודק בלבד. התכונה שהחמור מייצג היא גאוות הקול, ההתפארות במה שאינו כלום, ובעומקה שוב אי־ידיעת השפלות: "ולא יכיר את שפלותו", כלשון הנמשל, לעומת "מכיר מקומו" שבחרוז הפותח.</w:t>
+      </w:r>
+    </w:p>
+    <w:p>
+      <w:pPr>
+        <w:pStyle w:val="Heading1"/>
+        <w:keepNext/>
+        <w:pageBreakBefore/>
+        <w:bidi/>
+        <w:spacing w:after="360" w:before="0" w:line="360"/>
+        <w:jc w:val="center"/>
+      </w:pPr>
+      <w:r>
+        <w:rPr>
+          <w:rFonts w:ascii="Times New Roman" w:cs="David" w:eastAsia="David" w:hAnsi="Times New Roman"/>
+          <w:b/>
+          <w:bCs/>
+          <w:i w:val="false"/>
+          <w:iCs w:val="false"/>
+          <w:sz w:val="32"/>
+          <w:szCs w:val="32"/>
+          <w:rtl/>
+        </w:rPr>
+        <w:t xml:space="preserve">פרק 7: סיכום ומסקנות</w:t>
+      </w:r>
+    </w:p>
+    <w:p>
+      <w:pPr>
+        <w:bidi/>
+        <w:spacing w:after="120" w:before="0" w:line="360"/>
+        <w:jc w:val="both"/>
+      </w:pPr>
+      <w:r>
+        <w:rPr>
+          <w:rFonts w:ascii="Times New Roman" w:cs="David" w:eastAsia="David" w:hAnsi="Times New Roman"/>
+          <w:i w:val="false"/>
+          <w:iCs w:val="false"/>
+          <w:sz w:val="24"/>
+          <w:szCs w:val="24"/>
+          <w:rtl/>
+        </w:rPr>
+        <w:t xml:space="preserve">העבודה שאלה מהי התכונה שהחמור מייצג במשליו של ברכיה הנקדן, וכיצד נבנה הקשר בין המשל לנמשל. לארבעת המשלים ארבעה חרוזים פותחים שונים: זלזול בקטן, גאווה בלי חוכמה, קנאה, אי־הכרת המקום. אבל בארבעתם החמור עושה אותו הדבר: הוא מנסה להיות מה שאינו. שליט שאינו חושש מצרעה, אריה, כלב חיק, משנה למלך. בארבעתם הכישלון בא מן הגוף, מן האוזן שאי אפשר לסתום, מן האוזניים שמציצות מעור האריה, מן הגוף הכבד שנופל על האדון, מן הקול שאינו אלא נעירה. ובארבעתם הסוף הוא חזרה למקום: עבדות, משא כפול, אבוס, ובמשל סה, ברמז, שיני האריה. החמור של ברכיה אינו הכסיל של איזופוס. הוא מי שאינו יודע את מקומו, וברכיה מרחיק לכת ומסביר, דרך השיבוצים, שאי־ידיעת המקום היא חטא: "לא ידע" של ישעיהו, "דע מאין באת" של עקביא.</w:t>
+      </w:r>
+    </w:p>
+    <w:p>
+      <w:pPr>
+        <w:bidi/>
+        <w:spacing w:after="120" w:before="0" w:line="360"/>
+        <w:jc w:val="both"/>
+      </w:pPr>
+      <w:r>
+        <w:rPr>
+          <w:rFonts w:ascii="Times New Roman" w:cs="David" w:eastAsia="David" w:hAnsi="Times New Roman"/>
+          <w:i w:val="false"/>
+          <w:iCs w:val="false"/>
+          <w:sz w:val="24"/>
+          <w:szCs w:val="24"/>
+          <w:rtl/>
+        </w:rPr>
+        <w:t xml:space="preserve">הקשר בין המשל לנמשל נבנה בשלוש דרכים. הראשונה גלויה: הנמשל מתרגם את סיפור החיות ללשון החברה, לגדול ולקטן, לבן בלי שם ולמכבדיו, לאיש שרוצה למשול. השנייה היא השיבוץ, וזו הדרך העיקרית. הפסוקים שברכיה שם בפי החמור ובפי סובביו מציבים מאחוריו דמויות מקראיות שסופן ידוע: אמציה שאמר "נתראה פנים", רחבעם שאמר "קטני עבה ממתני", אדוניה שאמר "אני אמלך", המן שאמר "למי יחפץ המלך", נגיד צור, אדום, ארז אשור, בנות ציון נטויות הגרון. הקורא המשכיל קורא את הסוף בפסוק לפני שהסיפור מגיע אליו, והנמשל רק מאשר. במובן זה השיבוץ אצל ברכיה הוא אמצעי של הטרמה, לא של קישוט. השלישית היא השיר החותם, שמוסיף על הנמשל דוגמה מקראית מפורשת, שאול ואתונותיו, ובכך קושר את משל החיות למשל שלמה ולסיפור המקראי.</w:t>
+      </w:r>
+    </w:p>
+    <w:p>
+      <w:pPr>
+        <w:bidi/>
+        <w:spacing w:after="120" w:before="0" w:line="360"/>
+        <w:jc w:val="both"/>
+      </w:pPr>
+      <w:r>
+        <w:rPr>
+          <w:rFonts w:ascii="Times New Roman" w:cs="David" w:eastAsia="David" w:hAnsi="Times New Roman"/>
+          <w:i w:val="false"/>
+          <w:iCs w:val="false"/>
+          <w:sz w:val="24"/>
+          <w:szCs w:val="24"/>
+          <w:rtl/>
+        </w:rPr>
+        <w:t xml:space="preserve">העבודה העלתה גם ממצא שלא צפיתי בתחילתה. במשלים מז, יד ו-סה מסתתר מתחת לנמשל החברתי רובד תיאולוגי: האדון מדבר בלשון הנביאים, החמור "הולך בקרי" ו"לוקח כפליים", בני הבית מכים אותו במילים שנאמרו לשטן על איוב, והאריה שואל אותו את שאלות ה' לאיוב מן הסערה. הנמשל אינו מזכיר דבר מכל זה. ברכיה כותב אפוא בשתי שכבות: שכבה לכל קורא, שבה גאווה נענשת, ושכבה למי שיודע את הפסוקים, שבה מרד באדון הוא מרד בסדר שקבע האדון העליון. אפשר לקשור זאת להקדמת הספר, שבה תלונתו של ברכיה על דורו היא בו זמנית חברתית ודתית.</w:t>
+      </w:r>
+    </w:p>
+    <w:p>
+      <w:pPr>
+        <w:bidi/>
+        <w:spacing w:after="120" w:before="0" w:line="360"/>
+        <w:jc w:val="both"/>
+      </w:pPr>
+      <w:r>
+        <w:rPr>
+          <w:rFonts w:ascii="Times New Roman" w:cs="David" w:eastAsia="David" w:hAnsi="Times New Roman"/>
+          <w:i w:val="false"/>
+          <w:iCs w:val="false"/>
+          <w:sz w:val="24"/>
+          <w:szCs w:val="24"/>
+          <w:rtl/>
+        </w:rPr>
+        <w:t xml:space="preserve">ממצא נוסף נוגע לאוזן ולשמיעה. בשלושה מן המשלים האוזן של החמור היא מרכז: צרעה נכנסת בה, היא מציצה מעור האריה, והחמור מלקק את אדוניו "סביב אזניו". האריה אומר לחמור "האזן", ובמשל סה החמור רוצה רק "להשמיע" ומתבשר ש"מקולך לא יענה". החמור, שסימנו הגופני הוא האוזן הגדולה, הוא בעל החיים שאינו שומע ושאיש אינו רוצה לשמוע. ישעיהו אמר שהחמור יודע ועמי לא התבונן; ברכיה, שהיה נקדן ואיש של פסוקים, לוקח את החמור היודע של ישעיהו ועושה אותו לעם שאינו מתבונן.</w:t>
+      </w:r>
+    </w:p>
+    <w:p>
+      <w:pPr>
+        <w:bidi/>
+        <w:spacing w:after="120" w:before="0" w:line="360"/>
+        <w:jc w:val="both"/>
+      </w:pPr>
+      <w:r>
+        <w:rPr>
+          <w:rFonts w:ascii="Times New Roman" w:cs="David" w:eastAsia="David" w:hAnsi="Times New Roman"/>
+          <w:i w:val="false"/>
+          <w:iCs w:val="false"/>
+          <w:sz w:val="24"/>
+          <w:szCs w:val="24"/>
+          <w:rtl/>
+        </w:rPr>
+        <w:t xml:space="preserve">מבחינת ההשוואה למקורות, המסקנה היא שברכיה שינה את התכונה. החמור האיזופי טיפש; החמור של ברכיה גאה. זה עולה בקנה אחד עם מה שהראה שורצבוים על דרכו של ברכיה להוסיף לכל משל ממד מוסרי, ועם מה שיסיף מתאר כדרכו של המשל העברי לקבע לכל חיה תכונה אחת. אלא שאצל ברכיה התכונה אינה מקובעת אלא מנומקת: החמור גאה מפני שאינו יודע מי הוא. יש להוסיף שהאריה מופיע בשלושה מארבעת המשלים, כיועץ, כעור וכמלך, ובכולם הוא קנה המידה שהחמור נמדד בו ונכשל: הוא אינו יכול לעמוד בעצתו, ללבוש את עורו או לצוד בשבילו. הנמשל של משל סה אף מטיל חלק מן האחריות על האריה עצמו, ובכך ברכיה מרחיק לכת מעבר למקורו הלטיני.</w:t>
+      </w:r>
+    </w:p>
+    <w:p>
+      <w:pPr>
+        <w:bidi/>
+        <w:spacing w:after="120" w:before="0" w:line="360"/>
+        <w:jc w:val="both"/>
+      </w:pPr>
+      <w:r>
+        <w:rPr>
+          <w:rFonts w:ascii="Times New Roman" w:cs="David" w:eastAsia="David" w:hAnsi="Times New Roman"/>
+          <w:i w:val="false"/>
+          <w:iCs w:val="false"/>
+          <w:sz w:val="24"/>
+          <w:szCs w:val="24"/>
+          <w:rtl/>
+        </w:rPr>
+        <w:t xml:space="preserve">העבודה מוגבלת בכמה מובנים, וכל אחד מהם פותח כיוון להמשך. נותחו ארבעה משלים בלבד, ובמשלי שועלים יש חמורים נוספים. ההשוואה למארי דה פראנס נעשתה על פי תוכן ולא על פי הטקסט הצרפתי, ובדיקה צמודה של הנוסח יכולה להראות מה בדיוק שינה ברכיה. ולבסוף, השימוש החוזר ביחזקאל לא ובנאום אשור בישעיהו י בשלושה נמשלים מעלה שאלה רחבה יותר: האם יש לברכיה "פסוקי בית" קבועים לכל תכונה, שחוזרים לאורך הספר. בדיקה של כלל הנמשלים בספר לפי מקורותיהם המקראיים היא המחקר הבא שהעבודה הזאת מציעה.</w:t>
       </w:r>
     </w:p>
     <w:p>
@@ -6331,6 +7254,85 @@
           <w:rtl/>
         </w:rPr>
         <w:t xml:space="preserve">וָאֶשָּׂא מְשָׁלִי וָאֹמַר: לִפְנֵי שֵׁבֶר אִישׁ דְּרָכָיו מְעַקֵּשׁ / לִפְנֵי כָבוֹד שִׁפְלוּת לוֹ לְמוֹקֵשׁ / נָא זְכֹר מִי מָצָא מְלוּכָה וְנִבָּא / כַּאֲשֶׁר שָׁב מִן הָאֲתוֹנוֹת לְבַקֵּשׁ.</w:t>
+      </w:r>
+    </w:p>
+    <w:p>
+      <w:pPr>
+        <w:pStyle w:val="Heading2"/>
+        <w:keepNext/>
+        <w:bidi/>
+        <w:spacing w:after="120" w:before="240" w:line="360"/>
+        <w:jc w:val="start"/>
+      </w:pPr>
+      <w:r>
+        <w:rPr>
+          <w:rFonts w:ascii="Times New Roman" w:cs="David" w:eastAsia="David" w:hAnsi="Times New Roman"/>
+          <w:b/>
+          <w:bCs/>
+          <w:i w:val="false"/>
+          <w:iCs w:val="false"/>
+          <w:sz w:val="28"/>
+          <w:szCs w:val="28"/>
+          <w:rtl/>
+        </w:rPr>
+        <w:t xml:space="preserve">נספח ד: משל סה: אריה וחמור</w:t>
+      </w:r>
+    </w:p>
+    <w:p>
+      <w:pPr>
+        <w:bidi/>
+        <w:spacing w:after="200" w:before="0" w:line="300"/>
+        <w:ind w:start="709" w:end="709"/>
+        <w:jc w:val="both"/>
+      </w:pPr>
+      <w:r>
+        <w:rPr>
+          <w:rFonts w:ascii="Times New Roman" w:cs="David" w:eastAsia="David" w:hAnsi="Times New Roman"/>
+          <w:i w:val="false"/>
+          <w:iCs w:val="false"/>
+          <w:sz w:val="24"/>
+          <w:szCs w:val="24"/>
+          <w:rtl/>
+        </w:rPr>
+        <w:t xml:space="preserve">אִישׁ אֲשֶׁר מַכִּיר מְקוֹמוֹ / תִּגָּלֶה עֶרְוָתוֹ וְלִבּוֹ בַּל עִמּוֹ</w:t>
+      </w:r>
+    </w:p>
+    <w:p>
+      <w:pPr>
+        <w:bidi/>
+        <w:spacing w:after="200" w:before="0" w:line="300"/>
+        <w:ind w:start="709" w:end="709"/>
+        <w:jc w:val="both"/>
+      </w:pPr>
+      <w:r>
+        <w:rPr>
+          <w:rFonts w:ascii="Times New Roman" w:cs="David" w:eastAsia="David" w:hAnsi="Times New Roman"/>
+          <w:i w:val="false"/>
+          <w:iCs w:val="false"/>
+          <w:sz w:val="24"/>
+          <w:szCs w:val="24"/>
+          <w:rtl/>
+        </w:rPr>
+        <w:t xml:space="preserve">אַרְיֵה קָרָא לַחֲמוֹר לְהַרְאוֹתוֹ / אֶת יְקָר תִּפְאֶרֶת גְּדֻלָּתוֹ / וַיִּתְגָּאֶה הַחֲמוֹר בְּלִבּוֹ לֵאמֹר: מִי כָמוֹנִי / לְמִי יַחְפֹּץ הַמֶּלֶךְ לַעֲשׂוֹת יְקָר יוֹתֵר מִמֶּנִּי / בַּאֲשֶׁר אֲנִי לַחֲבוּרָתוֹ הוֹלֵךְ / וְעַתָּה יִקְרְאוּ לִי מִשְׁנֶה לַמֶּלֶךְ / כִּי שָׂמָנִי אֶל מִשְׁמַעְתּוֹ / אֹתִי בָחַר אֵין זָר אִתּוֹ / וַיֹּאמֶר לָאַרְיֵה: הִנֵּה עַל הַבְּהֵמוֹת אֶתֵּן חִתִּיתִי / מִקּוֹלִי יֵחָפְזוּן וְיָנוּסוּ מִגַּעֲרָתִי / וַיַּעַן הָאֲרִי: אַתָּה תַשְׂגִּיא פָעֳלֶךָ / לְהַשְׁמִיעַ בַּמָּרוֹם קוֹלֶךָ / וְנֵצֵא לִשְׁלֹל שָׁלָל רָב / וּפָנֶיךָ הֹלְכִים בַּקְּרָב / אַתָּה תִשְׁאַג וַאֲנִי אֶטְרֹף / תֹּאחֵז טֶרֶף וַאֲנִי אֶעֱרֹף / וַיֵּצְאוּ הַשָּׂדֶה וַיִּמְצְאוּ צֹאן וּבָקָר זְכָרִים / וַיָּשִׂימוּ מְגַמַּת פְּנֵיהֶם לִטְרֹף וּלְהַחֲרִים / וַיֹּאמֶר הָאֲרִי: הֲמוֹן קוֹלְךָ הַשְׁמִיעֵם / וּבְקוֹל כָּמוֹנִי תַּרְעֵם / וְהִנֵּה בְּקוֹלוֹ הַחֲמוֹר נֹעֵר / וְהַקּוֹל בְּמַחֲנֵיהֶם הֹלֵךְ וְסֹעֵר / וַתְּפוּצֶינָה בְקוֹלוֹ הָרְחֵלִים / מִשֵּׂתוֹ יָגוּרוּ אֵילִים / וַיְהִי לְחֶרְדַּת הַמַּחֲנֶה אֲשֶׁר הֹלֵךְ עַל אַרְבַּע / וּבְהַפְנוֹתָם לָנוּס וַיִּטְרֹף בָּם הָאֲרִי וַיֹּאכַל וַיִּשְׂבַּע / וַיָּנוּסוּ אָנֶה וְאָנָה לְקוֹל הֲמֻלּוֹת גְּדוֹלוֹת / וַיֹּאמֶר הָאֲרִי: אַל תַּשְׁמִיעַ עוֹד קוֹלְךָ וְרַב מִהְיֹת קוֹלוֹת / וַיְהִי כַאֲשֶׁר לִטְרֹף כִּלָּה / וְהַחֲמוֹר וְהָאַרְיֵה עֹמְדִים אֵצֶל הַנְּבֵלָה / וַיֹּאמֶר הַחֲמוֹר: הֲלֹא שָׁמַעְתָּ הוֹד נַחֲרִי / וְרָאִיתָ כִּי רַעְמָה לָבוּשׁ צַוָּארִי / בְּחָכְמָתְךָ אֹתִי תִבְחַר / וְהָיָה כָזֶה יוֹם מָחָר / וְאַפְחִיד הַבְּהֵמוֹת וְאוֹרִיד לָאָרֶץ נִצְחָם / וְלַמֶּלֶךְ אֵין שֹׁוֶה לְהַנִּיחָם / לֹא מֵהֶם וְלֹא מֶהֱמֵהֶם / וְאֵלֶּה הַמִּשְׁפָּטִים אֲשֶׁר תָּשִׂים לִפְנֵיהֶם / מִגַּעֲרָתִי יְנוּסוּן וְיֵחַתּוּ מִמֶּנּוּ / נַגְבִּיר שְׂפָתֵנוּ אִתָּנוּ מִי אָדוֹן לָנוּ / שְׁמָעֵנִי אֲדֹנִי הַמֶּלֶךְ / הֲלוֹא דְבָרַי יֵיטִיבוּ עִם הַיָּשָׁר הֹלֵךְ / וַיַּעַן לוֹ הָאֲרִי: הַמַּכִּיר תּוֹלַדְתְּךָ מִמַּעַל וּמִתָּחַת / מִקּוֹלְךָ לֹא יַעֲנֶה וּמֵהֲמוֹנְךָ לֹא יֵחָת / בָּזוּי וְשָׁפָל וּקְשֵׁה עֹרֶף / הֲתָצוּד לַלָּבִיא טֶרֶף / עוֹד יֹאמְרוּ בְאָזְנַי בְּנֵי שִׁכֻּלַי לֵאמֹר / אֵיךְ טָרַפְתָּ בַּצֹּאן וְלֹא שִׁבַּרְתָּ אֶת הַחֲמוֹר.</w:t>
+      </w:r>
+    </w:p>
+    <w:p>
+      <w:pPr>
+        <w:bidi/>
+        <w:spacing w:after="200" w:before="0" w:line="300"/>
+        <w:ind w:start="709" w:end="709"/>
+        <w:jc w:val="both"/>
+      </w:pPr>
+      <w:r>
+        <w:rPr>
+          <w:rFonts w:ascii="Times New Roman" w:cs="David" w:eastAsia="David" w:hAnsi="Times New Roman"/>
+          <w:i w:val="false"/>
+          <w:iCs w:val="false"/>
+          <w:sz w:val="24"/>
+          <w:szCs w:val="24"/>
+          <w:rtl/>
+        </w:rPr>
+        <w:t xml:space="preserve">וְהַמָּשָׁל בְּאִישׁ נִכְבָּד אֲשֶׁר יְקָרֵב בָּזוּי וְנִקְלֶה / וְרוּחַ גְּאוֹנוֹ תִּצְמַח וְתִגָּלֶה / לְהִתְגָּאוֹת עַל חֶבְרָתוֹ / וְלֹא יַכִּיר אֶת שִׁפְלוּתוֹ / וּזְדוֹן לִבּוֹ בְהִתְגַּלּוֹת / לָשׁוֹן מְדַבֶּרֶת גְּדוֹלוֹת / בְּחָכְמָתִי כִּי נְבוּנוֹתִי / כָּזֹאת וְכָזֹאת עָשִׂיתִי / וְאָמַר הֶחָכָם בְּחָכְמָתוֹ / שְׁתִיקַת הַכְּסִיל הִיא תְשׁוּבָתוֹ.</w:t>
       </w:r>
     </w:p>
     <w:sectPr>
@@ -7606,6 +8608,150 @@
           <w:rtl/>
         </w:rPr>
         <w:t xml:space="preserve">, הקדמת המחבר, מהדורת הברמן [לוודא עמודים וציטוט מדויק].</w:t>
+      </w:r>
+    </w:p>
+  </w:footnote>
+  <w:footnote w:id="21">
+    <w:p>
+      <w:pPr>
+        <w:bidi/>
+        <w:spacing w:after="60" w:line="240"/>
+        <w:jc w:val="both"/>
+      </w:pPr>
+      <w:r>
+        <w:rPr>
+          <w:rStyle w:val="FootnoteReference"/>
+        </w:rPr>
+        <w:footnoteRef/>
+      </w:r>
+      <w:r>
+        <w:rPr>
+          <w:rFonts w:ascii="Times New Roman" w:cs="David" w:eastAsia="David" w:hAnsi="Times New Roman"/>
+          <w:i w:val="false"/>
+          <w:iCs w:val="false"/>
+          <w:sz w:val="20"/>
+          <w:szCs w:val="20"/>
+          <w:rtl/>
+        </w:rPr>
+        <w:t xml:space="preserve">ברכיה הנקדן, </w:t>
+      </w:r>
+      <w:r>
+        <w:rPr>
+          <w:rFonts w:ascii="Times New Roman" w:cs="David" w:eastAsia="David" w:hAnsi="Times New Roman"/>
+          <w:i/>
+          <w:iCs/>
+          <w:sz w:val="20"/>
+          <w:szCs w:val="20"/>
+          <w:rtl/>
+        </w:rPr>
+        <w:t xml:space="preserve">משלי שועלים</w:t>
+      </w:r>
+      <w:r>
+        <w:rPr>
+          <w:rFonts w:ascii="Times New Roman" w:cs="David" w:eastAsia="David" w:hAnsi="Times New Roman"/>
+          <w:i w:val="false"/>
+          <w:iCs w:val="false"/>
+          <w:sz w:val="20"/>
+          <w:szCs w:val="20"/>
+          <w:rtl/>
+        </w:rPr>
+        <w:t xml:space="preserve">, משל סה, מהדורת הברמן [לוודא נוסח החרוז הפותח].</w:t>
+      </w:r>
+    </w:p>
+  </w:footnote>
+  <w:footnote w:id="22">
+    <w:p>
+      <w:pPr>
+        <w:bidi w:val="false"/>
+        <w:spacing w:after="60" w:line="240"/>
+        <w:jc w:val="left"/>
+      </w:pPr>
+      <w:r>
+        <w:rPr>
+          <w:rStyle w:val="FootnoteReference"/>
+        </w:rPr>
+        <w:footnoteRef/>
+      </w:r>
+      <w:r>
+        <w:rPr>
+          <w:rFonts w:ascii="Times New Roman" w:cs="David" w:eastAsia="David" w:hAnsi="Times New Roman"/>
+          <w:i w:val="false"/>
+          <w:iCs w:val="false"/>
+          <w:sz w:val="20"/>
+          <w:szCs w:val="20"/>
+          <w:rtl w:val="false"/>
+        </w:rPr>
+        <w:t xml:space="preserve">Perry, </w:t>
+      </w:r>
+      <w:r>
+        <w:rPr>
+          <w:rFonts w:ascii="Times New Roman" w:cs="David" w:eastAsia="David" w:hAnsi="Times New Roman"/>
+          <w:i/>
+          <w:iCs/>
+          <w:sz w:val="20"/>
+          <w:szCs w:val="20"/>
+          <w:rtl w:val="false"/>
+        </w:rPr>
+        <w:t xml:space="preserve">Babrius and Phaedrus</w:t>
+      </w:r>
+      <w:r>
+        <w:rPr>
+          <w:rFonts w:ascii="Times New Roman" w:cs="David" w:eastAsia="David" w:hAnsi="Times New Roman"/>
+          <w:i w:val="false"/>
+          <w:iCs w:val="false"/>
+          <w:sz w:val="20"/>
+          <w:szCs w:val="20"/>
+          <w:rtl w:val="false"/>
+        </w:rPr>
+        <w:t xml:space="preserve">, Phaedrus 1.11; Schwarzbaum, </w:t>
+      </w:r>
+      <w:r>
+        <w:rPr>
+          <w:rFonts w:ascii="Times New Roman" w:cs="David" w:eastAsia="David" w:hAnsi="Times New Roman"/>
+          <w:i/>
+          <w:iCs/>
+          <w:sz w:val="20"/>
+          <w:szCs w:val="20"/>
+          <w:rtl w:val="false"/>
+        </w:rPr>
+        <w:t xml:space="preserve">Mishle Shu'alim</w:t>
+      </w:r>
+      <w:r>
+        <w:rPr>
+          <w:rFonts w:ascii="Times New Roman" w:cs="David" w:eastAsia="David" w:hAnsi="Times New Roman"/>
+          <w:i w:val="false"/>
+          <w:iCs w:val="false"/>
+          <w:sz w:val="20"/>
+          <w:szCs w:val="20"/>
+          <w:rtl/>
+        </w:rPr>
+        <w:t xml:space="preserve">, בדיון על משל סה [לוודא עמודים].</w:t>
+      </w:r>
+    </w:p>
+  </w:footnote>
+  <w:footnote w:id="23">
+    <w:p>
+      <w:pPr>
+        <w:bidi/>
+        <w:spacing w:after="60" w:line="240"/>
+        <w:jc w:val="both"/>
+      </w:pPr>
+      <w:r>
+        <w:rPr>
+          <w:rStyle w:val="FootnoteReference"/>
+        </w:rPr>
+        <w:footnoteRef/>
+      </w:r>
+      <w:r>
+        <w:rPr>
+          <w:rFonts w:ascii="Times New Roman" w:cs="David" w:eastAsia="David" w:hAnsi="Times New Roman"/>
+          <w:i w:val="false"/>
+          <w:iCs w:val="false"/>
+          <w:sz w:val="20"/>
+          <w:szCs w:val="20"/>
+          <w:rtl/>
+        </w:rPr>
+        <w:t xml:space="preserve">השווה משלי יז, כח. את מקור הפתגם המדויק יש לבדוק בספרות המוסר של ימי הביניים, כגון "מבחר הפנינים" [לוודא].</w:t>
       </w:r>
     </w:p>
   </w:footnote>

</xml_diff>

<commit_message>
Add section on Christian, Muslim and folklore sources for the donkey
New subsection 1.4 covering Pseudo-Matthew, Isidore, the bestiary,
the Feast of the Ass, the Quran, Juha and Grimm, with matching
bibliography entries; corpus table renumbered to 1.5.

Co-Authored-By: Claude Fable 5.1 <noreply@anthropic.com>
Claude-Session: https://claude.ai/code/session_01LePeB11iN6PJ4Nt39a92mY
</commit_message>
<xml_diff>
--- a/seminar/seminar-donkey-fables.docx
+++ b/seminar/seminar-donkey-fables.docx
@@ -387,7 +387,7 @@
           <w:szCs w:val="24"/>
           <w:rtl/>
         </w:rPr>
-        <w:t xml:space="preserve">1.4 קורפוס משלי החמור: סיכום</w:t>
+        <w:t xml:space="preserve">1.4 החמור במקורות הנוצריים והמוסלמיים ובפולקלור</w:t>
       </w:r>
       <w:r>
         <w:rPr>
@@ -405,30 +405,31 @@
           <w:tab w:val="right" w:pos="9072" w:leader="dot"/>
         </w:tabs>
         <w:bidi/>
-        <w:spacing w:after="0" w:before="100" w:line="276"/>
+        <w:spacing w:after="0" w:before="0" w:line="276"/>
+        <w:ind w:start="567"/>
         <w:jc w:val="start"/>
       </w:pPr>
       <w:r>
         <w:rPr>
           <w:rFonts w:ascii="Times New Roman" w:cs="David" w:eastAsia="David" w:hAnsi="Times New Roman"/>
-          <w:b/>
-          <w:bCs/>
-          <w:i w:val="false"/>
-          <w:iCs w:val="false"/>
-          <w:sz w:val="24"/>
-          <w:szCs w:val="24"/>
-          <w:rtl/>
-        </w:rPr>
-        <w:t xml:space="preserve">פרק 2: היוצר, הספר וההקדמה</w:t>
-      </w:r>
-      <w:r>
-        <w:rPr>
-          <w:rFonts w:ascii="Times New Roman" w:cs="David" w:eastAsia="David" w:hAnsi="Times New Roman"/>
-          <w:sz w:val="24"/>
-          <w:szCs w:val="24"/>
-          <w:rtl/>
-        </w:rPr>
-        <w:t xml:space="preserve">	6</w:t>
+          <w:b w:val="false"/>
+          <w:bCs w:val="false"/>
+          <w:i w:val="false"/>
+          <w:iCs w:val="false"/>
+          <w:sz w:val="24"/>
+          <w:szCs w:val="24"/>
+          <w:rtl/>
+        </w:rPr>
+        <w:t xml:space="preserve">1.5 קורפוס משלי החמור: סיכום</w:t>
+      </w:r>
+      <w:r>
+        <w:rPr>
+          <w:rFonts w:ascii="Times New Roman" w:cs="David" w:eastAsia="David" w:hAnsi="Times New Roman"/>
+          <w:sz w:val="24"/>
+          <w:szCs w:val="24"/>
+          <w:rtl/>
+        </w:rPr>
+        <w:t xml:space="preserve">	5</w:t>
       </w:r>
     </w:p>
     <w:p>
@@ -437,6 +438,38 @@
           <w:tab w:val="right" w:pos="9072" w:leader="dot"/>
         </w:tabs>
         <w:bidi/>
+        <w:spacing w:after="0" w:before="100" w:line="276"/>
+        <w:jc w:val="start"/>
+      </w:pPr>
+      <w:r>
+        <w:rPr>
+          <w:rFonts w:ascii="Times New Roman" w:cs="David" w:eastAsia="David" w:hAnsi="Times New Roman"/>
+          <w:b/>
+          <w:bCs/>
+          <w:i w:val="false"/>
+          <w:iCs w:val="false"/>
+          <w:sz w:val="24"/>
+          <w:szCs w:val="24"/>
+          <w:rtl/>
+        </w:rPr>
+        <w:t xml:space="preserve">פרק 2: היוצר, הספר וההקדמה</w:t>
+      </w:r>
+      <w:r>
+        <w:rPr>
+          <w:rFonts w:ascii="Times New Roman" w:cs="David" w:eastAsia="David" w:hAnsi="Times New Roman"/>
+          <w:sz w:val="24"/>
+          <w:szCs w:val="24"/>
+          <w:rtl/>
+        </w:rPr>
+        <w:t xml:space="preserve">	7</w:t>
+      </w:r>
+    </w:p>
+    <w:p>
+      <w:pPr>
+        <w:tabs>
+          <w:tab w:val="right" w:pos="9072" w:leader="dot"/>
+        </w:tabs>
+        <w:bidi/>
         <w:spacing w:after="0" w:before="0" w:line="276"/>
         <w:ind w:start="567"/>
         <w:jc w:val="start"/>
@@ -461,7 +494,7 @@
           <w:szCs w:val="24"/>
           <w:rtl/>
         </w:rPr>
-        <w:t xml:space="preserve">	6</w:t>
+        <w:t xml:space="preserve">	7</w:t>
       </w:r>
     </w:p>
     <w:p>
@@ -494,7 +527,7 @@
           <w:szCs w:val="24"/>
           <w:rtl/>
         </w:rPr>
-        <w:t xml:space="preserve">	6</w:t>
+        <w:t xml:space="preserve">	7</w:t>
       </w:r>
     </w:p>
     <w:p>
@@ -527,7 +560,7 @@
           <w:szCs w:val="24"/>
           <w:rtl/>
         </w:rPr>
-        <w:t xml:space="preserve">	7</w:t>
+        <w:t xml:space="preserve">	8</w:t>
       </w:r>
     </w:p>
     <w:p>
@@ -560,7 +593,7 @@
           <w:szCs w:val="24"/>
           <w:rtl/>
         </w:rPr>
-        <w:t xml:space="preserve">	7</w:t>
+        <w:t xml:space="preserve">	8</w:t>
       </w:r>
     </w:p>
     <w:p>
@@ -592,7 +625,7 @@
           <w:szCs w:val="24"/>
           <w:rtl/>
         </w:rPr>
-        <w:t xml:space="preserve">	9</w:t>
+        <w:t xml:space="preserve">	10</w:t>
       </w:r>
     </w:p>
     <w:p>
@@ -625,7 +658,7 @@
           <w:szCs w:val="24"/>
           <w:rtl/>
         </w:rPr>
-        <w:t xml:space="preserve">	9</w:t>
+        <w:t xml:space="preserve">	10</w:t>
       </w:r>
     </w:p>
     <w:p>
@@ -658,7 +691,7 @@
           <w:szCs w:val="24"/>
           <w:rtl/>
         </w:rPr>
-        <w:t xml:space="preserve">	9</w:t>
+        <w:t xml:space="preserve">	10</w:t>
       </w:r>
     </w:p>
     <w:p>
@@ -691,7 +724,7 @@
           <w:szCs w:val="24"/>
           <w:rtl/>
         </w:rPr>
-        <w:t xml:space="preserve">	10</w:t>
+        <w:t xml:space="preserve">	11</w:t>
       </w:r>
     </w:p>
     <w:p>
@@ -724,7 +757,7 @@
           <w:szCs w:val="24"/>
           <w:rtl/>
         </w:rPr>
-        <w:t xml:space="preserve">	11</w:t>
+        <w:t xml:space="preserve">	12</w:t>
       </w:r>
     </w:p>
     <w:p>
@@ -756,7 +789,7 @@
           <w:szCs w:val="24"/>
           <w:rtl/>
         </w:rPr>
-        <w:t xml:space="preserve">	12</w:t>
+        <w:t xml:space="preserve">	13</w:t>
       </w:r>
     </w:p>
     <w:p>
@@ -789,7 +822,7 @@
           <w:szCs w:val="24"/>
           <w:rtl/>
         </w:rPr>
-        <w:t xml:space="preserve">	12</w:t>
+        <w:t xml:space="preserve">	13</w:t>
       </w:r>
     </w:p>
     <w:p>
@@ -822,7 +855,7 @@
           <w:szCs w:val="24"/>
           <w:rtl/>
         </w:rPr>
-        <w:t xml:space="preserve">	12</w:t>
+        <w:t xml:space="preserve">	13</w:t>
       </w:r>
     </w:p>
     <w:p>
@@ -855,7 +888,7 @@
           <w:szCs w:val="24"/>
           <w:rtl/>
         </w:rPr>
-        <w:t xml:space="preserve">	13</w:t>
+        <w:t xml:space="preserve">	14</w:t>
       </w:r>
     </w:p>
     <w:p>
@@ -888,7 +921,7 @@
           <w:szCs w:val="24"/>
           <w:rtl/>
         </w:rPr>
-        <w:t xml:space="preserve">	14</w:t>
+        <w:t xml:space="preserve">	15</w:t>
       </w:r>
     </w:p>
     <w:p>
@@ -920,7 +953,7 @@
           <w:szCs w:val="24"/>
           <w:rtl/>
         </w:rPr>
-        <w:t xml:space="preserve">	15</w:t>
+        <w:t xml:space="preserve">	16</w:t>
       </w:r>
     </w:p>
     <w:p>
@@ -953,7 +986,7 @@
           <w:szCs w:val="24"/>
           <w:rtl/>
         </w:rPr>
-        <w:t xml:space="preserve">	15</w:t>
+        <w:t xml:space="preserve">	16</w:t>
       </w:r>
     </w:p>
     <w:p>
@@ -986,7 +1019,7 @@
           <w:szCs w:val="24"/>
           <w:rtl/>
         </w:rPr>
-        <w:t xml:space="preserve">	15</w:t>
+        <w:t xml:space="preserve">	16</w:t>
       </w:r>
     </w:p>
     <w:p>
@@ -1019,7 +1052,7 @@
           <w:szCs w:val="24"/>
           <w:rtl/>
         </w:rPr>
-        <w:t xml:space="preserve">	16</w:t>
+        <w:t xml:space="preserve">	17</w:t>
       </w:r>
     </w:p>
     <w:p>
@@ -1052,7 +1085,7 @@
           <w:szCs w:val="24"/>
           <w:rtl/>
         </w:rPr>
-        <w:t xml:space="preserve">	16</w:t>
+        <w:t xml:space="preserve">	17</w:t>
       </w:r>
     </w:p>
     <w:p>
@@ -1084,7 +1117,7 @@
           <w:szCs w:val="24"/>
           <w:rtl/>
         </w:rPr>
-        <w:t xml:space="preserve">	18</w:t>
+        <w:t xml:space="preserve">	19</w:t>
       </w:r>
     </w:p>
     <w:p>
@@ -1117,7 +1150,7 @@
           <w:szCs w:val="24"/>
           <w:rtl/>
         </w:rPr>
-        <w:t xml:space="preserve">	18</w:t>
+        <w:t xml:space="preserve">	19</w:t>
       </w:r>
     </w:p>
     <w:p>
@@ -1150,7 +1183,7 @@
           <w:szCs w:val="24"/>
           <w:rtl/>
         </w:rPr>
-        <w:t xml:space="preserve">	18</w:t>
+        <w:t xml:space="preserve">	19</w:t>
       </w:r>
     </w:p>
     <w:p>
@@ -1183,7 +1216,7 @@
           <w:szCs w:val="24"/>
           <w:rtl/>
         </w:rPr>
-        <w:t xml:space="preserve">	20</w:t>
+        <w:t xml:space="preserve">	21</w:t>
       </w:r>
     </w:p>
     <w:p>
@@ -1216,7 +1249,7 @@
           <w:szCs w:val="24"/>
           <w:rtl/>
         </w:rPr>
-        <w:t xml:space="preserve">	20</w:t>
+        <w:t xml:space="preserve">	21</w:t>
       </w:r>
     </w:p>
     <w:p>
@@ -1248,7 +1281,7 @@
           <w:szCs w:val="24"/>
           <w:rtl/>
         </w:rPr>
-        <w:t xml:space="preserve">	21</w:t>
+        <w:t xml:space="preserve">	22</w:t>
       </w:r>
     </w:p>
     <w:p>
@@ -1280,7 +1313,7 @@
           <w:szCs w:val="24"/>
           <w:rtl/>
         </w:rPr>
-        <w:t xml:space="preserve">	23</w:t>
+        <w:t xml:space="preserve">	24</w:t>
       </w:r>
     </w:p>
     <w:p>
@@ -1312,7 +1345,7 @@
           <w:szCs w:val="24"/>
           <w:rtl/>
         </w:rPr>
-        <w:t xml:space="preserve">	25</w:t>
+        <w:t xml:space="preserve">	26</w:t>
       </w:r>
     </w:p>
     <w:p>
@@ -1345,7 +1378,7 @@
           <w:szCs w:val="24"/>
           <w:rtl/>
         </w:rPr>
-        <w:t xml:space="preserve">	25</w:t>
+        <w:t xml:space="preserve">	26</w:t>
       </w:r>
     </w:p>
     <w:p>
@@ -1378,7 +1411,7 @@
           <w:szCs w:val="24"/>
           <w:rtl/>
         </w:rPr>
-        <w:t xml:space="preserve">	25</w:t>
+        <w:t xml:space="preserve">	26</w:t>
       </w:r>
     </w:p>
     <w:p>
@@ -1411,7 +1444,7 @@
           <w:szCs w:val="24"/>
           <w:rtl/>
         </w:rPr>
-        <w:t xml:space="preserve">	26</w:t>
+        <w:t xml:space="preserve">	27</w:t>
       </w:r>
     </w:p>
     <w:p>
@@ -1444,7 +1477,7 @@
           <w:szCs w:val="24"/>
           <w:rtl/>
         </w:rPr>
-        <w:t xml:space="preserve">	26</w:t>
+        <w:t xml:space="preserve">	27</w:t>
       </w:r>
     </w:p>
     <w:p>
@@ -1565,7 +1598,7 @@
           <w:szCs w:val="24"/>
           <w:rtl/>
         </w:rPr>
-        <w:t xml:space="preserve">מבנה העבודה: פרק 1 סוקר את החמור מן הבחינה הזואולוגית, במקורות היהודיים ובמקורות הכלליים, ומציג את קורפוס משלי החמור בימי הביניים. פרק 2 עוסק ביוצר, בספר ובהקדמתו, וסוקר את ארבעת המשלים הנבחרים ואת הנמשל של כל אחד מהם. פרקים 3 עד 6 מנתחים כל משל בנפרד: מבנהו, השיבוצים שבו, הפואטיקה שלו והקשר בין המשל לנמשל. פרק 7 מסכם ומשיב על שאלת המחקר. בנספחים מובאים ארבעת המשלים במלואם.</w:t>
+        <w:t xml:space="preserve">מבנה העבודה: פרק 1 סוקר את החמור מן הבחינה הזואולוגית, במקורות היהודיים, במקורות הכלליים, הנוצריים והמוסלמיים ובפולקלור, ומציג את קורפוס משלי החמור בימי הביניים. פרק 2 עוסק ביוצר, בספר ובהקדמתו, וסוקר את ארבעת המשלים הנבחרים ואת הנמשל של כל אחד מהם. פרקים 3 עד 6 מנתחים כל משל בנפרד: מבנהו, השיבוצים שבו, הפואטיקה שלו והקשר בין המשל לנמשל. פרק 7 מסכם ומשיב על שאלת המחקר. בנספחים מובאים ארבעת המשלים במלואם.</w:t>
       </w:r>
     </w:p>
     <w:p>
@@ -2170,7 +2203,241 @@
           <w:szCs w:val="28"/>
           <w:rtl/>
         </w:rPr>
-        <w:t xml:space="preserve">1.4 קורפוס משלי החמור: סיכום</w:t>
+        <w:t xml:space="preserve">1.4 החמור במקורות הנוצריים והמוסלמיים ובפולקלור</w:t>
+      </w:r>
+    </w:p>
+    <w:p>
+      <w:pPr>
+        <w:bidi/>
+        <w:spacing w:after="120" w:before="0" w:line="360"/>
+        <w:jc w:val="both"/>
+      </w:pPr>
+      <w:r>
+        <w:rPr>
+          <w:rFonts w:ascii="Times New Roman" w:cs="David" w:eastAsia="David" w:hAnsi="Times New Roman"/>
+          <w:i w:val="false"/>
+          <w:iCs w:val="false"/>
+          <w:sz w:val="24"/>
+          <w:szCs w:val="24"/>
+          <w:rtl/>
+        </w:rPr>
+        <w:t xml:space="preserve">במסורת הנוצרית החמור נוכח בשלוש תמונות מרכזיות, ושלושתן נשענות על המקרא. הראשונה היא האבוס: הבשורות הקנוניות מספרות רק שישוע הושכב באבוס (לוקס ב, ז), אבל הבשורה החיצונית של פסאודו-מתי מוסיפה שור וחמור שכרעו לפניו, וקושרת זאת במפורש לישעיהו א, ג, "ידע שור קנהו וחמור אבוס בעליו".</w:t>
+      </w:r>
+      <w:r>
+        <w:rPr>
+          <w:rStyle w:val="FootnoteReference"/>
+        </w:rPr>
+        <w:footnoteReference w:id="14"/>
+      </w:r>
+      <w:r>
+        <w:rPr>
+          <w:rFonts w:ascii="Times New Roman" w:cs="David" w:eastAsia="David" w:hAnsi="Times New Roman"/>
+          <w:i w:val="false"/>
+          <w:iCs w:val="false"/>
+          <w:sz w:val="24"/>
+          <w:szCs w:val="24"/>
+          <w:rtl/>
+        </w:rPr>
+        <w:t xml:space="preserve"> הפסוק שברכיה הופך במשל מז הוא אפוא גם הפסוק שעומד מאחורי כל תמונת מולד נוצרית בימי הביניים, וקוראיו של ברכיה בצרפת ובאנגליה ראו את השור והחמור האלה בכנסיות. השנייה היא הכניסה לירושלים על חמור (מתי כא, א-ז), המצוטטת מזכריה ט, ט. השלישית היא אתונו של בלעם, שאיגרת פטרוס השנייה (ב, טז) מביאה כדוגמה לבהמה אילמת שהוכיחה נביא. בספרות הטבע של ימי הביניים החמור מוגדר בעיקר כאיטי וכסיל: איזידורוס מסביליה גוזר את שמו הלטיני, </w:t>
+      </w:r>
+      <w:r>
+        <w:rPr>
+          <w:rFonts w:ascii="Times New Roman" w:cs="David" w:eastAsia="David" w:hAnsi="Times New Roman"/>
+          <w:i w:val="false"/>
+          <w:iCs w:val="false"/>
+          <w:sz w:val="24"/>
+          <w:szCs w:val="24"/>
+          <w:rtl w:val="false"/>
+        </w:rPr>
+        <w:t xml:space="preserve">asinus, </w:t>
+      </w:r>
+      <w:r>
+        <w:rPr>
+          <w:rFonts w:ascii="Times New Roman" w:cs="David" w:eastAsia="David" w:hAnsi="Times New Roman"/>
+          <w:i w:val="false"/>
+          <w:iCs w:val="false"/>
+          <w:sz w:val="24"/>
+          <w:szCs w:val="24"/>
+          <w:rtl/>
+        </w:rPr>
+        <w:t xml:space="preserve">מן הפועל "לשבת", מפני שהוא בהמה איטית שאין בה תבונה,</w:t>
+      </w:r>
+      <w:r>
+        <w:rPr>
+          <w:rStyle w:val="FootnoteReference"/>
+        </w:rPr>
+        <w:footnoteReference w:id="15"/>
+      </w:r>
+      <w:r>
+        <w:rPr>
+          <w:rFonts w:ascii="Times New Roman" w:cs="David" w:eastAsia="David" w:hAnsi="Times New Roman"/>
+          <w:i w:val="false"/>
+          <w:iCs w:val="false"/>
+          <w:sz w:val="24"/>
+          <w:szCs w:val="24"/>
+          <w:rtl/>
+        </w:rPr>
+        <w:t xml:space="preserve"> והבסטיאריום, ספר החיות המוסרי שהיה נפוץ באנגליה במאה השתים עשרה, בדיוק בזמנו ובמקומו של ברכיה, מבחין בין החמור הביתי ובין הפרא ומייחס לשניהם כסילות ותאווה.</w:t>
+      </w:r>
+      <w:r>
+        <w:rPr>
+          <w:rStyle w:val="FootnoteReference"/>
+        </w:rPr>
+        <w:footnoteReference w:id="16"/>
+      </w:r>
+      <w:r>
+        <w:rPr>
+          <w:rFonts w:ascii="Times New Roman" w:cs="David" w:eastAsia="David" w:hAnsi="Times New Roman"/>
+          <w:i w:val="false"/>
+          <w:iCs w:val="false"/>
+          <w:sz w:val="24"/>
+          <w:szCs w:val="24"/>
+          <w:rtl/>
+        </w:rPr>
+        <w:t xml:space="preserve"> ובכנסיות של צפון צרפת נחוג בימי הביניים "חג החמור", טקס עממי שבו הובל חמור אל הכנסייה ונשמעה נעירה במקום "אמן"; החמור היה גם בתרבות הסובבת חיה של צחוק והיפוך סדרים.</w:t>
+      </w:r>
+      <w:r>
+        <w:rPr>
+          <w:rStyle w:val="FootnoteReference"/>
+        </w:rPr>
+        <w:footnoteReference w:id="17"/>
+      </w:r>
+    </w:p>
+    <w:p>
+      <w:pPr>
+        <w:bidi/>
+        <w:spacing w:after="120" w:before="0" w:line="360"/>
+        <w:jc w:val="both"/>
+      </w:pPr>
+      <w:r>
+        <w:rPr>
+          <w:rFonts w:ascii="Times New Roman" w:cs="David" w:eastAsia="David" w:hAnsi="Times New Roman"/>
+          <w:i w:val="false"/>
+          <w:iCs w:val="false"/>
+          <w:sz w:val="24"/>
+          <w:szCs w:val="24"/>
+          <w:rtl/>
+        </w:rPr>
+        <w:t xml:space="preserve">בקוראן החמור מופיע בארבעה הקשרים, ושלושה מהם נוגעים ישירות לתכונות שברכיה מפעיל. בסורה 62, פסוק 5, מי שהופקדו על התורה ולא נשאו אותה נמשלים ל"חמור נושא ספרים": ידע שנישא על הגב ואינו נכנס לראש, ממש כמו "לא ידע" של ישעיהו. בסורה 31, פסוק 19, נאמר שהנתעב שבקולות הוא קול החמורים, וזה בדיוק הקול שהחמור במשל סה מתפאר בו. ובסורה 74, פסוקים 50-51, הכופרים הבורחים מן התוכחה נמשלים לחמורי בר נבהלים הנסים מפני אריה, תמונה שהיא כמעט הציד של משל סה.</w:t>
+      </w:r>
+      <w:r>
+        <w:rPr>
+          <w:rStyle w:val="FootnoteReference"/>
+        </w:rPr>
+        <w:footnoteReference w:id="18"/>
+      </w:r>
+      <w:r>
+        <w:rPr>
+          <w:rFonts w:ascii="Times New Roman" w:cs="David" w:eastAsia="David" w:hAnsi="Times New Roman"/>
+          <w:i w:val="false"/>
+          <w:iCs w:val="false"/>
+          <w:sz w:val="24"/>
+          <w:szCs w:val="24"/>
+          <w:rtl/>
+        </w:rPr>
+        <w:t xml:space="preserve"> הדימוי "חמור נושא ספרים" עבר מן הערבית לעברית ורווח בספרות המוסר של ימי הביניים ככינוי למי שלמד ולא הבין.</w:t>
+      </w:r>
+      <w:r>
+        <w:rPr>
+          <w:rStyle w:val="FootnoteReference"/>
+        </w:rPr>
+        <w:footnoteReference w:id="19"/>
+      </w:r>
+      <w:r>
+        <w:rPr>
+          <w:rFonts w:ascii="Times New Roman" w:cs="David" w:eastAsia="David" w:hAnsi="Times New Roman"/>
+          <w:i w:val="false"/>
+          <w:iCs w:val="false"/>
+          <w:sz w:val="24"/>
+          <w:szCs w:val="24"/>
+          <w:rtl/>
+        </w:rPr>
+        <w:t xml:space="preserve"> בספרות העממית הערבית החמור הוא בן לווייתו הקבוע של ג'וחא, הטיפש-חכם, ורבים מן הסיפורים על ג'וחא וחמורו הגיעו גם לפולקלור היהודי במזרח.</w:t>
+      </w:r>
+      <w:r>
+        <w:rPr>
+          <w:rStyle w:val="FootnoteReference"/>
+        </w:rPr>
+        <w:footnoteReference w:id="20"/>
+      </w:r>
+    </w:p>
+    <w:p>
+      <w:pPr>
+        <w:bidi/>
+        <w:spacing w:after="120" w:before="0" w:line="360"/>
+        <w:jc w:val="both"/>
+      </w:pPr>
+      <w:r>
+        <w:rPr>
+          <w:rFonts w:ascii="Times New Roman" w:cs="David" w:eastAsia="David" w:hAnsi="Times New Roman"/>
+          <w:i w:val="false"/>
+          <w:iCs w:val="false"/>
+          <w:sz w:val="24"/>
+          <w:szCs w:val="24"/>
+          <w:rtl/>
+        </w:rPr>
+        <w:t xml:space="preserve">בפולקלור האירופי המאוחר יותר החמור שומר על שתי פניו. הוא הכסיל שבפתגמים ובבדיחות, אבל הוא גם הפועל הזקן שנזרק אחרי שנות עבודה, כמו החמור של "נגני העיר ברמן" אצל האחים גרים (טיפוס </w:t>
+      </w:r>
+      <w:r>
+        <w:rPr>
+          <w:rFonts w:ascii="Times New Roman" w:cs="David" w:eastAsia="David" w:hAnsi="Times New Roman"/>
+          <w:i w:val="false"/>
+          <w:iCs w:val="false"/>
+          <w:sz w:val="24"/>
+          <w:szCs w:val="24"/>
+          <w:rtl w:val="false"/>
+        </w:rPr>
+        <w:t xml:space="preserve">ATU 130), </w:t>
+      </w:r>
+      <w:r>
+        <w:rPr>
+          <w:rFonts w:ascii="Times New Roman" w:cs="David" w:eastAsia="David" w:hAnsi="Times New Roman"/>
+          <w:i w:val="false"/>
+          <w:iCs w:val="false"/>
+          <w:sz w:val="24"/>
+          <w:szCs w:val="24"/>
+          <w:rtl/>
+        </w:rPr>
+        <w:t xml:space="preserve">שמנהיג את החיות המשוחררות.</w:t>
+      </w:r>
+      <w:r>
+        <w:rPr>
+          <w:rStyle w:val="FootnoteReference"/>
+        </w:rPr>
+        <w:footnoteReference w:id="21"/>
+      </w:r>
+      <w:r>
+        <w:rPr>
+          <w:rFonts w:ascii="Times New Roman" w:cs="David" w:eastAsia="David" w:hAnsi="Times New Roman"/>
+          <w:i w:val="false"/>
+          <w:iCs w:val="false"/>
+          <w:sz w:val="24"/>
+          <w:szCs w:val="24"/>
+          <w:rtl/>
+        </w:rPr>
+        <w:t xml:space="preserve"> המסורת העממית משמרת אפוא את המתח שנמצא כבר במקרא: החמור הוא בעל החיים הנלעג ביותר ובעל החיים העמל ביותר. ברכיה בוחר בצד הלעג, אבל שלושת המשלים שמסתיימים בעבודה, בעבדות ובאבוס מזכירים גם את הצד השני.</w:t>
+      </w:r>
+    </w:p>
+    <w:p>
+      <w:pPr>
+        <w:pStyle w:val="Heading2"/>
+        <w:keepNext/>
+        <w:bidi/>
+        <w:spacing w:after="120" w:before="240" w:line="360"/>
+        <w:jc w:val="start"/>
+      </w:pPr>
+      <w:r>
+        <w:rPr>
+          <w:rFonts w:ascii="Times New Roman" w:cs="David" w:eastAsia="David" w:hAnsi="Times New Roman"/>
+          <w:b/>
+          <w:bCs/>
+          <w:i w:val="false"/>
+          <w:iCs w:val="false"/>
+          <w:sz w:val="28"/>
+          <w:szCs w:val="28"/>
+          <w:rtl/>
+        </w:rPr>
+        <w:t xml:space="preserve">1.5 קורפוס משלי החמור: סיכום</w:t>
       </w:r>
     </w:p>
     <w:p>
@@ -4230,7 +4497,7 @@
         <w:rPr>
           <w:rStyle w:val="FootnoteReference"/>
         </w:rPr>
-        <w:footnoteReference w:id="14"/>
+        <w:footnoteReference w:id="22"/>
       </w:r>
       <w:r>
         <w:rPr>
@@ -4247,7 +4514,7 @@
         <w:rPr>
           <w:rStyle w:val="FootnoteReference"/>
         </w:rPr>
-        <w:footnoteReference w:id="15"/>
+        <w:footnoteReference w:id="23"/>
       </w:r>
       <w:r>
         <w:rPr>
@@ -4264,7 +4531,7 @@
         <w:rPr>
           <w:rStyle w:val="FootnoteReference"/>
         </w:rPr>
-        <w:footnoteReference w:id="16"/>
+        <w:footnoteReference w:id="24"/>
       </w:r>
       <w:r>
         <w:rPr>
@@ -4321,7 +4588,7 @@
         <w:rPr>
           <w:rStyle w:val="FootnoteReference"/>
         </w:rPr>
-        <w:footnoteReference w:id="17"/>
+        <w:footnoteReference w:id="25"/>
       </w:r>
       <w:r>
         <w:rPr>
@@ -4338,7 +4605,7 @@
         <w:rPr>
           <w:rStyle w:val="FootnoteReference"/>
         </w:rPr>
-        <w:footnoteReference w:id="18"/>
+        <w:footnoteReference w:id="26"/>
       </w:r>
     </w:p>
     <w:p>
@@ -4362,7 +4629,7 @@
         <w:rPr>
           <w:rStyle w:val="FootnoteReference"/>
         </w:rPr>
-        <w:footnoteReference w:id="19"/>
+        <w:footnoteReference w:id="27"/>
       </w:r>
       <w:r>
         <w:rPr>
@@ -4419,7 +4686,7 @@
         <w:rPr>
           <w:rStyle w:val="FootnoteReference"/>
         </w:rPr>
-        <w:footnoteReference w:id="20"/>
+        <w:footnoteReference w:id="28"/>
       </w:r>
       <w:r>
         <w:rPr>
@@ -5556,7 +5823,7 @@
         <w:rPr>
           <w:rStyle w:val="FootnoteReference"/>
         </w:rPr>
-        <w:footnoteReference w:id="21"/>
+        <w:footnoteReference w:id="29"/>
       </w:r>
       <w:r>
         <w:rPr>
@@ -5609,7 +5876,7 @@
         <w:rPr>
           <w:rStyle w:val="FootnoteReference"/>
         </w:rPr>
-        <w:footnoteReference w:id="22"/>
+        <w:footnoteReference w:id="30"/>
       </w:r>
     </w:p>
     <w:p>
@@ -5745,7 +6012,7 @@
         <w:rPr>
           <w:rStyle w:val="FootnoteReference"/>
         </w:rPr>
-        <w:footnoteReference w:id="23"/>
+        <w:footnoteReference w:id="31"/>
       </w:r>
     </w:p>
     <w:p>
@@ -6126,6 +6393,77 @@
           <w:rtl/>
         </w:rPr>
         <w:t xml:space="preserve">, תרגם מערבית יוסף יואל ריבלין, כרך א, תל אביב: קרית ספר, תש"ז.</w:t>
+      </w:r>
+    </w:p>
+    <w:p>
+      <w:pPr>
+        <w:bidi/>
+        <w:spacing w:after="160" w:before="0" w:line="276"/>
+        <w:ind w:start="709" w:hanging="709"/>
+        <w:jc w:val="both"/>
+      </w:pPr>
+      <w:r>
+        <w:rPr>
+          <w:rFonts w:ascii="Times New Roman" w:cs="David" w:eastAsia="David" w:hAnsi="Times New Roman"/>
+          <w:i w:val="false"/>
+          <w:iCs w:val="false"/>
+          <w:sz w:val="24"/>
+          <w:szCs w:val="24"/>
+          <w:rtl/>
+        </w:rPr>
+        <w:t xml:space="preserve">גרים, יעקב ווילהלם, </w:t>
+      </w:r>
+      <w:r>
+        <w:rPr>
+          <w:rFonts w:ascii="Times New Roman" w:cs="David" w:eastAsia="David" w:hAnsi="Times New Roman"/>
+          <w:i/>
+          <w:iCs/>
+          <w:sz w:val="24"/>
+          <w:szCs w:val="24"/>
+          <w:rtl/>
+        </w:rPr>
+        <w:t xml:space="preserve">מעשיות האחים גרים</w:t>
+      </w:r>
+      <w:r>
+        <w:rPr>
+          <w:rFonts w:ascii="Times New Roman" w:cs="David" w:eastAsia="David" w:hAnsi="Times New Roman"/>
+          <w:i w:val="false"/>
+          <w:iCs w:val="false"/>
+          <w:sz w:val="24"/>
+          <w:szCs w:val="24"/>
+          <w:rtl/>
+        </w:rPr>
+        <w:t xml:space="preserve">, תרגם שמעון לוי, תל אביב: ספרית פועלים, 1994.</w:t>
+      </w:r>
+    </w:p>
+    <w:p>
+      <w:pPr>
+        <w:bidi/>
+        <w:spacing w:after="160" w:before="0" w:line="276"/>
+        <w:ind w:start="709" w:hanging="709"/>
+        <w:jc w:val="both"/>
+      </w:pPr>
+      <w:r>
+        <w:rPr>
+          <w:rFonts w:ascii="Times New Roman" w:cs="David" w:eastAsia="David" w:hAnsi="Times New Roman"/>
+          <w:i/>
+          <w:iCs/>
+          <w:sz w:val="24"/>
+          <w:szCs w:val="24"/>
+          <w:rtl/>
+        </w:rPr>
+        <w:t xml:space="preserve">הקוראן</w:t>
+      </w:r>
+      <w:r>
+        <w:rPr>
+          <w:rFonts w:ascii="Times New Roman" w:cs="David" w:eastAsia="David" w:hAnsi="Times New Roman"/>
+          <w:i w:val="false"/>
+          <w:iCs w:val="false"/>
+          <w:sz w:val="24"/>
+          <w:szCs w:val="24"/>
+          <w:rtl/>
+        </w:rPr>
+        <w:t xml:space="preserve">, תרגם מערבית אורי רובין, תל אביב: אוניברסיטת תל אביב, 2005.</w:t>
       </w:r>
     </w:p>
     <w:p>
@@ -6316,7 +6654,7 @@
           <w:szCs w:val="24"/>
           <w:rtl w:val="false"/>
         </w:rPr>
-        <w:t xml:space="preserve">Derenbourg, Joseph (ed.), </w:t>
+        <w:t xml:space="preserve">Barney, Stephen A., W. J. Lewis, J. A. Beach, and Oliver Berghof (trans.), </w:t>
       </w:r>
       <w:r>
         <w:rPr>
@@ -6327,18 +6665,18 @@
           <w:szCs w:val="24"/>
           <w:rtl w:val="false"/>
         </w:rPr>
-        <w:t xml:space="preserve">Deux versions hébraïques du livre de Kalîlâh et Dimnâh</w:t>
-      </w:r>
-      <w:r>
-        <w:rPr>
-          <w:rFonts w:ascii="Times New Roman" w:cs="David" w:eastAsia="David" w:hAnsi="Times New Roman"/>
-          <w:i w:val="false"/>
-          <w:iCs w:val="false"/>
-          <w:sz w:val="24"/>
-          <w:szCs w:val="24"/>
-          <w:rtl w:val="false"/>
-        </w:rPr>
-        <w:t xml:space="preserve">, Paris: F. Vieweg, 1881.</w:t>
+        <w:t xml:space="preserve">The Etymologies of Isidore of Seville</w:t>
+      </w:r>
+      <w:r>
+        <w:rPr>
+          <w:rFonts w:ascii="Times New Roman" w:cs="David" w:eastAsia="David" w:hAnsi="Times New Roman"/>
+          <w:i w:val="false"/>
+          <w:iCs w:val="false"/>
+          <w:sz w:val="24"/>
+          <w:szCs w:val="24"/>
+          <w:rtl w:val="false"/>
+        </w:rPr>
+        <w:t xml:space="preserve">, Cambridge: Cambridge University Press, 2006.</w:t>
       </w:r>
     </w:p>
     <w:p>
@@ -6357,7 +6695,7 @@
           <w:szCs w:val="24"/>
           <w:rtl w:val="false"/>
         </w:rPr>
-        <w:t xml:space="preserve">Ibn Sahula, Isaac, </w:t>
+        <w:t xml:space="preserve">Derenbourg, Joseph (ed.), </w:t>
       </w:r>
       <w:r>
         <w:rPr>
@@ -6368,18 +6706,18 @@
           <w:szCs w:val="24"/>
           <w:rtl w:val="false"/>
         </w:rPr>
-        <w:t xml:space="preserve">Meshal Haqadmoni: Fables from the Distant Past</w:t>
-      </w:r>
-      <w:r>
-        <w:rPr>
-          <w:rFonts w:ascii="Times New Roman" w:cs="David" w:eastAsia="David" w:hAnsi="Times New Roman"/>
-          <w:i w:val="false"/>
-          <w:iCs w:val="false"/>
-          <w:sz w:val="24"/>
-          <w:szCs w:val="24"/>
-          <w:rtl w:val="false"/>
-        </w:rPr>
-        <w:t xml:space="preserve">, ed. and trans. Raphael Loewe, 2 vols., Oxford: Littman Library of Jewish Civilization, 2004.</w:t>
+        <w:t xml:space="preserve">Deux versions hébraïques du livre de Kalîlâh et Dimnâh</w:t>
+      </w:r>
+      <w:r>
+        <w:rPr>
+          <w:rFonts w:ascii="Times New Roman" w:cs="David" w:eastAsia="David" w:hAnsi="Times New Roman"/>
+          <w:i w:val="false"/>
+          <w:iCs w:val="false"/>
+          <w:sz w:val="24"/>
+          <w:szCs w:val="24"/>
+          <w:rtl w:val="false"/>
+        </w:rPr>
+        <w:t xml:space="preserve">, Paris: F. Vieweg, 1881.</w:t>
       </w:r>
     </w:p>
     <w:p>
@@ -6398,7 +6736,7 @@
           <w:szCs w:val="24"/>
           <w:rtl w:val="false"/>
         </w:rPr>
-        <w:t xml:space="preserve">Marie de France, </w:t>
+        <w:t xml:space="preserve">Elliott, J. K., </w:t>
       </w:r>
       <w:r>
         <w:rPr>
@@ -6409,18 +6747,18 @@
           <w:szCs w:val="24"/>
           <w:rtl w:val="false"/>
         </w:rPr>
-        <w:t xml:space="preserve">Fables</w:t>
-      </w:r>
-      <w:r>
-        <w:rPr>
-          <w:rFonts w:ascii="Times New Roman" w:cs="David" w:eastAsia="David" w:hAnsi="Times New Roman"/>
-          <w:i w:val="false"/>
-          <w:iCs w:val="false"/>
-          <w:sz w:val="24"/>
-          <w:szCs w:val="24"/>
-          <w:rtl w:val="false"/>
-        </w:rPr>
-        <w:t xml:space="preserve">, ed. and trans. Harriet Spiegel, Toronto: University of Toronto Press, 1987.</w:t>
+        <w:t xml:space="preserve">The Apocryphal New Testament</w:t>
+      </w:r>
+      <w:r>
+        <w:rPr>
+          <w:rFonts w:ascii="Times New Roman" w:cs="David" w:eastAsia="David" w:hAnsi="Times New Roman"/>
+          <w:i w:val="false"/>
+          <w:iCs w:val="false"/>
+          <w:sz w:val="24"/>
+          <w:szCs w:val="24"/>
+          <w:rtl w:val="false"/>
+        </w:rPr>
+        <w:t xml:space="preserve">, Oxford: Clarendon Press, 1993.</w:t>
       </w:r>
     </w:p>
     <w:p>
@@ -6439,7 +6777,7 @@
           <w:szCs w:val="24"/>
           <w:rtl w:val="false"/>
         </w:rPr>
-        <w:t xml:space="preserve">Perry, Ben Edwin, </w:t>
+        <w:t xml:space="preserve">Ibn Sahula, Isaac, </w:t>
       </w:r>
       <w:r>
         <w:rPr>
@@ -6450,18 +6788,18 @@
           <w:szCs w:val="24"/>
           <w:rtl w:val="false"/>
         </w:rPr>
-        <w:t xml:space="preserve">Aesopica</w:t>
-      </w:r>
-      <w:r>
-        <w:rPr>
-          <w:rFonts w:ascii="Times New Roman" w:cs="David" w:eastAsia="David" w:hAnsi="Times New Roman"/>
-          <w:i w:val="false"/>
-          <w:iCs w:val="false"/>
-          <w:sz w:val="24"/>
-          <w:szCs w:val="24"/>
-          <w:rtl w:val="false"/>
-        </w:rPr>
-        <w:t xml:space="preserve">, vol. 1, Urbana: University of Illinois Press, 1952.</w:t>
+        <w:t xml:space="preserve">Meshal Haqadmoni: Fables from the Distant Past</w:t>
+      </w:r>
+      <w:r>
+        <w:rPr>
+          <w:rFonts w:ascii="Times New Roman" w:cs="David" w:eastAsia="David" w:hAnsi="Times New Roman"/>
+          <w:i w:val="false"/>
+          <w:iCs w:val="false"/>
+          <w:sz w:val="24"/>
+          <w:szCs w:val="24"/>
+          <w:rtl w:val="false"/>
+        </w:rPr>
+        <w:t xml:space="preserve">, ed. and trans. Raphael Loewe, 2 vols., Oxford: Littman Library of Jewish Civilization, 2004.</w:t>
       </w:r>
     </w:p>
     <w:p>
@@ -6480,7 +6818,7 @@
           <w:szCs w:val="24"/>
           <w:rtl w:val="false"/>
         </w:rPr>
-        <w:t xml:space="preserve">Perry, Ben Edwin (ed. and trans.), </w:t>
+        <w:t xml:space="preserve">Marie de France, </w:t>
       </w:r>
       <w:r>
         <w:rPr>
@@ -6491,162 +6829,18 @@
           <w:szCs w:val="24"/>
           <w:rtl w:val="false"/>
         </w:rPr>
-        <w:t xml:space="preserve">Babrius and Phaedrus</w:t>
-      </w:r>
-      <w:r>
-        <w:rPr>
-          <w:rFonts w:ascii="Times New Roman" w:cs="David" w:eastAsia="David" w:hAnsi="Times New Roman"/>
-          <w:i w:val="false"/>
-          <w:iCs w:val="false"/>
-          <w:sz w:val="24"/>
-          <w:szCs w:val="24"/>
-          <w:rtl w:val="false"/>
-        </w:rPr>
-        <w:t xml:space="preserve">, Loeb Classical Library, Cambridge, MA: Harvard University Press, 1965.</w:t>
-      </w:r>
-    </w:p>
-    <w:p>
-      <w:pPr>
-        <w:keepNext/>
-        <w:bidi/>
-        <w:spacing w:after="120" w:before="240" w:line="360"/>
-        <w:jc w:val="start"/>
-      </w:pPr>
-      <w:r>
-        <w:rPr>
-          <w:rFonts w:ascii="Times New Roman" w:cs="David" w:eastAsia="David" w:hAnsi="Times New Roman"/>
-          <w:b/>
-          <w:bCs/>
-          <w:i w:val="false"/>
-          <w:iCs w:val="false"/>
-          <w:sz w:val="26"/>
-          <w:szCs w:val="26"/>
-          <w:rtl/>
-        </w:rPr>
-        <w:t xml:space="preserve">מחקרים</w:t>
-      </w:r>
-    </w:p>
-    <w:p>
-      <w:pPr>
-        <w:bidi/>
-        <w:spacing w:after="160" w:before="0" w:line="276"/>
-        <w:ind w:start="709" w:hanging="709"/>
-        <w:jc w:val="both"/>
-      </w:pPr>
-      <w:r>
-        <w:rPr>
-          <w:rFonts w:ascii="Times New Roman" w:cs="David" w:eastAsia="David" w:hAnsi="Times New Roman"/>
-          <w:i w:val="false"/>
-          <w:iCs w:val="false"/>
-          <w:sz w:val="24"/>
-          <w:szCs w:val="24"/>
-          <w:rtl/>
-        </w:rPr>
-        <w:t xml:space="preserve">יסיף, עלי, </w:t>
-      </w:r>
-      <w:r>
-        <w:rPr>
-          <w:rFonts w:ascii="Times New Roman" w:cs="David" w:eastAsia="David" w:hAnsi="Times New Roman"/>
-          <w:i/>
-          <w:iCs/>
-          <w:sz w:val="24"/>
-          <w:szCs w:val="24"/>
-          <w:rtl/>
-        </w:rPr>
-        <w:t xml:space="preserve">סיפור העם העברי: תולדותיו, סוגיו ומשמעותו</w:t>
-      </w:r>
-      <w:r>
-        <w:rPr>
-          <w:rFonts w:ascii="Times New Roman" w:cs="David" w:eastAsia="David" w:hAnsi="Times New Roman"/>
-          <w:i w:val="false"/>
-          <w:iCs w:val="false"/>
-          <w:sz w:val="24"/>
-          <w:szCs w:val="24"/>
-          <w:rtl/>
-        </w:rPr>
-        <w:t xml:space="preserve">, ירושלים: מוסד ביאליק, תשנ"ד.</w:t>
-      </w:r>
-    </w:p>
-    <w:p>
-      <w:pPr>
-        <w:bidi/>
-        <w:spacing w:after="160" w:before="0" w:line="276"/>
-        <w:ind w:start="709" w:hanging="709"/>
-        <w:jc w:val="both"/>
-      </w:pPr>
-      <w:r>
-        <w:rPr>
-          <w:rFonts w:ascii="Times New Roman" w:cs="David" w:eastAsia="David" w:hAnsi="Times New Roman"/>
-          <w:i w:val="false"/>
-          <w:iCs w:val="false"/>
-          <w:sz w:val="24"/>
-          <w:szCs w:val="24"/>
-          <w:rtl/>
-        </w:rPr>
-        <w:t xml:space="preserve">פגיס, דן, </w:t>
-      </w:r>
-      <w:r>
-        <w:rPr>
-          <w:rFonts w:ascii="Times New Roman" w:cs="David" w:eastAsia="David" w:hAnsi="Times New Roman"/>
-          <w:i/>
-          <w:iCs/>
-          <w:sz w:val="24"/>
-          <w:szCs w:val="24"/>
-          <w:rtl/>
-        </w:rPr>
-        <w:t xml:space="preserve">חידוש ומסורת בשירת החול העברית: ספרד ואיטליה</w:t>
-      </w:r>
-      <w:r>
-        <w:rPr>
-          <w:rFonts w:ascii="Times New Roman" w:cs="David" w:eastAsia="David" w:hAnsi="Times New Roman"/>
-          <w:i w:val="false"/>
-          <w:iCs w:val="false"/>
-          <w:sz w:val="24"/>
-          <w:szCs w:val="24"/>
-          <w:rtl/>
-        </w:rPr>
-        <w:t xml:space="preserve">, ירושלים: כתר, 1976.</w:t>
-      </w:r>
-    </w:p>
-    <w:p>
-      <w:pPr>
-        <w:bidi/>
-        <w:spacing w:after="160" w:before="0" w:line="276"/>
-        <w:ind w:start="709" w:hanging="709"/>
-        <w:jc w:val="both"/>
-      </w:pPr>
-      <w:r>
-        <w:rPr>
-          <w:rFonts w:ascii="Times New Roman" w:cs="David" w:eastAsia="David" w:hAnsi="Times New Roman"/>
-          <w:i w:val="false"/>
-          <w:iCs w:val="false"/>
-          <w:sz w:val="24"/>
-          <w:szCs w:val="24"/>
-          <w:rtl/>
-        </w:rPr>
-        <w:t xml:space="preserve">פליקס, יהודה, </w:t>
-      </w:r>
-      <w:r>
-        <w:rPr>
-          <w:rFonts w:ascii="Times New Roman" w:cs="David" w:eastAsia="David" w:hAnsi="Times New Roman"/>
-          <w:i/>
-          <w:iCs/>
-          <w:sz w:val="24"/>
-          <w:szCs w:val="24"/>
-          <w:rtl/>
-        </w:rPr>
-        <w:t xml:space="preserve">החי של התנ"ך</w:t>
-      </w:r>
-      <w:r>
-        <w:rPr>
-          <w:rFonts w:ascii="Times New Roman" w:cs="David" w:eastAsia="David" w:hAnsi="Times New Roman"/>
-          <w:i w:val="false"/>
-          <w:iCs w:val="false"/>
-          <w:sz w:val="24"/>
-          <w:szCs w:val="24"/>
-          <w:rtl/>
-        </w:rPr>
-        <w:t xml:space="preserve">, תל אביב: סיני, תשי"ד.</w:t>
+        <w:t xml:space="preserve">Fables</w:t>
+      </w:r>
+      <w:r>
+        <w:rPr>
+          <w:rFonts w:ascii="Times New Roman" w:cs="David" w:eastAsia="David" w:hAnsi="Times New Roman"/>
+          <w:i w:val="false"/>
+          <w:iCs w:val="false"/>
+          <w:sz w:val="24"/>
+          <w:szCs w:val="24"/>
+          <w:rtl w:val="false"/>
+        </w:rPr>
+        <w:t xml:space="preserve">, ed. and trans. Harriet Spiegel, Toronto: University of Toronto Press, 1987.</w:t>
       </w:r>
     </w:p>
     <w:p>
@@ -6665,7 +6859,7 @@
           <w:szCs w:val="24"/>
           <w:rtl w:val="false"/>
         </w:rPr>
-        <w:t xml:space="preserve">Jacobs, Joseph, </w:t>
+        <w:t xml:space="preserve">Perry, Ben Edwin, </w:t>
       </w:r>
       <w:r>
         <w:rPr>
@@ -6676,40 +6870,18 @@
           <w:szCs w:val="24"/>
           <w:rtl w:val="false"/>
         </w:rPr>
-        <w:t xml:space="preserve">The Fables of Aesop as First Printed by William Caxton in 1484</w:t>
-      </w:r>
-      <w:r>
-        <w:rPr>
-          <w:rFonts w:ascii="Times New Roman" w:cs="David" w:eastAsia="David" w:hAnsi="Times New Roman"/>
-          <w:i w:val="false"/>
-          <w:iCs w:val="false"/>
-          <w:sz w:val="24"/>
-          <w:szCs w:val="24"/>
-          <w:rtl w:val="false"/>
-        </w:rPr>
-        <w:t xml:space="preserve">, vol. 1: </w:t>
-      </w:r>
-      <w:r>
-        <w:rPr>
-          <w:rFonts w:ascii="Times New Roman" w:cs="David" w:eastAsia="David" w:hAnsi="Times New Roman"/>
-          <w:i/>
-          <w:iCs/>
-          <w:sz w:val="24"/>
-          <w:szCs w:val="24"/>
-          <w:rtl w:val="false"/>
-        </w:rPr>
-        <w:t xml:space="preserve">History of the Aesopic Fable</w:t>
-      </w:r>
-      <w:r>
-        <w:rPr>
-          <w:rFonts w:ascii="Times New Roman" w:cs="David" w:eastAsia="David" w:hAnsi="Times New Roman"/>
-          <w:i w:val="false"/>
-          <w:iCs w:val="false"/>
-          <w:sz w:val="24"/>
-          <w:szCs w:val="24"/>
-          <w:rtl w:val="false"/>
-        </w:rPr>
-        <w:t xml:space="preserve">, London: David Nutt, 1889.</w:t>
+        <w:t xml:space="preserve">Aesopica</w:t>
+      </w:r>
+      <w:r>
+        <w:rPr>
+          <w:rFonts w:ascii="Times New Roman" w:cs="David" w:eastAsia="David" w:hAnsi="Times New Roman"/>
+          <w:i w:val="false"/>
+          <w:iCs w:val="false"/>
+          <w:sz w:val="24"/>
+          <w:szCs w:val="24"/>
+          <w:rtl w:val="false"/>
+        </w:rPr>
+        <w:t xml:space="preserve">, vol. 1, Urbana: University of Illinois Press, 1952.</w:t>
       </w:r>
     </w:p>
     <w:p>
@@ -6728,7 +6900,7 @@
           <w:szCs w:val="24"/>
           <w:rtl w:val="false"/>
         </w:rPr>
-        <w:t xml:space="preserve">Rossel, Stine, Fiona Marshall, Joris Peters, Tom Pilgram, Matthew D. Adams, and David O'Connor, "Domestication of the Donkey: Timing, Processes, and Indicators," </w:t>
+        <w:t xml:space="preserve">Perry, Ben Edwin (ed. and trans.), </w:t>
       </w:r>
       <w:r>
         <w:rPr>
@@ -6739,18 +6911,162 @@
           <w:szCs w:val="24"/>
           <w:rtl w:val="false"/>
         </w:rPr>
-        <w:t xml:space="preserve">Proceedings of the National Academy of Sciences</w:t>
-      </w:r>
-      <w:r>
-        <w:rPr>
-          <w:rFonts w:ascii="Times New Roman" w:cs="David" w:eastAsia="David" w:hAnsi="Times New Roman"/>
-          <w:i w:val="false"/>
-          <w:iCs w:val="false"/>
-          <w:sz w:val="24"/>
-          <w:szCs w:val="24"/>
-          <w:rtl w:val="false"/>
-        </w:rPr>
-        <w:t xml:space="preserve"> 105, no. 10 (2008): 3715-3720.</w:t>
+        <w:t xml:space="preserve">Babrius and Phaedrus</w:t>
+      </w:r>
+      <w:r>
+        <w:rPr>
+          <w:rFonts w:ascii="Times New Roman" w:cs="David" w:eastAsia="David" w:hAnsi="Times New Roman"/>
+          <w:i w:val="false"/>
+          <w:iCs w:val="false"/>
+          <w:sz w:val="24"/>
+          <w:szCs w:val="24"/>
+          <w:rtl w:val="false"/>
+        </w:rPr>
+        <w:t xml:space="preserve">, Loeb Classical Library, Cambridge, MA: Harvard University Press, 1965.</w:t>
+      </w:r>
+    </w:p>
+    <w:p>
+      <w:pPr>
+        <w:keepNext/>
+        <w:bidi/>
+        <w:spacing w:after="120" w:before="240" w:line="360"/>
+        <w:jc w:val="start"/>
+      </w:pPr>
+      <w:r>
+        <w:rPr>
+          <w:rFonts w:ascii="Times New Roman" w:cs="David" w:eastAsia="David" w:hAnsi="Times New Roman"/>
+          <w:b/>
+          <w:bCs/>
+          <w:i w:val="false"/>
+          <w:iCs w:val="false"/>
+          <w:sz w:val="26"/>
+          <w:szCs w:val="26"/>
+          <w:rtl/>
+        </w:rPr>
+        <w:t xml:space="preserve">מחקרים</w:t>
+      </w:r>
+    </w:p>
+    <w:p>
+      <w:pPr>
+        <w:bidi/>
+        <w:spacing w:after="160" w:before="0" w:line="276"/>
+        <w:ind w:start="709" w:hanging="709"/>
+        <w:jc w:val="both"/>
+      </w:pPr>
+      <w:r>
+        <w:rPr>
+          <w:rFonts w:ascii="Times New Roman" w:cs="David" w:eastAsia="David" w:hAnsi="Times New Roman"/>
+          <w:i w:val="false"/>
+          <w:iCs w:val="false"/>
+          <w:sz w:val="24"/>
+          <w:szCs w:val="24"/>
+          <w:rtl/>
+        </w:rPr>
+        <w:t xml:space="preserve">יסיף, עלי, </w:t>
+      </w:r>
+      <w:r>
+        <w:rPr>
+          <w:rFonts w:ascii="Times New Roman" w:cs="David" w:eastAsia="David" w:hAnsi="Times New Roman"/>
+          <w:i/>
+          <w:iCs/>
+          <w:sz w:val="24"/>
+          <w:szCs w:val="24"/>
+          <w:rtl/>
+        </w:rPr>
+        <w:t xml:space="preserve">סיפור העם העברי: תולדותיו, סוגיו ומשמעותו</w:t>
+      </w:r>
+      <w:r>
+        <w:rPr>
+          <w:rFonts w:ascii="Times New Roman" w:cs="David" w:eastAsia="David" w:hAnsi="Times New Roman"/>
+          <w:i w:val="false"/>
+          <w:iCs w:val="false"/>
+          <w:sz w:val="24"/>
+          <w:szCs w:val="24"/>
+          <w:rtl/>
+        </w:rPr>
+        <w:t xml:space="preserve">, ירושלים: מוסד ביאליק, תשנ"ד.</w:t>
+      </w:r>
+    </w:p>
+    <w:p>
+      <w:pPr>
+        <w:bidi/>
+        <w:spacing w:after="160" w:before="0" w:line="276"/>
+        <w:ind w:start="709" w:hanging="709"/>
+        <w:jc w:val="both"/>
+      </w:pPr>
+      <w:r>
+        <w:rPr>
+          <w:rFonts w:ascii="Times New Roman" w:cs="David" w:eastAsia="David" w:hAnsi="Times New Roman"/>
+          <w:i w:val="false"/>
+          <w:iCs w:val="false"/>
+          <w:sz w:val="24"/>
+          <w:szCs w:val="24"/>
+          <w:rtl/>
+        </w:rPr>
+        <w:t xml:space="preserve">פגיס, דן, </w:t>
+      </w:r>
+      <w:r>
+        <w:rPr>
+          <w:rFonts w:ascii="Times New Roman" w:cs="David" w:eastAsia="David" w:hAnsi="Times New Roman"/>
+          <w:i/>
+          <w:iCs/>
+          <w:sz w:val="24"/>
+          <w:szCs w:val="24"/>
+          <w:rtl/>
+        </w:rPr>
+        <w:t xml:space="preserve">חידוש ומסורת בשירת החול העברית: ספרד ואיטליה</w:t>
+      </w:r>
+      <w:r>
+        <w:rPr>
+          <w:rFonts w:ascii="Times New Roman" w:cs="David" w:eastAsia="David" w:hAnsi="Times New Roman"/>
+          <w:i w:val="false"/>
+          <w:iCs w:val="false"/>
+          <w:sz w:val="24"/>
+          <w:szCs w:val="24"/>
+          <w:rtl/>
+        </w:rPr>
+        <w:t xml:space="preserve">, ירושלים: כתר, 1976.</w:t>
+      </w:r>
+    </w:p>
+    <w:p>
+      <w:pPr>
+        <w:bidi/>
+        <w:spacing w:after="160" w:before="0" w:line="276"/>
+        <w:ind w:start="709" w:hanging="709"/>
+        <w:jc w:val="both"/>
+      </w:pPr>
+      <w:r>
+        <w:rPr>
+          <w:rFonts w:ascii="Times New Roman" w:cs="David" w:eastAsia="David" w:hAnsi="Times New Roman"/>
+          <w:i w:val="false"/>
+          <w:iCs w:val="false"/>
+          <w:sz w:val="24"/>
+          <w:szCs w:val="24"/>
+          <w:rtl/>
+        </w:rPr>
+        <w:t xml:space="preserve">פליקס, יהודה, </w:t>
+      </w:r>
+      <w:r>
+        <w:rPr>
+          <w:rFonts w:ascii="Times New Roman" w:cs="David" w:eastAsia="David" w:hAnsi="Times New Roman"/>
+          <w:i/>
+          <w:iCs/>
+          <w:sz w:val="24"/>
+          <w:szCs w:val="24"/>
+          <w:rtl/>
+        </w:rPr>
+        <w:t xml:space="preserve">החי של התנ"ך</w:t>
+      </w:r>
+      <w:r>
+        <w:rPr>
+          <w:rFonts w:ascii="Times New Roman" w:cs="David" w:eastAsia="David" w:hAnsi="Times New Roman"/>
+          <w:i w:val="false"/>
+          <w:iCs w:val="false"/>
+          <w:sz w:val="24"/>
+          <w:szCs w:val="24"/>
+          <w:rtl/>
+        </w:rPr>
+        <w:t xml:space="preserve">, תל אביב: סיני, תשי"ד.</w:t>
       </w:r>
     </w:p>
     <w:p>
@@ -6769,7 +7085,7 @@
           <w:szCs w:val="24"/>
           <w:rtl w:val="false"/>
         </w:rPr>
-        <w:t xml:space="preserve">Schwarzbaum, Haim, </w:t>
+        <w:t xml:space="preserve">Chambers, E. K., </w:t>
       </w:r>
       <w:r>
         <w:rPr>
@@ -6780,18 +7096,18 @@
           <w:szCs w:val="24"/>
           <w:rtl w:val="false"/>
         </w:rPr>
-        <w:t xml:space="preserve">The Mishle Shu'alim (Fox Fables) of Rabbi Berechiah ha-Nakdan: A Study in Comparative Folklore and Fable Lore</w:t>
-      </w:r>
-      <w:r>
-        <w:rPr>
-          <w:rFonts w:ascii="Times New Roman" w:cs="David" w:eastAsia="David" w:hAnsi="Times New Roman"/>
-          <w:i w:val="false"/>
-          <w:iCs w:val="false"/>
-          <w:sz w:val="24"/>
-          <w:szCs w:val="24"/>
-          <w:rtl w:val="false"/>
-        </w:rPr>
-        <w:t xml:space="preserve">, Kiron: Institute for Jewish and Arab Folklore Research, 1979.</w:t>
+        <w:t xml:space="preserve">The Mediaeval Stage</w:t>
+      </w:r>
+      <w:r>
+        <w:rPr>
+          <w:rFonts w:ascii="Times New Roman" w:cs="David" w:eastAsia="David" w:hAnsi="Times New Roman"/>
+          <w:i w:val="false"/>
+          <w:iCs w:val="false"/>
+          <w:sz w:val="24"/>
+          <w:szCs w:val="24"/>
+          <w:rtl w:val="false"/>
+        </w:rPr>
+        <w:t xml:space="preserve">, 2 vols., Oxford: Clarendon Press, 1903.</w:t>
       </w:r>
     </w:p>
     <w:p>
@@ -6810,7 +7126,7 @@
           <w:szCs w:val="24"/>
           <w:rtl w:val="false"/>
         </w:rPr>
-        <w:t xml:space="preserve">Thompson, Stith, </w:t>
+        <w:t xml:space="preserve">Jacobs, Joseph, </w:t>
       </w:r>
       <w:r>
         <w:rPr>
@@ -6821,6 +7137,192 @@
           <w:szCs w:val="24"/>
           <w:rtl w:val="false"/>
         </w:rPr>
+        <w:t xml:space="preserve">The Fables of Aesop as First Printed by William Caxton in 1484</w:t>
+      </w:r>
+      <w:r>
+        <w:rPr>
+          <w:rFonts w:ascii="Times New Roman" w:cs="David" w:eastAsia="David" w:hAnsi="Times New Roman"/>
+          <w:i w:val="false"/>
+          <w:iCs w:val="false"/>
+          <w:sz w:val="24"/>
+          <w:szCs w:val="24"/>
+          <w:rtl w:val="false"/>
+        </w:rPr>
+        <w:t xml:space="preserve">, vol. 1: </w:t>
+      </w:r>
+      <w:r>
+        <w:rPr>
+          <w:rFonts w:ascii="Times New Roman" w:cs="David" w:eastAsia="David" w:hAnsi="Times New Roman"/>
+          <w:i/>
+          <w:iCs/>
+          <w:sz w:val="24"/>
+          <w:szCs w:val="24"/>
+          <w:rtl w:val="false"/>
+        </w:rPr>
+        <w:t xml:space="preserve">History of the Aesopic Fable</w:t>
+      </w:r>
+      <w:r>
+        <w:rPr>
+          <w:rFonts w:ascii="Times New Roman" w:cs="David" w:eastAsia="David" w:hAnsi="Times New Roman"/>
+          <w:i w:val="false"/>
+          <w:iCs w:val="false"/>
+          <w:sz w:val="24"/>
+          <w:szCs w:val="24"/>
+          <w:rtl w:val="false"/>
+        </w:rPr>
+        <w:t xml:space="preserve">, London: David Nutt, 1889.</w:t>
+      </w:r>
+    </w:p>
+    <w:p>
+      <w:pPr>
+        <w:bidi w:val="false"/>
+        <w:spacing w:after="160" w:before="0" w:line="276"/>
+        <w:ind w:left="709" w:hanging="709"/>
+        <w:jc w:val="left"/>
+      </w:pPr>
+      <w:r>
+        <w:rPr>
+          <w:rFonts w:ascii="Times New Roman" w:cs="David" w:eastAsia="David" w:hAnsi="Times New Roman"/>
+          <w:i w:val="false"/>
+          <w:iCs w:val="false"/>
+          <w:sz w:val="24"/>
+          <w:szCs w:val="24"/>
+          <w:rtl w:val="false"/>
+        </w:rPr>
+        <w:t xml:space="preserve">Pellat, Charles, "Djuha," in </w:t>
+      </w:r>
+      <w:r>
+        <w:rPr>
+          <w:rFonts w:ascii="Times New Roman" w:cs="David" w:eastAsia="David" w:hAnsi="Times New Roman"/>
+          <w:i/>
+          <w:iCs/>
+          <w:sz w:val="24"/>
+          <w:szCs w:val="24"/>
+          <w:rtl w:val="false"/>
+        </w:rPr>
+        <w:t xml:space="preserve">The Encyclopaedia of Islam</w:t>
+      </w:r>
+      <w:r>
+        <w:rPr>
+          <w:rFonts w:ascii="Times New Roman" w:cs="David" w:eastAsia="David" w:hAnsi="Times New Roman"/>
+          <w:i w:val="false"/>
+          <w:iCs w:val="false"/>
+          <w:sz w:val="24"/>
+          <w:szCs w:val="24"/>
+          <w:rtl w:val="false"/>
+        </w:rPr>
+        <w:t xml:space="preserve">, 2nd ed., vol. 2, Leiden: Brill, 1965, pp. 590-592.</w:t>
+      </w:r>
+    </w:p>
+    <w:p>
+      <w:pPr>
+        <w:bidi w:val="false"/>
+        <w:spacing w:after="160" w:before="0" w:line="276"/>
+        <w:ind w:left="709" w:hanging="709"/>
+        <w:jc w:val="left"/>
+      </w:pPr>
+      <w:r>
+        <w:rPr>
+          <w:rFonts w:ascii="Times New Roman" w:cs="David" w:eastAsia="David" w:hAnsi="Times New Roman"/>
+          <w:i w:val="false"/>
+          <w:iCs w:val="false"/>
+          <w:sz w:val="24"/>
+          <w:szCs w:val="24"/>
+          <w:rtl w:val="false"/>
+        </w:rPr>
+        <w:t xml:space="preserve">Rossel, Stine, Fiona Marshall, Joris Peters, Tom Pilgram, Matthew D. Adams, and David O'Connor, "Domestication of the Donkey: Timing, Processes, and Indicators," </w:t>
+      </w:r>
+      <w:r>
+        <w:rPr>
+          <w:rFonts w:ascii="Times New Roman" w:cs="David" w:eastAsia="David" w:hAnsi="Times New Roman"/>
+          <w:i/>
+          <w:iCs/>
+          <w:sz w:val="24"/>
+          <w:szCs w:val="24"/>
+          <w:rtl w:val="false"/>
+        </w:rPr>
+        <w:t xml:space="preserve">Proceedings of the National Academy of Sciences</w:t>
+      </w:r>
+      <w:r>
+        <w:rPr>
+          <w:rFonts w:ascii="Times New Roman" w:cs="David" w:eastAsia="David" w:hAnsi="Times New Roman"/>
+          <w:i w:val="false"/>
+          <w:iCs w:val="false"/>
+          <w:sz w:val="24"/>
+          <w:szCs w:val="24"/>
+          <w:rtl w:val="false"/>
+        </w:rPr>
+        <w:t xml:space="preserve"> 105, no. 10 (2008): 3715-3720.</w:t>
+      </w:r>
+    </w:p>
+    <w:p>
+      <w:pPr>
+        <w:bidi w:val="false"/>
+        <w:spacing w:after="160" w:before="0" w:line="276"/>
+        <w:ind w:left="709" w:hanging="709"/>
+        <w:jc w:val="left"/>
+      </w:pPr>
+      <w:r>
+        <w:rPr>
+          <w:rFonts w:ascii="Times New Roman" w:cs="David" w:eastAsia="David" w:hAnsi="Times New Roman"/>
+          <w:i w:val="false"/>
+          <w:iCs w:val="false"/>
+          <w:sz w:val="24"/>
+          <w:szCs w:val="24"/>
+          <w:rtl w:val="false"/>
+        </w:rPr>
+        <w:t xml:space="preserve">Schwarzbaum, Haim, </w:t>
+      </w:r>
+      <w:r>
+        <w:rPr>
+          <w:rFonts w:ascii="Times New Roman" w:cs="David" w:eastAsia="David" w:hAnsi="Times New Roman"/>
+          <w:i/>
+          <w:iCs/>
+          <w:sz w:val="24"/>
+          <w:szCs w:val="24"/>
+          <w:rtl w:val="false"/>
+        </w:rPr>
+        <w:t xml:space="preserve">The Mishle Shu'alim (Fox Fables) of Rabbi Berechiah ha-Nakdan: A Study in Comparative Folklore and Fable Lore</w:t>
+      </w:r>
+      <w:r>
+        <w:rPr>
+          <w:rFonts w:ascii="Times New Roman" w:cs="David" w:eastAsia="David" w:hAnsi="Times New Roman"/>
+          <w:i w:val="false"/>
+          <w:iCs w:val="false"/>
+          <w:sz w:val="24"/>
+          <w:szCs w:val="24"/>
+          <w:rtl w:val="false"/>
+        </w:rPr>
+        <w:t xml:space="preserve">, Kiron: Institute for Jewish and Arab Folklore Research, 1979.</w:t>
+      </w:r>
+    </w:p>
+    <w:p>
+      <w:pPr>
+        <w:bidi w:val="false"/>
+        <w:spacing w:after="160" w:before="0" w:line="276"/>
+        <w:ind w:left="709" w:hanging="709"/>
+        <w:jc w:val="left"/>
+      </w:pPr>
+      <w:r>
+        <w:rPr>
+          <w:rFonts w:ascii="Times New Roman" w:cs="David" w:eastAsia="David" w:hAnsi="Times New Roman"/>
+          <w:i w:val="false"/>
+          <w:iCs w:val="false"/>
+          <w:sz w:val="24"/>
+          <w:szCs w:val="24"/>
+          <w:rtl w:val="false"/>
+        </w:rPr>
+        <w:t xml:space="preserve">Thompson, Stith, </w:t>
+      </w:r>
+      <w:r>
+        <w:rPr>
+          <w:rFonts w:ascii="Times New Roman" w:cs="David" w:eastAsia="David" w:hAnsi="Times New Roman"/>
+          <w:i/>
+          <w:iCs/>
+          <w:sz w:val="24"/>
+          <w:szCs w:val="24"/>
+          <w:rtl w:val="false"/>
+        </w:rPr>
         <w:t xml:space="preserve">Motif-Index of Folk-Literature</w:t>
       </w:r>
       <w:r>
@@ -6833,6 +7335,47 @@
           <w:rtl w:val="false"/>
         </w:rPr>
         <w:t xml:space="preserve">, 6 vols., Bloomington: Indiana University Press, 1955-1958.</w:t>
+      </w:r>
+    </w:p>
+    <w:p>
+      <w:pPr>
+        <w:bidi w:val="false"/>
+        <w:spacing w:after="160" w:before="0" w:line="276"/>
+        <w:ind w:left="709" w:hanging="709"/>
+        <w:jc w:val="left"/>
+      </w:pPr>
+      <w:r>
+        <w:rPr>
+          <w:rFonts w:ascii="Times New Roman" w:cs="David" w:eastAsia="David" w:hAnsi="Times New Roman"/>
+          <w:i w:val="false"/>
+          <w:iCs w:val="false"/>
+          <w:sz w:val="24"/>
+          <w:szCs w:val="24"/>
+          <w:rtl w:val="false"/>
+        </w:rPr>
+        <w:t xml:space="preserve">White, T. H. (trans.), </w:t>
+      </w:r>
+      <w:r>
+        <w:rPr>
+          <w:rFonts w:ascii="Times New Roman" w:cs="David" w:eastAsia="David" w:hAnsi="Times New Roman"/>
+          <w:i/>
+          <w:iCs/>
+          <w:sz w:val="24"/>
+          <w:szCs w:val="24"/>
+          <w:rtl w:val="false"/>
+        </w:rPr>
+        <w:t xml:space="preserve">The Book of Beasts: Being a Translation from a Latin Bestiary of the Twelfth Century</w:t>
+      </w:r>
+      <w:r>
+        <w:rPr>
+          <w:rFonts w:ascii="Times New Roman" w:cs="David" w:eastAsia="David" w:hAnsi="Times New Roman"/>
+          <w:i w:val="false"/>
+          <w:iCs w:val="false"/>
+          <w:sz w:val="24"/>
+          <w:szCs w:val="24"/>
+          <w:rtl w:val="false"/>
+        </w:rPr>
+        <w:t xml:space="preserve">, London: Jonathan Cape, 1954.</w:t>
       </w:r>
     </w:p>
     <w:p>
@@ -8242,7 +8785,7 @@
           <w:szCs w:val="20"/>
           <w:rtl w:val="false"/>
         </w:rPr>
-        <w:t xml:space="preserve">Jacobs, </w:t>
+        <w:t xml:space="preserve">J. K. Elliott, </w:t>
       </w:r>
       <w:r>
         <w:rPr>
@@ -8253,18 +8796,33 @@
           <w:szCs w:val="20"/>
           <w:rtl w:val="false"/>
         </w:rPr>
-        <w:t xml:space="preserve">Fables of Aesop</w:t>
-      </w:r>
-      <w:r>
-        <w:rPr>
-          <w:rFonts w:ascii="Times New Roman" w:cs="David" w:eastAsia="David" w:hAnsi="Times New Roman"/>
-          <w:i w:val="false"/>
-          <w:iCs w:val="false"/>
-          <w:sz w:val="20"/>
-          <w:szCs w:val="20"/>
-          <w:rtl w:val="false"/>
-        </w:rPr>
-        <w:t xml:space="preserve">, vol. 1, pp. 168-178; Schwarzbaum, </w:t>
+        <w:t xml:space="preserve">The Apocryphal New Testament</w:t>
+      </w:r>
+      <w:r>
+        <w:rPr>
+          <w:rFonts w:ascii="Times New Roman" w:cs="David" w:eastAsia="David" w:hAnsi="Times New Roman"/>
+          <w:i w:val="false"/>
+          <w:iCs w:val="false"/>
+          <w:sz w:val="20"/>
+          <w:szCs w:val="20"/>
+          <w:rtl w:val="false"/>
+        </w:rPr>
+        <w:t xml:space="preserve">, Oxford: Clarendon Press, 1993, Gospel of Pseudo-Matthew, ch. 14.</w:t>
+      </w:r>
+    </w:p>
+  </w:footnote>
+  <w:footnote w:id="15">
+    <w:p>
+      <w:pPr>
+        <w:bidi/>
+        <w:spacing w:after="60" w:line="240"/>
+        <w:jc w:val="both"/>
+      </w:pPr>
+      <w:r>
+        <w:rPr>
+          <w:rStyle w:val="FootnoteReference"/>
+        </w:rPr>
+        <w:footnoteRef/>
       </w:r>
       <w:r>
         <w:rPr>
@@ -8275,22 +8833,22 @@
           <w:szCs w:val="20"/>
           <w:rtl w:val="false"/>
         </w:rPr>
-        <w:t xml:space="preserve">Mishle Shu'alim</w:t>
-      </w:r>
-      <w:r>
-        <w:rPr>
-          <w:rFonts w:ascii="Times New Roman" w:cs="David" w:eastAsia="David" w:hAnsi="Times New Roman"/>
-          <w:i w:val="false"/>
-          <w:iCs w:val="false"/>
-          <w:sz w:val="20"/>
-          <w:szCs w:val="20"/>
-          <w:rtl w:val="false"/>
-        </w:rPr>
-        <w:t xml:space="preserve">, Introduction.</w:t>
+        <w:t xml:space="preserve">The Etymologies of Isidore of Seville</w:t>
+      </w:r>
+      <w:r>
+        <w:rPr>
+          <w:rFonts w:ascii="Times New Roman" w:cs="David" w:eastAsia="David" w:hAnsi="Times New Roman"/>
+          <w:i w:val="false"/>
+          <w:iCs w:val="false"/>
+          <w:sz w:val="20"/>
+          <w:szCs w:val="20"/>
+          <w:rtl w:val="false"/>
+        </w:rPr>
+        <w:t xml:space="preserve">, trans. Stephen A. Barney et al., Cambridge: Cambridge University Press, 2006, XII.1.38-39.</w:t>
       </w:r>
     </w:p>
   </w:footnote>
-  <w:footnote w:id="15">
+  <w:footnote w:id="16">
     <w:p>
       <w:pPr>
         <w:bidi w:val="false"/>
@@ -8312,7 +8870,7 @@
           <w:szCs w:val="20"/>
           <w:rtl w:val="false"/>
         </w:rPr>
-        <w:t xml:space="preserve">Hadas, </w:t>
+        <w:t xml:space="preserve">T. H. White, </w:t>
       </w:r>
       <w:r>
         <w:rPr>
@@ -8323,18 +8881,62 @@
           <w:szCs w:val="20"/>
           <w:rtl w:val="false"/>
         </w:rPr>
-        <w:t xml:space="preserve">Fables of a Jewish Aesop</w:t>
-      </w:r>
-      <w:r>
-        <w:rPr>
-          <w:rFonts w:ascii="Times New Roman" w:cs="David" w:eastAsia="David" w:hAnsi="Times New Roman"/>
-          <w:i w:val="false"/>
-          <w:iCs w:val="false"/>
-          <w:sz w:val="20"/>
-          <w:szCs w:val="20"/>
-          <w:rtl w:val="false"/>
-        </w:rPr>
-        <w:t xml:space="preserve">, Introduction, pp. vii-xiv [</w:t>
+        <w:t xml:space="preserve">The Book of Beasts: Being a Translation from a Latin Bestiary of the Twelfth Century</w:t>
+      </w:r>
+      <w:r>
+        <w:rPr>
+          <w:rFonts w:ascii="Times New Roman" w:cs="David" w:eastAsia="David" w:hAnsi="Times New Roman"/>
+          <w:i w:val="false"/>
+          <w:iCs w:val="false"/>
+          <w:sz w:val="20"/>
+          <w:szCs w:val="20"/>
+          <w:rtl w:val="false"/>
+        </w:rPr>
+        <w:t xml:space="preserve">, London: Jonathan Cape, 1954, </w:t>
+      </w:r>
+      <w:r>
+        <w:rPr>
+          <w:rFonts w:ascii="Times New Roman" w:cs="David" w:eastAsia="David" w:hAnsi="Times New Roman"/>
+          <w:i w:val="false"/>
+          <w:iCs w:val="false"/>
+          <w:sz w:val="20"/>
+          <w:szCs w:val="20"/>
+          <w:rtl/>
+        </w:rPr>
+        <w:t xml:space="preserve">בערכים </w:t>
+      </w:r>
+      <w:r>
+        <w:rPr>
+          <w:rFonts w:ascii="Times New Roman" w:cs="David" w:eastAsia="David" w:hAnsi="Times New Roman"/>
+          <w:i w:val="false"/>
+          <w:iCs w:val="false"/>
+          <w:sz w:val="20"/>
+          <w:szCs w:val="20"/>
+          <w:rtl w:val="false"/>
+        </w:rPr>
+        <w:t xml:space="preserve">ass </w:t>
+      </w:r>
+      <w:r>
+        <w:rPr>
+          <w:rFonts w:ascii="Times New Roman" w:cs="David" w:eastAsia="David" w:hAnsi="Times New Roman"/>
+          <w:i w:val="false"/>
+          <w:iCs w:val="false"/>
+          <w:sz w:val="20"/>
+          <w:szCs w:val="20"/>
+          <w:rtl/>
+        </w:rPr>
+        <w:t xml:space="preserve">ו-</w:t>
+      </w:r>
+      <w:r>
+        <w:rPr>
+          <w:rFonts w:ascii="Times New Roman" w:cs="David" w:eastAsia="David" w:hAnsi="Times New Roman"/>
+          <w:i w:val="false"/>
+          <w:iCs w:val="false"/>
+          <w:sz w:val="20"/>
+          <w:szCs w:val="20"/>
+          <w:rtl w:val="false"/>
+        </w:rPr>
+        <w:t xml:space="preserve">onager [</w:t>
       </w:r>
       <w:r>
         <w:rPr>
@@ -8349,7 +8951,7 @@
       </w:r>
     </w:p>
   </w:footnote>
-  <w:footnote w:id="16">
+  <w:footnote w:id="17">
     <w:p>
       <w:pPr>
         <w:bidi w:val="false"/>
@@ -8371,7 +8973,7 @@
           <w:szCs w:val="20"/>
           <w:rtl w:val="false"/>
         </w:rPr>
-        <w:t xml:space="preserve">Jan M. Ziolkowski, </w:t>
+        <w:t xml:space="preserve">E. K. Chambers, </w:t>
       </w:r>
       <w:r>
         <w:rPr>
@@ -8382,22 +8984,118 @@
           <w:szCs w:val="20"/>
           <w:rtl w:val="false"/>
         </w:rPr>
-        <w:t xml:space="preserve">Talking Animals: Medieval Latin Beast Poetry, 750-1150</w:t>
-      </w:r>
-      <w:r>
-        <w:rPr>
-          <w:rFonts w:ascii="Times New Roman" w:cs="David" w:eastAsia="David" w:hAnsi="Times New Roman"/>
-          <w:i w:val="false"/>
-          <w:iCs w:val="false"/>
-          <w:sz w:val="20"/>
-          <w:szCs w:val="20"/>
-          <w:rtl w:val="false"/>
-        </w:rPr>
-        <w:t xml:space="preserve">, Philadelphia: University of Pennsylvania Press, 1993, pp. 1-14.</w:t>
+        <w:t xml:space="preserve">The Mediaeval Stage</w:t>
+      </w:r>
+      <w:r>
+        <w:rPr>
+          <w:rFonts w:ascii="Times New Roman" w:cs="David" w:eastAsia="David" w:hAnsi="Times New Roman"/>
+          <w:i w:val="false"/>
+          <w:iCs w:val="false"/>
+          <w:sz w:val="20"/>
+          <w:szCs w:val="20"/>
+          <w:rtl w:val="false"/>
+        </w:rPr>
+        <w:t xml:space="preserve">, vol. 1, Oxford: Clarendon Press, 1903, ch. 14 [</w:t>
+      </w:r>
+      <w:r>
+        <w:rPr>
+          <w:rFonts w:ascii="Times New Roman" w:cs="David" w:eastAsia="David" w:hAnsi="Times New Roman"/>
+          <w:i w:val="false"/>
+          <w:iCs w:val="false"/>
+          <w:sz w:val="20"/>
+          <w:szCs w:val="20"/>
+          <w:rtl/>
+        </w:rPr>
+        <w:t xml:space="preserve">לוודא עמודים].</w:t>
       </w:r>
     </w:p>
   </w:footnote>
-  <w:footnote w:id="17">
+  <w:footnote w:id="18">
+    <w:p>
+      <w:pPr>
+        <w:bidi/>
+        <w:spacing w:after="60" w:line="240"/>
+        <w:jc w:val="both"/>
+      </w:pPr>
+      <w:r>
+        <w:rPr>
+          <w:rStyle w:val="FootnoteReference"/>
+        </w:rPr>
+        <w:footnoteRef/>
+      </w:r>
+      <w:r>
+        <w:rPr>
+          <w:rFonts w:ascii="Times New Roman" w:cs="David" w:eastAsia="David" w:hAnsi="Times New Roman"/>
+          <w:i/>
+          <w:iCs/>
+          <w:sz w:val="20"/>
+          <w:szCs w:val="20"/>
+          <w:rtl/>
+        </w:rPr>
+        <w:t xml:space="preserve">הקוראן</w:t>
+      </w:r>
+      <w:r>
+        <w:rPr>
+          <w:rFonts w:ascii="Times New Roman" w:cs="David" w:eastAsia="David" w:hAnsi="Times New Roman"/>
+          <w:i w:val="false"/>
+          <w:iCs w:val="false"/>
+          <w:sz w:val="20"/>
+          <w:szCs w:val="20"/>
+          <w:rtl/>
+        </w:rPr>
+        <w:t xml:space="preserve">, תרגם מערבית אורי רובין, תל אביב: אוניברסיטת תל אביב, 2005, סורות 31, 62, 74. ההקשר הרביעי הוא סורה 2, פסוק 259, על האיש שחמורו הוחיה לאחר מאה שנה.</w:t>
+      </w:r>
+    </w:p>
+  </w:footnote>
+  <w:footnote w:id="19">
+    <w:p>
+      <w:pPr>
+        <w:bidi/>
+        <w:spacing w:after="60" w:line="240"/>
+        <w:jc w:val="both"/>
+      </w:pPr>
+      <w:r>
+        <w:rPr>
+          <w:rStyle w:val="FootnoteReference"/>
+        </w:rPr>
+        <w:footnoteRef/>
+      </w:r>
+      <w:r>
+        <w:rPr>
+          <w:rFonts w:ascii="Times New Roman" w:cs="David" w:eastAsia="David" w:hAnsi="Times New Roman"/>
+          <w:i w:val="false"/>
+          <w:iCs w:val="false"/>
+          <w:sz w:val="20"/>
+          <w:szCs w:val="20"/>
+          <w:rtl/>
+        </w:rPr>
+        <w:t xml:space="preserve">את גלגולו של הביטוי בספרות העברית של ימי הביניים יש לבדוק; ראו לפי שעה יסיף, </w:t>
+      </w:r>
+      <w:r>
+        <w:rPr>
+          <w:rFonts w:ascii="Times New Roman" w:cs="David" w:eastAsia="David" w:hAnsi="Times New Roman"/>
+          <w:i/>
+          <w:iCs/>
+          <w:sz w:val="20"/>
+          <w:szCs w:val="20"/>
+          <w:rtl/>
+        </w:rPr>
+        <w:t xml:space="preserve">סיפור העם העברי</w:t>
+      </w:r>
+      <w:r>
+        <w:rPr>
+          <w:rFonts w:ascii="Times New Roman" w:cs="David" w:eastAsia="David" w:hAnsi="Times New Roman"/>
+          <w:i w:val="false"/>
+          <w:iCs w:val="false"/>
+          <w:sz w:val="20"/>
+          <w:szCs w:val="20"/>
+          <w:rtl/>
+        </w:rPr>
+        <w:t xml:space="preserve">, במפתח בערך "חמור" [לוודא].</w:t>
+      </w:r>
+    </w:p>
+  </w:footnote>
+  <w:footnote w:id="20">
     <w:p>
       <w:pPr>
         <w:bidi w:val="false"/>
@@ -8419,7 +9117,7 @@
           <w:szCs w:val="20"/>
           <w:rtl w:val="false"/>
         </w:rPr>
-        <w:t xml:space="preserve">Berechiah ha-Nakdan, </w:t>
+        <w:t xml:space="preserve">Charles Pellat, "Djuha," in </w:t>
       </w:r>
       <w:r>
         <w:rPr>
@@ -8430,18 +9128,55 @@
           <w:szCs w:val="20"/>
           <w:rtl w:val="false"/>
         </w:rPr>
-        <w:t xml:space="preserve">Fables of a Jewish Aesop</w:t>
-      </w:r>
-      <w:r>
-        <w:rPr>
-          <w:rFonts w:ascii="Times New Roman" w:cs="David" w:eastAsia="David" w:hAnsi="Times New Roman"/>
-          <w:i w:val="false"/>
-          <w:iCs w:val="false"/>
-          <w:sz w:val="20"/>
-          <w:szCs w:val="20"/>
-          <w:rtl w:val="false"/>
-        </w:rPr>
-        <w:t xml:space="preserve">, trans. Moses Hadas, New York: Columbia University Press, 1967; Schwarzbaum, </w:t>
+        <w:t xml:space="preserve">The Encyclopaedia of Islam</w:t>
+      </w:r>
+      <w:r>
+        <w:rPr>
+          <w:rFonts w:ascii="Times New Roman" w:cs="David" w:eastAsia="David" w:hAnsi="Times New Roman"/>
+          <w:i w:val="false"/>
+          <w:iCs w:val="false"/>
+          <w:sz w:val="20"/>
+          <w:szCs w:val="20"/>
+          <w:rtl w:val="false"/>
+        </w:rPr>
+        <w:t xml:space="preserve">, 2nd ed., vol. 2, Leiden: Brill, 1965, pp. 590-592 [</w:t>
+      </w:r>
+      <w:r>
+        <w:rPr>
+          <w:rFonts w:ascii="Times New Roman" w:cs="David" w:eastAsia="David" w:hAnsi="Times New Roman"/>
+          <w:i w:val="false"/>
+          <w:iCs w:val="false"/>
+          <w:sz w:val="20"/>
+          <w:szCs w:val="20"/>
+          <w:rtl/>
+        </w:rPr>
+        <w:t xml:space="preserve">לוודא עמודים].</w:t>
+      </w:r>
+    </w:p>
+  </w:footnote>
+  <w:footnote w:id="21">
+    <w:p>
+      <w:pPr>
+        <w:bidi/>
+        <w:spacing w:after="60" w:line="240"/>
+        <w:jc w:val="both"/>
+      </w:pPr>
+      <w:r>
+        <w:rPr>
+          <w:rStyle w:val="FootnoteReference"/>
+        </w:rPr>
+        <w:footnoteRef/>
+      </w:r>
+      <w:r>
+        <w:rPr>
+          <w:rFonts w:ascii="Times New Roman" w:cs="David" w:eastAsia="David" w:hAnsi="Times New Roman"/>
+          <w:i w:val="false"/>
+          <w:iCs w:val="false"/>
+          <w:sz w:val="20"/>
+          <w:szCs w:val="20"/>
+          <w:rtl/>
+        </w:rPr>
+        <w:t xml:space="preserve">האחים גרים, </w:t>
       </w:r>
       <w:r>
         <w:rPr>
@@ -8450,24 +9185,57 @@
           <w:iCs/>
           <w:sz w:val="20"/>
           <w:szCs w:val="20"/>
-          <w:rtl w:val="false"/>
-        </w:rPr>
-        <w:t xml:space="preserve">Mishle Shu'alim</w:t>
-      </w:r>
-      <w:r>
-        <w:rPr>
-          <w:rFonts w:ascii="Times New Roman" w:cs="David" w:eastAsia="David" w:hAnsi="Times New Roman"/>
-          <w:i w:val="false"/>
-          <w:iCs w:val="false"/>
-          <w:sz w:val="20"/>
-          <w:szCs w:val="20"/>
-          <w:rtl/>
-        </w:rPr>
-        <w:t xml:space="preserve">.</w:t>
+          <w:rtl/>
+        </w:rPr>
+        <w:t xml:space="preserve">מעשיות האחים גרים</w:t>
+      </w:r>
+      <w:r>
+        <w:rPr>
+          <w:rFonts w:ascii="Times New Roman" w:cs="David" w:eastAsia="David" w:hAnsi="Times New Roman"/>
+          <w:i w:val="false"/>
+          <w:iCs w:val="false"/>
+          <w:sz w:val="20"/>
+          <w:szCs w:val="20"/>
+          <w:rtl/>
+        </w:rPr>
+        <w:t xml:space="preserve">, תרגם שמעון לוי, תל אביב: ספרית פועלים, 1994, מעשייה 27; </w:t>
+      </w:r>
+      <w:r>
+        <w:rPr>
+          <w:rFonts w:ascii="Times New Roman" w:cs="David" w:eastAsia="David" w:hAnsi="Times New Roman"/>
+          <w:i w:val="false"/>
+          <w:iCs w:val="false"/>
+          <w:sz w:val="20"/>
+          <w:szCs w:val="20"/>
+          <w:rtl w:val="false"/>
+        </w:rPr>
+        <w:t xml:space="preserve">Uther, </w:t>
+      </w:r>
+      <w:r>
+        <w:rPr>
+          <w:rFonts w:ascii="Times New Roman" w:cs="David" w:eastAsia="David" w:hAnsi="Times New Roman"/>
+          <w:i/>
+          <w:iCs/>
+          <w:sz w:val="20"/>
+          <w:szCs w:val="20"/>
+          <w:rtl w:val="false"/>
+        </w:rPr>
+        <w:t xml:space="preserve">Types of International Folktales</w:t>
+      </w:r>
+      <w:r>
+        <w:rPr>
+          <w:rFonts w:ascii="Times New Roman" w:cs="David" w:eastAsia="David" w:hAnsi="Times New Roman"/>
+          <w:i w:val="false"/>
+          <w:iCs w:val="false"/>
+          <w:sz w:val="20"/>
+          <w:szCs w:val="20"/>
+          <w:rtl w:val="false"/>
+        </w:rPr>
+        <w:t xml:space="preserve">, no. 130.</w:t>
       </w:r>
     </w:p>
   </w:footnote>
-  <w:footnote w:id="18">
+  <w:footnote w:id="22">
     <w:p>
       <w:pPr>
         <w:bidi w:val="false"/>
@@ -8489,7 +9257,7 @@
           <w:szCs w:val="20"/>
           <w:rtl w:val="false"/>
         </w:rPr>
-        <w:t xml:space="preserve">Schwarzbaum, </w:t>
+        <w:t xml:space="preserve">Jacobs, </w:t>
       </w:r>
       <w:r>
         <w:rPr>
@@ -8500,44 +9268,18 @@
           <w:szCs w:val="20"/>
           <w:rtl w:val="false"/>
         </w:rPr>
-        <w:t xml:space="preserve">Mishle Shu'alim</w:t>
-      </w:r>
-      <w:r>
-        <w:rPr>
-          <w:rFonts w:ascii="Times New Roman" w:cs="David" w:eastAsia="David" w:hAnsi="Times New Roman"/>
-          <w:i w:val="false"/>
-          <w:iCs w:val="false"/>
-          <w:sz w:val="20"/>
-          <w:szCs w:val="20"/>
-          <w:rtl w:val="false"/>
-        </w:rPr>
-        <w:t xml:space="preserve">, Introduction.</w:t>
-      </w:r>
-    </w:p>
-  </w:footnote>
-  <w:footnote w:id="19">
-    <w:p>
-      <w:pPr>
-        <w:bidi/>
-        <w:spacing w:after="60" w:line="240"/>
-        <w:jc w:val="both"/>
-      </w:pPr>
-      <w:r>
-        <w:rPr>
-          <w:rStyle w:val="FootnoteReference"/>
-        </w:rPr>
-        <w:footnoteRef/>
-      </w:r>
-      <w:r>
-        <w:rPr>
-          <w:rFonts w:ascii="Times New Roman" w:cs="David" w:eastAsia="David" w:hAnsi="Times New Roman"/>
-          <w:i w:val="false"/>
-          <w:iCs w:val="false"/>
-          <w:sz w:val="20"/>
-          <w:szCs w:val="20"/>
-          <w:rtl/>
-        </w:rPr>
-        <w:t xml:space="preserve">דן פגיס, </w:t>
+        <w:t xml:space="preserve">Fables of Aesop</w:t>
+      </w:r>
+      <w:r>
+        <w:rPr>
+          <w:rFonts w:ascii="Times New Roman" w:cs="David" w:eastAsia="David" w:hAnsi="Times New Roman"/>
+          <w:i w:val="false"/>
+          <w:iCs w:val="false"/>
+          <w:sz w:val="20"/>
+          <w:szCs w:val="20"/>
+          <w:rtl w:val="false"/>
+        </w:rPr>
+        <w:t xml:space="preserve">, vol. 1, pp. 168-178; Schwarzbaum, </w:t>
       </w:r>
       <w:r>
         <w:rPr>
@@ -8546,120 +9288,24 @@
           <w:iCs/>
           <w:sz w:val="20"/>
           <w:szCs w:val="20"/>
-          <w:rtl/>
-        </w:rPr>
-        <w:t xml:space="preserve">חידוש ומסורת בשירת החול העברית: ספרד ואיטליה</w:t>
-      </w:r>
-      <w:r>
-        <w:rPr>
-          <w:rFonts w:ascii="Times New Roman" w:cs="David" w:eastAsia="David" w:hAnsi="Times New Roman"/>
-          <w:i w:val="false"/>
-          <w:iCs w:val="false"/>
-          <w:sz w:val="20"/>
-          <w:szCs w:val="20"/>
-          <w:rtl/>
-        </w:rPr>
-        <w:t xml:space="preserve">, ירושלים: כתר, 1976, עמ' 70-77 [לוודא עמודים].</w:t>
+          <w:rtl w:val="false"/>
+        </w:rPr>
+        <w:t xml:space="preserve">Mishle Shu'alim</w:t>
+      </w:r>
+      <w:r>
+        <w:rPr>
+          <w:rFonts w:ascii="Times New Roman" w:cs="David" w:eastAsia="David" w:hAnsi="Times New Roman"/>
+          <w:i w:val="false"/>
+          <w:iCs w:val="false"/>
+          <w:sz w:val="20"/>
+          <w:szCs w:val="20"/>
+          <w:rtl w:val="false"/>
+        </w:rPr>
+        <w:t xml:space="preserve">, Introduction.</w:t>
       </w:r>
     </w:p>
   </w:footnote>
-  <w:footnote w:id="20">
-    <w:p>
-      <w:pPr>
-        <w:bidi/>
-        <w:spacing w:after="60" w:line="240"/>
-        <w:jc w:val="both"/>
-      </w:pPr>
-      <w:r>
-        <w:rPr>
-          <w:rStyle w:val="FootnoteReference"/>
-        </w:rPr>
-        <w:footnoteRef/>
-      </w:r>
-      <w:r>
-        <w:rPr>
-          <w:rFonts w:ascii="Times New Roman" w:cs="David" w:eastAsia="David" w:hAnsi="Times New Roman"/>
-          <w:i w:val="false"/>
-          <w:iCs w:val="false"/>
-          <w:sz w:val="20"/>
-          <w:szCs w:val="20"/>
-          <w:rtl/>
-        </w:rPr>
-        <w:t xml:space="preserve">ברכיה הנקדן, </w:t>
-      </w:r>
-      <w:r>
-        <w:rPr>
-          <w:rFonts w:ascii="Times New Roman" w:cs="David" w:eastAsia="David" w:hAnsi="Times New Roman"/>
-          <w:i/>
-          <w:iCs/>
-          <w:sz w:val="20"/>
-          <w:szCs w:val="20"/>
-          <w:rtl/>
-        </w:rPr>
-        <w:t xml:space="preserve">משלי שועלים</w:t>
-      </w:r>
-      <w:r>
-        <w:rPr>
-          <w:rFonts w:ascii="Times New Roman" w:cs="David" w:eastAsia="David" w:hAnsi="Times New Roman"/>
-          <w:i w:val="false"/>
-          <w:iCs w:val="false"/>
-          <w:sz w:val="20"/>
-          <w:szCs w:val="20"/>
-          <w:rtl/>
-        </w:rPr>
-        <w:t xml:space="preserve">, הקדמת המחבר, מהדורת הברמן [לוודא עמודים וציטוט מדויק].</w:t>
-      </w:r>
-    </w:p>
-  </w:footnote>
-  <w:footnote w:id="21">
-    <w:p>
-      <w:pPr>
-        <w:bidi/>
-        <w:spacing w:after="60" w:line="240"/>
-        <w:jc w:val="both"/>
-      </w:pPr>
-      <w:r>
-        <w:rPr>
-          <w:rStyle w:val="FootnoteReference"/>
-        </w:rPr>
-        <w:footnoteRef/>
-      </w:r>
-      <w:r>
-        <w:rPr>
-          <w:rFonts w:ascii="Times New Roman" w:cs="David" w:eastAsia="David" w:hAnsi="Times New Roman"/>
-          <w:i w:val="false"/>
-          <w:iCs w:val="false"/>
-          <w:sz w:val="20"/>
-          <w:szCs w:val="20"/>
-          <w:rtl/>
-        </w:rPr>
-        <w:t xml:space="preserve">ברכיה הנקדן, </w:t>
-      </w:r>
-      <w:r>
-        <w:rPr>
-          <w:rFonts w:ascii="Times New Roman" w:cs="David" w:eastAsia="David" w:hAnsi="Times New Roman"/>
-          <w:i/>
-          <w:iCs/>
-          <w:sz w:val="20"/>
-          <w:szCs w:val="20"/>
-          <w:rtl/>
-        </w:rPr>
-        <w:t xml:space="preserve">משלי שועלים</w:t>
-      </w:r>
-      <w:r>
-        <w:rPr>
-          <w:rFonts w:ascii="Times New Roman" w:cs="David" w:eastAsia="David" w:hAnsi="Times New Roman"/>
-          <w:i w:val="false"/>
-          <w:iCs w:val="false"/>
-          <w:sz w:val="20"/>
-          <w:szCs w:val="20"/>
-          <w:rtl/>
-        </w:rPr>
-        <w:t xml:space="preserve">, משל סה, מהדורת הברמן [לוודא נוסח החרוז הפותח].</w:t>
-      </w:r>
-    </w:p>
-  </w:footnote>
-  <w:footnote w:id="22">
+  <w:footnote w:id="23">
     <w:p>
       <w:pPr>
         <w:bidi w:val="false"/>
@@ -8681,7 +9327,7 @@
           <w:szCs w:val="20"/>
           <w:rtl w:val="false"/>
         </w:rPr>
-        <w:t xml:space="preserve">Perry, </w:t>
+        <w:t xml:space="preserve">Hadas, </w:t>
       </w:r>
       <w:r>
         <w:rPr>
@@ -8692,18 +9338,55 @@
           <w:szCs w:val="20"/>
           <w:rtl w:val="false"/>
         </w:rPr>
-        <w:t xml:space="preserve">Babrius and Phaedrus</w:t>
-      </w:r>
-      <w:r>
-        <w:rPr>
-          <w:rFonts w:ascii="Times New Roman" w:cs="David" w:eastAsia="David" w:hAnsi="Times New Roman"/>
-          <w:i w:val="false"/>
-          <w:iCs w:val="false"/>
-          <w:sz w:val="20"/>
-          <w:szCs w:val="20"/>
-          <w:rtl w:val="false"/>
-        </w:rPr>
-        <w:t xml:space="preserve">, Phaedrus 1.11; Schwarzbaum, </w:t>
+        <w:t xml:space="preserve">Fables of a Jewish Aesop</w:t>
+      </w:r>
+      <w:r>
+        <w:rPr>
+          <w:rFonts w:ascii="Times New Roman" w:cs="David" w:eastAsia="David" w:hAnsi="Times New Roman"/>
+          <w:i w:val="false"/>
+          <w:iCs w:val="false"/>
+          <w:sz w:val="20"/>
+          <w:szCs w:val="20"/>
+          <w:rtl w:val="false"/>
+        </w:rPr>
+        <w:t xml:space="preserve">, Introduction, pp. vii-xiv [</w:t>
+      </w:r>
+      <w:r>
+        <w:rPr>
+          <w:rFonts w:ascii="Times New Roman" w:cs="David" w:eastAsia="David" w:hAnsi="Times New Roman"/>
+          <w:i w:val="false"/>
+          <w:iCs w:val="false"/>
+          <w:sz w:val="20"/>
+          <w:szCs w:val="20"/>
+          <w:rtl/>
+        </w:rPr>
+        <w:t xml:space="preserve">לוודא עמודים].</w:t>
+      </w:r>
+    </w:p>
+  </w:footnote>
+  <w:footnote w:id="24">
+    <w:p>
+      <w:pPr>
+        <w:bidi w:val="false"/>
+        <w:spacing w:after="60" w:line="240"/>
+        <w:jc w:val="left"/>
+      </w:pPr>
+      <w:r>
+        <w:rPr>
+          <w:rStyle w:val="FootnoteReference"/>
+        </w:rPr>
+        <w:footnoteRef/>
+      </w:r>
+      <w:r>
+        <w:rPr>
+          <w:rFonts w:ascii="Times New Roman" w:cs="David" w:eastAsia="David" w:hAnsi="Times New Roman"/>
+          <w:i w:val="false"/>
+          <w:iCs w:val="false"/>
+          <w:sz w:val="20"/>
+          <w:szCs w:val="20"/>
+          <w:rtl w:val="false"/>
+        </w:rPr>
+        <w:t xml:space="preserve">Jan M. Ziolkowski, </w:t>
       </w:r>
       <w:r>
         <w:rPr>
@@ -8714,6 +9397,76 @@
           <w:szCs w:val="20"/>
           <w:rtl w:val="false"/>
         </w:rPr>
+        <w:t xml:space="preserve">Talking Animals: Medieval Latin Beast Poetry, 750-1150</w:t>
+      </w:r>
+      <w:r>
+        <w:rPr>
+          <w:rFonts w:ascii="Times New Roman" w:cs="David" w:eastAsia="David" w:hAnsi="Times New Roman"/>
+          <w:i w:val="false"/>
+          <w:iCs w:val="false"/>
+          <w:sz w:val="20"/>
+          <w:szCs w:val="20"/>
+          <w:rtl w:val="false"/>
+        </w:rPr>
+        <w:t xml:space="preserve">, Philadelphia: University of Pennsylvania Press, 1993, pp. 1-14.</w:t>
+      </w:r>
+    </w:p>
+  </w:footnote>
+  <w:footnote w:id="25">
+    <w:p>
+      <w:pPr>
+        <w:bidi w:val="false"/>
+        <w:spacing w:after="60" w:line="240"/>
+        <w:jc w:val="left"/>
+      </w:pPr>
+      <w:r>
+        <w:rPr>
+          <w:rStyle w:val="FootnoteReference"/>
+        </w:rPr>
+        <w:footnoteRef/>
+      </w:r>
+      <w:r>
+        <w:rPr>
+          <w:rFonts w:ascii="Times New Roman" w:cs="David" w:eastAsia="David" w:hAnsi="Times New Roman"/>
+          <w:i w:val="false"/>
+          <w:iCs w:val="false"/>
+          <w:sz w:val="20"/>
+          <w:szCs w:val="20"/>
+          <w:rtl w:val="false"/>
+        </w:rPr>
+        <w:t xml:space="preserve">Berechiah ha-Nakdan, </w:t>
+      </w:r>
+      <w:r>
+        <w:rPr>
+          <w:rFonts w:ascii="Times New Roman" w:cs="David" w:eastAsia="David" w:hAnsi="Times New Roman"/>
+          <w:i/>
+          <w:iCs/>
+          <w:sz w:val="20"/>
+          <w:szCs w:val="20"/>
+          <w:rtl w:val="false"/>
+        </w:rPr>
+        <w:t xml:space="preserve">Fables of a Jewish Aesop</w:t>
+      </w:r>
+      <w:r>
+        <w:rPr>
+          <w:rFonts w:ascii="Times New Roman" w:cs="David" w:eastAsia="David" w:hAnsi="Times New Roman"/>
+          <w:i w:val="false"/>
+          <w:iCs w:val="false"/>
+          <w:sz w:val="20"/>
+          <w:szCs w:val="20"/>
+          <w:rtl w:val="false"/>
+        </w:rPr>
+        <w:t xml:space="preserve">, trans. Moses Hadas, New York: Columbia University Press, 1967; Schwarzbaum, </w:t>
+      </w:r>
+      <w:r>
+        <w:rPr>
+          <w:rFonts w:ascii="Times New Roman" w:cs="David" w:eastAsia="David" w:hAnsi="Times New Roman"/>
+          <w:i/>
+          <w:iCs/>
+          <w:sz w:val="20"/>
+          <w:szCs w:val="20"/>
+          <w:rtl w:val="false"/>
+        </w:rPr>
         <w:t xml:space="preserve">Mishle Shu'alim</w:t>
       </w:r>
       <w:r>
@@ -8725,11 +9478,273 @@
           <w:szCs w:val="20"/>
           <w:rtl/>
         </w:rPr>
+        <w:t xml:space="preserve">.</w:t>
+      </w:r>
+    </w:p>
+  </w:footnote>
+  <w:footnote w:id="26">
+    <w:p>
+      <w:pPr>
+        <w:bidi w:val="false"/>
+        <w:spacing w:after="60" w:line="240"/>
+        <w:jc w:val="left"/>
+      </w:pPr>
+      <w:r>
+        <w:rPr>
+          <w:rStyle w:val="FootnoteReference"/>
+        </w:rPr>
+        <w:footnoteRef/>
+      </w:r>
+      <w:r>
+        <w:rPr>
+          <w:rFonts w:ascii="Times New Roman" w:cs="David" w:eastAsia="David" w:hAnsi="Times New Roman"/>
+          <w:i w:val="false"/>
+          <w:iCs w:val="false"/>
+          <w:sz w:val="20"/>
+          <w:szCs w:val="20"/>
+          <w:rtl w:val="false"/>
+        </w:rPr>
+        <w:t xml:space="preserve">Schwarzbaum, </w:t>
+      </w:r>
+      <w:r>
+        <w:rPr>
+          <w:rFonts w:ascii="Times New Roman" w:cs="David" w:eastAsia="David" w:hAnsi="Times New Roman"/>
+          <w:i/>
+          <w:iCs/>
+          <w:sz w:val="20"/>
+          <w:szCs w:val="20"/>
+          <w:rtl w:val="false"/>
+        </w:rPr>
+        <w:t xml:space="preserve">Mishle Shu'alim</w:t>
+      </w:r>
+      <w:r>
+        <w:rPr>
+          <w:rFonts w:ascii="Times New Roman" w:cs="David" w:eastAsia="David" w:hAnsi="Times New Roman"/>
+          <w:i w:val="false"/>
+          <w:iCs w:val="false"/>
+          <w:sz w:val="20"/>
+          <w:szCs w:val="20"/>
+          <w:rtl w:val="false"/>
+        </w:rPr>
+        <w:t xml:space="preserve">, Introduction.</w:t>
+      </w:r>
+    </w:p>
+  </w:footnote>
+  <w:footnote w:id="27">
+    <w:p>
+      <w:pPr>
+        <w:bidi/>
+        <w:spacing w:after="60" w:line="240"/>
+        <w:jc w:val="both"/>
+      </w:pPr>
+      <w:r>
+        <w:rPr>
+          <w:rStyle w:val="FootnoteReference"/>
+        </w:rPr>
+        <w:footnoteRef/>
+      </w:r>
+      <w:r>
+        <w:rPr>
+          <w:rFonts w:ascii="Times New Roman" w:cs="David" w:eastAsia="David" w:hAnsi="Times New Roman"/>
+          <w:i w:val="false"/>
+          <w:iCs w:val="false"/>
+          <w:sz w:val="20"/>
+          <w:szCs w:val="20"/>
+          <w:rtl/>
+        </w:rPr>
+        <w:t xml:space="preserve">דן פגיס, </w:t>
+      </w:r>
+      <w:r>
+        <w:rPr>
+          <w:rFonts w:ascii="Times New Roman" w:cs="David" w:eastAsia="David" w:hAnsi="Times New Roman"/>
+          <w:i/>
+          <w:iCs/>
+          <w:sz w:val="20"/>
+          <w:szCs w:val="20"/>
+          <w:rtl/>
+        </w:rPr>
+        <w:t xml:space="preserve">חידוש ומסורת בשירת החול העברית: ספרד ואיטליה</w:t>
+      </w:r>
+      <w:r>
+        <w:rPr>
+          <w:rFonts w:ascii="Times New Roman" w:cs="David" w:eastAsia="David" w:hAnsi="Times New Roman"/>
+          <w:i w:val="false"/>
+          <w:iCs w:val="false"/>
+          <w:sz w:val="20"/>
+          <w:szCs w:val="20"/>
+          <w:rtl/>
+        </w:rPr>
+        <w:t xml:space="preserve">, ירושלים: כתר, 1976, עמ' 70-77 [לוודא עמודים].</w:t>
+      </w:r>
+    </w:p>
+  </w:footnote>
+  <w:footnote w:id="28">
+    <w:p>
+      <w:pPr>
+        <w:bidi/>
+        <w:spacing w:after="60" w:line="240"/>
+        <w:jc w:val="both"/>
+      </w:pPr>
+      <w:r>
+        <w:rPr>
+          <w:rStyle w:val="FootnoteReference"/>
+        </w:rPr>
+        <w:footnoteRef/>
+      </w:r>
+      <w:r>
+        <w:rPr>
+          <w:rFonts w:ascii="Times New Roman" w:cs="David" w:eastAsia="David" w:hAnsi="Times New Roman"/>
+          <w:i w:val="false"/>
+          <w:iCs w:val="false"/>
+          <w:sz w:val="20"/>
+          <w:szCs w:val="20"/>
+          <w:rtl/>
+        </w:rPr>
+        <w:t xml:space="preserve">ברכיה הנקדן, </w:t>
+      </w:r>
+      <w:r>
+        <w:rPr>
+          <w:rFonts w:ascii="Times New Roman" w:cs="David" w:eastAsia="David" w:hAnsi="Times New Roman"/>
+          <w:i/>
+          <w:iCs/>
+          <w:sz w:val="20"/>
+          <w:szCs w:val="20"/>
+          <w:rtl/>
+        </w:rPr>
+        <w:t xml:space="preserve">משלי שועלים</w:t>
+      </w:r>
+      <w:r>
+        <w:rPr>
+          <w:rFonts w:ascii="Times New Roman" w:cs="David" w:eastAsia="David" w:hAnsi="Times New Roman"/>
+          <w:i w:val="false"/>
+          <w:iCs w:val="false"/>
+          <w:sz w:val="20"/>
+          <w:szCs w:val="20"/>
+          <w:rtl/>
+        </w:rPr>
+        <w:t xml:space="preserve">, הקדמת המחבר, מהדורת הברמן [לוודא עמודים וציטוט מדויק].</w:t>
+      </w:r>
+    </w:p>
+  </w:footnote>
+  <w:footnote w:id="29">
+    <w:p>
+      <w:pPr>
+        <w:bidi/>
+        <w:spacing w:after="60" w:line="240"/>
+        <w:jc w:val="both"/>
+      </w:pPr>
+      <w:r>
+        <w:rPr>
+          <w:rStyle w:val="FootnoteReference"/>
+        </w:rPr>
+        <w:footnoteRef/>
+      </w:r>
+      <w:r>
+        <w:rPr>
+          <w:rFonts w:ascii="Times New Roman" w:cs="David" w:eastAsia="David" w:hAnsi="Times New Roman"/>
+          <w:i w:val="false"/>
+          <w:iCs w:val="false"/>
+          <w:sz w:val="20"/>
+          <w:szCs w:val="20"/>
+          <w:rtl/>
+        </w:rPr>
+        <w:t xml:space="preserve">ברכיה הנקדן, </w:t>
+      </w:r>
+      <w:r>
+        <w:rPr>
+          <w:rFonts w:ascii="Times New Roman" w:cs="David" w:eastAsia="David" w:hAnsi="Times New Roman"/>
+          <w:i/>
+          <w:iCs/>
+          <w:sz w:val="20"/>
+          <w:szCs w:val="20"/>
+          <w:rtl/>
+        </w:rPr>
+        <w:t xml:space="preserve">משלי שועלים</w:t>
+      </w:r>
+      <w:r>
+        <w:rPr>
+          <w:rFonts w:ascii="Times New Roman" w:cs="David" w:eastAsia="David" w:hAnsi="Times New Roman"/>
+          <w:i w:val="false"/>
+          <w:iCs w:val="false"/>
+          <w:sz w:val="20"/>
+          <w:szCs w:val="20"/>
+          <w:rtl/>
+        </w:rPr>
+        <w:t xml:space="preserve">, משל סה, מהדורת הברמן [לוודא נוסח החרוז הפותח].</w:t>
+      </w:r>
+    </w:p>
+  </w:footnote>
+  <w:footnote w:id="30">
+    <w:p>
+      <w:pPr>
+        <w:bidi w:val="false"/>
+        <w:spacing w:after="60" w:line="240"/>
+        <w:jc w:val="left"/>
+      </w:pPr>
+      <w:r>
+        <w:rPr>
+          <w:rStyle w:val="FootnoteReference"/>
+        </w:rPr>
+        <w:footnoteRef/>
+      </w:r>
+      <w:r>
+        <w:rPr>
+          <w:rFonts w:ascii="Times New Roman" w:cs="David" w:eastAsia="David" w:hAnsi="Times New Roman"/>
+          <w:i w:val="false"/>
+          <w:iCs w:val="false"/>
+          <w:sz w:val="20"/>
+          <w:szCs w:val="20"/>
+          <w:rtl w:val="false"/>
+        </w:rPr>
+        <w:t xml:space="preserve">Perry, </w:t>
+      </w:r>
+      <w:r>
+        <w:rPr>
+          <w:rFonts w:ascii="Times New Roman" w:cs="David" w:eastAsia="David" w:hAnsi="Times New Roman"/>
+          <w:i/>
+          <w:iCs/>
+          <w:sz w:val="20"/>
+          <w:szCs w:val="20"/>
+          <w:rtl w:val="false"/>
+        </w:rPr>
+        <w:t xml:space="preserve">Babrius and Phaedrus</w:t>
+      </w:r>
+      <w:r>
+        <w:rPr>
+          <w:rFonts w:ascii="Times New Roman" w:cs="David" w:eastAsia="David" w:hAnsi="Times New Roman"/>
+          <w:i w:val="false"/>
+          <w:iCs w:val="false"/>
+          <w:sz w:val="20"/>
+          <w:szCs w:val="20"/>
+          <w:rtl w:val="false"/>
+        </w:rPr>
+        <w:t xml:space="preserve">, Phaedrus 1.11; Schwarzbaum, </w:t>
+      </w:r>
+      <w:r>
+        <w:rPr>
+          <w:rFonts w:ascii="Times New Roman" w:cs="David" w:eastAsia="David" w:hAnsi="Times New Roman"/>
+          <w:i/>
+          <w:iCs/>
+          <w:sz w:val="20"/>
+          <w:szCs w:val="20"/>
+          <w:rtl w:val="false"/>
+        </w:rPr>
+        <w:t xml:space="preserve">Mishle Shu'alim</w:t>
+      </w:r>
+      <w:r>
+        <w:rPr>
+          <w:rFonts w:ascii="Times New Roman" w:cs="David" w:eastAsia="David" w:hAnsi="Times New Roman"/>
+          <w:i w:val="false"/>
+          <w:iCs w:val="false"/>
+          <w:sz w:val="20"/>
+          <w:szCs w:val="20"/>
+          <w:rtl/>
+        </w:rPr>
         <w:t xml:space="preserve">, בדיון על משל סה [לוודא עמודים].</w:t>
       </w:r>
     </w:p>
   </w:footnote>
-  <w:footnote w:id="23">
+  <w:footnote w:id="31">
     <w:p>
       <w:pPr>
         <w:bidi/>

</xml_diff>

<commit_message>
Integrate seven vetted secondary sources into the seminar paper
Adds Schwarzbaum (Hebrew congress paper), Stern on the rabbinic mashal,
Cohen on the Shpan Aesop translation, Yassif on the exemplum in Sefer
Hasidim, Shapira on the narrative mashal and Fruchtman on La Fontaine
in Hebrew, with footnotes in chapters 1, 2 and 7 and bibliography
entries; fixes alphabetical order of two bibliography entries.

Co-Authored-By: Claude Fable 5.1 <noreply@anthropic.com>
Claude-Session: https://claude.ai/code/session_01LePeB11iN6PJ4Nt39a92mY
</commit_message>
<xml_diff>
--- a/seminar/seminar-donkey-fables.docx
+++ b/seminar/seminar-donkey-fables.docx
@@ -513,7 +513,7 @@
           <w:rtl/>
           <w:lang w:val="en-US" w:bidi="he-IL"/>
         </w:rPr>
-        <w:t xml:space="preserve">	7</w:t>
+        <w:t xml:space="preserve">	8</w:t>
       </w:r>
     </w:p>
     <w:p>
@@ -550,7 +550,7 @@
           <w:rtl/>
           <w:lang w:val="en-US" w:bidi="he-IL"/>
         </w:rPr>
-        <w:t xml:space="preserve">	7</w:t>
+        <w:t xml:space="preserve">	8</w:t>
       </w:r>
     </w:p>
     <w:p>
@@ -587,7 +587,7 @@
           <w:rtl/>
           <w:lang w:val="en-US" w:bidi="he-IL"/>
         </w:rPr>
-        <w:t xml:space="preserve">	7</w:t>
+        <w:t xml:space="preserve">	8</w:t>
       </w:r>
     </w:p>
     <w:p>
@@ -624,7 +624,7 @@
           <w:rtl/>
           <w:lang w:val="en-US" w:bidi="he-IL"/>
         </w:rPr>
-        <w:t xml:space="preserve">	8</w:t>
+        <w:t xml:space="preserve">	9</w:t>
       </w:r>
     </w:p>
     <w:p>
@@ -661,7 +661,7 @@
           <w:rtl/>
           <w:lang w:val="en-US" w:bidi="he-IL"/>
         </w:rPr>
-        <w:t xml:space="preserve">	8</w:t>
+        <w:t xml:space="preserve">	9</w:t>
       </w:r>
     </w:p>
     <w:p>
@@ -697,7 +697,7 @@
           <w:rtl/>
           <w:lang w:val="en-US" w:bidi="he-IL"/>
         </w:rPr>
-        <w:t xml:space="preserve">	10</w:t>
+        <w:t xml:space="preserve">	11</w:t>
       </w:r>
     </w:p>
     <w:p>
@@ -734,7 +734,7 @@
           <w:rtl/>
           <w:lang w:val="en-US" w:bidi="he-IL"/>
         </w:rPr>
-        <w:t xml:space="preserve">	10</w:t>
+        <w:t xml:space="preserve">	11</w:t>
       </w:r>
     </w:p>
     <w:p>
@@ -771,7 +771,7 @@
           <w:rtl/>
           <w:lang w:val="en-US" w:bidi="he-IL"/>
         </w:rPr>
-        <w:t xml:space="preserve">	10</w:t>
+        <w:t xml:space="preserve">	11</w:t>
       </w:r>
     </w:p>
     <w:p>
@@ -808,7 +808,7 @@
           <w:rtl/>
           <w:lang w:val="en-US" w:bidi="he-IL"/>
         </w:rPr>
-        <w:t xml:space="preserve">	11</w:t>
+        <w:t xml:space="preserve">	12</w:t>
       </w:r>
     </w:p>
     <w:p>
@@ -845,7 +845,7 @@
           <w:rtl/>
           <w:lang w:val="en-US" w:bidi="he-IL"/>
         </w:rPr>
-        <w:t xml:space="preserve">	12</w:t>
+        <w:t xml:space="preserve">	13</w:t>
       </w:r>
     </w:p>
     <w:p>
@@ -881,7 +881,7 @@
           <w:rtl/>
           <w:lang w:val="en-US" w:bidi="he-IL"/>
         </w:rPr>
-        <w:t xml:space="preserve">	13</w:t>
+        <w:t xml:space="preserve">	14</w:t>
       </w:r>
     </w:p>
     <w:p>
@@ -918,7 +918,7 @@
           <w:rtl/>
           <w:lang w:val="en-US" w:bidi="he-IL"/>
         </w:rPr>
-        <w:t xml:space="preserve">	13</w:t>
+        <w:t xml:space="preserve">	14</w:t>
       </w:r>
     </w:p>
     <w:p>
@@ -955,7 +955,7 @@
           <w:rtl/>
           <w:lang w:val="en-US" w:bidi="he-IL"/>
         </w:rPr>
-        <w:t xml:space="preserve">	13</w:t>
+        <w:t xml:space="preserve">	14</w:t>
       </w:r>
     </w:p>
     <w:p>
@@ -992,7 +992,7 @@
           <w:rtl/>
           <w:lang w:val="en-US" w:bidi="he-IL"/>
         </w:rPr>
-        <w:t xml:space="preserve">	14</w:t>
+        <w:t xml:space="preserve">	15</w:t>
       </w:r>
     </w:p>
     <w:p>
@@ -1029,7 +1029,7 @@
           <w:rtl/>
           <w:lang w:val="en-US" w:bidi="he-IL"/>
         </w:rPr>
-        <w:t xml:space="preserve">	15</w:t>
+        <w:t xml:space="preserve">	16</w:t>
       </w:r>
     </w:p>
     <w:p>
@@ -1065,7 +1065,7 @@
           <w:rtl/>
           <w:lang w:val="en-US" w:bidi="he-IL"/>
         </w:rPr>
-        <w:t xml:space="preserve">	16</w:t>
+        <w:t xml:space="preserve">	17</w:t>
       </w:r>
     </w:p>
     <w:p>
@@ -1102,7 +1102,7 @@
           <w:rtl/>
           <w:lang w:val="en-US" w:bidi="he-IL"/>
         </w:rPr>
-        <w:t xml:space="preserve">	16</w:t>
+        <w:t xml:space="preserve">	17</w:t>
       </w:r>
     </w:p>
     <w:p>
@@ -1139,7 +1139,7 @@
           <w:rtl/>
           <w:lang w:val="en-US" w:bidi="he-IL"/>
         </w:rPr>
-        <w:t xml:space="preserve">	16</w:t>
+        <w:t xml:space="preserve">	17</w:t>
       </w:r>
     </w:p>
     <w:p>
@@ -1176,7 +1176,7 @@
           <w:rtl/>
           <w:lang w:val="en-US" w:bidi="he-IL"/>
         </w:rPr>
-        <w:t xml:space="preserve">	17</w:t>
+        <w:t xml:space="preserve">	18</w:t>
       </w:r>
     </w:p>
     <w:p>
@@ -1213,7 +1213,7 @@
           <w:rtl/>
           <w:lang w:val="en-US" w:bidi="he-IL"/>
         </w:rPr>
-        <w:t xml:space="preserve">	17</w:t>
+        <w:t xml:space="preserve">	18</w:t>
       </w:r>
     </w:p>
     <w:p>
@@ -1249,7 +1249,7 @@
           <w:rtl/>
           <w:lang w:val="en-US" w:bidi="he-IL"/>
         </w:rPr>
-        <w:t xml:space="preserve">	19</w:t>
+        <w:t xml:space="preserve">	20</w:t>
       </w:r>
     </w:p>
     <w:p>
@@ -1286,7 +1286,7 @@
           <w:rtl/>
           <w:lang w:val="en-US" w:bidi="he-IL"/>
         </w:rPr>
-        <w:t xml:space="preserve">	19</w:t>
+        <w:t xml:space="preserve">	20</w:t>
       </w:r>
     </w:p>
     <w:p>
@@ -1323,7 +1323,7 @@
           <w:rtl/>
           <w:lang w:val="en-US" w:bidi="he-IL"/>
         </w:rPr>
-        <w:t xml:space="preserve">	19</w:t>
+        <w:t xml:space="preserve">	20</w:t>
       </w:r>
     </w:p>
     <w:p>
@@ -1360,7 +1360,7 @@
           <w:rtl/>
           <w:lang w:val="en-US" w:bidi="he-IL"/>
         </w:rPr>
-        <w:t xml:space="preserve">	21</w:t>
+        <w:t xml:space="preserve">	22</w:t>
       </w:r>
     </w:p>
     <w:p>
@@ -1397,7 +1397,7 @@
           <w:rtl/>
           <w:lang w:val="en-US" w:bidi="he-IL"/>
         </w:rPr>
-        <w:t xml:space="preserve">	21</w:t>
+        <w:t xml:space="preserve">	22</w:t>
       </w:r>
     </w:p>
     <w:p>
@@ -1433,7 +1433,7 @@
           <w:rtl/>
           <w:lang w:val="en-US" w:bidi="he-IL"/>
         </w:rPr>
-        <w:t xml:space="preserve">	23</w:t>
+        <w:t xml:space="preserve">	24</w:t>
       </w:r>
     </w:p>
     <w:p>
@@ -1469,7 +1469,7 @@
           <w:rtl/>
           <w:lang w:val="en-US" w:bidi="he-IL"/>
         </w:rPr>
-        <w:t xml:space="preserve">	25</w:t>
+        <w:t xml:space="preserve">	26</w:t>
       </w:r>
     </w:p>
     <w:p>
@@ -1505,7 +1505,7 @@
           <w:rtl/>
           <w:lang w:val="en-US" w:bidi="he-IL"/>
         </w:rPr>
-        <w:t xml:space="preserve">	27</w:t>
+        <w:t xml:space="preserve">	28</w:t>
       </w:r>
     </w:p>
     <w:p>
@@ -1542,7 +1542,7 @@
           <w:rtl/>
           <w:lang w:val="en-US" w:bidi="he-IL"/>
         </w:rPr>
-        <w:t xml:space="preserve">	27</w:t>
+        <w:t xml:space="preserve">	28</w:t>
       </w:r>
     </w:p>
     <w:p>
@@ -1579,7 +1579,7 @@
           <w:rtl/>
           <w:lang w:val="en-US" w:bidi="he-IL"/>
         </w:rPr>
-        <w:t xml:space="preserve">	27</w:t>
+        <w:t xml:space="preserve">	28</w:t>
       </w:r>
     </w:p>
     <w:p>
@@ -1616,7 +1616,7 @@
           <w:rtl/>
           <w:lang w:val="en-US" w:bidi="he-IL"/>
         </w:rPr>
-        <w:t xml:space="preserve">	28</w:t>
+        <w:t xml:space="preserve">	29</w:t>
       </w:r>
     </w:p>
     <w:p>
@@ -1653,7 +1653,7 @@
           <w:rtl/>
           <w:lang w:val="en-US" w:bidi="he-IL"/>
         </w:rPr>
-        <w:t xml:space="preserve">	29</w:t>
+        <w:t xml:space="preserve">	30</w:t>
       </w:r>
     </w:p>
     <w:p>
@@ -2077,6 +2077,38 @@
         </w:rPr>
         <w:footnoteReference w:id="5"/>
       </w:r>
+      <w:r>
+        <w:rPr>
+          <w:rFonts w:ascii="Times New Roman" w:cs="David" w:eastAsia="David" w:hAnsi="Times New Roman"/>
+          <w:i w:val="false"/>
+          <w:iCs w:val="false"/>
+          <w:noProof/>
+          <w:sz w:val="24"/>
+          <w:szCs w:val="24"/>
+          <w:rtl/>
+          <w:lang w:val="en-US" w:bidi="he-IL"/>
+        </w:rPr>
+        <w:t xml:space="preserve"> דוד שטרן, שחקר את תפקידו של המשל בספרות חז"ל, הראה שהמשל הדרשני הוא קודם כול כלי רטורי, ושאפשר למיין כמעט כל משל לפי מטרתו: שבח או גנאי, ובתוכם אזהרה, תלונה, פולמוס ונחמה.</w:t>
+      </w:r>
+      <w:r>
+        <w:rPr>
+          <w:rStyle w:val="FootnoteReference"/>
+        </w:rPr>
+        <w:footnoteReference w:id="6"/>
+      </w:r>
+      <w:r>
+        <w:rPr>
+          <w:rFonts w:ascii="Times New Roman" w:cs="David" w:eastAsia="David" w:hAnsi="Times New Roman"/>
+          <w:i w:val="false"/>
+          <w:iCs w:val="false"/>
+          <w:noProof/>
+          <w:sz w:val="24"/>
+          <w:szCs w:val="24"/>
+          <w:rtl/>
+          <w:lang w:val="en-US" w:bidi="he-IL"/>
+        </w:rPr>
+        <w:t xml:space="preserve"> לפי המיון הזה ארבעת משלי החמור של ברכיה הם משלי גנאי ואזהרה, וכך גם ננתח אותם.</w:t>
+      </w:r>
     </w:p>
     <w:p>
       <w:pPr>
@@ -2125,7 +2157,26 @@
         <w:rPr>
           <w:rStyle w:val="FootnoteReference"/>
         </w:rPr>
-        <w:footnoteReference w:id="6"/>
+        <w:footnoteReference w:id="7"/>
+      </w:r>
+      <w:r>
+        <w:rPr>
+          <w:rFonts w:ascii="Times New Roman" w:cs="David" w:eastAsia="David" w:hAnsi="Times New Roman"/>
+          <w:i w:val="false"/>
+          <w:iCs w:val="false"/>
+          <w:noProof/>
+          <w:sz w:val="24"/>
+          <w:szCs w:val="24"/>
+          <w:rtl/>
+          <w:lang w:val="en-US" w:bidi="he-IL"/>
+        </w:rPr>
+        <w:t xml:space="preserve"> עם הופעת תרגומו של שפאן עמד ישראל כהן על הקרבה בין משלי איזופוס למשלי שועלים, והדפיס זה לצד זה את "הזאב והעגור" בנוסח ברכיה ובנוסח האיזופי, כדי להראות מה עשה ברכיה למקורו.</w:t>
+      </w:r>
+      <w:r>
+        <w:rPr>
+          <w:rStyle w:val="FootnoteReference"/>
+        </w:rPr>
+        <w:footnoteReference w:id="8"/>
       </w:r>
       <w:r>
         <w:rPr>
@@ -2144,7 +2195,7 @@
         <w:rPr>
           <w:rStyle w:val="FootnoteReference"/>
         </w:rPr>
-        <w:footnoteReference w:id="7"/>
+        <w:footnoteReference w:id="9"/>
       </w:r>
     </w:p>
     <w:p>
@@ -2164,7 +2215,26 @@
           <w:rtl/>
           <w:lang w:val="en-US" w:bidi="he-IL"/>
         </w:rPr>
-        <w:t xml:space="preserve">במפתחות הבינלאומיים של סיפורי העם שניים מן הטיפוסים רשומים: </w:t>
+        <w:t xml:space="preserve">שורצבוים היה הראשון שבדק את משלי שועלים לפי מפתחות הטיפוסים והמוטיבים הבינלאומיים, והראה שהשיטה הזאת מאפשרת לזהות לכל משל את מקורו ואת גלגוליו, וגם להבחין בין מה שברכיה ירש ובין מה ששינה.</w:t>
+      </w:r>
+      <w:r>
+        <w:rPr>
+          <w:rStyle w:val="FootnoteReference"/>
+        </w:rPr>
+        <w:footnoteReference w:id="10"/>
+      </w:r>
+      <w:r>
+        <w:rPr>
+          <w:rFonts w:ascii="Times New Roman" w:cs="David" w:eastAsia="David" w:hAnsi="Times New Roman"/>
+          <w:i w:val="false"/>
+          <w:iCs w:val="false"/>
+          <w:noProof/>
+          <w:sz w:val="24"/>
+          <w:szCs w:val="24"/>
+          <w:rtl/>
+          <w:lang w:val="en-US" w:bidi="he-IL"/>
+        </w:rPr>
+        <w:t xml:space="preserve"> במפתחות האלה שניים מן הטיפוסים רשומים: </w:t>
       </w:r>
       <w:r>
         <w:rPr>
@@ -2222,7 +2292,7 @@
         <w:rPr>
           <w:rStyle w:val="FootnoteReference"/>
         </w:rPr>
-        <w:footnoteReference w:id="8"/>
+        <w:footnoteReference w:id="11"/>
       </w:r>
       <w:r>
         <w:rPr>
@@ -2345,7 +2415,7 @@
         <w:rPr>
           <w:rStyle w:val="FootnoteReference"/>
         </w:rPr>
-        <w:footnoteReference w:id="9"/>
+        <w:footnoteReference w:id="12"/>
       </w:r>
       <w:r>
         <w:rPr>
@@ -2384,7 +2454,7 @@
         <w:rPr>
           <w:rStyle w:val="FootnoteReference"/>
         </w:rPr>
-        <w:footnoteReference w:id="10"/>
+        <w:footnoteReference w:id="13"/>
       </w:r>
       <w:r>
         <w:rPr>
@@ -2403,7 +2473,7 @@
         <w:rPr>
           <w:rStyle w:val="FootnoteReference"/>
         </w:rPr>
-        <w:footnoteReference w:id="11"/>
+        <w:footnoteReference w:id="14"/>
       </w:r>
       <w:r>
         <w:rPr>
@@ -2422,7 +2492,7 @@
         <w:rPr>
           <w:rStyle w:val="FootnoteReference"/>
         </w:rPr>
-        <w:footnoteReference w:id="12"/>
+        <w:footnoteReference w:id="15"/>
       </w:r>
       <w:r>
         <w:rPr>
@@ -2441,7 +2511,7 @@
         <w:rPr>
           <w:rStyle w:val="FootnoteReference"/>
         </w:rPr>
-        <w:footnoteReference w:id="13"/>
+        <w:footnoteReference w:id="16"/>
       </w:r>
     </w:p>
     <w:p>
@@ -2491,7 +2561,7 @@
         <w:rPr>
           <w:rStyle w:val="FootnoteReference"/>
         </w:rPr>
-        <w:footnoteReference w:id="14"/>
+        <w:footnoteReference w:id="17"/>
       </w:r>
       <w:r>
         <w:rPr>
@@ -2536,7 +2606,7 @@
         <w:rPr>
           <w:rStyle w:val="FootnoteReference"/>
         </w:rPr>
-        <w:footnoteReference w:id="15"/>
+        <w:footnoteReference w:id="18"/>
       </w:r>
       <w:r>
         <w:rPr>
@@ -2555,7 +2625,7 @@
         <w:rPr>
           <w:rStyle w:val="FootnoteReference"/>
         </w:rPr>
-        <w:footnoteReference w:id="16"/>
+        <w:footnoteReference w:id="19"/>
       </w:r>
       <w:r>
         <w:rPr>
@@ -2574,7 +2644,7 @@
         <w:rPr>
           <w:rStyle w:val="FootnoteReference"/>
         </w:rPr>
-        <w:footnoteReference w:id="17"/>
+        <w:footnoteReference w:id="20"/>
       </w:r>
     </w:p>
     <w:p>
@@ -2600,7 +2670,7 @@
         <w:rPr>
           <w:rStyle w:val="FootnoteReference"/>
         </w:rPr>
-        <w:footnoteReference w:id="18"/>
+        <w:footnoteReference w:id="21"/>
       </w:r>
       <w:r>
         <w:rPr>
@@ -2619,7 +2689,7 @@
         <w:rPr>
           <w:rStyle w:val="FootnoteReference"/>
         </w:rPr>
-        <w:footnoteReference w:id="19"/>
+        <w:footnoteReference w:id="22"/>
       </w:r>
       <w:r>
         <w:rPr>
@@ -2638,7 +2708,7 @@
         <w:rPr>
           <w:rStyle w:val="FootnoteReference"/>
         </w:rPr>
-        <w:footnoteReference w:id="20"/>
+        <w:footnoteReference w:id="23"/>
       </w:r>
     </w:p>
     <w:p>
@@ -2690,7 +2760,26 @@
         <w:rPr>
           <w:rStyle w:val="FootnoteReference"/>
         </w:rPr>
-        <w:footnoteReference w:id="21"/>
+        <w:footnoteReference w:id="24"/>
+      </w:r>
+      <w:r>
+        <w:rPr>
+          <w:rFonts w:ascii="Times New Roman" w:cs="David" w:eastAsia="David" w:hAnsi="Times New Roman"/>
+          <w:i w:val="false"/>
+          <w:iCs w:val="false"/>
+          <w:noProof/>
+          <w:sz w:val="24"/>
+          <w:szCs w:val="24"/>
+          <w:rtl/>
+          <w:lang w:val="en-US" w:bidi="he-IL"/>
+        </w:rPr>
+        <w:t xml:space="preserve"> גם בעברית החדשה נשמר הדימוי הכפול: מאיה פרוכטמן, בדיונה במשלי לה-פונטן בתרגום רטוש, מגדירה את החמור של המשלים "מעין טיפש-חכם".</w:t>
+      </w:r>
+      <w:r>
+        <w:rPr>
+          <w:rStyle w:val="FootnoteReference"/>
+        </w:rPr>
+        <w:footnoteReference w:id="25"/>
       </w:r>
       <w:r>
         <w:rPr>
@@ -4899,7 +4988,7 @@
         <w:rPr>
           <w:rStyle w:val="FootnoteReference"/>
         </w:rPr>
-        <w:footnoteReference w:id="22"/>
+        <w:footnoteReference w:id="26"/>
       </w:r>
       <w:r>
         <w:rPr>
@@ -4918,7 +5007,7 @@
         <w:rPr>
           <w:rStyle w:val="FootnoteReference"/>
         </w:rPr>
-        <w:footnoteReference w:id="23"/>
+        <w:footnoteReference w:id="27"/>
       </w:r>
       <w:r>
         <w:rPr>
@@ -4937,20 +5026,39 @@
         <w:rPr>
           <w:rStyle w:val="FootnoteReference"/>
         </w:rPr>
-        <w:footnoteReference w:id="24"/>
-      </w:r>
-      <w:r>
-        <w:rPr>
-          <w:rFonts w:ascii="Times New Roman" w:cs="David" w:eastAsia="David" w:hAnsi="Times New Roman"/>
-          <w:i w:val="false"/>
-          <w:iCs w:val="false"/>
-          <w:noProof/>
-          <w:sz w:val="24"/>
-          <w:szCs w:val="24"/>
-          <w:rtl/>
-          <w:lang w:val="en-US" w:bidi="he-IL"/>
-        </w:rPr>
-        <w:t xml:space="preserve"> ברכיה כתב בתוך הפריחה הזאת, אך בעברית.</w:t>
+        <w:footnoteReference w:id="28"/>
+      </w:r>
+      <w:r>
+        <w:rPr>
+          <w:rFonts w:ascii="Times New Roman" w:cs="David" w:eastAsia="David" w:hAnsi="Times New Roman"/>
+          <w:i w:val="false"/>
+          <w:iCs w:val="false"/>
+          <w:noProof/>
+          <w:sz w:val="24"/>
+          <w:szCs w:val="24"/>
+          <w:rtl/>
+          <w:lang w:val="en-US" w:bidi="he-IL"/>
+        </w:rPr>
+        <w:t xml:space="preserve"> ברכיה כתב בתוך הפריחה הזאת, אך בעברית. עלי יסיף הראה שבאותן שנים בדיוק, 1170-1220 בקירוב, שהיו תור הזהב של האקסמפלום הנוצרי, אימץ גם ספר חסידים באשכנז את הסיפור הדידקטי הקצר ועיבר אותו, ושמשלי איזופוס ומשלי בעלי החיים של ימי הביניים נמנים עם מקורותיו של הז'אנר הזה.</w:t>
+      </w:r>
+      <w:r>
+        <w:rPr>
+          <w:rStyle w:val="FootnoteReference"/>
+        </w:rPr>
+        <w:footnoteReference w:id="29"/>
+      </w:r>
+      <w:r>
+        <w:rPr>
+          <w:rFonts w:ascii="Times New Roman" w:cs="David" w:eastAsia="David" w:hAnsi="Times New Roman"/>
+          <w:i w:val="false"/>
+          <w:iCs w:val="false"/>
+          <w:noProof/>
+          <w:sz w:val="24"/>
+          <w:szCs w:val="24"/>
+          <w:rtl/>
+          <w:lang w:val="en-US" w:bidi="he-IL"/>
+        </w:rPr>
+        <w:t xml:space="preserve"> משלי שועלים הם אפוא חלק מתנועה רחבה יותר של אימוץ ז'אנרים דידקטיים אירופיים לעברית, ולא מקרה יחיד.</w:t>
       </w:r>
     </w:p>
     <w:p>
@@ -5000,7 +5108,7 @@
         <w:rPr>
           <w:rStyle w:val="FootnoteReference"/>
         </w:rPr>
-        <w:footnoteReference w:id="25"/>
+        <w:footnoteReference w:id="30"/>
       </w:r>
       <w:r>
         <w:rPr>
@@ -5019,7 +5127,7 @@
         <w:rPr>
           <w:rStyle w:val="FootnoteReference"/>
         </w:rPr>
-        <w:footnoteReference w:id="26"/>
+        <w:footnoteReference w:id="31"/>
       </w:r>
     </w:p>
     <w:p>
@@ -5045,7 +5153,7 @@
         <w:rPr>
           <w:rStyle w:val="FootnoteReference"/>
         </w:rPr>
-        <w:footnoteReference w:id="27"/>
+        <w:footnoteReference w:id="32"/>
       </w:r>
       <w:r>
         <w:rPr>
@@ -5059,6 +5167,45 @@
           <w:lang w:val="en-US" w:bidi="he-IL"/>
         </w:rPr>
         <w:t xml:space="preserve"> במשלי שועלים הפער הזה הוא לב העניין. כשחמור מדבר בלשונו של רחבעם, הקורא יודע איך זה ייגמר.</w:t>
+      </w:r>
+    </w:p>
+    <w:p>
+      <w:pPr>
+        <w:bidi/>
+        <w:spacing w:after="120" w:before="0" w:line="360"/>
+        <w:jc w:val="both"/>
+      </w:pPr>
+      <w:r>
+        <w:rPr>
+          <w:rFonts w:ascii="Times New Roman" w:cs="David" w:eastAsia="David" w:hAnsi="Times New Roman"/>
+          <w:i w:val="false"/>
+          <w:iCs w:val="false"/>
+          <w:noProof/>
+          <w:sz w:val="24"/>
+          <w:szCs w:val="24"/>
+          <w:rtl/>
+          <w:lang w:val="en-US" w:bidi="he-IL"/>
+        </w:rPr>
+        <w:t xml:space="preserve">לעניין היחס בין המשל לנמשל מועילה הבחנתה של ענת שפירא, שנוסחה לגבי סדר אליהו: בין המשל הדרשני של חז"ל, הקצר והצמוד לפסוק, ובין המשל הנרטיבי-ספרותי, שיש בו עלילה מפותחת, דיאלוג ודמויות, ונמשלו אינו תלוי בפסוק אלא חי מכוחו של הסיפור.</w:t>
+      </w:r>
+      <w:r>
+        <w:rPr>
+          <w:rStyle w:val="FootnoteReference"/>
+        </w:rPr>
+        <w:footnoteReference w:id="33"/>
+      </w:r>
+      <w:r>
+        <w:rPr>
+          <w:rFonts w:ascii="Times New Roman" w:cs="David" w:eastAsia="David" w:hAnsi="Times New Roman"/>
+          <w:i w:val="false"/>
+          <w:iCs w:val="false"/>
+          <w:noProof/>
+          <w:sz w:val="24"/>
+          <w:szCs w:val="24"/>
+          <w:rtl/>
+          <w:lang w:val="en-US" w:bidi="he-IL"/>
+        </w:rPr>
+        <w:t xml:space="preserve"> משליו של ברכיה שייכים בבירור לסוג השני. הנמשל שלו, "והמשל ב...", אינו מפרש פסוק אלא מתרגם את הסיפור לטיפוס אנושי, והפסוקים נכנסים למשל לא כנושא הדרשה אלא כשיבוצים בתוך הסיפור עצמו.</w:t>
       </w:r>
     </w:p>
     <w:p>
@@ -5108,7 +5255,26 @@
         <w:rPr>
           <w:rStyle w:val="FootnoteReference"/>
         </w:rPr>
-        <w:footnoteReference w:id="28"/>
+        <w:footnoteReference w:id="34"/>
+      </w:r>
+      <w:r>
+        <w:rPr>
+          <w:rFonts w:ascii="Times New Roman" w:cs="David" w:eastAsia="David" w:hAnsi="Times New Roman"/>
+          <w:i w:val="false"/>
+          <w:iCs w:val="false"/>
+          <w:noProof/>
+          <w:sz w:val="24"/>
+          <w:szCs w:val="24"/>
+          <w:rtl/>
+          <w:lang w:val="en-US" w:bidi="he-IL"/>
+        </w:rPr>
+        <w:t xml:space="preserve"> התוכחה העקיפה היא בדיוק התפקיד שייחסו בימי הביניים לאקסמפלום: לשכנע ולתת דגם לחיקוי, לא רק להדגים.</w:t>
+      </w:r>
+      <w:r>
+        <w:rPr>
+          <w:rStyle w:val="FootnoteReference"/>
+        </w:rPr>
+        <w:footnoteReference w:id="35"/>
       </w:r>
       <w:r>
         <w:rPr>
@@ -6363,7 +6529,7 @@
         <w:rPr>
           <w:rStyle w:val="FootnoteReference"/>
         </w:rPr>
-        <w:footnoteReference w:id="29"/>
+        <w:footnoteReference w:id="36"/>
       </w:r>
       <w:r>
         <w:rPr>
@@ -6422,7 +6588,7 @@
         <w:rPr>
           <w:rStyle w:val="FootnoteReference"/>
         </w:rPr>
-        <w:footnoteReference w:id="30"/>
+        <w:footnoteReference w:id="37"/>
       </w:r>
     </w:p>
     <w:p>
@@ -6572,7 +6738,7 @@
         <w:rPr>
           <w:rStyle w:val="FootnoteReference"/>
         </w:rPr>
-        <w:footnoteReference w:id="31"/>
+        <w:footnoteReference w:id="38"/>
       </w:r>
     </w:p>
     <w:p>
@@ -6785,7 +6951,26 @@
           <w:rtl/>
           <w:lang w:val="en-US" w:bidi="he-IL"/>
         </w:rPr>
-        <w:t xml:space="preserve">הקשר בין המשל לנמשל נבנה בשלוש דרכים. הראשונה גלויה: הנמשל מתרגם את סיפור החיות ללשון החברה, לגדול ולקטן, לבן בלי שם ולמכבדיו, לאיש שרוצה למשול. השנייה היא השיבוץ, וזו הדרך העיקרית. הפסוקים שברכיה שם בפי החמור ובפי סובביו מציבים מאחוריו דמויות מקראיות שסופן ידוע: אמציה שאמר "נתראה פנים", רחבעם שאמר "קטני עבה ממתני", אדוניה שאמר "אני אמלך", המן שאמר "למי יחפץ המלך", נגיד צור, אדום, ארז אשור, בנות ציון נטויות הגרון. הקורא המשכיל קורא את הסוף בפסוק לפני שהסיפור מגיע אליו, והנמשל רק מאשר. במובן זה השיבוץ אצל ברכיה הוא אמצעי של הטרמה, לא של קישוט. השלישית היא השיר החותם, שמוסיף על הנמשל דוגמה מקראית מפורשת, שאול ואתונותיו, ובכך קושר את משל החיות למשל שלמה ולסיפור המקראי.</w:t>
+        <w:t xml:space="preserve">הקשר בין המשל לנמשל נבנה בשלוש דרכים. הראשונה גלויה: הנמשל מתרגם את סיפור החיות ללשון החברה, לגדול ולקטן, לבן בלי שם ולמכבדיו, לאיש שרוצה למשול. השנייה היא השיבוץ, וזו הדרך העיקרית. הפסוקים שברכיה שם בפי החמור ובפי סובביו מציבים מאחוריו דמויות מקראיות שסופן ידוע: אמציה שאמר "נתראה פנים", רחבעם שאמר "קטני עבה ממתני", אדוניה שאמר "אני אמלך", המן שאמר "למי יחפץ המלך", נגיד צור, אדום, ארז אשור, בנות ציון נטויות הגרון. הקורא המשכיל קורא את הסוף בפסוק לפני שהסיפור מגיע אליו, והנמשל רק מאשר. במובן זה השיבוץ אצל ברכיה הוא אמצעי של הטרמה, לא של קישוט. במונחיו של שטרן, ארבעת הנמשלים הם משלי גנאי ואזהרה, ובמונחיה של שפירא הם נמשלים של משל נרטיבי, שאינם צמודים לפסוק אלא לטיפוס אנושי.</w:t>
+      </w:r>
+      <w:r>
+        <w:rPr>
+          <w:rStyle w:val="FootnoteReference"/>
+        </w:rPr>
+        <w:footnoteReference w:id="39"/>
+      </w:r>
+      <w:r>
+        <w:rPr>
+          <w:rFonts w:ascii="Times New Roman" w:cs="David" w:eastAsia="David" w:hAnsi="Times New Roman"/>
+          <w:i w:val="false"/>
+          <w:iCs w:val="false"/>
+          <w:noProof/>
+          <w:sz w:val="24"/>
+          <w:szCs w:val="24"/>
+          <w:rtl/>
+          <w:lang w:val="en-US" w:bidi="he-IL"/>
+        </w:rPr>
+        <w:t xml:space="preserve"> השלישית היא השיר החותם, שמוסיף על הנמשל דוגמה מקראית מפורשת, שאול ואתונותיו, ובכך קושר את משל החיות למשל שלמה ולסיפור המקראי.</w:t>
       </w:r>
     </w:p>
     <w:p>
@@ -7015,7 +7200,7 @@
           <w:rtl/>
           <w:lang w:val="en-US" w:bidi="he-IL"/>
         </w:rPr>
-        <w:t xml:space="preserve">גרים, יעקב ווילהלם, </w:t>
+        <w:t xml:space="preserve">ברכיה הנקדן, </w:t>
       </w:r>
       <w:r>
         <w:rPr>
@@ -7028,20 +7213,20 @@
           <w:rtl/>
           <w:lang w:val="en-US" w:bidi="he-IL"/>
         </w:rPr>
-        <w:t xml:space="preserve">מעשיות האחים גרים</w:t>
-      </w:r>
-      <w:r>
-        <w:rPr>
-          <w:rFonts w:ascii="Times New Roman" w:cs="David" w:eastAsia="David" w:hAnsi="Times New Roman"/>
-          <w:i w:val="false"/>
-          <w:iCs w:val="false"/>
-          <w:noProof/>
-          <w:sz w:val="24"/>
-          <w:szCs w:val="24"/>
-          <w:rtl/>
-          <w:lang w:val="en-US" w:bidi="he-IL"/>
-        </w:rPr>
-        <w:t xml:space="preserve">, תרגם שמעון לוי, תל אביב: ספרית פועלים, 1994.</w:t>
+        <w:t xml:space="preserve">משלי שועלים</w:t>
+      </w:r>
+      <w:r>
+        <w:rPr>
+          <w:rFonts w:ascii="Times New Roman" w:cs="David" w:eastAsia="David" w:hAnsi="Times New Roman"/>
+          <w:i w:val="false"/>
+          <w:iCs w:val="false"/>
+          <w:noProof/>
+          <w:sz w:val="24"/>
+          <w:szCs w:val="24"/>
+          <w:rtl/>
+          <w:lang w:val="en-US" w:bidi="he-IL"/>
+        </w:rPr>
+        <w:t xml:space="preserve">, מהדורת א"מ הברמן, ירושלים ותל אביב: שוקן, תש"ו.</w:t>
       </w:r>
     </w:p>
     <w:p>
@@ -7054,6 +7239,19 @@
       <w:r>
         <w:rPr>
           <w:rFonts w:ascii="Times New Roman" w:cs="David" w:eastAsia="David" w:hAnsi="Times New Roman"/>
+          <w:i w:val="false"/>
+          <w:iCs w:val="false"/>
+          <w:noProof/>
+          <w:sz w:val="24"/>
+          <w:szCs w:val="24"/>
+          <w:rtl/>
+          <w:lang w:val="en-US" w:bidi="he-IL"/>
+        </w:rPr>
+        <w:t xml:space="preserve">גרים, יעקב ווילהלם, </w:t>
+      </w:r>
+      <w:r>
+        <w:rPr>
+          <w:rFonts w:ascii="Times New Roman" w:cs="David" w:eastAsia="David" w:hAnsi="Times New Roman"/>
           <w:i/>
           <w:iCs/>
           <w:noProof/>
@@ -7062,20 +7260,20 @@
           <w:rtl/>
           <w:lang w:val="en-US" w:bidi="he-IL"/>
         </w:rPr>
-        <w:t xml:space="preserve">הקוראן</w:t>
-      </w:r>
-      <w:r>
-        <w:rPr>
-          <w:rFonts w:ascii="Times New Roman" w:cs="David" w:eastAsia="David" w:hAnsi="Times New Roman"/>
-          <w:i w:val="false"/>
-          <w:iCs w:val="false"/>
-          <w:noProof/>
-          <w:sz w:val="24"/>
-          <w:szCs w:val="24"/>
-          <w:rtl/>
-          <w:lang w:val="en-US" w:bidi="he-IL"/>
-        </w:rPr>
-        <w:t xml:space="preserve">, תרגם מערבית אורי רובין, תל אביב: אוניברסיטת תל אביב, 2005.</w:t>
+        <w:t xml:space="preserve">מעשיות האחים גרים</w:t>
+      </w:r>
+      <w:r>
+        <w:rPr>
+          <w:rFonts w:ascii="Times New Roman" w:cs="David" w:eastAsia="David" w:hAnsi="Times New Roman"/>
+          <w:i w:val="false"/>
+          <w:iCs w:val="false"/>
+          <w:noProof/>
+          <w:sz w:val="24"/>
+          <w:szCs w:val="24"/>
+          <w:rtl/>
+          <w:lang w:val="en-US" w:bidi="he-IL"/>
+        </w:rPr>
+        <w:t xml:space="preserve">, תרגם שמעון לוי, תל אביב: ספרית פועלים, 1994.</w:t>
       </w:r>
     </w:p>
     <w:p>
@@ -7088,19 +7286,6 @@
       <w:r>
         <w:rPr>
           <w:rFonts w:ascii="Times New Roman" w:cs="David" w:eastAsia="David" w:hAnsi="Times New Roman"/>
-          <w:i w:val="false"/>
-          <w:iCs w:val="false"/>
-          <w:noProof/>
-          <w:sz w:val="24"/>
-          <w:szCs w:val="24"/>
-          <w:rtl/>
-          <w:lang w:val="en-US" w:bidi="he-IL"/>
-        </w:rPr>
-        <w:t xml:space="preserve">ברכיה הנקדן, </w:t>
-      </w:r>
-      <w:r>
-        <w:rPr>
-          <w:rFonts w:ascii="Times New Roman" w:cs="David" w:eastAsia="David" w:hAnsi="Times New Roman"/>
           <w:i/>
           <w:iCs/>
           <w:noProof/>
@@ -7109,20 +7294,20 @@
           <w:rtl/>
           <w:lang w:val="en-US" w:bidi="he-IL"/>
         </w:rPr>
-        <w:t xml:space="preserve">משלי שועלים</w:t>
-      </w:r>
-      <w:r>
-        <w:rPr>
-          <w:rFonts w:ascii="Times New Roman" w:cs="David" w:eastAsia="David" w:hAnsi="Times New Roman"/>
-          <w:i w:val="false"/>
-          <w:iCs w:val="false"/>
-          <w:noProof/>
-          <w:sz w:val="24"/>
-          <w:szCs w:val="24"/>
-          <w:rtl/>
-          <w:lang w:val="en-US" w:bidi="he-IL"/>
-        </w:rPr>
-        <w:t xml:space="preserve">, מהדורת א"מ הברמן, ירושלים ותל אביב: שוקן, תש"ו.</w:t>
+        <w:t xml:space="preserve">הקוראן</w:t>
+      </w:r>
+      <w:r>
+        <w:rPr>
+          <w:rFonts w:ascii="Times New Roman" w:cs="David" w:eastAsia="David" w:hAnsi="Times New Roman"/>
+          <w:i w:val="false"/>
+          <w:iCs w:val="false"/>
+          <w:noProof/>
+          <w:sz w:val="24"/>
+          <w:szCs w:val="24"/>
+          <w:rtl/>
+          <w:lang w:val="en-US" w:bidi="he-IL"/>
+        </w:rPr>
+        <w:t xml:space="preserve">, תרגם מערבית אורי רובין, תל אביב: אוניברסיטת תל אביב, 2005.</w:t>
       </w:r>
     </w:p>
     <w:p>
@@ -7245,7 +7430,7 @@
           <w:rtl w:val="false"/>
           <w:lang w:val="en-US" w:bidi="he-IL"/>
         </w:rPr>
-        <w:t xml:space="preserve">Berechiah ha-Nakdan, </w:t>
+        <w:t xml:space="preserve">Barney, Stephen A., W. J. Lewis, J. A. Beach, and Oliver Berghof (trans.), </w:t>
       </w:r>
       <w:r>
         <w:rPr>
@@ -7258,20 +7443,20 @@
           <w:rtl w:val="false"/>
           <w:lang w:val="en-US" w:bidi="he-IL"/>
         </w:rPr>
-        <w:t xml:space="preserve">Fables of a Jewish Aesop</w:t>
-      </w:r>
-      <w:r>
-        <w:rPr>
-          <w:rFonts w:ascii="Times New Roman" w:cs="David" w:eastAsia="David" w:hAnsi="Times New Roman"/>
-          <w:i w:val="false"/>
-          <w:iCs w:val="false"/>
-          <w:noProof/>
-          <w:sz w:val="24"/>
-          <w:szCs w:val="24"/>
-          <w:rtl w:val="false"/>
-          <w:lang w:val="en-US" w:bidi="he-IL"/>
-        </w:rPr>
-        <w:t xml:space="preserve">, trans. Moses Hadas, New York: Columbia University Press, 1967.</w:t>
+        <w:t xml:space="preserve">The Etymologies of Isidore of Seville</w:t>
+      </w:r>
+      <w:r>
+        <w:rPr>
+          <w:rFonts w:ascii="Times New Roman" w:cs="David" w:eastAsia="David" w:hAnsi="Times New Roman"/>
+          <w:i w:val="false"/>
+          <w:iCs w:val="false"/>
+          <w:noProof/>
+          <w:sz w:val="24"/>
+          <w:szCs w:val="24"/>
+          <w:rtl w:val="false"/>
+          <w:lang w:val="en-US" w:bidi="he-IL"/>
+        </w:rPr>
+        <w:t xml:space="preserve">, Cambridge: Cambridge University Press, 2006.</w:t>
       </w:r>
     </w:p>
     <w:p>
@@ -7292,7 +7477,7 @@
           <w:rtl w:val="false"/>
           <w:lang w:val="en-US" w:bidi="he-IL"/>
         </w:rPr>
-        <w:t xml:space="preserve">Barney, Stephen A., W. J. Lewis, J. A. Beach, and Oliver Berghof (trans.), </w:t>
+        <w:t xml:space="preserve">Berechiah ha-Nakdan, </w:t>
       </w:r>
       <w:r>
         <w:rPr>
@@ -7305,20 +7490,20 @@
           <w:rtl w:val="false"/>
           <w:lang w:val="en-US" w:bidi="he-IL"/>
         </w:rPr>
-        <w:t xml:space="preserve">The Etymologies of Isidore of Seville</w:t>
-      </w:r>
-      <w:r>
-        <w:rPr>
-          <w:rFonts w:ascii="Times New Roman" w:cs="David" w:eastAsia="David" w:hAnsi="Times New Roman"/>
-          <w:i w:val="false"/>
-          <w:iCs w:val="false"/>
-          <w:noProof/>
-          <w:sz w:val="24"/>
-          <w:szCs w:val="24"/>
-          <w:rtl w:val="false"/>
-          <w:lang w:val="en-US" w:bidi="he-IL"/>
-        </w:rPr>
-        <w:t xml:space="preserve">, Cambridge: Cambridge University Press, 2006.</w:t>
+        <w:t xml:space="preserve">Fables of a Jewish Aesop</w:t>
+      </w:r>
+      <w:r>
+        <w:rPr>
+          <w:rFonts w:ascii="Times New Roman" w:cs="David" w:eastAsia="David" w:hAnsi="Times New Roman"/>
+          <w:i w:val="false"/>
+          <w:iCs w:val="false"/>
+          <w:noProof/>
+          <w:sz w:val="24"/>
+          <w:szCs w:val="24"/>
+          <w:rtl w:val="false"/>
+          <w:lang w:val="en-US" w:bidi="he-IL"/>
+        </w:rPr>
+        <w:t xml:space="preserve">, trans. Moses Hadas, New York: Columbia University Press, 1967.</w:t>
       </w:r>
     </w:p>
     <w:p>
@@ -7644,7 +7829,7 @@
           <w:rtl/>
           <w:lang w:val="en-US" w:bidi="he-IL"/>
         </w:rPr>
-        <w:t xml:space="preserve">יסיף, עלי, </w:t>
+        <w:t xml:space="preserve">יסיף, עלי, "הסיפור האקסמפלארי בספר חסידים", </w:t>
       </w:r>
       <w:r>
         <w:rPr>
@@ -7657,20 +7842,20 @@
           <w:rtl/>
           <w:lang w:val="en-US" w:bidi="he-IL"/>
         </w:rPr>
-        <w:t xml:space="preserve">סיפור העם העברי: תולדותיו, סוגיו ומשמעותו</w:t>
-      </w:r>
-      <w:r>
-        <w:rPr>
-          <w:rFonts w:ascii="Times New Roman" w:cs="David" w:eastAsia="David" w:hAnsi="Times New Roman"/>
-          <w:i w:val="false"/>
-          <w:iCs w:val="false"/>
-          <w:noProof/>
-          <w:sz w:val="24"/>
-          <w:szCs w:val="24"/>
-          <w:rtl/>
-          <w:lang w:val="en-US" w:bidi="he-IL"/>
-        </w:rPr>
-        <w:t xml:space="preserve">, ירושלים: מוסד ביאליק, תשנ"ד.</w:t>
+        <w:t xml:space="preserve">תרביץ</w:t>
+      </w:r>
+      <w:r>
+        <w:rPr>
+          <w:rFonts w:ascii="Times New Roman" w:cs="David" w:eastAsia="David" w:hAnsi="Times New Roman"/>
+          <w:i w:val="false"/>
+          <w:iCs w:val="false"/>
+          <w:noProof/>
+          <w:sz w:val="24"/>
+          <w:szCs w:val="24"/>
+          <w:rtl/>
+          <w:lang w:val="en-US" w:bidi="he-IL"/>
+        </w:rPr>
+        <w:t xml:space="preserve"> נז (תשמ"ח), עמ' 217-255.</w:t>
       </w:r>
     </w:p>
     <w:p>
@@ -7691,7 +7876,7 @@
           <w:rtl/>
           <w:lang w:val="en-US" w:bidi="he-IL"/>
         </w:rPr>
-        <w:t xml:space="preserve">פגיס, דן, </w:t>
+        <w:t xml:space="preserve">יסיף, עלי, </w:t>
       </w:r>
       <w:r>
         <w:rPr>
@@ -7704,20 +7889,20 @@
           <w:rtl/>
           <w:lang w:val="en-US" w:bidi="he-IL"/>
         </w:rPr>
-        <w:t xml:space="preserve">חידוש ומסורת בשירת החול העברית: ספרד ואיטליה</w:t>
-      </w:r>
-      <w:r>
-        <w:rPr>
-          <w:rFonts w:ascii="Times New Roman" w:cs="David" w:eastAsia="David" w:hAnsi="Times New Roman"/>
-          <w:i w:val="false"/>
-          <w:iCs w:val="false"/>
-          <w:noProof/>
-          <w:sz w:val="24"/>
-          <w:szCs w:val="24"/>
-          <w:rtl/>
-          <w:lang w:val="en-US" w:bidi="he-IL"/>
-        </w:rPr>
-        <w:t xml:space="preserve">, ירושלים: כתר, 1976.</w:t>
+        <w:t xml:space="preserve">סיפור העם העברי: תולדותיו, סוגיו ומשמעותו</w:t>
+      </w:r>
+      <w:r>
+        <w:rPr>
+          <w:rFonts w:ascii="Times New Roman" w:cs="David" w:eastAsia="David" w:hAnsi="Times New Roman"/>
+          <w:i w:val="false"/>
+          <w:iCs w:val="false"/>
+          <w:noProof/>
+          <w:sz w:val="24"/>
+          <w:szCs w:val="24"/>
+          <w:rtl/>
+          <w:lang w:val="en-US" w:bidi="he-IL"/>
+        </w:rPr>
+        <w:t xml:space="preserve">, ירושלים: מוסד ביאליק, תשנ"ד.</w:t>
       </w:r>
     </w:p>
     <w:p>
@@ -7738,7 +7923,7 @@
           <w:rtl/>
           <w:lang w:val="en-US" w:bidi="he-IL"/>
         </w:rPr>
-        <w:t xml:space="preserve">פליקס, יהודה, </w:t>
+        <w:t xml:space="preserve">כהן, ישראל, "משלי איסופוס: עם הופעת תרגומו של ש. שפאן", </w:t>
       </w:r>
       <w:r>
         <w:rPr>
@@ -7751,6 +7936,100 @@
           <w:rtl/>
           <w:lang w:val="en-US" w:bidi="he-IL"/>
         </w:rPr>
+        <w:t xml:space="preserve">מאזנים</w:t>
+      </w:r>
+      <w:r>
+        <w:rPr>
+          <w:rFonts w:ascii="Times New Roman" w:cs="David" w:eastAsia="David" w:hAnsi="Times New Roman"/>
+          <w:i w:val="false"/>
+          <w:iCs w:val="false"/>
+          <w:noProof/>
+          <w:sz w:val="24"/>
+          <w:szCs w:val="24"/>
+          <w:rtl/>
+          <w:lang w:val="en-US" w:bidi="he-IL"/>
+        </w:rPr>
+        <w:t xml:space="preserve"> י (תש"ך), עמ' 453-456.</w:t>
+      </w:r>
+    </w:p>
+    <w:p>
+      <w:pPr>
+        <w:bidi/>
+        <w:spacing w:after="160" w:before="0" w:line="276"/>
+        <w:ind w:start="709" w:hanging="709"/>
+        <w:jc w:val="both"/>
+      </w:pPr>
+      <w:r>
+        <w:rPr>
+          <w:rFonts w:ascii="Times New Roman" w:cs="David" w:eastAsia="David" w:hAnsi="Times New Roman"/>
+          <w:i w:val="false"/>
+          <w:iCs w:val="false"/>
+          <w:noProof/>
+          <w:sz w:val="24"/>
+          <w:szCs w:val="24"/>
+          <w:rtl/>
+          <w:lang w:val="en-US" w:bidi="he-IL"/>
+        </w:rPr>
+        <w:t xml:space="preserve">פגיס, דן, </w:t>
+      </w:r>
+      <w:r>
+        <w:rPr>
+          <w:rFonts w:ascii="Times New Roman" w:cs="David" w:eastAsia="David" w:hAnsi="Times New Roman"/>
+          <w:i/>
+          <w:iCs/>
+          <w:noProof/>
+          <w:sz w:val="24"/>
+          <w:szCs w:val="24"/>
+          <w:rtl/>
+          <w:lang w:val="en-US" w:bidi="he-IL"/>
+        </w:rPr>
+        <w:t xml:space="preserve">חידוש ומסורת בשירת החול העברית: ספרד ואיטליה</w:t>
+      </w:r>
+      <w:r>
+        <w:rPr>
+          <w:rFonts w:ascii="Times New Roman" w:cs="David" w:eastAsia="David" w:hAnsi="Times New Roman"/>
+          <w:i w:val="false"/>
+          <w:iCs w:val="false"/>
+          <w:noProof/>
+          <w:sz w:val="24"/>
+          <w:szCs w:val="24"/>
+          <w:rtl/>
+          <w:lang w:val="en-US" w:bidi="he-IL"/>
+        </w:rPr>
+        <w:t xml:space="preserve">, ירושלים: כתר, 1976.</w:t>
+      </w:r>
+    </w:p>
+    <w:p>
+      <w:pPr>
+        <w:bidi/>
+        <w:spacing w:after="160" w:before="0" w:line="276"/>
+        <w:ind w:start="709" w:hanging="709"/>
+        <w:jc w:val="both"/>
+      </w:pPr>
+      <w:r>
+        <w:rPr>
+          <w:rFonts w:ascii="Times New Roman" w:cs="David" w:eastAsia="David" w:hAnsi="Times New Roman"/>
+          <w:i w:val="false"/>
+          <w:iCs w:val="false"/>
+          <w:noProof/>
+          <w:sz w:val="24"/>
+          <w:szCs w:val="24"/>
+          <w:rtl/>
+          <w:lang w:val="en-US" w:bidi="he-IL"/>
+        </w:rPr>
+        <w:t xml:space="preserve">פליקס, יהודה, </w:t>
+      </w:r>
+      <w:r>
+        <w:rPr>
+          <w:rFonts w:ascii="Times New Roman" w:cs="David" w:eastAsia="David" w:hAnsi="Times New Roman"/>
+          <w:i/>
+          <w:iCs/>
+          <w:noProof/>
+          <w:sz w:val="24"/>
+          <w:szCs w:val="24"/>
+          <w:rtl/>
+          <w:lang w:val="en-US" w:bidi="he-IL"/>
+        </w:rPr>
         <w:t xml:space="preserve">החי של התנ"ך</w:t>
       </w:r>
       <w:r>
@@ -7765,6 +8044,220 @@
           <w:lang w:val="en-US" w:bidi="he-IL"/>
         </w:rPr>
         <w:t xml:space="preserve">, תל אביב: סיני, תשי"ד.</w:t>
+      </w:r>
+    </w:p>
+    <w:p>
+      <w:pPr>
+        <w:bidi/>
+        <w:spacing w:after="160" w:before="0" w:line="276"/>
+        <w:ind w:start="709" w:hanging="709"/>
+        <w:jc w:val="both"/>
+      </w:pPr>
+      <w:r>
+        <w:rPr>
+          <w:rFonts w:ascii="Times New Roman" w:cs="David" w:eastAsia="David" w:hAnsi="Times New Roman"/>
+          <w:i w:val="false"/>
+          <w:iCs w:val="false"/>
+          <w:noProof/>
+          <w:sz w:val="24"/>
+          <w:szCs w:val="24"/>
+          <w:rtl/>
+          <w:lang w:val="en-US" w:bidi="he-IL"/>
+        </w:rPr>
+        <w:t xml:space="preserve">פרוכטמן, מאיה, "מרן עורב, מרן שועל ובן-עור תבנוני: מילון וטקסט ב'משלי לה-פונטן' בתרגומו של יונתן רטוש", </w:t>
+      </w:r>
+      <w:r>
+        <w:rPr>
+          <w:rFonts w:ascii="Times New Roman" w:cs="David" w:eastAsia="David" w:hAnsi="Times New Roman"/>
+          <w:i/>
+          <w:iCs/>
+          <w:noProof/>
+          <w:sz w:val="24"/>
+          <w:szCs w:val="24"/>
+          <w:rtl/>
+          <w:lang w:val="en-US" w:bidi="he-IL"/>
+        </w:rPr>
+        <w:t xml:space="preserve">לשוננו</w:t>
+      </w:r>
+      <w:r>
+        <w:rPr>
+          <w:rFonts w:ascii="Times New Roman" w:cs="David" w:eastAsia="David" w:hAnsi="Times New Roman"/>
+          <w:i w:val="false"/>
+          <w:iCs w:val="false"/>
+          <w:noProof/>
+          <w:sz w:val="24"/>
+          <w:szCs w:val="24"/>
+          <w:rtl/>
+          <w:lang w:val="en-US" w:bidi="he-IL"/>
+        </w:rPr>
+        <w:t xml:space="preserve"> עח (תשע"ו), עמ' 155-167.</w:t>
+      </w:r>
+    </w:p>
+    <w:p>
+      <w:pPr>
+        <w:bidi/>
+        <w:spacing w:after="160" w:before="0" w:line="276"/>
+        <w:ind w:start="709" w:hanging="709"/>
+        <w:jc w:val="both"/>
+      </w:pPr>
+      <w:r>
+        <w:rPr>
+          <w:rFonts w:ascii="Times New Roman" w:cs="David" w:eastAsia="David" w:hAnsi="Times New Roman"/>
+          <w:i w:val="false"/>
+          <w:iCs w:val="false"/>
+          <w:noProof/>
+          <w:sz w:val="24"/>
+          <w:szCs w:val="24"/>
+          <w:rtl/>
+          <w:lang w:val="en-US" w:bidi="he-IL"/>
+        </w:rPr>
+        <w:t xml:space="preserve">שורצבוים, חיים, "טיפוסים פולקלוריים ומוטיבים עממיים בספר משלי שועלים לרבי ברכיה הנקדן", </w:t>
+      </w:r>
+      <w:r>
+        <w:rPr>
+          <w:rFonts w:ascii="Times New Roman" w:cs="David" w:eastAsia="David" w:hAnsi="Times New Roman"/>
+          <w:i/>
+          <w:iCs/>
+          <w:noProof/>
+          <w:sz w:val="24"/>
+          <w:szCs w:val="24"/>
+          <w:rtl/>
+          <w:lang w:val="en-US" w:bidi="he-IL"/>
+        </w:rPr>
+        <w:t xml:space="preserve">דברי הקונגרס העולמי הרביעי למדעי היהדות</w:t>
+      </w:r>
+      <w:r>
+        <w:rPr>
+          <w:rFonts w:ascii="Times New Roman" w:cs="David" w:eastAsia="David" w:hAnsi="Times New Roman"/>
+          <w:i w:val="false"/>
+          <w:iCs w:val="false"/>
+          <w:noProof/>
+          <w:sz w:val="24"/>
+          <w:szCs w:val="24"/>
+          <w:rtl/>
+          <w:lang w:val="en-US" w:bidi="he-IL"/>
+        </w:rPr>
+        <w:t xml:space="preserve">, כרך ב, ירושלים: האיגוד העולמי למדעי היהדות, תשכ"ה, עמ' 33-36.</w:t>
+      </w:r>
+    </w:p>
+    <w:p>
+      <w:pPr>
+        <w:bidi/>
+        <w:spacing w:after="160" w:before="0" w:line="276"/>
+        <w:ind w:start="709" w:hanging="709"/>
+        <w:jc w:val="both"/>
+      </w:pPr>
+      <w:r>
+        <w:rPr>
+          <w:rFonts w:ascii="Times New Roman" w:cs="David" w:eastAsia="David" w:hAnsi="Times New Roman"/>
+          <w:i w:val="false"/>
+          <w:iCs w:val="false"/>
+          <w:noProof/>
+          <w:sz w:val="24"/>
+          <w:szCs w:val="24"/>
+          <w:rtl/>
+          <w:lang w:val="en-US" w:bidi="he-IL"/>
+        </w:rPr>
+        <w:t xml:space="preserve">שטרן, דוד, "תפקידו של המשל בספרות חז"ל", </w:t>
+      </w:r>
+      <w:r>
+        <w:rPr>
+          <w:rFonts w:ascii="Times New Roman" w:cs="David" w:eastAsia="David" w:hAnsi="Times New Roman"/>
+          <w:i/>
+          <w:iCs/>
+          <w:noProof/>
+          <w:sz w:val="24"/>
+          <w:szCs w:val="24"/>
+          <w:rtl/>
+          <w:lang w:val="en-US" w:bidi="he-IL"/>
+        </w:rPr>
+        <w:t xml:space="preserve">מחקרי ירושלים בספרות עברית</w:t>
+      </w:r>
+      <w:r>
+        <w:rPr>
+          <w:rFonts w:ascii="Times New Roman" w:cs="David" w:eastAsia="David" w:hAnsi="Times New Roman"/>
+          <w:i w:val="false"/>
+          <w:iCs w:val="false"/>
+          <w:noProof/>
+          <w:sz w:val="24"/>
+          <w:szCs w:val="24"/>
+          <w:rtl/>
+          <w:lang w:val="en-US" w:bidi="he-IL"/>
+        </w:rPr>
+        <w:t xml:space="preserve"> ז (תשמ"ה), עמ' 90-102.</w:t>
+      </w:r>
+    </w:p>
+    <w:p>
+      <w:pPr>
+        <w:bidi/>
+        <w:spacing w:after="160" w:before="0" w:line="276"/>
+        <w:ind w:start="709" w:hanging="709"/>
+        <w:jc w:val="both"/>
+      </w:pPr>
+      <w:r>
+        <w:rPr>
+          <w:rFonts w:ascii="Times New Roman" w:cs="David" w:eastAsia="David" w:hAnsi="Times New Roman"/>
+          <w:i w:val="false"/>
+          <w:iCs w:val="false"/>
+          <w:noProof/>
+          <w:sz w:val="24"/>
+          <w:szCs w:val="24"/>
+          <w:rtl/>
+          <w:lang w:val="en-US" w:bidi="he-IL"/>
+        </w:rPr>
+        <w:t xml:space="preserve">שפירא, ענת, "המשל הנרטיבי-ספרותי ב'סדר אליהו' לאור המשל הדרשני בספרות חז"ל", </w:t>
+      </w:r>
+      <w:r>
+        <w:rPr>
+          <w:rFonts w:ascii="Times New Roman" w:cs="David" w:eastAsia="David" w:hAnsi="Times New Roman"/>
+          <w:i/>
+          <w:iCs/>
+          <w:noProof/>
+          <w:sz w:val="24"/>
+          <w:szCs w:val="24"/>
+          <w:rtl/>
+          <w:lang w:val="en-US" w:bidi="he-IL"/>
+        </w:rPr>
+        <w:t xml:space="preserve">מרקמים: תרבות, ספרות, פולקלור, לגלית חזן-רוקם</w:t>
+      </w:r>
+      <w:r>
+        <w:rPr>
+          <w:rFonts w:ascii="Times New Roman" w:cs="David" w:eastAsia="David" w:hAnsi="Times New Roman"/>
+          <w:i w:val="false"/>
+          <w:iCs w:val="false"/>
+          <w:noProof/>
+          <w:sz w:val="24"/>
+          <w:szCs w:val="24"/>
+          <w:rtl/>
+          <w:lang w:val="en-US" w:bidi="he-IL"/>
+        </w:rPr>
+        <w:t xml:space="preserve">, כרך א (= </w:t>
+      </w:r>
+      <w:r>
+        <w:rPr>
+          <w:rFonts w:ascii="Times New Roman" w:cs="David" w:eastAsia="David" w:hAnsi="Times New Roman"/>
+          <w:i/>
+          <w:iCs/>
+          <w:noProof/>
+          <w:sz w:val="24"/>
+          <w:szCs w:val="24"/>
+          <w:rtl/>
+          <w:lang w:val="en-US" w:bidi="he-IL"/>
+        </w:rPr>
+        <w:t xml:space="preserve">מחקרי ירושלים בספרות עברית</w:t>
+      </w:r>
+      <w:r>
+        <w:rPr>
+          <w:rFonts w:ascii="Times New Roman" w:cs="David" w:eastAsia="David" w:hAnsi="Times New Roman"/>
+          <w:i w:val="false"/>
+          <w:iCs w:val="false"/>
+          <w:noProof/>
+          <w:sz w:val="24"/>
+          <w:szCs w:val="24"/>
+          <w:rtl/>
+          <w:lang w:val="en-US" w:bidi="he-IL"/>
+        </w:rPr>
+        <w:t xml:space="preserve"> כה), ירושלים: המכון למדעי היהדות ע"ש מנדל, תשע"ג, עמ' 133-151.</w:t>
       </w:r>
     </w:p>
     <w:p>
@@ -9073,6 +9566,60 @@
   <w:footnote w:id="6">
     <w:p>
       <w:pPr>
+        <w:bidi/>
+        <w:spacing w:after="60" w:line="240"/>
+        <w:jc w:val="both"/>
+      </w:pPr>
+      <w:r>
+        <w:rPr>
+          <w:rStyle w:val="FootnoteReference"/>
+        </w:rPr>
+        <w:footnoteRef/>
+      </w:r>
+      <w:r>
+        <w:rPr>
+          <w:rFonts w:ascii="Times New Roman" w:cs="David" w:eastAsia="David" w:hAnsi="Times New Roman"/>
+          <w:i w:val="false"/>
+          <w:iCs w:val="false"/>
+          <w:noProof/>
+          <w:sz w:val="20"/>
+          <w:szCs w:val="20"/>
+          <w:rtl/>
+          <w:lang w:val="en-US" w:bidi="he-IL"/>
+        </w:rPr>
+        <w:t xml:space="preserve">דוד שטרן, "תפקידו של המשל בספרות חז"ל", </w:t>
+      </w:r>
+      <w:r>
+        <w:rPr>
+          <w:rFonts w:ascii="Times New Roman" w:cs="David" w:eastAsia="David" w:hAnsi="Times New Roman"/>
+          <w:i/>
+          <w:iCs/>
+          <w:noProof/>
+          <w:sz w:val="20"/>
+          <w:szCs w:val="20"/>
+          <w:rtl/>
+          <w:lang w:val="en-US" w:bidi="he-IL"/>
+        </w:rPr>
+        <w:t xml:space="preserve">מחקרי ירושלים בספרות עברית</w:t>
+      </w:r>
+      <w:r>
+        <w:rPr>
+          <w:rFonts w:ascii="Times New Roman" w:cs="David" w:eastAsia="David" w:hAnsi="Times New Roman"/>
+          <w:i w:val="false"/>
+          <w:iCs w:val="false"/>
+          <w:noProof/>
+          <w:sz w:val="20"/>
+          <w:szCs w:val="20"/>
+          <w:rtl/>
+          <w:lang w:val="en-US" w:bidi="he-IL"/>
+        </w:rPr>
+        <w:t xml:space="preserve"> ז (תשמ"ה), עמ' 90-102, בייחוד עמ' 97.</w:t>
+      </w:r>
+    </w:p>
+  </w:footnote>
+  <w:footnote w:id="7">
+    <w:p>
+      <w:pPr>
         <w:bidi w:val="false"/>
         <w:spacing w:after="60" w:line="240"/>
         <w:jc w:val="left"/>
@@ -9189,7 +9736,61 @@
       </w:r>
     </w:p>
   </w:footnote>
-  <w:footnote w:id="7">
+  <w:footnote w:id="8">
+    <w:p>
+      <w:pPr>
+        <w:bidi/>
+        <w:spacing w:after="60" w:line="240"/>
+        <w:jc w:val="both"/>
+      </w:pPr>
+      <w:r>
+        <w:rPr>
+          <w:rStyle w:val="FootnoteReference"/>
+        </w:rPr>
+        <w:footnoteRef/>
+      </w:r>
+      <w:r>
+        <w:rPr>
+          <w:rFonts w:ascii="Times New Roman" w:cs="David" w:eastAsia="David" w:hAnsi="Times New Roman"/>
+          <w:i w:val="false"/>
+          <w:iCs w:val="false"/>
+          <w:noProof/>
+          <w:sz w:val="20"/>
+          <w:szCs w:val="20"/>
+          <w:rtl/>
+          <w:lang w:val="en-US" w:bidi="he-IL"/>
+        </w:rPr>
+        <w:t xml:space="preserve">ישראל כהן, "משלי איסופוס: עם הופעת תרגומו של ש. שפאן", </w:t>
+      </w:r>
+      <w:r>
+        <w:rPr>
+          <w:rFonts w:ascii="Times New Roman" w:cs="David" w:eastAsia="David" w:hAnsi="Times New Roman"/>
+          <w:i/>
+          <w:iCs/>
+          <w:noProof/>
+          <w:sz w:val="20"/>
+          <w:szCs w:val="20"/>
+          <w:rtl/>
+          <w:lang w:val="en-US" w:bidi="he-IL"/>
+        </w:rPr>
+        <w:t xml:space="preserve">מאזנים</w:t>
+      </w:r>
+      <w:r>
+        <w:rPr>
+          <w:rFonts w:ascii="Times New Roman" w:cs="David" w:eastAsia="David" w:hAnsi="Times New Roman"/>
+          <w:i w:val="false"/>
+          <w:iCs w:val="false"/>
+          <w:noProof/>
+          <w:sz w:val="20"/>
+          <w:szCs w:val="20"/>
+          <w:rtl/>
+          <w:lang w:val="en-US" w:bidi="he-IL"/>
+        </w:rPr>
+        <w:t xml:space="preserve"> י (תש"ך), עמ' 453-456, בעמ' 455.</w:t>
+      </w:r>
+    </w:p>
+  </w:footnote>
+  <w:footnote w:id="9">
     <w:p>
       <w:pPr>
         <w:bidi w:val="false"/>
@@ -9304,11 +9905,65 @@
           <w:rtl/>
           <w:lang w:val="en-US" w:bidi="he-IL"/>
         </w:rPr>
-        <w:t xml:space="preserve">בדיון על משלים יד ו-מז [לוודא עמודים].</w:t>
+        <w:t xml:space="preserve">בדיון על משלים יד ו-מז [לוודא עמודים]; וכן חיים שורצבוים, "טיפוסים פולקלוריים ומוטיבים עממיים בספר משלי שועלים לרבי ברכיה הנקדן", </w:t>
+      </w:r>
+      <w:r>
+        <w:rPr>
+          <w:rFonts w:ascii="Times New Roman" w:cs="David" w:eastAsia="David" w:hAnsi="Times New Roman"/>
+          <w:i/>
+          <w:iCs/>
+          <w:noProof/>
+          <w:sz w:val="20"/>
+          <w:szCs w:val="20"/>
+          <w:rtl/>
+          <w:lang w:val="en-US" w:bidi="he-IL"/>
+        </w:rPr>
+        <w:t xml:space="preserve">דברי הקונגרס העולמי הרביעי למדעי היהדות</w:t>
+      </w:r>
+      <w:r>
+        <w:rPr>
+          <w:rFonts w:ascii="Times New Roman" w:cs="David" w:eastAsia="David" w:hAnsi="Times New Roman"/>
+          <w:i w:val="false"/>
+          <w:iCs w:val="false"/>
+          <w:noProof/>
+          <w:sz w:val="20"/>
+          <w:szCs w:val="20"/>
+          <w:rtl/>
+          <w:lang w:val="en-US" w:bidi="he-IL"/>
+        </w:rPr>
+        <w:t xml:space="preserve">, כרך ב, ירושלים: האיגוד העולמי למדעי היהדות, תשכ"ה, עמ' 33-36.</w:t>
       </w:r>
     </w:p>
   </w:footnote>
-  <w:footnote w:id="8">
+  <w:footnote w:id="10">
+    <w:p>
+      <w:pPr>
+        <w:bidi/>
+        <w:spacing w:after="60" w:line="240"/>
+        <w:jc w:val="both"/>
+      </w:pPr>
+      <w:r>
+        <w:rPr>
+          <w:rStyle w:val="FootnoteReference"/>
+        </w:rPr>
+        <w:footnoteRef/>
+      </w:r>
+      <w:r>
+        <w:rPr>
+          <w:rFonts w:ascii="Times New Roman" w:cs="David" w:eastAsia="David" w:hAnsi="Times New Roman"/>
+          <w:i w:val="false"/>
+          <w:iCs w:val="false"/>
+          <w:noProof/>
+          <w:sz w:val="20"/>
+          <w:szCs w:val="20"/>
+          <w:rtl/>
+          <w:lang w:val="en-US" w:bidi="he-IL"/>
+        </w:rPr>
+        <w:t xml:space="preserve">שורצבוים, "טיפוסים פולקלוריים", עמ' 33-34.</w:t>
+      </w:r>
+    </w:p>
+  </w:footnote>
+  <w:footnote w:id="11">
     <w:p>
       <w:pPr>
         <w:bidi w:val="false"/>
@@ -9362,7 +10017,7 @@
       </w:r>
     </w:p>
   </w:footnote>
-  <w:footnote w:id="9">
+  <w:footnote w:id="12">
     <w:p>
       <w:pPr>
         <w:bidi w:val="false"/>
@@ -9429,7 +10084,7 @@
       </w:r>
     </w:p>
   </w:footnote>
-  <w:footnote w:id="10">
+  <w:footnote w:id="13">
     <w:p>
       <w:pPr>
         <w:bidi w:val="false"/>
@@ -9496,7 +10151,7 @@
       </w:r>
     </w:p>
   </w:footnote>
-  <w:footnote w:id="11">
+  <w:footnote w:id="14">
     <w:p>
       <w:pPr>
         <w:bidi/>
@@ -9537,7 +10192,7 @@
       </w:r>
     </w:p>
   </w:footnote>
-  <w:footnote w:id="12">
+  <w:footnote w:id="15">
     <w:p>
       <w:pPr>
         <w:bidi w:val="false"/>
@@ -9604,7 +10259,7 @@
       </w:r>
     </w:p>
   </w:footnote>
-  <w:footnote w:id="13">
+  <w:footnote w:id="16">
     <w:p>
       <w:pPr>
         <w:bidi w:val="false"/>
@@ -9671,7 +10326,7 @@
       </w:r>
     </w:p>
   </w:footnote>
-  <w:footnote w:id="14">
+  <w:footnote w:id="17">
     <w:p>
       <w:pPr>
         <w:bidi w:val="false"/>
@@ -9725,7 +10380,7 @@
       </w:r>
     </w:p>
   </w:footnote>
-  <w:footnote w:id="15">
+  <w:footnote w:id="18">
     <w:p>
       <w:pPr>
         <w:bidi/>
@@ -9766,7 +10421,7 @@
       </w:r>
     </w:p>
   </w:footnote>
-  <w:footnote w:id="16">
+  <w:footnote w:id="19">
     <w:p>
       <w:pPr>
         <w:bidi w:val="false"/>
@@ -9885,7 +10540,7 @@
       </w:r>
     </w:p>
   </w:footnote>
-  <w:footnote w:id="17">
+  <w:footnote w:id="20">
     <w:p>
       <w:pPr>
         <w:bidi w:val="false"/>
@@ -9952,7 +10607,7 @@
       </w:r>
     </w:p>
   </w:footnote>
-  <w:footnote w:id="18">
+  <w:footnote w:id="21">
     <w:p>
       <w:pPr>
         <w:bidi/>
@@ -9993,7 +10648,7 @@
       </w:r>
     </w:p>
   </w:footnote>
-  <w:footnote w:id="19">
+  <w:footnote w:id="22">
     <w:p>
       <w:pPr>
         <w:bidi/>
@@ -10047,7 +10702,7 @@
       </w:r>
     </w:p>
   </w:footnote>
-  <w:footnote w:id="20">
+  <w:footnote w:id="23">
     <w:p>
       <w:pPr>
         <w:bidi w:val="false"/>
@@ -10114,7 +10769,7 @@
       </w:r>
     </w:p>
   </w:footnote>
-  <w:footnote w:id="21">
+  <w:footnote w:id="24">
     <w:p>
       <w:pPr>
         <w:bidi/>
@@ -10207,7 +10862,61 @@
       </w:r>
     </w:p>
   </w:footnote>
-  <w:footnote w:id="22">
+  <w:footnote w:id="25">
+    <w:p>
+      <w:pPr>
+        <w:bidi/>
+        <w:spacing w:after="60" w:line="240"/>
+        <w:jc w:val="both"/>
+      </w:pPr>
+      <w:r>
+        <w:rPr>
+          <w:rStyle w:val="FootnoteReference"/>
+        </w:rPr>
+        <w:footnoteRef/>
+      </w:r>
+      <w:r>
+        <w:rPr>
+          <w:rFonts w:ascii="Times New Roman" w:cs="David" w:eastAsia="David" w:hAnsi="Times New Roman"/>
+          <w:i w:val="false"/>
+          <w:iCs w:val="false"/>
+          <w:noProof/>
+          <w:sz w:val="20"/>
+          <w:szCs w:val="20"/>
+          <w:rtl/>
+          <w:lang w:val="en-US" w:bidi="he-IL"/>
+        </w:rPr>
+        <w:t xml:space="preserve">מאיה פרוכטמן, "מרן עורב, מרן שועל ובן-עור תבנוני: מילון וטקסט ב'משלי לה-פונטן' בתרגומו של יונתן רטוש", </w:t>
+      </w:r>
+      <w:r>
+        <w:rPr>
+          <w:rFonts w:ascii="Times New Roman" w:cs="David" w:eastAsia="David" w:hAnsi="Times New Roman"/>
+          <w:i/>
+          <w:iCs/>
+          <w:noProof/>
+          <w:sz w:val="20"/>
+          <w:szCs w:val="20"/>
+          <w:rtl/>
+          <w:lang w:val="en-US" w:bidi="he-IL"/>
+        </w:rPr>
+        <w:t xml:space="preserve">לשוננו</w:t>
+      </w:r>
+      <w:r>
+        <w:rPr>
+          <w:rFonts w:ascii="Times New Roman" w:cs="David" w:eastAsia="David" w:hAnsi="Times New Roman"/>
+          <w:i w:val="false"/>
+          <w:iCs w:val="false"/>
+          <w:noProof/>
+          <w:sz w:val="20"/>
+          <w:szCs w:val="20"/>
+          <w:rtl/>
+          <w:lang w:val="en-US" w:bidi="he-IL"/>
+        </w:rPr>
+        <w:t xml:space="preserve"> עח (תשע"ו), עמ' 155-167, בעמ' 157.</w:t>
+      </w:r>
+    </w:p>
+  </w:footnote>
+  <w:footnote w:id="26">
     <w:p>
       <w:pPr>
         <w:bidi w:val="false"/>
@@ -10287,7 +10996,7 @@
       </w:r>
     </w:p>
   </w:footnote>
-  <w:footnote w:id="23">
+  <w:footnote w:id="27">
     <w:p>
       <w:pPr>
         <w:bidi w:val="false"/>
@@ -10354,7 +11063,7 @@
       </w:r>
     </w:p>
   </w:footnote>
-  <w:footnote w:id="24">
+  <w:footnote w:id="28">
     <w:p>
       <w:pPr>
         <w:bidi w:val="false"/>
@@ -10408,7 +11117,61 @@
       </w:r>
     </w:p>
   </w:footnote>
-  <w:footnote w:id="25">
+  <w:footnote w:id="29">
+    <w:p>
+      <w:pPr>
+        <w:bidi/>
+        <w:spacing w:after="60" w:line="240"/>
+        <w:jc w:val="both"/>
+      </w:pPr>
+      <w:r>
+        <w:rPr>
+          <w:rStyle w:val="FootnoteReference"/>
+        </w:rPr>
+        <w:footnoteRef/>
+      </w:r>
+      <w:r>
+        <w:rPr>
+          <w:rFonts w:ascii="Times New Roman" w:cs="David" w:eastAsia="David" w:hAnsi="Times New Roman"/>
+          <w:i w:val="false"/>
+          <w:iCs w:val="false"/>
+          <w:noProof/>
+          <w:sz w:val="20"/>
+          <w:szCs w:val="20"/>
+          <w:rtl/>
+          <w:lang w:val="en-US" w:bidi="he-IL"/>
+        </w:rPr>
+        <w:t xml:space="preserve">עלי יסיף, "הסיפור האקסמפלארי בספר חסידים", </w:t>
+      </w:r>
+      <w:r>
+        <w:rPr>
+          <w:rFonts w:ascii="Times New Roman" w:cs="David" w:eastAsia="David" w:hAnsi="Times New Roman"/>
+          <w:i/>
+          <w:iCs/>
+          <w:noProof/>
+          <w:sz w:val="20"/>
+          <w:szCs w:val="20"/>
+          <w:rtl/>
+          <w:lang w:val="en-US" w:bidi="he-IL"/>
+        </w:rPr>
+        <w:t xml:space="preserve">תרביץ</w:t>
+      </w:r>
+      <w:r>
+        <w:rPr>
+          <w:rFonts w:ascii="Times New Roman" w:cs="David" w:eastAsia="David" w:hAnsi="Times New Roman"/>
+          <w:i w:val="false"/>
+          <w:iCs w:val="false"/>
+          <w:noProof/>
+          <w:sz w:val="20"/>
+          <w:szCs w:val="20"/>
+          <w:rtl/>
+          <w:lang w:val="en-US" w:bidi="he-IL"/>
+        </w:rPr>
+        <w:t xml:space="preserve"> נז (תשמ"ח), עמ' 217-255, בעמ' 220-221.</w:t>
+      </w:r>
+    </w:p>
+  </w:footnote>
+  <w:footnote w:id="30">
     <w:p>
       <w:pPr>
         <w:bidi w:val="false"/>
@@ -10488,7 +11251,7 @@
       </w:r>
     </w:p>
   </w:footnote>
-  <w:footnote w:id="26">
+  <w:footnote w:id="31">
     <w:p>
       <w:pPr>
         <w:bidi w:val="false"/>
@@ -10538,11 +11301,24 @@
           <w:rtl w:val="false"/>
           <w:lang w:val="en-US" w:bidi="he-IL"/>
         </w:rPr>
-        <w:t xml:space="preserve">, Introduction.</w:t>
+        <w:t xml:space="preserve">, Introduction; </w:t>
+      </w:r>
+      <w:r>
+        <w:rPr>
+          <w:rFonts w:ascii="Times New Roman" w:cs="David" w:eastAsia="David" w:hAnsi="Times New Roman"/>
+          <w:i w:val="false"/>
+          <w:iCs w:val="false"/>
+          <w:noProof/>
+          <w:sz w:val="20"/>
+          <w:szCs w:val="20"/>
+          <w:rtl/>
+          <w:lang w:val="en-US" w:bidi="he-IL"/>
+        </w:rPr>
+        <w:t xml:space="preserve">שורצבוים, "טיפוסים פולקלוריים", עמ' 34-36.</w:t>
       </w:r>
     </w:p>
   </w:footnote>
-  <w:footnote w:id="27">
+  <w:footnote w:id="32">
     <w:p>
       <w:pPr>
         <w:bidi/>
@@ -10596,7 +11372,7 @@
       </w:r>
     </w:p>
   </w:footnote>
-  <w:footnote w:id="28">
+  <w:footnote w:id="33">
     <w:p>
       <w:pPr>
         <w:bidi/>
@@ -10620,7 +11396,7 @@
           <w:rtl/>
           <w:lang w:val="en-US" w:bidi="he-IL"/>
         </w:rPr>
-        <w:t xml:space="preserve">ברכיה הנקדן, </w:t>
+        <w:t xml:space="preserve">ענת שפירא, "המשל הנרטיבי-ספרותי ב'סדר אליהו' לאור המשל הדרשני בספרות חז"ל", </w:t>
       </w:r>
       <w:r>
         <w:rPr>
@@ -10633,48 +11409,20 @@
           <w:rtl/>
           <w:lang w:val="en-US" w:bidi="he-IL"/>
         </w:rPr>
-        <w:t xml:space="preserve">משלי שועלים</w:t>
-      </w:r>
-      <w:r>
-        <w:rPr>
-          <w:rFonts w:ascii="Times New Roman" w:cs="David" w:eastAsia="David" w:hAnsi="Times New Roman"/>
-          <w:i w:val="false"/>
-          <w:iCs w:val="false"/>
-          <w:noProof/>
-          <w:sz w:val="20"/>
-          <w:szCs w:val="20"/>
-          <w:rtl/>
-          <w:lang w:val="en-US" w:bidi="he-IL"/>
-        </w:rPr>
-        <w:t xml:space="preserve">, הקדמת המחבר, מהדורת הברמן [לוודא עמודים וציטוט מדויק].</w:t>
-      </w:r>
-    </w:p>
-  </w:footnote>
-  <w:footnote w:id="29">
-    <w:p>
-      <w:pPr>
-        <w:bidi/>
-        <w:spacing w:after="60" w:line="240"/>
-        <w:jc w:val="both"/>
-      </w:pPr>
-      <w:r>
-        <w:rPr>
-          <w:rStyle w:val="FootnoteReference"/>
-        </w:rPr>
-        <w:footnoteRef/>
-      </w:r>
-      <w:r>
-        <w:rPr>
-          <w:rFonts w:ascii="Times New Roman" w:cs="David" w:eastAsia="David" w:hAnsi="Times New Roman"/>
-          <w:i w:val="false"/>
-          <w:iCs w:val="false"/>
-          <w:noProof/>
-          <w:sz w:val="20"/>
-          <w:szCs w:val="20"/>
-          <w:rtl/>
-          <w:lang w:val="en-US" w:bidi="he-IL"/>
-        </w:rPr>
-        <w:t xml:space="preserve">ברכיה הנקדן, </w:t>
+        <w:t xml:space="preserve">מרקמים: תרבות, ספרות, פולקלור, לגלית חזן-רוקם</w:t>
+      </w:r>
+      <w:r>
+        <w:rPr>
+          <w:rFonts w:ascii="Times New Roman" w:cs="David" w:eastAsia="David" w:hAnsi="Times New Roman"/>
+          <w:i w:val="false"/>
+          <w:iCs w:val="false"/>
+          <w:noProof/>
+          <w:sz w:val="20"/>
+          <w:szCs w:val="20"/>
+          <w:rtl/>
+          <w:lang w:val="en-US" w:bidi="he-IL"/>
+        </w:rPr>
+        <w:t xml:space="preserve">, כרך א (= </w:t>
       </w:r>
       <w:r>
         <w:rPr>
@@ -10687,6 +11435,60 @@
           <w:rtl/>
           <w:lang w:val="en-US" w:bidi="he-IL"/>
         </w:rPr>
+        <w:t xml:space="preserve">מחקרי ירושלים בספרות עברית</w:t>
+      </w:r>
+      <w:r>
+        <w:rPr>
+          <w:rFonts w:ascii="Times New Roman" w:cs="David" w:eastAsia="David" w:hAnsi="Times New Roman"/>
+          <w:i w:val="false"/>
+          <w:iCs w:val="false"/>
+          <w:noProof/>
+          <w:sz w:val="20"/>
+          <w:szCs w:val="20"/>
+          <w:rtl/>
+          <w:lang w:val="en-US" w:bidi="he-IL"/>
+        </w:rPr>
+        <w:t xml:space="preserve"> כה), ירושלים: המכון למדעי היהדות ע"ש מנדל, תשע"ג, עמ' 133-151, בעמ' 133-135, 150.</w:t>
+      </w:r>
+    </w:p>
+  </w:footnote>
+  <w:footnote w:id="34">
+    <w:p>
+      <w:pPr>
+        <w:bidi/>
+        <w:spacing w:after="60" w:line="240"/>
+        <w:jc w:val="both"/>
+      </w:pPr>
+      <w:r>
+        <w:rPr>
+          <w:rStyle w:val="FootnoteReference"/>
+        </w:rPr>
+        <w:footnoteRef/>
+      </w:r>
+      <w:r>
+        <w:rPr>
+          <w:rFonts w:ascii="Times New Roman" w:cs="David" w:eastAsia="David" w:hAnsi="Times New Roman"/>
+          <w:i w:val="false"/>
+          <w:iCs w:val="false"/>
+          <w:noProof/>
+          <w:sz w:val="20"/>
+          <w:szCs w:val="20"/>
+          <w:rtl/>
+          <w:lang w:val="en-US" w:bidi="he-IL"/>
+        </w:rPr>
+        <w:t xml:space="preserve">ברכיה הנקדן, </w:t>
+      </w:r>
+      <w:r>
+        <w:rPr>
+          <w:rFonts w:ascii="Times New Roman" w:cs="David" w:eastAsia="David" w:hAnsi="Times New Roman"/>
+          <w:i/>
+          <w:iCs/>
+          <w:noProof/>
+          <w:sz w:val="20"/>
+          <w:szCs w:val="20"/>
+          <w:rtl/>
+          <w:lang w:val="en-US" w:bidi="he-IL"/>
+        </w:rPr>
         <w:t xml:space="preserve">משלי שועלים</w:t>
       </w:r>
       <w:r>
@@ -10700,11 +11502,93 @@
           <w:rtl/>
           <w:lang w:val="en-US" w:bidi="he-IL"/>
         </w:rPr>
+        <w:t xml:space="preserve">, הקדמת המחבר, מהדורת הברמן [לוודא עמודים וציטוט מדויק].</w:t>
+      </w:r>
+    </w:p>
+  </w:footnote>
+  <w:footnote w:id="35">
+    <w:p>
+      <w:pPr>
+        <w:bidi/>
+        <w:spacing w:after="60" w:line="240"/>
+        <w:jc w:val="both"/>
+      </w:pPr>
+      <w:r>
+        <w:rPr>
+          <w:rStyle w:val="FootnoteReference"/>
+        </w:rPr>
+        <w:footnoteRef/>
+      </w:r>
+      <w:r>
+        <w:rPr>
+          <w:rFonts w:ascii="Times New Roman" w:cs="David" w:eastAsia="David" w:hAnsi="Times New Roman"/>
+          <w:i w:val="false"/>
+          <w:iCs w:val="false"/>
+          <w:noProof/>
+          <w:sz w:val="20"/>
+          <w:szCs w:val="20"/>
+          <w:rtl/>
+          <w:lang w:val="en-US" w:bidi="he-IL"/>
+        </w:rPr>
+        <w:t xml:space="preserve">יסיף, "הסיפור האקסמפלארי", עמ' 220.</w:t>
+      </w:r>
+    </w:p>
+  </w:footnote>
+  <w:footnote w:id="36">
+    <w:p>
+      <w:pPr>
+        <w:bidi/>
+        <w:spacing w:after="60" w:line="240"/>
+        <w:jc w:val="both"/>
+      </w:pPr>
+      <w:r>
+        <w:rPr>
+          <w:rStyle w:val="FootnoteReference"/>
+        </w:rPr>
+        <w:footnoteRef/>
+      </w:r>
+      <w:r>
+        <w:rPr>
+          <w:rFonts w:ascii="Times New Roman" w:cs="David" w:eastAsia="David" w:hAnsi="Times New Roman"/>
+          <w:i w:val="false"/>
+          <w:iCs w:val="false"/>
+          <w:noProof/>
+          <w:sz w:val="20"/>
+          <w:szCs w:val="20"/>
+          <w:rtl/>
+          <w:lang w:val="en-US" w:bidi="he-IL"/>
+        </w:rPr>
+        <w:t xml:space="preserve">ברכיה הנקדן, </w:t>
+      </w:r>
+      <w:r>
+        <w:rPr>
+          <w:rFonts w:ascii="Times New Roman" w:cs="David" w:eastAsia="David" w:hAnsi="Times New Roman"/>
+          <w:i/>
+          <w:iCs/>
+          <w:noProof/>
+          <w:sz w:val="20"/>
+          <w:szCs w:val="20"/>
+          <w:rtl/>
+          <w:lang w:val="en-US" w:bidi="he-IL"/>
+        </w:rPr>
+        <w:t xml:space="preserve">משלי שועלים</w:t>
+      </w:r>
+      <w:r>
+        <w:rPr>
+          <w:rFonts w:ascii="Times New Roman" w:cs="David" w:eastAsia="David" w:hAnsi="Times New Roman"/>
+          <w:i w:val="false"/>
+          <w:iCs w:val="false"/>
+          <w:noProof/>
+          <w:sz w:val="20"/>
+          <w:szCs w:val="20"/>
+          <w:rtl/>
+          <w:lang w:val="en-US" w:bidi="he-IL"/>
+        </w:rPr>
         <w:t xml:space="preserve">, משל סה, מהדורת הברמן [לוודא נוסח החרוז הפותח].</w:t>
       </w:r>
     </w:p>
   </w:footnote>
-  <w:footnote w:id="30">
+  <w:footnote w:id="37">
     <w:p>
       <w:pPr>
         <w:bidi w:val="false"/>
@@ -10784,7 +11668,7 @@
       </w:r>
     </w:p>
   </w:footnote>
-  <w:footnote w:id="31">
+  <w:footnote w:id="38">
     <w:p>
       <w:pPr>
         <w:bidi/>
@@ -10809,6 +11693,34 @@
           <w:lang w:val="en-US" w:bidi="he-IL"/>
         </w:rPr>
         <w:t xml:space="preserve">השווה משלי יז, כח. את מקור הפתגם המדויק יש לבדוק בספרות המוסר של ימי הביניים, כגון "מבחר הפנינים" [לוודא].</w:t>
+      </w:r>
+    </w:p>
+  </w:footnote>
+  <w:footnote w:id="39">
+    <w:p>
+      <w:pPr>
+        <w:bidi/>
+        <w:spacing w:after="60" w:line="240"/>
+        <w:jc w:val="both"/>
+      </w:pPr>
+      <w:r>
+        <w:rPr>
+          <w:rStyle w:val="FootnoteReference"/>
+        </w:rPr>
+        <w:footnoteRef/>
+      </w:r>
+      <w:r>
+        <w:rPr>
+          <w:rFonts w:ascii="Times New Roman" w:cs="David" w:eastAsia="David" w:hAnsi="Times New Roman"/>
+          <w:i w:val="false"/>
+          <w:iCs w:val="false"/>
+          <w:noProof/>
+          <w:sz w:val="20"/>
+          <w:szCs w:val="20"/>
+          <w:rtl/>
+          <w:lang w:val="en-US" w:bidi="he-IL"/>
+        </w:rPr>
+        <w:t xml:space="preserve">שטרן, "תפקידו של המשל", עמ' 97; שפירא, "המשל הנרטיבי-ספרותי", עמ' 150.</w:t>
       </w:r>
     </w:p>
   </w:footnote>

</xml_diff>

<commit_message>
Limit foreign-language sources to six
Perry, Marie de France and Kalila wa-Dimna are now cited through
Schwarzbaum, Rossel is replaced by Way, and the bestiary sentence is
removed; bibliography down to 16 entries, footnotes adjusted.

Co-Authored-By: Claude Fable 5.1 <noreply@anthropic.com>
Claude-Session: https://claude.ai/code/session_01LePeB11iN6PJ4Nt39a92mY
</commit_message>
<xml_diff>
--- a/seminar/seminar-donkey-fables.docx
+++ b/seminar/seminar-donkey-fables.docx
@@ -477,7 +477,7 @@
           <w:rtl/>
           <w:lang w:val="en-US" w:bidi="he-IL"/>
         </w:rPr>
-        <w:t xml:space="preserve">	6</w:t>
+        <w:t xml:space="preserve">	5</w:t>
       </w:r>
     </w:p>
     <w:p>
@@ -1505,7 +1505,7 @@
           <w:rtl/>
           <w:lang w:val="en-US" w:bidi="he-IL"/>
         </w:rPr>
-        <w:t xml:space="preserve">	27</w:t>
+        <w:t xml:space="preserve">	26</w:t>
       </w:r>
     </w:p>
     <w:p>
@@ -1542,7 +1542,7 @@
           <w:rtl/>
           <w:lang w:val="en-US" w:bidi="he-IL"/>
         </w:rPr>
-        <w:t xml:space="preserve">	27</w:t>
+        <w:t xml:space="preserve">	26</w:t>
       </w:r>
     </w:p>
     <w:p>
@@ -1579,7 +1579,7 @@
           <w:rtl/>
           <w:lang w:val="en-US" w:bidi="he-IL"/>
         </w:rPr>
-        <w:t xml:space="preserve">	27</w:t>
+        <w:t xml:space="preserve">	26</w:t>
       </w:r>
     </w:p>
     <w:p>
@@ -1616,7 +1616,7 @@
           <w:rtl/>
           <w:lang w:val="en-US" w:bidi="he-IL"/>
         </w:rPr>
-        <w:t xml:space="preserve">	28</w:t>
+        <w:t xml:space="preserve">	27</w:t>
       </w:r>
     </w:p>
     <w:p>
@@ -1653,7 +1653,7 @@
           <w:rtl/>
           <w:lang w:val="en-US" w:bidi="he-IL"/>
         </w:rPr>
-        <w:t xml:space="preserve">	29</w:t>
+        <w:t xml:space="preserve">	28</w:t>
       </w:r>
     </w:p>
     <w:p>
@@ -2530,7 +2530,72 @@
           <w:rtl/>
           <w:lang w:val="en-US" w:bidi="he-IL"/>
         </w:rPr>
-        <w:t xml:space="preserve"> הפסוק שברכיה הופך במשל מז הוא אפוא גם הפסוק שעומד מאחורי כל תמונת מולד נוצרית בימי הביניים, וקוראיו של ברכיה בצרפת ובאנגליה ראו את השור והחמור האלה בכנסיות. השנייה היא הכניסה לירושלים על חמור (מתי כא, א-ז), המצוטטת מזכריה ט, ט. השלישית היא אתונו של בלעם, שאיגרת פטרוס השנייה (ב, טז) מביאה כדוגמה לבהמה אילמת שהוכיחה נביא. בספרות הטבע של ימי הביניים החמור מוגדר בעיקר כאיטי וכסיל. הבסטיאריום, ספר החיות המוסרי שהיה נפוץ באנגליה במאה השתים עשרה, בדיוק בזמנו ובמקומו של ברכיה, גוזר בעקבות איזידורוס מסביליה את שמו הלטיני של החמור, </w:t>
+        <w:t xml:space="preserve"> הפסוק שברכיה הופך במשל מז הוא אפוא גם הפסוק שעומד מאחורי כל תמונת מולד נוצרית בימי הביניים, וקוראיו של ברכיה בצרפת ובאנגליה ראו את השור והחמור האלה בכנסיות. השנייה היא הכניסה לירושלים על חמור (מתי כא, א-ז), המצוטטת מזכריה ט, ט. השלישית היא אתונו של בלעם, שאיגרת פטרוס השנייה (ב, טז) מביאה כדוגמה לבהמה אילמת שהוכיחה נביא.</w:t>
+      </w:r>
+    </w:p>
+    <w:p>
+      <w:pPr>
+        <w:bidi/>
+        <w:spacing w:after="120" w:before="0" w:line="360"/>
+        <w:jc w:val="both"/>
+      </w:pPr>
+      <w:r>
+        <w:rPr>
+          <w:rFonts w:ascii="Times New Roman" w:cs="David" w:eastAsia="David" w:hAnsi="Times New Roman"/>
+          <w:i w:val="false"/>
+          <w:iCs w:val="false"/>
+          <w:noProof/>
+          <w:sz w:val="24"/>
+          <w:szCs w:val="24"/>
+          <w:rtl/>
+          <w:lang w:val="en-US" w:bidi="he-IL"/>
+        </w:rPr>
+        <w:t xml:space="preserve">בקוראן החמור מופיע בארבעה הקשרים, ושלושה מהם נוגעים ישירות לתכונות שברכיה מפעיל. בסורה 62, פסוק 5, מי שהופקדו על התורה ולא נשאו אותה נמשלים ל"חמור נושא ספרים": ידע שנישא על הגב ואינו נכנס לראש, ממש כמו "לא ידע" של ישעיהו. בסורה 31, פסוק 19, נאמר שהנתעב שבקולות הוא קול החמורים, וזה בדיוק הקול שהחמור במשל סה מתפאר בו. ובסורה 74, פסוקים 50-51, הכופרים הבורחים מן התוכחה נמשלים לחמורי בר נבהלים הנסים מפני אריה, תמונה שהיא כמעט הציד של משל סה.</w:t>
+      </w:r>
+      <w:r>
+        <w:rPr>
+          <w:rStyle w:val="FootnoteReference"/>
+        </w:rPr>
+        <w:footnoteReference w:id="15"/>
+      </w:r>
+      <w:r>
+        <w:rPr>
+          <w:rFonts w:ascii="Times New Roman" w:cs="David" w:eastAsia="David" w:hAnsi="Times New Roman"/>
+          <w:i w:val="false"/>
+          <w:iCs w:val="false"/>
+          <w:noProof/>
+          <w:sz w:val="24"/>
+          <w:szCs w:val="24"/>
+          <w:rtl/>
+          <w:lang w:val="en-US" w:bidi="he-IL"/>
+        </w:rPr>
+        <w:t xml:space="preserve"> הדימוי "חמור נושא ספרים" עבר מן הערבית לעברית ורווח בספרות המוסר של ימי הביניים ככינוי למי שלמד ולא הבין.</w:t>
+      </w:r>
+      <w:r>
+        <w:rPr>
+          <w:rStyle w:val="FootnoteReference"/>
+        </w:rPr>
+        <w:footnoteReference w:id="16"/>
+      </w:r>
+    </w:p>
+    <w:p>
+      <w:pPr>
+        <w:bidi/>
+        <w:spacing w:after="120" w:before="0" w:line="360"/>
+        <w:jc w:val="both"/>
+      </w:pPr>
+      <w:r>
+        <w:rPr>
+          <w:rFonts w:ascii="Times New Roman" w:cs="David" w:eastAsia="David" w:hAnsi="Times New Roman"/>
+          <w:i w:val="false"/>
+          <w:iCs w:val="false"/>
+          <w:noProof/>
+          <w:sz w:val="24"/>
+          <w:szCs w:val="24"/>
+          <w:rtl/>
+          <w:lang w:val="en-US" w:bidi="he-IL"/>
+        </w:rPr>
+        <w:t xml:space="preserve">בפולקלור האירופי המאוחר יותר החמור שומר על שתי פניו. הוא הכסיל שבפתגמים ובבדיחות, אבל הוא גם הפועל הזקן שנזרק אחרי שנות עבודה, כמו החמור של "נגני העיר ברמן" אצל האחים גרים (טיפוס </w:t>
       </w:r>
       <w:r>
         <w:rPr>
@@ -2543,123 +2608,26 @@
           <w:rtl w:val="false"/>
           <w:lang w:val="en-US" w:bidi="he-IL"/>
         </w:rPr>
-        <w:t xml:space="preserve">asinus, </w:t>
-      </w:r>
-      <w:r>
-        <w:rPr>
-          <w:rFonts w:ascii="Times New Roman" w:cs="David" w:eastAsia="David" w:hAnsi="Times New Roman"/>
-          <w:i w:val="false"/>
-          <w:iCs w:val="false"/>
-          <w:noProof/>
-          <w:sz w:val="24"/>
-          <w:szCs w:val="24"/>
-          <w:rtl/>
-          <w:lang w:val="en-US" w:bidi="he-IL"/>
-        </w:rPr>
-        <w:t xml:space="preserve">מן הפועל "לשבת", מפני שהוא בהמה איטית, ומבחין בין החמור הביתי ובין הפרא ומייחס לשניהם כסילות ותאווה.</w:t>
+        <w:t xml:space="preserve">ATU 130), </w:t>
+      </w:r>
+      <w:r>
+        <w:rPr>
+          <w:rFonts w:ascii="Times New Roman" w:cs="David" w:eastAsia="David" w:hAnsi="Times New Roman"/>
+          <w:i w:val="false"/>
+          <w:iCs w:val="false"/>
+          <w:noProof/>
+          <w:sz w:val="24"/>
+          <w:szCs w:val="24"/>
+          <w:rtl/>
+          <w:lang w:val="en-US" w:bidi="he-IL"/>
+        </w:rPr>
+        <w:t xml:space="preserve">שמנהיג את החיות המשוחררות.</w:t>
       </w:r>
       <w:r>
         <w:rPr>
           <w:rStyle w:val="FootnoteReference"/>
         </w:rPr>
-        <w:footnoteReference w:id="15"/>
-      </w:r>
-    </w:p>
-    <w:p>
-      <w:pPr>
-        <w:bidi/>
-        <w:spacing w:after="120" w:before="0" w:line="360"/>
-        <w:jc w:val="both"/>
-      </w:pPr>
-      <w:r>
-        <w:rPr>
-          <w:rFonts w:ascii="Times New Roman" w:cs="David" w:eastAsia="David" w:hAnsi="Times New Roman"/>
-          <w:i w:val="false"/>
-          <w:iCs w:val="false"/>
-          <w:noProof/>
-          <w:sz w:val="24"/>
-          <w:szCs w:val="24"/>
-          <w:rtl/>
-          <w:lang w:val="en-US" w:bidi="he-IL"/>
-        </w:rPr>
-        <w:t xml:space="preserve">בקוראן החמור מופיע בארבעה הקשרים, ושלושה מהם נוגעים ישירות לתכונות שברכיה מפעיל. בסורה 62, פסוק 5, מי שהופקדו על התורה ולא נשאו אותה נמשלים ל"חמור נושא ספרים": ידע שנישא על הגב ואינו נכנס לראש, ממש כמו "לא ידע" של ישעיהו. בסורה 31, פסוק 19, נאמר שהנתעב שבקולות הוא קול החמורים, וזה בדיוק הקול שהחמור במשל סה מתפאר בו. ובסורה 74, פסוקים 50-51, הכופרים הבורחים מן התוכחה נמשלים לחמורי בר נבהלים הנסים מפני אריה, תמונה שהיא כמעט הציד של משל סה.</w:t>
-      </w:r>
-      <w:r>
-        <w:rPr>
-          <w:rStyle w:val="FootnoteReference"/>
-        </w:rPr>
-        <w:footnoteReference w:id="16"/>
-      </w:r>
-      <w:r>
-        <w:rPr>
-          <w:rFonts w:ascii="Times New Roman" w:cs="David" w:eastAsia="David" w:hAnsi="Times New Roman"/>
-          <w:i w:val="false"/>
-          <w:iCs w:val="false"/>
-          <w:noProof/>
-          <w:sz w:val="24"/>
-          <w:szCs w:val="24"/>
-          <w:rtl/>
-          <w:lang w:val="en-US" w:bidi="he-IL"/>
-        </w:rPr>
-        <w:t xml:space="preserve"> הדימוי "חמור נושא ספרים" עבר מן הערבית לעברית ורווח בספרות המוסר של ימי הביניים ככינוי למי שלמד ולא הבין.</w:t>
-      </w:r>
-      <w:r>
-        <w:rPr>
-          <w:rStyle w:val="FootnoteReference"/>
-        </w:rPr>
         <w:footnoteReference w:id="17"/>
-      </w:r>
-    </w:p>
-    <w:p>
-      <w:pPr>
-        <w:bidi/>
-        <w:spacing w:after="120" w:before="0" w:line="360"/>
-        <w:jc w:val="both"/>
-      </w:pPr>
-      <w:r>
-        <w:rPr>
-          <w:rFonts w:ascii="Times New Roman" w:cs="David" w:eastAsia="David" w:hAnsi="Times New Roman"/>
-          <w:i w:val="false"/>
-          <w:iCs w:val="false"/>
-          <w:noProof/>
-          <w:sz w:val="24"/>
-          <w:szCs w:val="24"/>
-          <w:rtl/>
-          <w:lang w:val="en-US" w:bidi="he-IL"/>
-        </w:rPr>
-        <w:t xml:space="preserve">בפולקלור האירופי המאוחר יותר החמור שומר על שתי פניו. הוא הכסיל שבפתגמים ובבדיחות, אבל הוא גם הפועל הזקן שנזרק אחרי שנות עבודה, כמו החמור של "נגני העיר ברמן" אצל האחים גרים (טיפוס </w:t>
-      </w:r>
-      <w:r>
-        <w:rPr>
-          <w:rFonts w:ascii="Times New Roman" w:cs="David" w:eastAsia="David" w:hAnsi="Times New Roman"/>
-          <w:i w:val="false"/>
-          <w:iCs w:val="false"/>
-          <w:noProof/>
-          <w:sz w:val="24"/>
-          <w:szCs w:val="24"/>
-          <w:rtl w:val="false"/>
-          <w:lang w:val="en-US" w:bidi="he-IL"/>
-        </w:rPr>
-        <w:t xml:space="preserve">ATU 130), </w:t>
-      </w:r>
-      <w:r>
-        <w:rPr>
-          <w:rFonts w:ascii="Times New Roman" w:cs="David" w:eastAsia="David" w:hAnsi="Times New Roman"/>
-          <w:i w:val="false"/>
-          <w:iCs w:val="false"/>
-          <w:noProof/>
-          <w:sz w:val="24"/>
-          <w:szCs w:val="24"/>
-          <w:rtl/>
-          <w:lang w:val="en-US" w:bidi="he-IL"/>
-        </w:rPr>
-        <w:t xml:space="preserve">שמנהיג את החיות המשוחררות.</w:t>
-      </w:r>
-      <w:r>
-        <w:rPr>
-          <w:rStyle w:val="FootnoteReference"/>
-        </w:rPr>
-        <w:footnoteReference w:id="18"/>
       </w:r>
       <w:r>
         <w:rPr>
@@ -4868,6 +4836,25 @@
         <w:rPr>
           <w:rStyle w:val="FootnoteReference"/>
         </w:rPr>
+        <w:footnoteReference w:id="18"/>
+      </w:r>
+      <w:r>
+        <w:rPr>
+          <w:rFonts w:ascii="Times New Roman" w:cs="David" w:eastAsia="David" w:hAnsi="Times New Roman"/>
+          <w:i w:val="false"/>
+          <w:iCs w:val="false"/>
+          <w:noProof/>
+          <w:sz w:val="24"/>
+          <w:szCs w:val="24"/>
+          <w:rtl/>
+          <w:lang w:val="en-US" w:bidi="he-IL"/>
+        </w:rPr>
+        <w:t xml:space="preserve"> הכינוי "הנקדן" מעיד על עיסוקו בניקוד ובמסורה, כלומר במלאכת הדיוק בטקסט המקראי, וזו עובדה חשובה להבנת סגנונו: אדם שמקצועו הוא הפסוק ניגש אל המשל החייתי מתוך הפסוק. מלבד משלי שועלים חיבר ברכיה את ספר המוסר "ספר המצרף", עיבד לעברית את "שאלות הטבע" של אדלרד מבאת' בשם "דודי ונכדי", ותרגם ספר על סגולות האבנים.</w:t>
+      </w:r>
+      <w:r>
+        <w:rPr>
+          <w:rStyle w:val="FootnoteReference"/>
+        </w:rPr>
         <w:footnoteReference w:id="19"/>
       </w:r>
       <w:r>
@@ -4881,32 +4868,13 @@
           <w:rtl/>
           <w:lang w:val="en-US" w:bidi="he-IL"/>
         </w:rPr>
-        <w:t xml:space="preserve"> הכינוי "הנקדן" מעיד על עיסוקו בניקוד ובמסורה, כלומר במלאכת הדיוק בטקסט המקראי, וזו עובדה חשובה להבנת סגנונו: אדם שמקצועו הוא הפסוק ניגש אל המשל החייתי מתוך הפסוק. מלבד משלי שועלים חיבר ברכיה את ספר המוסר "ספר המצרף", עיבד לעברית את "שאלות הטבע" של אדלרד מבאת' בשם "דודי ונכדי", ותרגם ספר על סגולות האבנים.</w:t>
+        <w:t xml:space="preserve"> הוא אפוא איש ביניים: בין התרבות הלטינית והצרפתית שסביבו ובין הספרייה העברית שבתוכו, ובמאה השתים עשרה, כשפרחו בצרפת ובאנגליה קובצי משלים בלטינית ובצרפתית עתיקה, כתב את קובץ המשלים שלו בעברית. עלי יסיף הראה שבאותן שנים בדיוק, 1170-1220 בקירוב, שהיו תור הזהב של האקסמפלום הנוצרי, אימץ גם ספר חסידים באשכנז את הסיפור הדידקטי הקצר ועיבר אותו, ושמשלי איזופוס ומשלי בעלי החיים של ימי הביניים נמנים עם מקורותיו של הז'אנר הזה.</w:t>
       </w:r>
       <w:r>
         <w:rPr>
           <w:rStyle w:val="FootnoteReference"/>
         </w:rPr>
         <w:footnoteReference w:id="20"/>
-      </w:r>
-      <w:r>
-        <w:rPr>
-          <w:rFonts w:ascii="Times New Roman" w:cs="David" w:eastAsia="David" w:hAnsi="Times New Roman"/>
-          <w:i w:val="false"/>
-          <w:iCs w:val="false"/>
-          <w:noProof/>
-          <w:sz w:val="24"/>
-          <w:szCs w:val="24"/>
-          <w:rtl/>
-          <w:lang w:val="en-US" w:bidi="he-IL"/>
-        </w:rPr>
-        <w:t xml:space="preserve"> הוא אפוא איש ביניים: בין התרבות הלטינית והצרפתית שסביבו ובין הספרייה העברית שבתוכו, ובמאה השתים עשרה, כשפרחו בצרפת ובאנגליה קובצי משלים בלטינית ובצרפתית עתיקה, כתב את קובץ המשלים שלו בעברית. עלי יסיף הראה שבאותן שנים בדיוק, 1170-1220 בקירוב, שהיו תור הזהב של האקסמפלום הנוצרי, אימץ גם ספר חסידים באשכנז את הסיפור הדידקטי הקצר ועיבר אותו, ושמשלי איזופוס ומשלי בעלי החיים של ימי הביניים נמנים עם מקורותיו של הז'אנר הזה.</w:t>
-      </w:r>
-      <w:r>
-        <w:rPr>
-          <w:rStyle w:val="FootnoteReference"/>
-        </w:rPr>
-        <w:footnoteReference w:id="21"/>
       </w:r>
       <w:r>
         <w:rPr>
@@ -4969,20 +4937,46 @@
         <w:rPr>
           <w:rStyle w:val="FootnoteReference"/>
         </w:rPr>
+        <w:footnoteReference w:id="21"/>
+      </w:r>
+      <w:r>
+        <w:rPr>
+          <w:rFonts w:ascii="Times New Roman" w:cs="David" w:eastAsia="David" w:hAnsi="Times New Roman"/>
+          <w:i w:val="false"/>
+          <w:iCs w:val="false"/>
+          <w:noProof/>
+          <w:sz w:val="24"/>
+          <w:szCs w:val="24"/>
+          <w:rtl/>
+          <w:lang w:val="en-US" w:bidi="he-IL"/>
+        </w:rPr>
+        <w:t xml:space="preserve"> השם עצמו לקוח מן התלמוד: על רבי מאיר נאמר שהיו לו שלוש מאות משלי שועלים (בבלי סנהדרין לח ע"ב), ועל רבן יוחנן בן זכאי שידע "משלות שועלים" (בבלי סוכה כח ע"א). ברכיה מציב את עצמו במודע כממשיך המסורת הזאת, אף על פי שרוב משליו לקוחים ממקורות לטיניים וצרפתיים: קובצי "רומולוס", שהם העיבודים הלטיניים של פדרוס, משלי אביאנוס, וכנראה גם קובץ המשלים הצרפתי של מארי דה פראנס. שורצבוים הראה שברכיה לא תרגם אלא עיבד: הוא משנה סיומים, מוסיף נמשלים, ומחליף את הצבע האלילי בצבע מקראי.</w:t>
+      </w:r>
+      <w:r>
+        <w:rPr>
+          <w:rStyle w:val="FootnoteReference"/>
+        </w:rPr>
         <w:footnoteReference w:id="22"/>
       </w:r>
-      <w:r>
-        <w:rPr>
-          <w:rFonts w:ascii="Times New Roman" w:cs="David" w:eastAsia="David" w:hAnsi="Times New Roman"/>
-          <w:i w:val="false"/>
-          <w:iCs w:val="false"/>
-          <w:noProof/>
-          <w:sz w:val="24"/>
-          <w:szCs w:val="24"/>
-          <w:rtl/>
-          <w:lang w:val="en-US" w:bidi="he-IL"/>
-        </w:rPr>
-        <w:t xml:space="preserve"> השם עצמו לקוח מן התלמוד: על רבי מאיר נאמר שהיו לו שלוש מאות משלי שועלים (בבלי סנהדרין לח ע"ב), ועל רבן יוחנן בן זכאי שידע "משלות שועלים" (בבלי סוכה כח ע"א). ברכיה מציב את עצמו במודע כממשיך המסורת הזאת, אף על פי שרוב משליו לקוחים ממקורות לטיניים וצרפתיים: קובצי "רומולוס", שהם העיבודים הלטיניים של פדרוס, משלי אביאנוס, וכנראה גם קובץ המשלים הצרפתי של מארי דה פראנס. שורצבוים הראה שברכיה לא תרגם אלא עיבד: הוא משנה סיומים, מוסיף נמשלים, ומחליף את הצבע האלילי בצבע מקראי.</w:t>
+    </w:p>
+    <w:p>
+      <w:pPr>
+        <w:bidi/>
+        <w:spacing w:after="120" w:before="0" w:line="360"/>
+        <w:jc w:val="both"/>
+      </w:pPr>
+      <w:r>
+        <w:rPr>
+          <w:rFonts w:ascii="Times New Roman" w:cs="David" w:eastAsia="David" w:hAnsi="Times New Roman"/>
+          <w:i w:val="false"/>
+          <w:iCs w:val="false"/>
+          <w:noProof/>
+          <w:sz w:val="24"/>
+          <w:szCs w:val="24"/>
+          <w:rtl/>
+          <w:lang w:val="en-US" w:bidi="he-IL"/>
+        </w:rPr>
+        <w:t xml:space="preserve">המבנה של כל משל קבוע ברובו. הוא נפתח בחרוז מוסרי קצר, שהוא מעין כותרת רעיונית. אחריו בא גוף הסיפור בפרוזה מחורזת. "והמשל" הוא הנמשל, שבו מפרש המחבר את הסיפור על בני אדם. במשלים רבים באה גם חתימה בשיר שקול קצר הפותח ב"ואשא משלי ואומר". שניים מארבעת המשלים הנדונים בעבודה מכילים את כל ארבעת החלקים; במשל הצרעה ובמשל סה אין שיר חותם. הסגנון הוא פרוזה מחורזת שכמעט כל צלע שלה נשענת על שיבוץ, כלומר על שילוב לשון המקרא בתוך משפט חדש, לעיתים תוך שינוי משמעות. דן פגיס תיאר את השיבוץ כאמצעי מרכזי בפואטיקה העברית של ימי הביניים, שבו הקורא המשכיל מזהה את הפסוק ונהנה מן הפער בין ההקשר המקורי ובין ההקשר החדש.</w:t>
       </w:r>
       <w:r>
         <w:rPr>
@@ -4990,6 +4984,19 @@
         </w:rPr>
         <w:footnoteReference w:id="23"/>
       </w:r>
+      <w:r>
+        <w:rPr>
+          <w:rFonts w:ascii="Times New Roman" w:cs="David" w:eastAsia="David" w:hAnsi="Times New Roman"/>
+          <w:i w:val="false"/>
+          <w:iCs w:val="false"/>
+          <w:noProof/>
+          <w:sz w:val="24"/>
+          <w:szCs w:val="24"/>
+          <w:rtl/>
+          <w:lang w:val="en-US" w:bidi="he-IL"/>
+        </w:rPr>
+        <w:t xml:space="preserve"> במשלי שועלים הפער הזה הוא לב העניין. כשחמור מדבר בלשונו של רחבעם, הקורא יודע איך זה ייגמר.</w:t>
+      </w:r>
     </w:p>
     <w:p>
       <w:pPr>
@@ -5008,52 +5015,13 @@
           <w:rtl/>
           <w:lang w:val="en-US" w:bidi="he-IL"/>
         </w:rPr>
-        <w:t xml:space="preserve">המבנה של כל משל קבוע ברובו. הוא נפתח בחרוז מוסרי קצר, שהוא מעין כותרת רעיונית. אחריו בא גוף הסיפור בפרוזה מחורזת. "והמשל" הוא הנמשל, שבו מפרש המחבר את הסיפור על בני אדם. במשלים רבים באה גם חתימה בשיר שקול קצר הפותח ב"ואשא משלי ואומר". שניים מארבעת המשלים הנדונים בעבודה מכילים את כל ארבעת החלקים; במשל הצרעה ובמשל סה אין שיר חותם. הסגנון הוא פרוזה מחורזת שכמעט כל צלע שלה נשענת על שיבוץ, כלומר על שילוב לשון המקרא בתוך משפט חדש, לעיתים תוך שינוי משמעות. דן פגיס תיאר את השיבוץ כאמצעי מרכזי בפואטיקה העברית של ימי הביניים, שבו הקורא המשכיל מזהה את הפסוק ונהנה מן הפער בין ההקשר המקורי ובין ההקשר החדש.</w:t>
+        <w:t xml:space="preserve">לעניין היחס בין המשל לנמשל מועילה הבחנתה של ענת שפירא, שנוסחה לגבי סדר אליהו: בין המשל הדרשני של חז"ל, הקצר והצמוד לפסוק, ובין המשל הנרטיבי-ספרותי, שיש בו עלילה מפותחת, דיאלוג ודמויות, ונמשלו אינו תלוי בפסוק אלא חי מכוחו של הסיפור.</w:t>
       </w:r>
       <w:r>
         <w:rPr>
           <w:rStyle w:val="FootnoteReference"/>
         </w:rPr>
         <w:footnoteReference w:id="24"/>
-      </w:r>
-      <w:r>
-        <w:rPr>
-          <w:rFonts w:ascii="Times New Roman" w:cs="David" w:eastAsia="David" w:hAnsi="Times New Roman"/>
-          <w:i w:val="false"/>
-          <w:iCs w:val="false"/>
-          <w:noProof/>
-          <w:sz w:val="24"/>
-          <w:szCs w:val="24"/>
-          <w:rtl/>
-          <w:lang w:val="en-US" w:bidi="he-IL"/>
-        </w:rPr>
-        <w:t xml:space="preserve"> במשלי שועלים הפער הזה הוא לב העניין. כשחמור מדבר בלשונו של רחבעם, הקורא יודע איך זה ייגמר.</w:t>
-      </w:r>
-    </w:p>
-    <w:p>
-      <w:pPr>
-        <w:bidi/>
-        <w:spacing w:after="120" w:before="0" w:line="360"/>
-        <w:jc w:val="both"/>
-      </w:pPr>
-      <w:r>
-        <w:rPr>
-          <w:rFonts w:ascii="Times New Roman" w:cs="David" w:eastAsia="David" w:hAnsi="Times New Roman"/>
-          <w:i w:val="false"/>
-          <w:iCs w:val="false"/>
-          <w:noProof/>
-          <w:sz w:val="24"/>
-          <w:szCs w:val="24"/>
-          <w:rtl/>
-          <w:lang w:val="en-US" w:bidi="he-IL"/>
-        </w:rPr>
-        <w:t xml:space="preserve">לעניין היחס בין המשל לנמשל מועילה הבחנתה של ענת שפירא, שנוסחה לגבי סדר אליהו: בין המשל הדרשני של חז"ל, הקצר והצמוד לפסוק, ובין המשל הנרטיבי-ספרותי, שיש בו עלילה מפותחת, דיאלוג ודמויות, ונמשלו אינו תלוי בפסוק אלא חי מכוחו של הסיפור.</w:t>
-      </w:r>
-      <w:r>
-        <w:rPr>
-          <w:rStyle w:val="FootnoteReference"/>
-        </w:rPr>
-        <w:footnoteReference w:id="25"/>
       </w:r>
       <w:r>
         <w:rPr>
@@ -5116,26 +5084,26 @@
         <w:rPr>
           <w:rStyle w:val="FootnoteReference"/>
         </w:rPr>
+        <w:footnoteReference w:id="25"/>
+      </w:r>
+      <w:r>
+        <w:rPr>
+          <w:rFonts w:ascii="Times New Roman" w:cs="David" w:eastAsia="David" w:hAnsi="Times New Roman"/>
+          <w:i w:val="false"/>
+          <w:iCs w:val="false"/>
+          <w:noProof/>
+          <w:sz w:val="24"/>
+          <w:szCs w:val="24"/>
+          <w:rtl/>
+          <w:lang w:val="en-US" w:bidi="he-IL"/>
+        </w:rPr>
+        <w:t xml:space="preserve"> התוכחה העקיפה היא בדיוק התפקיד שייחסו בימי הביניים לאקסמפלום: לשכנע ולתת דגם לחיקוי, לא רק להדגים.</w:t>
+      </w:r>
+      <w:r>
+        <w:rPr>
+          <w:rStyle w:val="FootnoteReference"/>
+        </w:rPr>
         <w:footnoteReference w:id="26"/>
-      </w:r>
-      <w:r>
-        <w:rPr>
-          <w:rFonts w:ascii="Times New Roman" w:cs="David" w:eastAsia="David" w:hAnsi="Times New Roman"/>
-          <w:i w:val="false"/>
-          <w:iCs w:val="false"/>
-          <w:noProof/>
-          <w:sz w:val="24"/>
-          <w:szCs w:val="24"/>
-          <w:rtl/>
-          <w:lang w:val="en-US" w:bidi="he-IL"/>
-        </w:rPr>
-        <w:t xml:space="preserve"> התוכחה העקיפה היא בדיוק התפקיד שייחסו בימי הביניים לאקסמפלום: לשכנע ולתת דגם לחיקוי, לא רק להדגים.</w:t>
-      </w:r>
-      <w:r>
-        <w:rPr>
-          <w:rStyle w:val="FootnoteReference"/>
-        </w:rPr>
-        <w:footnoteReference w:id="27"/>
       </w:r>
       <w:r>
         <w:rPr>
@@ -6390,66 +6358,66 @@
         <w:rPr>
           <w:rStyle w:val="FootnoteReference"/>
         </w:rPr>
+        <w:footnoteReference w:id="27"/>
+      </w:r>
+      <w:r>
+        <w:rPr>
+          <w:rFonts w:ascii="Times New Roman" w:cs="David" w:eastAsia="David" w:hAnsi="Times New Roman"/>
+          <w:i w:val="false"/>
+          <w:iCs w:val="false"/>
+          <w:noProof/>
+          <w:sz w:val="24"/>
+          <w:szCs w:val="24"/>
+          <w:rtl/>
+          <w:lang w:val="en-US" w:bidi="he-IL"/>
+        </w:rPr>
+        <w:t xml:space="preserve"> "ולבו בל עמו" לקוח ממשלי כג, ז, "ולבו בל עמך", על הצר עין שמארח ולבו אינו עם אורחו, ו"תגלה ערותו" מהדהד את ישעיהו מז, ג, "תגל ערותך", על בת בבל שירדה מכיסאה.</w:t>
+      </w:r>
+    </w:p>
+    <w:p>
+      <w:pPr>
+        <w:bidi/>
+        <w:spacing w:after="120" w:before="0" w:line="360"/>
+        <w:jc w:val="both"/>
+      </w:pPr>
+      <w:r>
+        <w:rPr>
+          <w:rFonts w:ascii="Times New Roman" w:cs="David" w:eastAsia="David" w:hAnsi="Times New Roman"/>
+          <w:i w:val="false"/>
+          <w:iCs w:val="false"/>
+          <w:noProof/>
+          <w:sz w:val="24"/>
+          <w:szCs w:val="24"/>
+          <w:rtl/>
+          <w:lang w:val="en-US" w:bidi="he-IL"/>
+        </w:rPr>
+        <w:t xml:space="preserve">העלילה בנויה בחמש תנועות. הראשונה היא ההזמנה והגאווה: האריה קורא לחמור להראות לו את גדולתו, והחמור מפרש את ההזמנה כמינוי, "ועתה יקראו לי משנה למלך". השנייה היא חלוקת התפקידים: החמור מציע את קולו, והאריה מחלק, "אתה תשאג ואני אטרוף". השלישית היא הציד: הנעירה, המנוסה, הטריפה, והפקודה להשתיק. הרביעית היא הבקשה: ליד הנבלה החמור מתפאר בקולו וברעמתו ומבקש קביעות. החמישית היא התשובה: האריה מגדיר את החמור, "בזוי ושפל וקשה ערף", ומסיים באיום מרומז, שגוריו עוד ילעגו לו על שטרף בצאן ולא שבר את החמור. המשל נגמר בדברי האריה, ואין בו שיר חותם. גורל החמור אינו מסופר, אבל המשפט האחרון אומר אותו למי שמכיר את המקור.</w:t>
+      </w:r>
+    </w:p>
+    <w:p>
+      <w:pPr>
+        <w:bidi/>
+        <w:spacing w:after="120" w:before="0" w:line="360"/>
+        <w:jc w:val="both"/>
+      </w:pPr>
+      <w:r>
+        <w:rPr>
+          <w:rFonts w:ascii="Times New Roman" w:cs="David" w:eastAsia="David" w:hAnsi="Times New Roman"/>
+          <w:i w:val="false"/>
+          <w:iCs w:val="false"/>
+          <w:noProof/>
+          <w:sz w:val="24"/>
+          <w:szCs w:val="24"/>
+          <w:rtl/>
+          <w:lang w:val="en-US" w:bidi="he-IL"/>
+        </w:rPr>
+        <w:t xml:space="preserve">לעומת המקור, פדרוס א, יא, ברכיה שינה שני דברים. הוא הוסיף את המונולוג הפנימי של החמור בראשית המשל, שהופך את הגאווה מתגובה רגעית לתכונה, והוא הוסיף לתשובת האריה את הסיום המאיים. אצל פדרוס האריה עונה בהומור, "אילולא ידעתי מי אתה הייתי בורח גם אני"; אצל ברכיה ההומור נשאר, "מקולך לא יענה ומהמונך לא יחת", אבל אחריו בא הבוז ואחריו האיום.</w:t>
+      </w:r>
+      <w:r>
+        <w:rPr>
+          <w:rStyle w:val="FootnoteReference"/>
+        </w:rPr>
         <w:footnoteReference w:id="28"/>
-      </w:r>
-      <w:r>
-        <w:rPr>
-          <w:rFonts w:ascii="Times New Roman" w:cs="David" w:eastAsia="David" w:hAnsi="Times New Roman"/>
-          <w:i w:val="false"/>
-          <w:iCs w:val="false"/>
-          <w:noProof/>
-          <w:sz w:val="24"/>
-          <w:szCs w:val="24"/>
-          <w:rtl/>
-          <w:lang w:val="en-US" w:bidi="he-IL"/>
-        </w:rPr>
-        <w:t xml:space="preserve"> "ולבו בל עמו" לקוח ממשלי כג, ז, "ולבו בל עמך", על הצר עין שמארח ולבו אינו עם אורחו, ו"תגלה ערותו" מהדהד את ישעיהו מז, ג, "תגל ערותך", על בת בבל שירדה מכיסאה.</w:t>
-      </w:r>
-    </w:p>
-    <w:p>
-      <w:pPr>
-        <w:bidi/>
-        <w:spacing w:after="120" w:before="0" w:line="360"/>
-        <w:jc w:val="both"/>
-      </w:pPr>
-      <w:r>
-        <w:rPr>
-          <w:rFonts w:ascii="Times New Roman" w:cs="David" w:eastAsia="David" w:hAnsi="Times New Roman"/>
-          <w:i w:val="false"/>
-          <w:iCs w:val="false"/>
-          <w:noProof/>
-          <w:sz w:val="24"/>
-          <w:szCs w:val="24"/>
-          <w:rtl/>
-          <w:lang w:val="en-US" w:bidi="he-IL"/>
-        </w:rPr>
-        <w:t xml:space="preserve">העלילה בנויה בחמש תנועות. הראשונה היא ההזמנה והגאווה: האריה קורא לחמור להראות לו את גדולתו, והחמור מפרש את ההזמנה כמינוי, "ועתה יקראו לי משנה למלך". השנייה היא חלוקת התפקידים: החמור מציע את קולו, והאריה מחלק, "אתה תשאג ואני אטרוף". השלישית היא הציד: הנעירה, המנוסה, הטריפה, והפקודה להשתיק. הרביעית היא הבקשה: ליד הנבלה החמור מתפאר בקולו וברעמתו ומבקש קביעות. החמישית היא התשובה: האריה מגדיר את החמור, "בזוי ושפל וקשה ערף", ומסיים באיום מרומז, שגוריו עוד ילעגו לו על שטרף בצאן ולא שבר את החמור. המשל נגמר בדברי האריה, ואין בו שיר חותם. גורל החמור אינו מסופר, אבל המשפט האחרון אומר אותו למי שמכיר את המקור.</w:t>
-      </w:r>
-    </w:p>
-    <w:p>
-      <w:pPr>
-        <w:bidi/>
-        <w:spacing w:after="120" w:before="0" w:line="360"/>
-        <w:jc w:val="both"/>
-      </w:pPr>
-      <w:r>
-        <w:rPr>
-          <w:rFonts w:ascii="Times New Roman" w:cs="David" w:eastAsia="David" w:hAnsi="Times New Roman"/>
-          <w:i w:val="false"/>
-          <w:iCs w:val="false"/>
-          <w:noProof/>
-          <w:sz w:val="24"/>
-          <w:szCs w:val="24"/>
-          <w:rtl/>
-          <w:lang w:val="en-US" w:bidi="he-IL"/>
-        </w:rPr>
-        <w:t xml:space="preserve">לעומת המקור, פדרוס א, יא, ברכיה שינה שני דברים. הוא הוסיף את המונולוג הפנימי של החמור בראשית המשל, שהופך את הגאווה מתגובה רגעית לתכונה, והוא הוסיף לתשובת האריה את הסיום המאיים. אצל פדרוס האריה עונה בהומור, "אילולא ידעתי מי אתה הייתי בורח גם אני"; אצל ברכיה ההומור נשאר, "מקולך לא יענה ומהמונך לא יחת", אבל אחריו בא הבוז ואחריו האיום.</w:t>
-      </w:r>
-      <w:r>
-        <w:rPr>
-          <w:rStyle w:val="FootnoteReference"/>
-        </w:rPr>
-        <w:footnoteReference w:id="29"/>
       </w:r>
     </w:p>
     <w:p>
@@ -6599,7 +6567,7 @@
         <w:rPr>
           <w:rStyle w:val="FootnoteReference"/>
         </w:rPr>
-        <w:footnoteReference w:id="30"/>
+        <w:footnoteReference w:id="29"/>
       </w:r>
     </w:p>
     <w:p>
@@ -6818,7 +6786,7 @@
         <w:rPr>
           <w:rStyle w:val="FootnoteReference"/>
         </w:rPr>
-        <w:footnoteReference w:id="31"/>
+        <w:footnoteReference w:id="30"/>
       </w:r>
       <w:r>
         <w:rPr>
@@ -7189,7 +7157,7 @@
           <w:rtl w:val="false"/>
           <w:lang w:val="en-US" w:bidi="he-IL"/>
         </w:rPr>
-        <w:t xml:space="preserve">Derenbourg, Joseph (ed.), </w:t>
+        <w:t xml:space="preserve">Elliott, J. K., </w:t>
       </w:r>
       <w:r>
         <w:rPr>
@@ -7202,7 +7170,7 @@
           <w:rtl w:val="false"/>
           <w:lang w:val="en-US" w:bidi="he-IL"/>
         </w:rPr>
-        <w:t xml:space="preserve">Deux versions hébraïques du livre de Kalîlâh et Dimnâh</w:t>
+        <w:t xml:space="preserve">The Apocryphal New Testament</w:t>
       </w:r>
       <w:r>
         <w:rPr>
@@ -7215,7 +7183,338 @@
           <w:rtl w:val="false"/>
           <w:lang w:val="en-US" w:bidi="he-IL"/>
         </w:rPr>
-        <w:t xml:space="preserve">, Paris: F. Vieweg, 1881.</w:t>
+        <w:t xml:space="preserve">, Oxford: Clarendon Press, 1993.</w:t>
+      </w:r>
+    </w:p>
+    <w:p>
+      <w:pPr>
+        <w:keepNext/>
+        <w:bidi/>
+        <w:spacing w:after="120" w:before="240" w:line="360"/>
+        <w:jc w:val="start"/>
+      </w:pPr>
+      <w:r>
+        <w:rPr>
+          <w:rFonts w:ascii="Times New Roman" w:cs="David" w:eastAsia="David" w:hAnsi="Times New Roman"/>
+          <w:b/>
+          <w:bCs/>
+          <w:i w:val="false"/>
+          <w:iCs w:val="false"/>
+          <w:noProof/>
+          <w:sz w:val="26"/>
+          <w:szCs w:val="26"/>
+          <w:rtl/>
+          <w:lang w:val="en-US" w:bidi="he-IL"/>
+        </w:rPr>
+        <w:t xml:space="preserve">מחקרים</w:t>
+      </w:r>
+    </w:p>
+    <w:p>
+      <w:pPr>
+        <w:bidi/>
+        <w:spacing w:after="160" w:before="0" w:line="276"/>
+        <w:ind w:start="709" w:hanging="709"/>
+        <w:jc w:val="both"/>
+      </w:pPr>
+      <w:r>
+        <w:rPr>
+          <w:rFonts w:ascii="Times New Roman" w:cs="David" w:eastAsia="David" w:hAnsi="Times New Roman"/>
+          <w:i w:val="false"/>
+          <w:iCs w:val="false"/>
+          <w:noProof/>
+          <w:sz w:val="24"/>
+          <w:szCs w:val="24"/>
+          <w:rtl/>
+          <w:lang w:val="en-US" w:bidi="he-IL"/>
+        </w:rPr>
+        <w:t xml:space="preserve">יסיף, עלי, "הסיפור האקסמפלארי בספר חסידים", </w:t>
+      </w:r>
+      <w:r>
+        <w:rPr>
+          <w:rFonts w:ascii="Times New Roman" w:cs="David" w:eastAsia="David" w:hAnsi="Times New Roman"/>
+          <w:i/>
+          <w:iCs/>
+          <w:noProof/>
+          <w:sz w:val="24"/>
+          <w:szCs w:val="24"/>
+          <w:rtl/>
+          <w:lang w:val="en-US" w:bidi="he-IL"/>
+        </w:rPr>
+        <w:t xml:space="preserve">תרביץ</w:t>
+      </w:r>
+      <w:r>
+        <w:rPr>
+          <w:rFonts w:ascii="Times New Roman" w:cs="David" w:eastAsia="David" w:hAnsi="Times New Roman"/>
+          <w:i w:val="false"/>
+          <w:iCs w:val="false"/>
+          <w:noProof/>
+          <w:sz w:val="24"/>
+          <w:szCs w:val="24"/>
+          <w:rtl/>
+          <w:lang w:val="en-US" w:bidi="he-IL"/>
+        </w:rPr>
+        <w:t xml:space="preserve"> נז (תשמ"ח), עמ' 217-255.</w:t>
+      </w:r>
+    </w:p>
+    <w:p>
+      <w:pPr>
+        <w:bidi/>
+        <w:spacing w:after="160" w:before="0" w:line="276"/>
+        <w:ind w:start="709" w:hanging="709"/>
+        <w:jc w:val="both"/>
+      </w:pPr>
+      <w:r>
+        <w:rPr>
+          <w:rFonts w:ascii="Times New Roman" w:cs="David" w:eastAsia="David" w:hAnsi="Times New Roman"/>
+          <w:i w:val="false"/>
+          <w:iCs w:val="false"/>
+          <w:noProof/>
+          <w:sz w:val="24"/>
+          <w:szCs w:val="24"/>
+          <w:rtl/>
+          <w:lang w:val="en-US" w:bidi="he-IL"/>
+        </w:rPr>
+        <w:t xml:space="preserve">יסיף, עלי, </w:t>
+      </w:r>
+      <w:r>
+        <w:rPr>
+          <w:rFonts w:ascii="Times New Roman" w:cs="David" w:eastAsia="David" w:hAnsi="Times New Roman"/>
+          <w:i/>
+          <w:iCs/>
+          <w:noProof/>
+          <w:sz w:val="24"/>
+          <w:szCs w:val="24"/>
+          <w:rtl/>
+          <w:lang w:val="en-US" w:bidi="he-IL"/>
+        </w:rPr>
+        <w:t xml:space="preserve">סיפור העם העברי: תולדותיו, סוגיו ומשמעותו</w:t>
+      </w:r>
+      <w:r>
+        <w:rPr>
+          <w:rFonts w:ascii="Times New Roman" w:cs="David" w:eastAsia="David" w:hAnsi="Times New Roman"/>
+          <w:i w:val="false"/>
+          <w:iCs w:val="false"/>
+          <w:noProof/>
+          <w:sz w:val="24"/>
+          <w:szCs w:val="24"/>
+          <w:rtl/>
+          <w:lang w:val="en-US" w:bidi="he-IL"/>
+        </w:rPr>
+        <w:t xml:space="preserve">, ירושלים: מוסד ביאליק, תשנ"ד.</w:t>
+      </w:r>
+    </w:p>
+    <w:p>
+      <w:pPr>
+        <w:bidi/>
+        <w:spacing w:after="160" w:before="0" w:line="276"/>
+        <w:ind w:start="709" w:hanging="709"/>
+        <w:jc w:val="both"/>
+      </w:pPr>
+      <w:r>
+        <w:rPr>
+          <w:rFonts w:ascii="Times New Roman" w:cs="David" w:eastAsia="David" w:hAnsi="Times New Roman"/>
+          <w:i w:val="false"/>
+          <w:iCs w:val="false"/>
+          <w:noProof/>
+          <w:sz w:val="24"/>
+          <w:szCs w:val="24"/>
+          <w:rtl/>
+          <w:lang w:val="en-US" w:bidi="he-IL"/>
+        </w:rPr>
+        <w:t xml:space="preserve">פגיס, דן, </w:t>
+      </w:r>
+      <w:r>
+        <w:rPr>
+          <w:rFonts w:ascii="Times New Roman" w:cs="David" w:eastAsia="David" w:hAnsi="Times New Roman"/>
+          <w:i/>
+          <w:iCs/>
+          <w:noProof/>
+          <w:sz w:val="24"/>
+          <w:szCs w:val="24"/>
+          <w:rtl/>
+          <w:lang w:val="en-US" w:bidi="he-IL"/>
+        </w:rPr>
+        <w:t xml:space="preserve">חידוש ומסורת בשירת החול העברית: ספרד ואיטליה</w:t>
+      </w:r>
+      <w:r>
+        <w:rPr>
+          <w:rFonts w:ascii="Times New Roman" w:cs="David" w:eastAsia="David" w:hAnsi="Times New Roman"/>
+          <w:i w:val="false"/>
+          <w:iCs w:val="false"/>
+          <w:noProof/>
+          <w:sz w:val="24"/>
+          <w:szCs w:val="24"/>
+          <w:rtl/>
+          <w:lang w:val="en-US" w:bidi="he-IL"/>
+        </w:rPr>
+        <w:t xml:space="preserve">, ירושלים: כתר, 1976.</w:t>
+      </w:r>
+    </w:p>
+    <w:p>
+      <w:pPr>
+        <w:bidi/>
+        <w:spacing w:after="160" w:before="0" w:line="276"/>
+        <w:ind w:start="709" w:hanging="709"/>
+        <w:jc w:val="both"/>
+      </w:pPr>
+      <w:r>
+        <w:rPr>
+          <w:rFonts w:ascii="Times New Roman" w:cs="David" w:eastAsia="David" w:hAnsi="Times New Roman"/>
+          <w:i w:val="false"/>
+          <w:iCs w:val="false"/>
+          <w:noProof/>
+          <w:sz w:val="24"/>
+          <w:szCs w:val="24"/>
+          <w:rtl/>
+          <w:lang w:val="en-US" w:bidi="he-IL"/>
+        </w:rPr>
+        <w:t xml:space="preserve">שורצבוים, חיים, "טיפוסים פולקלוריים ומוטיבים עממיים בספר משלי שועלים לרבי ברכיה הנקדן", </w:t>
+      </w:r>
+      <w:r>
+        <w:rPr>
+          <w:rFonts w:ascii="Times New Roman" w:cs="David" w:eastAsia="David" w:hAnsi="Times New Roman"/>
+          <w:i/>
+          <w:iCs/>
+          <w:noProof/>
+          <w:sz w:val="24"/>
+          <w:szCs w:val="24"/>
+          <w:rtl/>
+          <w:lang w:val="en-US" w:bidi="he-IL"/>
+        </w:rPr>
+        <w:t xml:space="preserve">דברי הקונגרס העולמי הרביעי למדעי היהדות</w:t>
+      </w:r>
+      <w:r>
+        <w:rPr>
+          <w:rFonts w:ascii="Times New Roman" w:cs="David" w:eastAsia="David" w:hAnsi="Times New Roman"/>
+          <w:i w:val="false"/>
+          <w:iCs w:val="false"/>
+          <w:noProof/>
+          <w:sz w:val="24"/>
+          <w:szCs w:val="24"/>
+          <w:rtl/>
+          <w:lang w:val="en-US" w:bidi="he-IL"/>
+        </w:rPr>
+        <w:t xml:space="preserve">, כרך ב, ירושלים: האיגוד העולמי למדעי היהדות, תשכ"ה, עמ' 33-36.</w:t>
+      </w:r>
+    </w:p>
+    <w:p>
+      <w:pPr>
+        <w:bidi/>
+        <w:spacing w:after="160" w:before="0" w:line="276"/>
+        <w:ind w:start="709" w:hanging="709"/>
+        <w:jc w:val="both"/>
+      </w:pPr>
+      <w:r>
+        <w:rPr>
+          <w:rFonts w:ascii="Times New Roman" w:cs="David" w:eastAsia="David" w:hAnsi="Times New Roman"/>
+          <w:i w:val="false"/>
+          <w:iCs w:val="false"/>
+          <w:noProof/>
+          <w:sz w:val="24"/>
+          <w:szCs w:val="24"/>
+          <w:rtl/>
+          <w:lang w:val="en-US" w:bidi="he-IL"/>
+        </w:rPr>
+        <w:t xml:space="preserve">שטרן, דוד, "תפקידו של המשל בספרות חז"ל", </w:t>
+      </w:r>
+      <w:r>
+        <w:rPr>
+          <w:rFonts w:ascii="Times New Roman" w:cs="David" w:eastAsia="David" w:hAnsi="Times New Roman"/>
+          <w:i/>
+          <w:iCs/>
+          <w:noProof/>
+          <w:sz w:val="24"/>
+          <w:szCs w:val="24"/>
+          <w:rtl/>
+          <w:lang w:val="en-US" w:bidi="he-IL"/>
+        </w:rPr>
+        <w:t xml:space="preserve">מחקרי ירושלים בספרות עברית</w:t>
+      </w:r>
+      <w:r>
+        <w:rPr>
+          <w:rFonts w:ascii="Times New Roman" w:cs="David" w:eastAsia="David" w:hAnsi="Times New Roman"/>
+          <w:i w:val="false"/>
+          <w:iCs w:val="false"/>
+          <w:noProof/>
+          <w:sz w:val="24"/>
+          <w:szCs w:val="24"/>
+          <w:rtl/>
+          <w:lang w:val="en-US" w:bidi="he-IL"/>
+        </w:rPr>
+        <w:t xml:space="preserve"> ז (תשמ"ה), עמ' 90-102.</w:t>
+      </w:r>
+    </w:p>
+    <w:p>
+      <w:pPr>
+        <w:bidi/>
+        <w:spacing w:after="160" w:before="0" w:line="276"/>
+        <w:ind w:start="709" w:hanging="709"/>
+        <w:jc w:val="both"/>
+      </w:pPr>
+      <w:r>
+        <w:rPr>
+          <w:rFonts w:ascii="Times New Roman" w:cs="David" w:eastAsia="David" w:hAnsi="Times New Roman"/>
+          <w:i w:val="false"/>
+          <w:iCs w:val="false"/>
+          <w:noProof/>
+          <w:sz w:val="24"/>
+          <w:szCs w:val="24"/>
+          <w:rtl/>
+          <w:lang w:val="en-US" w:bidi="he-IL"/>
+        </w:rPr>
+        <w:t xml:space="preserve">שפירא, ענת, "המשל הנרטיבי-ספרותי ב'סדר אליהו' לאור המשל הדרשני בספרות חז"ל", </w:t>
+      </w:r>
+      <w:r>
+        <w:rPr>
+          <w:rFonts w:ascii="Times New Roman" w:cs="David" w:eastAsia="David" w:hAnsi="Times New Roman"/>
+          <w:i/>
+          <w:iCs/>
+          <w:noProof/>
+          <w:sz w:val="24"/>
+          <w:szCs w:val="24"/>
+          <w:rtl/>
+          <w:lang w:val="en-US" w:bidi="he-IL"/>
+        </w:rPr>
+        <w:t xml:space="preserve">מרקמים: תרבות, ספרות, פולקלור, לגלית חזן-רוקם</w:t>
+      </w:r>
+      <w:r>
+        <w:rPr>
+          <w:rFonts w:ascii="Times New Roman" w:cs="David" w:eastAsia="David" w:hAnsi="Times New Roman"/>
+          <w:i w:val="false"/>
+          <w:iCs w:val="false"/>
+          <w:noProof/>
+          <w:sz w:val="24"/>
+          <w:szCs w:val="24"/>
+          <w:rtl/>
+          <w:lang w:val="en-US" w:bidi="he-IL"/>
+        </w:rPr>
+        <w:t xml:space="preserve">, כרך א (= </w:t>
+      </w:r>
+      <w:r>
+        <w:rPr>
+          <w:rFonts w:ascii="Times New Roman" w:cs="David" w:eastAsia="David" w:hAnsi="Times New Roman"/>
+          <w:i/>
+          <w:iCs/>
+          <w:noProof/>
+          <w:sz w:val="24"/>
+          <w:szCs w:val="24"/>
+          <w:rtl/>
+          <w:lang w:val="en-US" w:bidi="he-IL"/>
+        </w:rPr>
+        <w:t xml:space="preserve">מחקרי ירושלים בספרות עברית</w:t>
+      </w:r>
+      <w:r>
+        <w:rPr>
+          <w:rFonts w:ascii="Times New Roman" w:cs="David" w:eastAsia="David" w:hAnsi="Times New Roman"/>
+          <w:i w:val="false"/>
+          <w:iCs w:val="false"/>
+          <w:noProof/>
+          <w:sz w:val="24"/>
+          <w:szCs w:val="24"/>
+          <w:rtl/>
+          <w:lang w:val="en-US" w:bidi="he-IL"/>
+        </w:rPr>
+        <w:t xml:space="preserve"> כה), ירושלים: המכון למדעי היהדות ע"ש מנדל, תשע"ג, עמ' 133-151.</w:t>
       </w:r>
     </w:p>
     <w:p>
@@ -7236,7 +7535,7 @@
           <w:rtl w:val="false"/>
           <w:lang w:val="en-US" w:bidi="he-IL"/>
         </w:rPr>
-        <w:t xml:space="preserve">Elliott, J. K., </w:t>
+        <w:t xml:space="preserve">Schwarzbaum, Haim, </w:t>
       </w:r>
       <w:r>
         <w:rPr>
@@ -7249,7 +7548,7 @@
           <w:rtl w:val="false"/>
           <w:lang w:val="en-US" w:bidi="he-IL"/>
         </w:rPr>
-        <w:t xml:space="preserve">The Apocryphal New Testament</w:t>
+        <w:t xml:space="preserve">The Mishle Shu'alim (Fox Fables) of Rabbi Berechiah ha-Nakdan: A Study in Comparative Folklore and Fable Lore</w:t>
       </w:r>
       <w:r>
         <w:rPr>
@@ -7262,7 +7561,7 @@
           <w:rtl w:val="false"/>
           <w:lang w:val="en-US" w:bidi="he-IL"/>
         </w:rPr>
-        <w:t xml:space="preserve">, Oxford: Clarendon Press, 1993.</w:t>
+        <w:t xml:space="preserve">, Kiron: Institute for Jewish and Arab Folklore Research, 1979.</w:t>
       </w:r>
     </w:p>
     <w:p>
@@ -7283,7 +7582,7 @@
           <w:rtl w:val="false"/>
           <w:lang w:val="en-US" w:bidi="he-IL"/>
         </w:rPr>
-        <w:t xml:space="preserve">Marie de France, </w:t>
+        <w:t xml:space="preserve">Thompson, Stith, </w:t>
       </w:r>
       <w:r>
         <w:rPr>
@@ -7296,7 +7595,7 @@
           <w:rtl w:val="false"/>
           <w:lang w:val="en-US" w:bidi="he-IL"/>
         </w:rPr>
-        <w:t xml:space="preserve">Fables</w:t>
+        <w:t xml:space="preserve">Motif-Index of Folk-Literature</w:t>
       </w:r>
       <w:r>
         <w:rPr>
@@ -7309,7 +7608,7 @@
           <w:rtl w:val="false"/>
           <w:lang w:val="en-US" w:bidi="he-IL"/>
         </w:rPr>
-        <w:t xml:space="preserve">, ed. and trans. Harriet Spiegel, Toronto: University of Toronto Press, 1987.</w:t>
+        <w:t xml:space="preserve">, 6 vols., Bloomington: Indiana University Press, 1955-1958.</w:t>
       </w:r>
     </w:p>
     <w:p>
@@ -7330,7 +7629,7 @@
           <w:rtl w:val="false"/>
           <w:lang w:val="en-US" w:bidi="he-IL"/>
         </w:rPr>
-        <w:t xml:space="preserve">Perry, Ben Edwin (ed. and trans.), </w:t>
+        <w:t xml:space="preserve">Uther, Hans-Jörg, </w:t>
       </w:r>
       <w:r>
         <w:rPr>
@@ -7343,7 +7642,7 @@
           <w:rtl w:val="false"/>
           <w:lang w:val="en-US" w:bidi="he-IL"/>
         </w:rPr>
-        <w:t xml:space="preserve">Babrius and Phaedrus</w:t>
+        <w:t xml:space="preserve">The Types of International Folktales: A Classification and Bibliography</w:t>
       </w:r>
       <w:r>
         <w:rPr>
@@ -7356,338 +7655,7 @@
           <w:rtl w:val="false"/>
           <w:lang w:val="en-US" w:bidi="he-IL"/>
         </w:rPr>
-        <w:t xml:space="preserve">, Loeb Classical Library, Cambridge, MA: Harvard University Press, 1965.</w:t>
-      </w:r>
-    </w:p>
-    <w:p>
-      <w:pPr>
-        <w:keepNext/>
-        <w:bidi/>
-        <w:spacing w:after="120" w:before="240" w:line="360"/>
-        <w:jc w:val="start"/>
-      </w:pPr>
-      <w:r>
-        <w:rPr>
-          <w:rFonts w:ascii="Times New Roman" w:cs="David" w:eastAsia="David" w:hAnsi="Times New Roman"/>
-          <w:b/>
-          <w:bCs/>
-          <w:i w:val="false"/>
-          <w:iCs w:val="false"/>
-          <w:noProof/>
-          <w:sz w:val="26"/>
-          <w:szCs w:val="26"/>
-          <w:rtl/>
-          <w:lang w:val="en-US" w:bidi="he-IL"/>
-        </w:rPr>
-        <w:t xml:space="preserve">מחקרים</w:t>
-      </w:r>
-    </w:p>
-    <w:p>
-      <w:pPr>
-        <w:bidi/>
-        <w:spacing w:after="160" w:before="0" w:line="276"/>
-        <w:ind w:start="709" w:hanging="709"/>
-        <w:jc w:val="both"/>
-      </w:pPr>
-      <w:r>
-        <w:rPr>
-          <w:rFonts w:ascii="Times New Roman" w:cs="David" w:eastAsia="David" w:hAnsi="Times New Roman"/>
-          <w:i w:val="false"/>
-          <w:iCs w:val="false"/>
-          <w:noProof/>
-          <w:sz w:val="24"/>
-          <w:szCs w:val="24"/>
-          <w:rtl/>
-          <w:lang w:val="en-US" w:bidi="he-IL"/>
-        </w:rPr>
-        <w:t xml:space="preserve">יסיף, עלי, "הסיפור האקסמפלארי בספר חסידים", </w:t>
-      </w:r>
-      <w:r>
-        <w:rPr>
-          <w:rFonts w:ascii="Times New Roman" w:cs="David" w:eastAsia="David" w:hAnsi="Times New Roman"/>
-          <w:i/>
-          <w:iCs/>
-          <w:noProof/>
-          <w:sz w:val="24"/>
-          <w:szCs w:val="24"/>
-          <w:rtl/>
-          <w:lang w:val="en-US" w:bidi="he-IL"/>
-        </w:rPr>
-        <w:t xml:space="preserve">תרביץ</w:t>
-      </w:r>
-      <w:r>
-        <w:rPr>
-          <w:rFonts w:ascii="Times New Roman" w:cs="David" w:eastAsia="David" w:hAnsi="Times New Roman"/>
-          <w:i w:val="false"/>
-          <w:iCs w:val="false"/>
-          <w:noProof/>
-          <w:sz w:val="24"/>
-          <w:szCs w:val="24"/>
-          <w:rtl/>
-          <w:lang w:val="en-US" w:bidi="he-IL"/>
-        </w:rPr>
-        <w:t xml:space="preserve"> נז (תשמ"ח), עמ' 217-255.</w:t>
-      </w:r>
-    </w:p>
-    <w:p>
-      <w:pPr>
-        <w:bidi/>
-        <w:spacing w:after="160" w:before="0" w:line="276"/>
-        <w:ind w:start="709" w:hanging="709"/>
-        <w:jc w:val="both"/>
-      </w:pPr>
-      <w:r>
-        <w:rPr>
-          <w:rFonts w:ascii="Times New Roman" w:cs="David" w:eastAsia="David" w:hAnsi="Times New Roman"/>
-          <w:i w:val="false"/>
-          <w:iCs w:val="false"/>
-          <w:noProof/>
-          <w:sz w:val="24"/>
-          <w:szCs w:val="24"/>
-          <w:rtl/>
-          <w:lang w:val="en-US" w:bidi="he-IL"/>
-        </w:rPr>
-        <w:t xml:space="preserve">יסיף, עלי, </w:t>
-      </w:r>
-      <w:r>
-        <w:rPr>
-          <w:rFonts w:ascii="Times New Roman" w:cs="David" w:eastAsia="David" w:hAnsi="Times New Roman"/>
-          <w:i/>
-          <w:iCs/>
-          <w:noProof/>
-          <w:sz w:val="24"/>
-          <w:szCs w:val="24"/>
-          <w:rtl/>
-          <w:lang w:val="en-US" w:bidi="he-IL"/>
-        </w:rPr>
-        <w:t xml:space="preserve">סיפור העם העברי: תולדותיו, סוגיו ומשמעותו</w:t>
-      </w:r>
-      <w:r>
-        <w:rPr>
-          <w:rFonts w:ascii="Times New Roman" w:cs="David" w:eastAsia="David" w:hAnsi="Times New Roman"/>
-          <w:i w:val="false"/>
-          <w:iCs w:val="false"/>
-          <w:noProof/>
-          <w:sz w:val="24"/>
-          <w:szCs w:val="24"/>
-          <w:rtl/>
-          <w:lang w:val="en-US" w:bidi="he-IL"/>
-        </w:rPr>
-        <w:t xml:space="preserve">, ירושלים: מוסד ביאליק, תשנ"ד.</w:t>
-      </w:r>
-    </w:p>
-    <w:p>
-      <w:pPr>
-        <w:bidi/>
-        <w:spacing w:after="160" w:before="0" w:line="276"/>
-        <w:ind w:start="709" w:hanging="709"/>
-        <w:jc w:val="both"/>
-      </w:pPr>
-      <w:r>
-        <w:rPr>
-          <w:rFonts w:ascii="Times New Roman" w:cs="David" w:eastAsia="David" w:hAnsi="Times New Roman"/>
-          <w:i w:val="false"/>
-          <w:iCs w:val="false"/>
-          <w:noProof/>
-          <w:sz w:val="24"/>
-          <w:szCs w:val="24"/>
-          <w:rtl/>
-          <w:lang w:val="en-US" w:bidi="he-IL"/>
-        </w:rPr>
-        <w:t xml:space="preserve">פגיס, דן, </w:t>
-      </w:r>
-      <w:r>
-        <w:rPr>
-          <w:rFonts w:ascii="Times New Roman" w:cs="David" w:eastAsia="David" w:hAnsi="Times New Roman"/>
-          <w:i/>
-          <w:iCs/>
-          <w:noProof/>
-          <w:sz w:val="24"/>
-          <w:szCs w:val="24"/>
-          <w:rtl/>
-          <w:lang w:val="en-US" w:bidi="he-IL"/>
-        </w:rPr>
-        <w:t xml:space="preserve">חידוש ומסורת בשירת החול העברית: ספרד ואיטליה</w:t>
-      </w:r>
-      <w:r>
-        <w:rPr>
-          <w:rFonts w:ascii="Times New Roman" w:cs="David" w:eastAsia="David" w:hAnsi="Times New Roman"/>
-          <w:i w:val="false"/>
-          <w:iCs w:val="false"/>
-          <w:noProof/>
-          <w:sz w:val="24"/>
-          <w:szCs w:val="24"/>
-          <w:rtl/>
-          <w:lang w:val="en-US" w:bidi="he-IL"/>
-        </w:rPr>
-        <w:t xml:space="preserve">, ירושלים: כתר, 1976.</w:t>
-      </w:r>
-    </w:p>
-    <w:p>
-      <w:pPr>
-        <w:bidi/>
-        <w:spacing w:after="160" w:before="0" w:line="276"/>
-        <w:ind w:start="709" w:hanging="709"/>
-        <w:jc w:val="both"/>
-      </w:pPr>
-      <w:r>
-        <w:rPr>
-          <w:rFonts w:ascii="Times New Roman" w:cs="David" w:eastAsia="David" w:hAnsi="Times New Roman"/>
-          <w:i w:val="false"/>
-          <w:iCs w:val="false"/>
-          <w:noProof/>
-          <w:sz w:val="24"/>
-          <w:szCs w:val="24"/>
-          <w:rtl/>
-          <w:lang w:val="en-US" w:bidi="he-IL"/>
-        </w:rPr>
-        <w:t xml:space="preserve">שורצבוים, חיים, "טיפוסים פולקלוריים ומוטיבים עממיים בספר משלי שועלים לרבי ברכיה הנקדן", </w:t>
-      </w:r>
-      <w:r>
-        <w:rPr>
-          <w:rFonts w:ascii="Times New Roman" w:cs="David" w:eastAsia="David" w:hAnsi="Times New Roman"/>
-          <w:i/>
-          <w:iCs/>
-          <w:noProof/>
-          <w:sz w:val="24"/>
-          <w:szCs w:val="24"/>
-          <w:rtl/>
-          <w:lang w:val="en-US" w:bidi="he-IL"/>
-        </w:rPr>
-        <w:t xml:space="preserve">דברי הקונגרס העולמי הרביעי למדעי היהדות</w:t>
-      </w:r>
-      <w:r>
-        <w:rPr>
-          <w:rFonts w:ascii="Times New Roman" w:cs="David" w:eastAsia="David" w:hAnsi="Times New Roman"/>
-          <w:i w:val="false"/>
-          <w:iCs w:val="false"/>
-          <w:noProof/>
-          <w:sz w:val="24"/>
-          <w:szCs w:val="24"/>
-          <w:rtl/>
-          <w:lang w:val="en-US" w:bidi="he-IL"/>
-        </w:rPr>
-        <w:t xml:space="preserve">, כרך ב, ירושלים: האיגוד העולמי למדעי היהדות, תשכ"ה, עמ' 33-36.</w:t>
-      </w:r>
-    </w:p>
-    <w:p>
-      <w:pPr>
-        <w:bidi/>
-        <w:spacing w:after="160" w:before="0" w:line="276"/>
-        <w:ind w:start="709" w:hanging="709"/>
-        <w:jc w:val="both"/>
-      </w:pPr>
-      <w:r>
-        <w:rPr>
-          <w:rFonts w:ascii="Times New Roman" w:cs="David" w:eastAsia="David" w:hAnsi="Times New Roman"/>
-          <w:i w:val="false"/>
-          <w:iCs w:val="false"/>
-          <w:noProof/>
-          <w:sz w:val="24"/>
-          <w:szCs w:val="24"/>
-          <w:rtl/>
-          <w:lang w:val="en-US" w:bidi="he-IL"/>
-        </w:rPr>
-        <w:t xml:space="preserve">שטרן, דוד, "תפקידו של המשל בספרות חז"ל", </w:t>
-      </w:r>
-      <w:r>
-        <w:rPr>
-          <w:rFonts w:ascii="Times New Roman" w:cs="David" w:eastAsia="David" w:hAnsi="Times New Roman"/>
-          <w:i/>
-          <w:iCs/>
-          <w:noProof/>
-          <w:sz w:val="24"/>
-          <w:szCs w:val="24"/>
-          <w:rtl/>
-          <w:lang w:val="en-US" w:bidi="he-IL"/>
-        </w:rPr>
-        <w:t xml:space="preserve">מחקרי ירושלים בספרות עברית</w:t>
-      </w:r>
-      <w:r>
-        <w:rPr>
-          <w:rFonts w:ascii="Times New Roman" w:cs="David" w:eastAsia="David" w:hAnsi="Times New Roman"/>
-          <w:i w:val="false"/>
-          <w:iCs w:val="false"/>
-          <w:noProof/>
-          <w:sz w:val="24"/>
-          <w:szCs w:val="24"/>
-          <w:rtl/>
-          <w:lang w:val="en-US" w:bidi="he-IL"/>
-        </w:rPr>
-        <w:t xml:space="preserve"> ז (תשמ"ה), עמ' 90-102.</w:t>
-      </w:r>
-    </w:p>
-    <w:p>
-      <w:pPr>
-        <w:bidi/>
-        <w:spacing w:after="160" w:before="0" w:line="276"/>
-        <w:ind w:start="709" w:hanging="709"/>
-        <w:jc w:val="both"/>
-      </w:pPr>
-      <w:r>
-        <w:rPr>
-          <w:rFonts w:ascii="Times New Roman" w:cs="David" w:eastAsia="David" w:hAnsi="Times New Roman"/>
-          <w:i w:val="false"/>
-          <w:iCs w:val="false"/>
-          <w:noProof/>
-          <w:sz w:val="24"/>
-          <w:szCs w:val="24"/>
-          <w:rtl/>
-          <w:lang w:val="en-US" w:bidi="he-IL"/>
-        </w:rPr>
-        <w:t xml:space="preserve">שפירא, ענת, "המשל הנרטיבי-ספרותי ב'סדר אליהו' לאור המשל הדרשני בספרות חז"ל", </w:t>
-      </w:r>
-      <w:r>
-        <w:rPr>
-          <w:rFonts w:ascii="Times New Roman" w:cs="David" w:eastAsia="David" w:hAnsi="Times New Roman"/>
-          <w:i/>
-          <w:iCs/>
-          <w:noProof/>
-          <w:sz w:val="24"/>
-          <w:szCs w:val="24"/>
-          <w:rtl/>
-          <w:lang w:val="en-US" w:bidi="he-IL"/>
-        </w:rPr>
-        <w:t xml:space="preserve">מרקמים: תרבות, ספרות, פולקלור, לגלית חזן-רוקם</w:t>
-      </w:r>
-      <w:r>
-        <w:rPr>
-          <w:rFonts w:ascii="Times New Roman" w:cs="David" w:eastAsia="David" w:hAnsi="Times New Roman"/>
-          <w:i w:val="false"/>
-          <w:iCs w:val="false"/>
-          <w:noProof/>
-          <w:sz w:val="24"/>
-          <w:szCs w:val="24"/>
-          <w:rtl/>
-          <w:lang w:val="en-US" w:bidi="he-IL"/>
-        </w:rPr>
-        <w:t xml:space="preserve">, כרך א (= </w:t>
-      </w:r>
-      <w:r>
-        <w:rPr>
-          <w:rFonts w:ascii="Times New Roman" w:cs="David" w:eastAsia="David" w:hAnsi="Times New Roman"/>
-          <w:i/>
-          <w:iCs/>
-          <w:noProof/>
-          <w:sz w:val="24"/>
-          <w:szCs w:val="24"/>
-          <w:rtl/>
-          <w:lang w:val="en-US" w:bidi="he-IL"/>
-        </w:rPr>
-        <w:t xml:space="preserve">מחקרי ירושלים בספרות עברית</w:t>
-      </w:r>
-      <w:r>
-        <w:rPr>
-          <w:rFonts w:ascii="Times New Roman" w:cs="David" w:eastAsia="David" w:hAnsi="Times New Roman"/>
-          <w:i w:val="false"/>
-          <w:iCs w:val="false"/>
-          <w:noProof/>
-          <w:sz w:val="24"/>
-          <w:szCs w:val="24"/>
-          <w:rtl/>
-          <w:lang w:val="en-US" w:bidi="he-IL"/>
-        </w:rPr>
-        <w:t xml:space="preserve"> כה), ירושלים: המכון למדעי היהדות ע"ש מנדל, תשע"ג, עמ' 133-151.</w:t>
+        <w:t xml:space="preserve">, FF Communications 284-286, 3 vols., Helsinki: Academia Scientiarum Fennica, 2004.</w:t>
       </w:r>
     </w:p>
     <w:p>
@@ -7708,7 +7676,7 @@
           <w:rtl w:val="false"/>
           <w:lang w:val="en-US" w:bidi="he-IL"/>
         </w:rPr>
-        <w:t xml:space="preserve">Rossel, Stine, Fiona Marshall, Joris Peters, Tom Pilgram, Matthew D. Adams, and David O'Connor, "Domestication of the Donkey: Timing, Processes, and Indicators," </w:t>
+        <w:t xml:space="preserve">Way, Kenneth C., </w:t>
       </w:r>
       <w:r>
         <w:rPr>
@@ -7721,7 +7689,7 @@
           <w:rtl w:val="false"/>
           <w:lang w:val="en-US" w:bidi="he-IL"/>
         </w:rPr>
-        <w:t xml:space="preserve">Proceedings of the National Academy of Sciences</w:t>
+        <w:t xml:space="preserve">Donkeys in the Biblical World: Ceremony and Symbol</w:t>
       </w:r>
       <w:r>
         <w:rPr>
@@ -7734,242 +7702,7 @@
           <w:rtl w:val="false"/>
           <w:lang w:val="en-US" w:bidi="he-IL"/>
         </w:rPr>
-        <w:t xml:space="preserve"> 105, no. 10 (2008): 3715-3720.</w:t>
-      </w:r>
-    </w:p>
-    <w:p>
-      <w:pPr>
-        <w:bidi w:val="false"/>
-        <w:spacing w:after="160" w:before="0" w:line="276"/>
-        <w:ind w:left="709" w:hanging="709"/>
-        <w:jc w:val="left"/>
-      </w:pPr>
-      <w:r>
-        <w:rPr>
-          <w:rFonts w:ascii="Times New Roman" w:cs="David" w:eastAsia="David" w:hAnsi="Times New Roman"/>
-          <w:i w:val="false"/>
-          <w:iCs w:val="false"/>
-          <w:noProof/>
-          <w:sz w:val="24"/>
-          <w:szCs w:val="24"/>
-          <w:rtl w:val="false"/>
-          <w:lang w:val="en-US" w:bidi="he-IL"/>
-        </w:rPr>
-        <w:t xml:space="preserve">Schwarzbaum, Haim, </w:t>
-      </w:r>
-      <w:r>
-        <w:rPr>
-          <w:rFonts w:ascii="Times New Roman" w:cs="David" w:eastAsia="David" w:hAnsi="Times New Roman"/>
-          <w:i/>
-          <w:iCs/>
-          <w:noProof/>
-          <w:sz w:val="24"/>
-          <w:szCs w:val="24"/>
-          <w:rtl w:val="false"/>
-          <w:lang w:val="en-US" w:bidi="he-IL"/>
-        </w:rPr>
-        <w:t xml:space="preserve">The Mishle Shu'alim (Fox Fables) of Rabbi Berechiah ha-Nakdan: A Study in Comparative Folklore and Fable Lore</w:t>
-      </w:r>
-      <w:r>
-        <w:rPr>
-          <w:rFonts w:ascii="Times New Roman" w:cs="David" w:eastAsia="David" w:hAnsi="Times New Roman"/>
-          <w:i w:val="false"/>
-          <w:iCs w:val="false"/>
-          <w:noProof/>
-          <w:sz w:val="24"/>
-          <w:szCs w:val="24"/>
-          <w:rtl w:val="false"/>
-          <w:lang w:val="en-US" w:bidi="he-IL"/>
-        </w:rPr>
-        <w:t xml:space="preserve">, Kiron: Institute for Jewish and Arab Folklore Research, 1979.</w:t>
-      </w:r>
-    </w:p>
-    <w:p>
-      <w:pPr>
-        <w:bidi w:val="false"/>
-        <w:spacing w:after="160" w:before="0" w:line="276"/>
-        <w:ind w:left="709" w:hanging="709"/>
-        <w:jc w:val="left"/>
-      </w:pPr>
-      <w:r>
-        <w:rPr>
-          <w:rFonts w:ascii="Times New Roman" w:cs="David" w:eastAsia="David" w:hAnsi="Times New Roman"/>
-          <w:i w:val="false"/>
-          <w:iCs w:val="false"/>
-          <w:noProof/>
-          <w:sz w:val="24"/>
-          <w:szCs w:val="24"/>
-          <w:rtl w:val="false"/>
-          <w:lang w:val="en-US" w:bidi="he-IL"/>
-        </w:rPr>
-        <w:t xml:space="preserve">Thompson, Stith, </w:t>
-      </w:r>
-      <w:r>
-        <w:rPr>
-          <w:rFonts w:ascii="Times New Roman" w:cs="David" w:eastAsia="David" w:hAnsi="Times New Roman"/>
-          <w:i/>
-          <w:iCs/>
-          <w:noProof/>
-          <w:sz w:val="24"/>
-          <w:szCs w:val="24"/>
-          <w:rtl w:val="false"/>
-          <w:lang w:val="en-US" w:bidi="he-IL"/>
-        </w:rPr>
-        <w:t xml:space="preserve">Motif-Index of Folk-Literature</w:t>
-      </w:r>
-      <w:r>
-        <w:rPr>
-          <w:rFonts w:ascii="Times New Roman" w:cs="David" w:eastAsia="David" w:hAnsi="Times New Roman"/>
-          <w:i w:val="false"/>
-          <w:iCs w:val="false"/>
-          <w:noProof/>
-          <w:sz w:val="24"/>
-          <w:szCs w:val="24"/>
-          <w:rtl w:val="false"/>
-          <w:lang w:val="en-US" w:bidi="he-IL"/>
-        </w:rPr>
-        <w:t xml:space="preserve">, 6 vols., Bloomington: Indiana University Press, 1955-1958.</w:t>
-      </w:r>
-    </w:p>
-    <w:p>
-      <w:pPr>
-        <w:bidi w:val="false"/>
-        <w:spacing w:after="160" w:before="0" w:line="276"/>
-        <w:ind w:left="709" w:hanging="709"/>
-        <w:jc w:val="left"/>
-      </w:pPr>
-      <w:r>
-        <w:rPr>
-          <w:rFonts w:ascii="Times New Roman" w:cs="David" w:eastAsia="David" w:hAnsi="Times New Roman"/>
-          <w:i w:val="false"/>
-          <w:iCs w:val="false"/>
-          <w:noProof/>
-          <w:sz w:val="24"/>
-          <w:szCs w:val="24"/>
-          <w:rtl w:val="false"/>
-          <w:lang w:val="en-US" w:bidi="he-IL"/>
-        </w:rPr>
-        <w:t xml:space="preserve">Uther, Hans-Jörg, </w:t>
-      </w:r>
-      <w:r>
-        <w:rPr>
-          <w:rFonts w:ascii="Times New Roman" w:cs="David" w:eastAsia="David" w:hAnsi="Times New Roman"/>
-          <w:i/>
-          <w:iCs/>
-          <w:noProof/>
-          <w:sz w:val="24"/>
-          <w:szCs w:val="24"/>
-          <w:rtl w:val="false"/>
-          <w:lang w:val="en-US" w:bidi="he-IL"/>
-        </w:rPr>
-        <w:t xml:space="preserve">The Types of International Folktales: A Classification and Bibliography</w:t>
-      </w:r>
-      <w:r>
-        <w:rPr>
-          <w:rFonts w:ascii="Times New Roman" w:cs="David" w:eastAsia="David" w:hAnsi="Times New Roman"/>
-          <w:i w:val="false"/>
-          <w:iCs w:val="false"/>
-          <w:noProof/>
-          <w:sz w:val="24"/>
-          <w:szCs w:val="24"/>
-          <w:rtl w:val="false"/>
-          <w:lang w:val="en-US" w:bidi="he-IL"/>
-        </w:rPr>
-        <w:t xml:space="preserve">, FF Communications 284-286, 3 vols., Helsinki: Academia Scientiarum Fennica, 2004.</w:t>
-      </w:r>
-    </w:p>
-    <w:p>
-      <w:pPr>
-        <w:bidi w:val="false"/>
-        <w:spacing w:after="160" w:before="0" w:line="276"/>
-        <w:ind w:left="709" w:hanging="709"/>
-        <w:jc w:val="left"/>
-      </w:pPr>
-      <w:r>
-        <w:rPr>
-          <w:rFonts w:ascii="Times New Roman" w:cs="David" w:eastAsia="David" w:hAnsi="Times New Roman"/>
-          <w:i w:val="false"/>
-          <w:iCs w:val="false"/>
-          <w:noProof/>
-          <w:sz w:val="24"/>
-          <w:szCs w:val="24"/>
-          <w:rtl w:val="false"/>
-          <w:lang w:val="en-US" w:bidi="he-IL"/>
-        </w:rPr>
-        <w:t xml:space="preserve">Way, Kenneth C., </w:t>
-      </w:r>
-      <w:r>
-        <w:rPr>
-          <w:rFonts w:ascii="Times New Roman" w:cs="David" w:eastAsia="David" w:hAnsi="Times New Roman"/>
-          <w:i/>
-          <w:iCs/>
-          <w:noProof/>
-          <w:sz w:val="24"/>
-          <w:szCs w:val="24"/>
-          <w:rtl w:val="false"/>
-          <w:lang w:val="en-US" w:bidi="he-IL"/>
-        </w:rPr>
-        <w:t xml:space="preserve">Donkeys in the Biblical World: Ceremony and Symbol</w:t>
-      </w:r>
-      <w:r>
-        <w:rPr>
-          <w:rFonts w:ascii="Times New Roman" w:cs="David" w:eastAsia="David" w:hAnsi="Times New Roman"/>
-          <w:i w:val="false"/>
-          <w:iCs w:val="false"/>
-          <w:noProof/>
-          <w:sz w:val="24"/>
-          <w:szCs w:val="24"/>
-          <w:rtl w:val="false"/>
-          <w:lang w:val="en-US" w:bidi="he-IL"/>
-        </w:rPr>
         <w:t xml:space="preserve">, Winona Lake: Eisenbrauns, 2011.</w:t>
-      </w:r>
-    </w:p>
-    <w:p>
-      <w:pPr>
-        <w:bidi w:val="false"/>
-        <w:spacing w:after="160" w:before="0" w:line="276"/>
-        <w:ind w:left="709" w:hanging="709"/>
-        <w:jc w:val="left"/>
-      </w:pPr>
-      <w:r>
-        <w:rPr>
-          <w:rFonts w:ascii="Times New Roman" w:cs="David" w:eastAsia="David" w:hAnsi="Times New Roman"/>
-          <w:i w:val="false"/>
-          <w:iCs w:val="false"/>
-          <w:noProof/>
-          <w:sz w:val="24"/>
-          <w:szCs w:val="24"/>
-          <w:rtl w:val="false"/>
-          <w:lang w:val="en-US" w:bidi="he-IL"/>
-        </w:rPr>
-        <w:t xml:space="preserve">White, T. H. (trans.), </w:t>
-      </w:r>
-      <w:r>
-        <w:rPr>
-          <w:rFonts w:ascii="Times New Roman" w:cs="David" w:eastAsia="David" w:hAnsi="Times New Roman"/>
-          <w:i/>
-          <w:iCs/>
-          <w:noProof/>
-          <w:sz w:val="24"/>
-          <w:szCs w:val="24"/>
-          <w:rtl w:val="false"/>
-          <w:lang w:val="en-US" w:bidi="he-IL"/>
-        </w:rPr>
-        <w:t xml:space="preserve">The Book of Beasts: Being a Translation from a Latin Bestiary of the Twelfth Century</w:t>
-      </w:r>
-      <w:r>
-        <w:rPr>
-          <w:rFonts w:ascii="Times New Roman" w:cs="David" w:eastAsia="David" w:hAnsi="Times New Roman"/>
-          <w:i w:val="false"/>
-          <w:iCs w:val="false"/>
-          <w:noProof/>
-          <w:sz w:val="24"/>
-          <w:szCs w:val="24"/>
-          <w:rtl w:val="false"/>
-          <w:lang w:val="en-US" w:bidi="he-IL"/>
-        </w:rPr>
-        <w:t xml:space="preserve">, London: Jonathan Cape, 1954.</w:t>
       </w:r>
     </w:p>
     <w:p>
@@ -8574,7 +8307,7 @@
           <w:rtl w:val="false"/>
           <w:lang w:val="en-US" w:bidi="he-IL"/>
         </w:rPr>
-        <w:t xml:space="preserve">Stine Rossel et al., "Domestication of the Donkey: Timing, Processes, and Indicators," </w:t>
+        <w:t xml:space="preserve">Kenneth C. Way, </w:t>
       </w:r>
       <w:r>
         <w:rPr>
@@ -8587,7 +8320,7 @@
           <w:rtl w:val="false"/>
           <w:lang w:val="en-US" w:bidi="he-IL"/>
         </w:rPr>
-        <w:t xml:space="preserve">Proceedings of the National Academy of Sciences</w:t>
+        <w:t xml:space="preserve">Donkeys in the Biblical World: Ceremony and Symbol</w:t>
       </w:r>
       <w:r>
         <w:rPr>
@@ -8600,7 +8333,20 @@
           <w:rtl w:val="false"/>
           <w:lang w:val="en-US" w:bidi="he-IL"/>
         </w:rPr>
-        <w:t xml:space="preserve"> 105, no. 10 (2008): 3715-3720.</w:t>
+        <w:t xml:space="preserve">, Winona Lake: Eisenbrauns, 2011, </w:t>
+      </w:r>
+      <w:r>
+        <w:rPr>
+          <w:rFonts w:ascii="Times New Roman" w:cs="David" w:eastAsia="David" w:hAnsi="Times New Roman"/>
+          <w:i w:val="false"/>
+          <w:iCs w:val="false"/>
+          <w:noProof/>
+          <w:sz w:val="20"/>
+          <w:szCs w:val="20"/>
+          <w:rtl/>
+          <w:lang w:val="en-US" w:bidi="he-IL"/>
+        </w:rPr>
+        <w:t xml:space="preserve">בפרק על ביות החמור ועל הממצא הארכיאולוגי [לוודא עמודים].</w:t>
       </w:r>
     </w:p>
   </w:footnote>
@@ -8628,7 +8374,7 @@
           <w:rtl w:val="false"/>
           <w:lang w:val="en-US" w:bidi="he-IL"/>
         </w:rPr>
-        <w:t xml:space="preserve">Kenneth C. Way, </w:t>
+        <w:t xml:space="preserve">Way, </w:t>
       </w:r>
       <w:r>
         <w:rPr>
@@ -8641,7 +8387,7 @@
           <w:rtl w:val="false"/>
           <w:lang w:val="en-US" w:bidi="he-IL"/>
         </w:rPr>
-        <w:t xml:space="preserve">Donkeys in the Biblical World: Ceremony and Symbol</w:t>
+        <w:t xml:space="preserve">Donkeys in the Biblical World</w:t>
       </w:r>
       <w:r>
         <w:rPr>
@@ -8654,7 +8400,7 @@
           <w:rtl w:val="false"/>
           <w:lang w:val="en-US" w:bidi="he-IL"/>
         </w:rPr>
-        <w:t xml:space="preserve">, Winona Lake: Eisenbrauns, 2011, pp. 1-6 [</w:t>
+        <w:t xml:space="preserve">, pp. 1-6 [</w:t>
       </w:r>
       <w:r>
         <w:rPr>
@@ -8780,6 +8526,112 @@
     </w:p>
   </w:footnote>
   <w:footnote w:id="6">
+    <w:p>
+      <w:pPr>
+        <w:bidi/>
+        <w:spacing w:after="60" w:line="240"/>
+        <w:jc w:val="both"/>
+      </w:pPr>
+      <w:r>
+        <w:rPr>
+          <w:rStyle w:val="FootnoteReference"/>
+        </w:rPr>
+        <w:footnoteRef/>
+      </w:r>
+      <w:r>
+        <w:rPr>
+          <w:rFonts w:ascii="Times New Roman" w:cs="David" w:eastAsia="David" w:hAnsi="Times New Roman"/>
+          <w:i w:val="false"/>
+          <w:iCs w:val="false"/>
+          <w:noProof/>
+          <w:sz w:val="20"/>
+          <w:szCs w:val="20"/>
+          <w:rtl/>
+          <w:lang w:val="en-US" w:bidi="he-IL"/>
+        </w:rPr>
+        <w:t xml:space="preserve">מספרי פרי, המפתח המקובל למשלי איזופוס, מובאים כפי שהם רשומים אצל </w:t>
+      </w:r>
+      <w:r>
+        <w:rPr>
+          <w:rFonts w:ascii="Times New Roman" w:cs="David" w:eastAsia="David" w:hAnsi="Times New Roman"/>
+          <w:i w:val="false"/>
+          <w:iCs w:val="false"/>
+          <w:noProof/>
+          <w:sz w:val="20"/>
+          <w:szCs w:val="20"/>
+          <w:rtl w:val="false"/>
+          <w:lang w:val="en-US" w:bidi="he-IL"/>
+        </w:rPr>
+        <w:t xml:space="preserve">Haim Schwarzbaum, </w:t>
+      </w:r>
+      <w:r>
+        <w:rPr>
+          <w:rFonts w:ascii="Times New Roman" w:cs="David" w:eastAsia="David" w:hAnsi="Times New Roman"/>
+          <w:i/>
+          <w:iCs/>
+          <w:noProof/>
+          <w:sz w:val="20"/>
+          <w:szCs w:val="20"/>
+          <w:rtl w:val="false"/>
+          <w:lang w:val="en-US" w:bidi="he-IL"/>
+        </w:rPr>
+        <w:t xml:space="preserve">The Mishle Shu'alim (Fox Fables) of Rabbi Berechiah ha-Nakdan: A Study in Comparative Folklore and Fable Lore</w:t>
+      </w:r>
+      <w:r>
+        <w:rPr>
+          <w:rFonts w:ascii="Times New Roman" w:cs="David" w:eastAsia="David" w:hAnsi="Times New Roman"/>
+          <w:i w:val="false"/>
+          <w:iCs w:val="false"/>
+          <w:noProof/>
+          <w:sz w:val="20"/>
+          <w:szCs w:val="20"/>
+          <w:rtl w:val="false"/>
+          <w:lang w:val="en-US" w:bidi="he-IL"/>
+        </w:rPr>
+        <w:t xml:space="preserve">, Kiron: Institute for Jewish and Arab Folklore Research, 1979, </w:t>
+      </w:r>
+      <w:r>
+        <w:rPr>
+          <w:rFonts w:ascii="Times New Roman" w:cs="David" w:eastAsia="David" w:hAnsi="Times New Roman"/>
+          <w:i w:val="false"/>
+          <w:iCs w:val="false"/>
+          <w:noProof/>
+          <w:sz w:val="20"/>
+          <w:szCs w:val="20"/>
+          <w:rtl/>
+          <w:lang w:val="en-US" w:bidi="he-IL"/>
+        </w:rPr>
+        <w:t xml:space="preserve">בדיון על כל משל. תרגום עברי: איסופוס, </w:t>
+      </w:r>
+      <w:r>
+        <w:rPr>
+          <w:rFonts w:ascii="Times New Roman" w:cs="David" w:eastAsia="David" w:hAnsi="Times New Roman"/>
+          <w:i/>
+          <w:iCs/>
+          <w:noProof/>
+          <w:sz w:val="20"/>
+          <w:szCs w:val="20"/>
+          <w:rtl/>
+          <w:lang w:val="en-US" w:bidi="he-IL"/>
+        </w:rPr>
+        <w:t xml:space="preserve">משלי איסופוס</w:t>
+      </w:r>
+      <w:r>
+        <w:rPr>
+          <w:rFonts w:ascii="Times New Roman" w:cs="David" w:eastAsia="David" w:hAnsi="Times New Roman"/>
+          <w:i w:val="false"/>
+          <w:iCs w:val="false"/>
+          <w:noProof/>
+          <w:sz w:val="20"/>
+          <w:szCs w:val="20"/>
+          <w:rtl/>
+          <w:lang w:val="en-US" w:bidi="he-IL"/>
+        </w:rPr>
+        <w:t xml:space="preserve">, תרגם שלמה שפאן, ירושלים: מוסד ביאליק, תש"ך.</w:t>
+      </w:r>
+    </w:p>
+  </w:footnote>
+  <w:footnote w:id="7">
     <w:p>
       <w:pPr>
         <w:bidi w:val="false"/>
@@ -8803,7 +8655,7 @@
           <w:rtl w:val="false"/>
           <w:lang w:val="en-US" w:bidi="he-IL"/>
         </w:rPr>
-        <w:t xml:space="preserve">Ben Edwin Perry (ed. and trans.), </w:t>
+        <w:t xml:space="preserve">Schwarzbaum, </w:t>
       </w:r>
       <w:r>
         <w:rPr>
@@ -8816,7 +8668,89 @@
           <w:rtl w:val="false"/>
           <w:lang w:val="en-US" w:bidi="he-IL"/>
         </w:rPr>
-        <w:t xml:space="preserve">Babrius and Phaedrus</w:t>
+        <w:t xml:space="preserve">Mishle Shu'alim</w:t>
+      </w:r>
+      <w:r>
+        <w:rPr>
+          <w:rFonts w:ascii="Times New Roman" w:cs="David" w:eastAsia="David" w:hAnsi="Times New Roman"/>
+          <w:i w:val="false"/>
+          <w:iCs w:val="false"/>
+          <w:noProof/>
+          <w:sz w:val="20"/>
+          <w:szCs w:val="20"/>
+          <w:rtl/>
+          <w:lang w:val="en-US" w:bidi="he-IL"/>
+        </w:rPr>
+        <w:t xml:space="preserve">, בדיון על משלים יד ו-מז [לוודא עמודים]; וכן חיים שורצבוים, "טיפוסים פולקלוריים ומוטיבים עממיים בספר משלי שועלים לרבי ברכיה הנקדן", </w:t>
+      </w:r>
+      <w:r>
+        <w:rPr>
+          <w:rFonts w:ascii="Times New Roman" w:cs="David" w:eastAsia="David" w:hAnsi="Times New Roman"/>
+          <w:i/>
+          <w:iCs/>
+          <w:noProof/>
+          <w:sz w:val="20"/>
+          <w:szCs w:val="20"/>
+          <w:rtl/>
+          <w:lang w:val="en-US" w:bidi="he-IL"/>
+        </w:rPr>
+        <w:t xml:space="preserve">דברי הקונגרס העולמי הרביעי למדעי היהדות</w:t>
+      </w:r>
+      <w:r>
+        <w:rPr>
+          <w:rFonts w:ascii="Times New Roman" w:cs="David" w:eastAsia="David" w:hAnsi="Times New Roman"/>
+          <w:i w:val="false"/>
+          <w:iCs w:val="false"/>
+          <w:noProof/>
+          <w:sz w:val="20"/>
+          <w:szCs w:val="20"/>
+          <w:rtl/>
+          <w:lang w:val="en-US" w:bidi="he-IL"/>
+        </w:rPr>
+        <w:t xml:space="preserve">, כרך ב, ירושלים: האיגוד העולמי למדעי היהדות, תשכ"ה, עמ' 33-36.</w:t>
+      </w:r>
+    </w:p>
+  </w:footnote>
+  <w:footnote w:id="8">
+    <w:p>
+      <w:pPr>
+        <w:bidi/>
+        <w:spacing w:after="60" w:line="240"/>
+        <w:jc w:val="both"/>
+      </w:pPr>
+      <w:r>
+        <w:rPr>
+          <w:rStyle w:val="FootnoteReference"/>
+        </w:rPr>
+        <w:footnoteRef/>
+      </w:r>
+      <w:r>
+        <w:rPr>
+          <w:rFonts w:ascii="Times New Roman" w:cs="David" w:eastAsia="David" w:hAnsi="Times New Roman"/>
+          <w:i w:val="false"/>
+          <w:iCs w:val="false"/>
+          <w:noProof/>
+          <w:sz w:val="20"/>
+          <w:szCs w:val="20"/>
+          <w:rtl/>
+          <w:lang w:val="en-US" w:bidi="he-IL"/>
+        </w:rPr>
+        <w:t xml:space="preserve">שורצבוים, "טיפוסים פולקלוריים", עמ' 33-34.</w:t>
+      </w:r>
+    </w:p>
+  </w:footnote>
+  <w:footnote w:id="9">
+    <w:p>
+      <w:pPr>
+        <w:bidi w:val="false"/>
+        <w:spacing w:after="60" w:line="240"/>
+        <w:jc w:val="left"/>
+      </w:pPr>
+      <w:r>
+        <w:rPr>
+          <w:rStyle w:val="FootnoteReference"/>
+        </w:rPr>
+        <w:footnoteRef/>
       </w:r>
       <w:r>
         <w:rPr>
@@ -8829,50 +8763,37 @@
           <w:rtl w:val="false"/>
           <w:lang w:val="en-US" w:bidi="he-IL"/>
         </w:rPr>
-        <w:t xml:space="preserve">, Loeb Classical Library, Cambridge, MA: Harvard University Press, 1965. </w:t>
-      </w:r>
-      <w:r>
-        <w:rPr>
-          <w:rFonts w:ascii="Times New Roman" w:cs="David" w:eastAsia="David" w:hAnsi="Times New Roman"/>
-          <w:i w:val="false"/>
-          <w:iCs w:val="false"/>
+        <w:t xml:space="preserve">Hans-Jörg Uther, </w:t>
+      </w:r>
+      <w:r>
+        <w:rPr>
+          <w:rFonts w:ascii="Times New Roman" w:cs="David" w:eastAsia="David" w:hAnsi="Times New Roman"/>
+          <w:i/>
+          <w:iCs/>
           <w:noProof/>
           <w:sz w:val="20"/>
           <w:szCs w:val="20"/>
-          <w:rtl/>
-          <w:lang w:val="en-US" w:bidi="he-IL"/>
-        </w:rPr>
-        <w:t xml:space="preserve">מספרי פרי לפי המפתח שבסוף כרך זה. תרגום עברי: איסופוס, </w:t>
-      </w:r>
-      <w:r>
-        <w:rPr>
-          <w:rFonts w:ascii="Times New Roman" w:cs="David" w:eastAsia="David" w:hAnsi="Times New Roman"/>
-          <w:i/>
-          <w:iCs/>
+          <w:rtl w:val="false"/>
+          <w:lang w:val="en-US" w:bidi="he-IL"/>
+        </w:rPr>
+        <w:t xml:space="preserve">The Types of International Folktales: A Classification and Bibliography</w:t>
+      </w:r>
+      <w:r>
+        <w:rPr>
+          <w:rFonts w:ascii="Times New Roman" w:cs="David" w:eastAsia="David" w:hAnsi="Times New Roman"/>
+          <w:i w:val="false"/>
+          <w:iCs w:val="false"/>
           <w:noProof/>
           <w:sz w:val="20"/>
           <w:szCs w:val="20"/>
-          <w:rtl/>
-          <w:lang w:val="en-US" w:bidi="he-IL"/>
-        </w:rPr>
-        <w:t xml:space="preserve">משלי איסופוס</w:t>
-      </w:r>
-      <w:r>
-        <w:rPr>
-          <w:rFonts w:ascii="Times New Roman" w:cs="David" w:eastAsia="David" w:hAnsi="Times New Roman"/>
-          <w:i w:val="false"/>
-          <w:iCs w:val="false"/>
-          <w:noProof/>
-          <w:sz w:val="20"/>
-          <w:szCs w:val="20"/>
-          <w:rtl/>
-          <w:lang w:val="en-US" w:bidi="he-IL"/>
-        </w:rPr>
-        <w:t xml:space="preserve">, תרגם שלמה שפאן, ירושלים: מוסד ביאליק, תש"ך.</w:t>
+          <w:rtl w:val="false"/>
+          <w:lang w:val="en-US" w:bidi="he-IL"/>
+        </w:rPr>
+        <w:t xml:space="preserve">, FF Communications 284-286, Helsinki: Academia Scientiarum Fennica, 2004, vol. 1, nos. 214, 214B.</w:t>
       </w:r>
     </w:p>
   </w:footnote>
-  <w:footnote w:id="7">
+  <w:footnote w:id="10">
     <w:p>
       <w:pPr>
         <w:bidi w:val="false"/>
@@ -8896,7 +8817,7 @@
           <w:rtl w:val="false"/>
           <w:lang w:val="en-US" w:bidi="he-IL"/>
         </w:rPr>
-        <w:t xml:space="preserve">Haim Schwarzbaum, </w:t>
+        <w:t xml:space="preserve">Stith Thompson, </w:t>
       </w:r>
       <w:r>
         <w:rPr>
@@ -8909,7 +8830,7 @@
           <w:rtl w:val="false"/>
           <w:lang w:val="en-US" w:bidi="he-IL"/>
         </w:rPr>
-        <w:t xml:space="preserve">The Mishle Shu'alim (Fox Fables) of Rabbi Berechiah ha-Nakdan: A Study in Comparative Folklore and Fable Lore</w:t>
+        <w:t xml:space="preserve">Motif-Index of Folk-Literature</w:t>
       </w:r>
       <w:r>
         <w:rPr>
@@ -8922,7 +8843,7 @@
           <w:rtl w:val="false"/>
           <w:lang w:val="en-US" w:bidi="he-IL"/>
         </w:rPr>
-        <w:t xml:space="preserve">, Kiron: Institute for Jewish and Arab Folklore Research, 1979, </w:t>
+        <w:t xml:space="preserve">, 6 vols., Bloomington: Indiana University Press, 1955-1958, motifs J951.1, J2413.1, L315 [</w:t>
       </w:r>
       <w:r>
         <w:rPr>
@@ -8935,7 +8856,50 @@
           <w:rtl/>
           <w:lang w:val="en-US" w:bidi="he-IL"/>
         </w:rPr>
-        <w:t xml:space="preserve">בדיון על משלים יד ו-מז [לוודא עמודים]; וכן חיים שורצבוים, "טיפוסים פולקלוריים ומוטיבים עממיים בספר משלי שועלים לרבי ברכיה הנקדן", </w:t>
+        <w:t xml:space="preserve">לוודא מספרים].</w:t>
+      </w:r>
+    </w:p>
+  </w:footnote>
+  <w:footnote w:id="11">
+    <w:p>
+      <w:pPr>
+        <w:bidi/>
+        <w:spacing w:after="60" w:line="240"/>
+        <w:jc w:val="both"/>
+      </w:pPr>
+      <w:r>
+        <w:rPr>
+          <w:rStyle w:val="FootnoteReference"/>
+        </w:rPr>
+        <w:footnoteRef/>
+      </w:r>
+      <w:r>
+        <w:rPr>
+          <w:rFonts w:ascii="Times New Roman" w:cs="David" w:eastAsia="David" w:hAnsi="Times New Roman"/>
+          <w:i w:val="false"/>
+          <w:iCs w:val="false"/>
+          <w:noProof/>
+          <w:sz w:val="20"/>
+          <w:szCs w:val="20"/>
+          <w:rtl/>
+          <w:lang w:val="en-US" w:bidi="he-IL"/>
+        </w:rPr>
+        <w:t xml:space="preserve">שורצבוים, "טיפוסים פולקלוריים", עמ' 35, שם מובא הסיפור לפי הנוסח העברי של רבי יעקב בן אלעזר ומהדורת דרנבורג.</w:t>
+      </w:r>
+    </w:p>
+  </w:footnote>
+  <w:footnote w:id="12">
+    <w:p>
+      <w:pPr>
+        <w:bidi/>
+        <w:spacing w:after="60" w:line="240"/>
+        <w:jc w:val="both"/>
+      </w:pPr>
+      <w:r>
+        <w:rPr>
+          <w:rStyle w:val="FootnoteReference"/>
+        </w:rPr>
+        <w:footnoteRef/>
       </w:r>
       <w:r>
         <w:rPr>
@@ -8948,7 +8912,7 @@
           <w:rtl/>
           <w:lang w:val="en-US" w:bidi="he-IL"/>
         </w:rPr>
-        <w:t xml:space="preserve">דברי הקונגרס העולמי הרביעי למדעי היהדות</w:t>
+        <w:t xml:space="preserve">אלף לילה ולילה</w:t>
       </w:r>
       <w:r>
         <w:rPr>
@@ -8961,11 +8925,11 @@
           <w:rtl/>
           <w:lang w:val="en-US" w:bidi="he-IL"/>
         </w:rPr>
-        <w:t xml:space="preserve">, כרך ב, ירושלים: האיגוד העולמי למדעי היהדות, תשכ"ה, עמ' 33-36.</w:t>
+        <w:t xml:space="preserve">, תרגם מערבית יוסף יואל ריבלין, כרך א, תל אביב: קרית ספר, תש"ז, סיפור המסגרת.</w:t>
       </w:r>
     </w:p>
   </w:footnote>
-  <w:footnote w:id="8">
+  <w:footnote w:id="13">
     <w:p>
       <w:pPr>
         <w:bidi/>
@@ -8989,11 +8953,50 @@
           <w:rtl/>
           <w:lang w:val="en-US" w:bidi="he-IL"/>
         </w:rPr>
-        <w:t xml:space="preserve">שורצבוים, "טיפוסים פולקלוריים", עמ' 33-34.</w:t>
+        <w:t xml:space="preserve">המקבילה אצל מארי דה פראנס, משל 15, מובאת אצל </w:t>
+      </w:r>
+      <w:r>
+        <w:rPr>
+          <w:rFonts w:ascii="Times New Roman" w:cs="David" w:eastAsia="David" w:hAnsi="Times New Roman"/>
+          <w:i w:val="false"/>
+          <w:iCs w:val="false"/>
+          <w:noProof/>
+          <w:sz w:val="20"/>
+          <w:szCs w:val="20"/>
+          <w:rtl w:val="false"/>
+          <w:lang w:val="en-US" w:bidi="he-IL"/>
+        </w:rPr>
+        <w:t xml:space="preserve">Schwarzbaum, </w:t>
+      </w:r>
+      <w:r>
+        <w:rPr>
+          <w:rFonts w:ascii="Times New Roman" w:cs="David" w:eastAsia="David" w:hAnsi="Times New Roman"/>
+          <w:i/>
+          <w:iCs/>
+          <w:noProof/>
+          <w:sz w:val="20"/>
+          <w:szCs w:val="20"/>
+          <w:rtl w:val="false"/>
+          <w:lang w:val="en-US" w:bidi="he-IL"/>
+        </w:rPr>
+        <w:t xml:space="preserve">Mishle Shu'alim</w:t>
+      </w:r>
+      <w:r>
+        <w:rPr>
+          <w:rFonts w:ascii="Times New Roman" w:cs="David" w:eastAsia="David" w:hAnsi="Times New Roman"/>
+          <w:i w:val="false"/>
+          <w:iCs w:val="false"/>
+          <w:noProof/>
+          <w:sz w:val="20"/>
+          <w:szCs w:val="20"/>
+          <w:rtl/>
+          <w:lang w:val="en-US" w:bidi="he-IL"/>
+        </w:rPr>
+        <w:t xml:space="preserve">, בדיון על משל יד [לוודא].</w:t>
       </w:r>
     </w:p>
   </w:footnote>
-  <w:footnote w:id="9">
+  <w:footnote w:id="14">
     <w:p>
       <w:pPr>
         <w:bidi w:val="false"/>
@@ -9017,7 +9020,7 @@
           <w:rtl w:val="false"/>
           <w:lang w:val="en-US" w:bidi="he-IL"/>
         </w:rPr>
-        <w:t xml:space="preserve">Hans-Jörg Uther, </w:t>
+        <w:t xml:space="preserve">J. K. Elliott, </w:t>
       </w:r>
       <w:r>
         <w:rPr>
@@ -9030,7 +9033,7 @@
           <w:rtl w:val="false"/>
           <w:lang w:val="en-US" w:bidi="he-IL"/>
         </w:rPr>
-        <w:t xml:space="preserve">The Types of International Folktales: A Classification and Bibliography</w:t>
+        <w:t xml:space="preserve">The Apocryphal New Testament</w:t>
       </w:r>
       <w:r>
         <w:rPr>
@@ -9043,11 +9046,106 @@
           <w:rtl w:val="false"/>
           <w:lang w:val="en-US" w:bidi="he-IL"/>
         </w:rPr>
-        <w:t xml:space="preserve">, FF Communications 284-286, Helsinki: Academia Scientiarum Fennica, 2004, vol. 1, nos. 214, 214B.</w:t>
+        <w:t xml:space="preserve">, Oxford: Clarendon Press, 1993, Gospel of Pseudo-Matthew, ch. 14.</w:t>
       </w:r>
     </w:p>
   </w:footnote>
-  <w:footnote w:id="10">
+  <w:footnote w:id="15">
+    <w:p>
+      <w:pPr>
+        <w:bidi/>
+        <w:spacing w:after="60" w:line="240"/>
+        <w:jc w:val="both"/>
+      </w:pPr>
+      <w:r>
+        <w:rPr>
+          <w:rStyle w:val="FootnoteReference"/>
+        </w:rPr>
+        <w:footnoteRef/>
+      </w:r>
+      <w:r>
+        <w:rPr>
+          <w:rFonts w:ascii="Times New Roman" w:cs="David" w:eastAsia="David" w:hAnsi="Times New Roman"/>
+          <w:i/>
+          <w:iCs/>
+          <w:noProof/>
+          <w:sz w:val="20"/>
+          <w:szCs w:val="20"/>
+          <w:rtl/>
+          <w:lang w:val="en-US" w:bidi="he-IL"/>
+        </w:rPr>
+        <w:t xml:space="preserve">הקוראן</w:t>
+      </w:r>
+      <w:r>
+        <w:rPr>
+          <w:rFonts w:ascii="Times New Roman" w:cs="David" w:eastAsia="David" w:hAnsi="Times New Roman"/>
+          <w:i w:val="false"/>
+          <w:iCs w:val="false"/>
+          <w:noProof/>
+          <w:sz w:val="20"/>
+          <w:szCs w:val="20"/>
+          <w:rtl/>
+          <w:lang w:val="en-US" w:bidi="he-IL"/>
+        </w:rPr>
+        <w:t xml:space="preserve">, תרגם מערבית אורי רובין, תל אביב: אוניברסיטת תל אביב, 2005, סורות 31, 62, 74. ההקשר הרביעי הוא סורה 2, פסוק 259, על האיש שחמורו הוחיה לאחר מאה שנה.</w:t>
+      </w:r>
+    </w:p>
+  </w:footnote>
+  <w:footnote w:id="16">
+    <w:p>
+      <w:pPr>
+        <w:bidi/>
+        <w:spacing w:after="60" w:line="240"/>
+        <w:jc w:val="both"/>
+      </w:pPr>
+      <w:r>
+        <w:rPr>
+          <w:rStyle w:val="FootnoteReference"/>
+        </w:rPr>
+        <w:footnoteRef/>
+      </w:r>
+      <w:r>
+        <w:rPr>
+          <w:rFonts w:ascii="Times New Roman" w:cs="David" w:eastAsia="David" w:hAnsi="Times New Roman"/>
+          <w:i w:val="false"/>
+          <w:iCs w:val="false"/>
+          <w:noProof/>
+          <w:sz w:val="20"/>
+          <w:szCs w:val="20"/>
+          <w:rtl/>
+          <w:lang w:val="en-US" w:bidi="he-IL"/>
+        </w:rPr>
+        <w:t xml:space="preserve">את גלגולו של הביטוי בספרות העברית של ימי הביניים יש לבדוק; ראו לפי שעה יסיף, </w:t>
+      </w:r>
+      <w:r>
+        <w:rPr>
+          <w:rFonts w:ascii="Times New Roman" w:cs="David" w:eastAsia="David" w:hAnsi="Times New Roman"/>
+          <w:i/>
+          <w:iCs/>
+          <w:noProof/>
+          <w:sz w:val="20"/>
+          <w:szCs w:val="20"/>
+          <w:rtl/>
+          <w:lang w:val="en-US" w:bidi="he-IL"/>
+        </w:rPr>
+        <w:t xml:space="preserve">סיפור העם העברי</w:t>
+      </w:r>
+      <w:r>
+        <w:rPr>
+          <w:rFonts w:ascii="Times New Roman" w:cs="David" w:eastAsia="David" w:hAnsi="Times New Roman"/>
+          <w:i w:val="false"/>
+          <w:iCs w:val="false"/>
+          <w:noProof/>
+          <w:sz w:val="20"/>
+          <w:szCs w:val="20"/>
+          <w:rtl/>
+          <w:lang w:val="en-US" w:bidi="he-IL"/>
+        </w:rPr>
+        <w:t xml:space="preserve">, במפתח בערך "חמור" [לוודא].</w:t>
+      </w:r>
+    </w:p>
+  </w:footnote>
+  <w:footnote w:id="17">
     <w:p>
       <w:pPr>
         <w:bidi w:val="false"/>
@@ -9071,7 +9169,7 @@
           <w:rtl w:val="false"/>
           <w:lang w:val="en-US" w:bidi="he-IL"/>
         </w:rPr>
-        <w:t xml:space="preserve">Stith Thompson, </w:t>
+        <w:t xml:space="preserve">Uther, </w:t>
       </w:r>
       <w:r>
         <w:rPr>
@@ -9084,7 +9182,7 @@
           <w:rtl w:val="false"/>
           <w:lang w:val="en-US" w:bidi="he-IL"/>
         </w:rPr>
-        <w:t xml:space="preserve">Motif-Index of Folk-Literature</w:t>
+        <w:t xml:space="preserve">Types of International Folktales</w:t>
       </w:r>
       <w:r>
         <w:rPr>
@@ -9097,24 +9195,11 @@
           <w:rtl w:val="false"/>
           <w:lang w:val="en-US" w:bidi="he-IL"/>
         </w:rPr>
-        <w:t xml:space="preserve">, 6 vols., Bloomington: Indiana University Press, 1955-1958, motifs J951.1, J2413.1, L315 [</w:t>
-      </w:r>
-      <w:r>
-        <w:rPr>
-          <w:rFonts w:ascii="Times New Roman" w:cs="David" w:eastAsia="David" w:hAnsi="Times New Roman"/>
-          <w:i w:val="false"/>
-          <w:iCs w:val="false"/>
-          <w:noProof/>
-          <w:sz w:val="20"/>
-          <w:szCs w:val="20"/>
-          <w:rtl/>
-          <w:lang w:val="en-US" w:bidi="he-IL"/>
-        </w:rPr>
-        <w:t xml:space="preserve">לוודא מספרים].</w:t>
+        <w:t xml:space="preserve">, no. 130.</w:t>
       </w:r>
     </w:p>
   </w:footnote>
-  <w:footnote w:id="11">
+  <w:footnote w:id="18">
     <w:p>
       <w:pPr>
         <w:bidi w:val="false"/>
@@ -9138,7 +9223,7 @@
           <w:rtl w:val="false"/>
           <w:lang w:val="en-US" w:bidi="he-IL"/>
         </w:rPr>
-        <w:t xml:space="preserve">Joseph Derenbourg (ed.), </w:t>
+        <w:t xml:space="preserve">Hadas, </w:t>
       </w:r>
       <w:r>
         <w:rPr>
@@ -9151,7 +9236,7 @@
           <w:rtl w:val="false"/>
           <w:lang w:val="en-US" w:bidi="he-IL"/>
         </w:rPr>
-        <w:t xml:space="preserve">Deux versions hébraïques du livre de Kalîlâh et Dimnâh</w:t>
+        <w:t xml:space="preserve">Fables of a Jewish Aesop</w:t>
       </w:r>
       <w:r>
         <w:rPr>
@@ -9164,65 +9249,37 @@
           <w:rtl w:val="false"/>
           <w:lang w:val="en-US" w:bidi="he-IL"/>
         </w:rPr>
-        <w:t xml:space="preserve">, Paris: F. Vieweg, 1881, </w:t>
-      </w:r>
-      <w:r>
-        <w:rPr>
-          <w:rFonts w:ascii="Times New Roman" w:cs="David" w:eastAsia="David" w:hAnsi="Times New Roman"/>
-          <w:i w:val="false"/>
-          <w:iCs w:val="false"/>
+        <w:t xml:space="preserve">, Introduction; Schwarzbaum, </w:t>
+      </w:r>
+      <w:r>
+        <w:rPr>
+          <w:rFonts w:ascii="Times New Roman" w:cs="David" w:eastAsia="David" w:hAnsi="Times New Roman"/>
+          <w:i/>
+          <w:iCs/>
           <w:noProof/>
           <w:sz w:val="20"/>
           <w:szCs w:val="20"/>
-          <w:rtl/>
-          <w:lang w:val="en-US" w:bidi="he-IL"/>
-        </w:rPr>
-        <w:t xml:space="preserve">בפרק "הקוף והצב" [לוודא מיקום].</w:t>
-      </w:r>
-    </w:p>
-  </w:footnote>
-  <w:footnote w:id="12">
-    <w:p>
-      <w:pPr>
-        <w:bidi/>
-        <w:spacing w:after="60" w:line="240"/>
-        <w:jc w:val="both"/>
-      </w:pPr>
-      <w:r>
-        <w:rPr>
-          <w:rStyle w:val="FootnoteReference"/>
-        </w:rPr>
-        <w:footnoteRef/>
-      </w:r>
-      <w:r>
-        <w:rPr>
-          <w:rFonts w:ascii="Times New Roman" w:cs="David" w:eastAsia="David" w:hAnsi="Times New Roman"/>
-          <w:i/>
-          <w:iCs/>
+          <w:rtl w:val="false"/>
+          <w:lang w:val="en-US" w:bidi="he-IL"/>
+        </w:rPr>
+        <w:t xml:space="preserve">Mishle Shu'alim</w:t>
+      </w:r>
+      <w:r>
+        <w:rPr>
+          <w:rFonts w:ascii="Times New Roman" w:cs="David" w:eastAsia="David" w:hAnsi="Times New Roman"/>
+          <w:i w:val="false"/>
+          <w:iCs w:val="false"/>
           <w:noProof/>
           <w:sz w:val="20"/>
           <w:szCs w:val="20"/>
-          <w:rtl/>
-          <w:lang w:val="en-US" w:bidi="he-IL"/>
-        </w:rPr>
-        <w:t xml:space="preserve">אלף לילה ולילה</w:t>
-      </w:r>
-      <w:r>
-        <w:rPr>
-          <w:rFonts w:ascii="Times New Roman" w:cs="David" w:eastAsia="David" w:hAnsi="Times New Roman"/>
-          <w:i w:val="false"/>
-          <w:iCs w:val="false"/>
-          <w:noProof/>
-          <w:sz w:val="20"/>
-          <w:szCs w:val="20"/>
-          <w:rtl/>
-          <w:lang w:val="en-US" w:bidi="he-IL"/>
-        </w:rPr>
-        <w:t xml:space="preserve">, תרגם מערבית יוסף יואל ריבלין, כרך א, תל אביב: קרית ספר, תש"ז, סיפור המסגרת.</w:t>
+          <w:rtl w:val="false"/>
+          <w:lang w:val="en-US" w:bidi="he-IL"/>
+        </w:rPr>
+        <w:t xml:space="preserve">, Introduction.</w:t>
       </w:r>
     </w:p>
   </w:footnote>
-  <w:footnote w:id="13">
+  <w:footnote w:id="19">
     <w:p>
       <w:pPr>
         <w:bidi w:val="false"/>
@@ -9246,7 +9303,7 @@
           <w:rtl w:val="false"/>
           <w:lang w:val="en-US" w:bidi="he-IL"/>
         </w:rPr>
-        <w:t xml:space="preserve">Marie de France, </w:t>
+        <w:t xml:space="preserve">Hadas, </w:t>
       </w:r>
       <w:r>
         <w:rPr>
@@ -9259,7 +9316,7 @@
           <w:rtl w:val="false"/>
           <w:lang w:val="en-US" w:bidi="he-IL"/>
         </w:rPr>
-        <w:t xml:space="preserve">Fables</w:t>
+        <w:t xml:space="preserve">Fables of a Jewish Aesop</w:t>
       </w:r>
       <w:r>
         <w:rPr>
@@ -9272,7 +9329,7 @@
           <w:rtl w:val="false"/>
           <w:lang w:val="en-US" w:bidi="he-IL"/>
         </w:rPr>
-        <w:t xml:space="preserve">, ed. and trans. Harriet Spiegel, Toronto: University of Toronto Press, 1987, no. 15 [</w:t>
+        <w:t xml:space="preserve">, Introduction, pp. vii-xiv [</w:t>
       </w:r>
       <w:r>
         <w:rPr>
@@ -9285,11 +9342,65 @@
           <w:rtl/>
           <w:lang w:val="en-US" w:bidi="he-IL"/>
         </w:rPr>
-        <w:t xml:space="preserve">לוודא].</w:t>
+        <w:t xml:space="preserve">לוודא עמודים].</w:t>
       </w:r>
     </w:p>
   </w:footnote>
-  <w:footnote w:id="14">
+  <w:footnote w:id="20">
+    <w:p>
+      <w:pPr>
+        <w:bidi/>
+        <w:spacing w:after="60" w:line="240"/>
+        <w:jc w:val="both"/>
+      </w:pPr>
+      <w:r>
+        <w:rPr>
+          <w:rStyle w:val="FootnoteReference"/>
+        </w:rPr>
+        <w:footnoteRef/>
+      </w:r>
+      <w:r>
+        <w:rPr>
+          <w:rFonts w:ascii="Times New Roman" w:cs="David" w:eastAsia="David" w:hAnsi="Times New Roman"/>
+          <w:i w:val="false"/>
+          <w:iCs w:val="false"/>
+          <w:noProof/>
+          <w:sz w:val="20"/>
+          <w:szCs w:val="20"/>
+          <w:rtl/>
+          <w:lang w:val="en-US" w:bidi="he-IL"/>
+        </w:rPr>
+        <w:t xml:space="preserve">עלי יסיף, "הסיפור האקסמפלארי בספר חסידים", </w:t>
+      </w:r>
+      <w:r>
+        <w:rPr>
+          <w:rFonts w:ascii="Times New Roman" w:cs="David" w:eastAsia="David" w:hAnsi="Times New Roman"/>
+          <w:i/>
+          <w:iCs/>
+          <w:noProof/>
+          <w:sz w:val="20"/>
+          <w:szCs w:val="20"/>
+          <w:rtl/>
+          <w:lang w:val="en-US" w:bidi="he-IL"/>
+        </w:rPr>
+        <w:t xml:space="preserve">תרביץ</w:t>
+      </w:r>
+      <w:r>
+        <w:rPr>
+          <w:rFonts w:ascii="Times New Roman" w:cs="David" w:eastAsia="David" w:hAnsi="Times New Roman"/>
+          <w:i w:val="false"/>
+          <w:iCs w:val="false"/>
+          <w:noProof/>
+          <w:sz w:val="20"/>
+          <w:szCs w:val="20"/>
+          <w:rtl/>
+          <w:lang w:val="en-US" w:bidi="he-IL"/>
+        </w:rPr>
+        <w:t xml:space="preserve"> נז (תשמ"ח), עמ' 217-255, בעמ' 220-221.</w:t>
+      </w:r>
+    </w:p>
+  </w:footnote>
+  <w:footnote w:id="21">
     <w:p>
       <w:pPr>
         <w:bidi w:val="false"/>
@@ -9313,7 +9424,7 @@
           <w:rtl w:val="false"/>
           <w:lang w:val="en-US" w:bidi="he-IL"/>
         </w:rPr>
-        <w:t xml:space="preserve">J. K. Elliott, </w:t>
+        <w:t xml:space="preserve">Berechiah ha-Nakdan, </w:t>
       </w:r>
       <w:r>
         <w:rPr>
@@ -9326,7 +9437,7 @@
           <w:rtl w:val="false"/>
           <w:lang w:val="en-US" w:bidi="he-IL"/>
         </w:rPr>
-        <w:t xml:space="preserve">The Apocryphal New Testament</w:t>
+        <w:t xml:space="preserve">Fables of a Jewish Aesop</w:t>
       </w:r>
       <w:r>
         <w:rPr>
@@ -9339,11 +9450,37 @@
           <w:rtl w:val="false"/>
           <w:lang w:val="en-US" w:bidi="he-IL"/>
         </w:rPr>
-        <w:t xml:space="preserve">, Oxford: Clarendon Press, 1993, Gospel of Pseudo-Matthew, ch. 14.</w:t>
+        <w:t xml:space="preserve">, trans. Moses Hadas, New York: Columbia University Press, 1967; Schwarzbaum, </w:t>
+      </w:r>
+      <w:r>
+        <w:rPr>
+          <w:rFonts w:ascii="Times New Roman" w:cs="David" w:eastAsia="David" w:hAnsi="Times New Roman"/>
+          <w:i/>
+          <w:iCs/>
+          <w:noProof/>
+          <w:sz w:val="20"/>
+          <w:szCs w:val="20"/>
+          <w:rtl w:val="false"/>
+          <w:lang w:val="en-US" w:bidi="he-IL"/>
+        </w:rPr>
+        <w:t xml:space="preserve">Mishle Shu'alim</w:t>
+      </w:r>
+      <w:r>
+        <w:rPr>
+          <w:rFonts w:ascii="Times New Roman" w:cs="David" w:eastAsia="David" w:hAnsi="Times New Roman"/>
+          <w:i w:val="false"/>
+          <w:iCs w:val="false"/>
+          <w:noProof/>
+          <w:sz w:val="20"/>
+          <w:szCs w:val="20"/>
+          <w:rtl/>
+          <w:lang w:val="en-US" w:bidi="he-IL"/>
+        </w:rPr>
+        <w:t xml:space="preserve">.</w:t>
       </w:r>
     </w:p>
   </w:footnote>
-  <w:footnote w:id="15">
+  <w:footnote w:id="22">
     <w:p>
       <w:pPr>
         <w:bidi w:val="false"/>
@@ -9367,7 +9504,7 @@
           <w:rtl w:val="false"/>
           <w:lang w:val="en-US" w:bidi="he-IL"/>
         </w:rPr>
-        <w:t xml:space="preserve">T. H. White, </w:t>
+        <w:t xml:space="preserve">Schwarzbaum, </w:t>
       </w:r>
       <w:r>
         <w:rPr>
@@ -9380,7 +9517,7 @@
           <w:rtl w:val="false"/>
           <w:lang w:val="en-US" w:bidi="he-IL"/>
         </w:rPr>
-        <w:t xml:space="preserve">The Book of Beasts: Being a Translation from a Latin Bestiary of the Twelfth Century</w:t>
+        <w:t xml:space="preserve">Mishle Shu'alim</w:t>
       </w:r>
       <w:r>
         <w:rPr>
@@ -9393,7 +9530,7 @@
           <w:rtl w:val="false"/>
           <w:lang w:val="en-US" w:bidi="he-IL"/>
         </w:rPr>
-        <w:t xml:space="preserve">, London: Jonathan Cape, 1954, </w:t>
+        <w:t xml:space="preserve">, Introduction; </w:t>
       </w:r>
       <w:r>
         <w:rPr>
@@ -9406,7 +9543,305 @@
           <w:rtl/>
           <w:lang w:val="en-US" w:bidi="he-IL"/>
         </w:rPr>
-        <w:t xml:space="preserve">בערכים </w:t>
+        <w:t xml:space="preserve">שורצבוים, "טיפוסים פולקלוריים", עמ' 34-36.</w:t>
+      </w:r>
+    </w:p>
+  </w:footnote>
+  <w:footnote w:id="23">
+    <w:p>
+      <w:pPr>
+        <w:bidi/>
+        <w:spacing w:after="60" w:line="240"/>
+        <w:jc w:val="both"/>
+      </w:pPr>
+      <w:r>
+        <w:rPr>
+          <w:rStyle w:val="FootnoteReference"/>
+        </w:rPr>
+        <w:footnoteRef/>
+      </w:r>
+      <w:r>
+        <w:rPr>
+          <w:rFonts w:ascii="Times New Roman" w:cs="David" w:eastAsia="David" w:hAnsi="Times New Roman"/>
+          <w:i w:val="false"/>
+          <w:iCs w:val="false"/>
+          <w:noProof/>
+          <w:sz w:val="20"/>
+          <w:szCs w:val="20"/>
+          <w:rtl/>
+          <w:lang w:val="en-US" w:bidi="he-IL"/>
+        </w:rPr>
+        <w:t xml:space="preserve">דן פגיס, </w:t>
+      </w:r>
+      <w:r>
+        <w:rPr>
+          <w:rFonts w:ascii="Times New Roman" w:cs="David" w:eastAsia="David" w:hAnsi="Times New Roman"/>
+          <w:i/>
+          <w:iCs/>
+          <w:noProof/>
+          <w:sz w:val="20"/>
+          <w:szCs w:val="20"/>
+          <w:rtl/>
+          <w:lang w:val="en-US" w:bidi="he-IL"/>
+        </w:rPr>
+        <w:t xml:space="preserve">חידוש ומסורת בשירת החול העברית: ספרד ואיטליה</w:t>
+      </w:r>
+      <w:r>
+        <w:rPr>
+          <w:rFonts w:ascii="Times New Roman" w:cs="David" w:eastAsia="David" w:hAnsi="Times New Roman"/>
+          <w:i w:val="false"/>
+          <w:iCs w:val="false"/>
+          <w:noProof/>
+          <w:sz w:val="20"/>
+          <w:szCs w:val="20"/>
+          <w:rtl/>
+          <w:lang w:val="en-US" w:bidi="he-IL"/>
+        </w:rPr>
+        <w:t xml:space="preserve">, ירושלים: כתר, 1976, עמ' 70-77 [לוודא עמודים].</w:t>
+      </w:r>
+    </w:p>
+  </w:footnote>
+  <w:footnote w:id="24">
+    <w:p>
+      <w:pPr>
+        <w:bidi/>
+        <w:spacing w:after="60" w:line="240"/>
+        <w:jc w:val="both"/>
+      </w:pPr>
+      <w:r>
+        <w:rPr>
+          <w:rStyle w:val="FootnoteReference"/>
+        </w:rPr>
+        <w:footnoteRef/>
+      </w:r>
+      <w:r>
+        <w:rPr>
+          <w:rFonts w:ascii="Times New Roman" w:cs="David" w:eastAsia="David" w:hAnsi="Times New Roman"/>
+          <w:i w:val="false"/>
+          <w:iCs w:val="false"/>
+          <w:noProof/>
+          <w:sz w:val="20"/>
+          <w:szCs w:val="20"/>
+          <w:rtl/>
+          <w:lang w:val="en-US" w:bidi="he-IL"/>
+        </w:rPr>
+        <w:t xml:space="preserve">ענת שפירא, "המשל הנרטיבי-ספרותי ב'סדר אליהו' לאור המשל הדרשני בספרות חז"ל", </w:t>
+      </w:r>
+      <w:r>
+        <w:rPr>
+          <w:rFonts w:ascii="Times New Roman" w:cs="David" w:eastAsia="David" w:hAnsi="Times New Roman"/>
+          <w:i/>
+          <w:iCs/>
+          <w:noProof/>
+          <w:sz w:val="20"/>
+          <w:szCs w:val="20"/>
+          <w:rtl/>
+          <w:lang w:val="en-US" w:bidi="he-IL"/>
+        </w:rPr>
+        <w:t xml:space="preserve">מרקמים: תרבות, ספרות, פולקלור, לגלית חזן-רוקם</w:t>
+      </w:r>
+      <w:r>
+        <w:rPr>
+          <w:rFonts w:ascii="Times New Roman" w:cs="David" w:eastAsia="David" w:hAnsi="Times New Roman"/>
+          <w:i w:val="false"/>
+          <w:iCs w:val="false"/>
+          <w:noProof/>
+          <w:sz w:val="20"/>
+          <w:szCs w:val="20"/>
+          <w:rtl/>
+          <w:lang w:val="en-US" w:bidi="he-IL"/>
+        </w:rPr>
+        <w:t xml:space="preserve">, כרך א (= </w:t>
+      </w:r>
+      <w:r>
+        <w:rPr>
+          <w:rFonts w:ascii="Times New Roman" w:cs="David" w:eastAsia="David" w:hAnsi="Times New Roman"/>
+          <w:i/>
+          <w:iCs/>
+          <w:noProof/>
+          <w:sz w:val="20"/>
+          <w:szCs w:val="20"/>
+          <w:rtl/>
+          <w:lang w:val="en-US" w:bidi="he-IL"/>
+        </w:rPr>
+        <w:t xml:space="preserve">מחקרי ירושלים בספרות עברית</w:t>
+      </w:r>
+      <w:r>
+        <w:rPr>
+          <w:rFonts w:ascii="Times New Roman" w:cs="David" w:eastAsia="David" w:hAnsi="Times New Roman"/>
+          <w:i w:val="false"/>
+          <w:iCs w:val="false"/>
+          <w:noProof/>
+          <w:sz w:val="20"/>
+          <w:szCs w:val="20"/>
+          <w:rtl/>
+          <w:lang w:val="en-US" w:bidi="he-IL"/>
+        </w:rPr>
+        <w:t xml:space="preserve"> כה), ירושלים: המכון למדעי היהדות ע"ש מנדל, תשע"ג, עמ' 133-151, בעמ' 133-135, 150.</w:t>
+      </w:r>
+    </w:p>
+  </w:footnote>
+  <w:footnote w:id="25">
+    <w:p>
+      <w:pPr>
+        <w:bidi/>
+        <w:spacing w:after="60" w:line="240"/>
+        <w:jc w:val="both"/>
+      </w:pPr>
+      <w:r>
+        <w:rPr>
+          <w:rStyle w:val="FootnoteReference"/>
+        </w:rPr>
+        <w:footnoteRef/>
+      </w:r>
+      <w:r>
+        <w:rPr>
+          <w:rFonts w:ascii="Times New Roman" w:cs="David" w:eastAsia="David" w:hAnsi="Times New Roman"/>
+          <w:i w:val="false"/>
+          <w:iCs w:val="false"/>
+          <w:noProof/>
+          <w:sz w:val="20"/>
+          <w:szCs w:val="20"/>
+          <w:rtl/>
+          <w:lang w:val="en-US" w:bidi="he-IL"/>
+        </w:rPr>
+        <w:t xml:space="preserve">ברכיה הנקדן, </w:t>
+      </w:r>
+      <w:r>
+        <w:rPr>
+          <w:rFonts w:ascii="Times New Roman" w:cs="David" w:eastAsia="David" w:hAnsi="Times New Roman"/>
+          <w:i/>
+          <w:iCs/>
+          <w:noProof/>
+          <w:sz w:val="20"/>
+          <w:szCs w:val="20"/>
+          <w:rtl/>
+          <w:lang w:val="en-US" w:bidi="he-IL"/>
+        </w:rPr>
+        <w:t xml:space="preserve">משלי שועלים</w:t>
+      </w:r>
+      <w:r>
+        <w:rPr>
+          <w:rFonts w:ascii="Times New Roman" w:cs="David" w:eastAsia="David" w:hAnsi="Times New Roman"/>
+          <w:i w:val="false"/>
+          <w:iCs w:val="false"/>
+          <w:noProof/>
+          <w:sz w:val="20"/>
+          <w:szCs w:val="20"/>
+          <w:rtl/>
+          <w:lang w:val="en-US" w:bidi="he-IL"/>
+        </w:rPr>
+        <w:t xml:space="preserve">, הקדמת המחבר, מהדורת הברמן [לוודא עמודים וציטוט מדויק].</w:t>
+      </w:r>
+    </w:p>
+  </w:footnote>
+  <w:footnote w:id="26">
+    <w:p>
+      <w:pPr>
+        <w:bidi/>
+        <w:spacing w:after="60" w:line="240"/>
+        <w:jc w:val="both"/>
+      </w:pPr>
+      <w:r>
+        <w:rPr>
+          <w:rStyle w:val="FootnoteReference"/>
+        </w:rPr>
+        <w:footnoteRef/>
+      </w:r>
+      <w:r>
+        <w:rPr>
+          <w:rFonts w:ascii="Times New Roman" w:cs="David" w:eastAsia="David" w:hAnsi="Times New Roman"/>
+          <w:i w:val="false"/>
+          <w:iCs w:val="false"/>
+          <w:noProof/>
+          <w:sz w:val="20"/>
+          <w:szCs w:val="20"/>
+          <w:rtl/>
+          <w:lang w:val="en-US" w:bidi="he-IL"/>
+        </w:rPr>
+        <w:t xml:space="preserve">יסיף, "הסיפור האקסמפלארי", עמ' 220.</w:t>
+      </w:r>
+    </w:p>
+  </w:footnote>
+  <w:footnote w:id="27">
+    <w:p>
+      <w:pPr>
+        <w:bidi/>
+        <w:spacing w:after="60" w:line="240"/>
+        <w:jc w:val="both"/>
+      </w:pPr>
+      <w:r>
+        <w:rPr>
+          <w:rStyle w:val="FootnoteReference"/>
+        </w:rPr>
+        <w:footnoteRef/>
+      </w:r>
+      <w:r>
+        <w:rPr>
+          <w:rFonts w:ascii="Times New Roman" w:cs="David" w:eastAsia="David" w:hAnsi="Times New Roman"/>
+          <w:i w:val="false"/>
+          <w:iCs w:val="false"/>
+          <w:noProof/>
+          <w:sz w:val="20"/>
+          <w:szCs w:val="20"/>
+          <w:rtl/>
+          <w:lang w:val="en-US" w:bidi="he-IL"/>
+        </w:rPr>
+        <w:t xml:space="preserve">ברכיה הנקדן, </w:t>
+      </w:r>
+      <w:r>
+        <w:rPr>
+          <w:rFonts w:ascii="Times New Roman" w:cs="David" w:eastAsia="David" w:hAnsi="Times New Roman"/>
+          <w:i/>
+          <w:iCs/>
+          <w:noProof/>
+          <w:sz w:val="20"/>
+          <w:szCs w:val="20"/>
+          <w:rtl/>
+          <w:lang w:val="en-US" w:bidi="he-IL"/>
+        </w:rPr>
+        <w:t xml:space="preserve">משלי שועלים</w:t>
+      </w:r>
+      <w:r>
+        <w:rPr>
+          <w:rFonts w:ascii="Times New Roman" w:cs="David" w:eastAsia="David" w:hAnsi="Times New Roman"/>
+          <w:i w:val="false"/>
+          <w:iCs w:val="false"/>
+          <w:noProof/>
+          <w:sz w:val="20"/>
+          <w:szCs w:val="20"/>
+          <w:rtl/>
+          <w:lang w:val="en-US" w:bidi="he-IL"/>
+        </w:rPr>
+        <w:t xml:space="preserve">, משל סה, מהדורת הברמן [לוודא נוסח החרוז הפותח].</w:t>
+      </w:r>
+    </w:p>
+  </w:footnote>
+  <w:footnote w:id="28">
+    <w:p>
+      <w:pPr>
+        <w:bidi/>
+        <w:spacing w:after="60" w:line="240"/>
+        <w:jc w:val="both"/>
+      </w:pPr>
+      <w:r>
+        <w:rPr>
+          <w:rStyle w:val="FootnoteReference"/>
+        </w:rPr>
+        <w:footnoteRef/>
+      </w:r>
+      <w:r>
+        <w:rPr>
+          <w:rFonts w:ascii="Times New Roman" w:cs="David" w:eastAsia="David" w:hAnsi="Times New Roman"/>
+          <w:i w:val="false"/>
+          <w:iCs w:val="false"/>
+          <w:noProof/>
+          <w:sz w:val="20"/>
+          <w:szCs w:val="20"/>
+          <w:rtl/>
+          <w:lang w:val="en-US" w:bidi="he-IL"/>
+        </w:rPr>
+        <w:t xml:space="preserve">פדרוס א, יא (פרי 151), לפי </w:t>
       </w:r>
       <w:r>
         <w:rPr>
@@ -9419,33 +9854,20 @@
           <w:rtl w:val="false"/>
           <w:lang w:val="en-US" w:bidi="he-IL"/>
         </w:rPr>
-        <w:t xml:space="preserve">ass </w:t>
-      </w:r>
-      <w:r>
-        <w:rPr>
-          <w:rFonts w:ascii="Times New Roman" w:cs="David" w:eastAsia="David" w:hAnsi="Times New Roman"/>
-          <w:i w:val="false"/>
-          <w:iCs w:val="false"/>
-          <w:noProof/>
-          <w:sz w:val="20"/>
-          <w:szCs w:val="20"/>
-          <w:rtl/>
-          <w:lang w:val="en-US" w:bidi="he-IL"/>
-        </w:rPr>
-        <w:t xml:space="preserve">ו-</w:t>
-      </w:r>
-      <w:r>
-        <w:rPr>
-          <w:rFonts w:ascii="Times New Roman" w:cs="David" w:eastAsia="David" w:hAnsi="Times New Roman"/>
-          <w:i w:val="false"/>
-          <w:iCs w:val="false"/>
+        <w:t xml:space="preserve">Schwarzbaum, </w:t>
+      </w:r>
+      <w:r>
+        <w:rPr>
+          <w:rFonts w:ascii="Times New Roman" w:cs="David" w:eastAsia="David" w:hAnsi="Times New Roman"/>
+          <w:i/>
+          <w:iCs/>
           <w:noProof/>
           <w:sz w:val="20"/>
           <w:szCs w:val="20"/>
           <w:rtl w:val="false"/>
           <w:lang w:val="en-US" w:bidi="he-IL"/>
         </w:rPr>
-        <w:t xml:space="preserve">onager [</w:t>
+        <w:t xml:space="preserve">Mishle Shu'alim</w:t>
       </w:r>
       <w:r>
         <w:rPr>
@@ -9458,11 +9880,11 @@
           <w:rtl/>
           <w:lang w:val="en-US" w:bidi="he-IL"/>
         </w:rPr>
-        <w:t xml:space="preserve">לוודא עמודים].</w:t>
+        <w:t xml:space="preserve">, בדיון על משל סה [לוודא עמודים].</w:t>
       </w:r>
     </w:p>
   </w:footnote>
-  <w:footnote w:id="16">
+  <w:footnote w:id="29">
     <w:p>
       <w:pPr>
         <w:bidi/>
@@ -9478,866 +9900,19 @@
       <w:r>
         <w:rPr>
           <w:rFonts w:ascii="Times New Roman" w:cs="David" w:eastAsia="David" w:hAnsi="Times New Roman"/>
-          <w:i/>
-          <w:iCs/>
+          <w:i w:val="false"/>
+          <w:iCs w:val="false"/>
           <w:noProof/>
           <w:sz w:val="20"/>
           <w:szCs w:val="20"/>
           <w:rtl/>
           <w:lang w:val="en-US" w:bidi="he-IL"/>
         </w:rPr>
-        <w:t xml:space="preserve">הקוראן</w:t>
-      </w:r>
-      <w:r>
-        <w:rPr>
-          <w:rFonts w:ascii="Times New Roman" w:cs="David" w:eastAsia="David" w:hAnsi="Times New Roman"/>
-          <w:i w:val="false"/>
-          <w:iCs w:val="false"/>
-          <w:noProof/>
-          <w:sz w:val="20"/>
-          <w:szCs w:val="20"/>
-          <w:rtl/>
-          <w:lang w:val="en-US" w:bidi="he-IL"/>
-        </w:rPr>
-        <w:t xml:space="preserve">, תרגם מערבית אורי רובין, תל אביב: אוניברסיטת תל אביב, 2005, סורות 31, 62, 74. ההקשר הרביעי הוא סורה 2, פסוק 259, על האיש שחמורו הוחיה לאחר מאה שנה.</w:t>
-      </w:r>
-    </w:p>
-  </w:footnote>
-  <w:footnote w:id="17">
-    <w:p>
-      <w:pPr>
-        <w:bidi/>
-        <w:spacing w:after="60" w:line="240"/>
-        <w:jc w:val="both"/>
-      </w:pPr>
-      <w:r>
-        <w:rPr>
-          <w:rStyle w:val="FootnoteReference"/>
-        </w:rPr>
-        <w:footnoteRef/>
-      </w:r>
-      <w:r>
-        <w:rPr>
-          <w:rFonts w:ascii="Times New Roman" w:cs="David" w:eastAsia="David" w:hAnsi="Times New Roman"/>
-          <w:i w:val="false"/>
-          <w:iCs w:val="false"/>
-          <w:noProof/>
-          <w:sz w:val="20"/>
-          <w:szCs w:val="20"/>
-          <w:rtl/>
-          <w:lang w:val="en-US" w:bidi="he-IL"/>
-        </w:rPr>
-        <w:t xml:space="preserve">את גלגולו של הביטוי בספרות העברית של ימי הביניים יש לבדוק; ראו לפי שעה יסיף, </w:t>
-      </w:r>
-      <w:r>
-        <w:rPr>
-          <w:rFonts w:ascii="Times New Roman" w:cs="David" w:eastAsia="David" w:hAnsi="Times New Roman"/>
-          <w:i/>
-          <w:iCs/>
-          <w:noProof/>
-          <w:sz w:val="20"/>
-          <w:szCs w:val="20"/>
-          <w:rtl/>
-          <w:lang w:val="en-US" w:bidi="he-IL"/>
-        </w:rPr>
-        <w:t xml:space="preserve">סיפור העם העברי</w:t>
-      </w:r>
-      <w:r>
-        <w:rPr>
-          <w:rFonts w:ascii="Times New Roman" w:cs="David" w:eastAsia="David" w:hAnsi="Times New Roman"/>
-          <w:i w:val="false"/>
-          <w:iCs w:val="false"/>
-          <w:noProof/>
-          <w:sz w:val="20"/>
-          <w:szCs w:val="20"/>
-          <w:rtl/>
-          <w:lang w:val="en-US" w:bidi="he-IL"/>
-        </w:rPr>
-        <w:t xml:space="preserve">, במפתח בערך "חמור" [לוודא].</w:t>
-      </w:r>
-    </w:p>
-  </w:footnote>
-  <w:footnote w:id="18">
-    <w:p>
-      <w:pPr>
-        <w:bidi w:val="false"/>
-        <w:spacing w:after="60" w:line="240"/>
-        <w:jc w:val="left"/>
-      </w:pPr>
-      <w:r>
-        <w:rPr>
-          <w:rStyle w:val="FootnoteReference"/>
-        </w:rPr>
-        <w:footnoteRef/>
-      </w:r>
-      <w:r>
-        <w:rPr>
-          <w:rFonts w:ascii="Times New Roman" w:cs="David" w:eastAsia="David" w:hAnsi="Times New Roman"/>
-          <w:i w:val="false"/>
-          <w:iCs w:val="false"/>
-          <w:noProof/>
-          <w:sz w:val="20"/>
-          <w:szCs w:val="20"/>
-          <w:rtl w:val="false"/>
-          <w:lang w:val="en-US" w:bidi="he-IL"/>
-        </w:rPr>
-        <w:t xml:space="preserve">Uther, </w:t>
-      </w:r>
-      <w:r>
-        <w:rPr>
-          <w:rFonts w:ascii="Times New Roman" w:cs="David" w:eastAsia="David" w:hAnsi="Times New Roman"/>
-          <w:i/>
-          <w:iCs/>
-          <w:noProof/>
-          <w:sz w:val="20"/>
-          <w:szCs w:val="20"/>
-          <w:rtl w:val="false"/>
-          <w:lang w:val="en-US" w:bidi="he-IL"/>
-        </w:rPr>
-        <w:t xml:space="preserve">Types of International Folktales</w:t>
-      </w:r>
-      <w:r>
-        <w:rPr>
-          <w:rFonts w:ascii="Times New Roman" w:cs="David" w:eastAsia="David" w:hAnsi="Times New Roman"/>
-          <w:i w:val="false"/>
-          <w:iCs w:val="false"/>
-          <w:noProof/>
-          <w:sz w:val="20"/>
-          <w:szCs w:val="20"/>
-          <w:rtl w:val="false"/>
-          <w:lang w:val="en-US" w:bidi="he-IL"/>
-        </w:rPr>
-        <w:t xml:space="preserve">, no. 130.</w:t>
-      </w:r>
-    </w:p>
-  </w:footnote>
-  <w:footnote w:id="19">
-    <w:p>
-      <w:pPr>
-        <w:bidi w:val="false"/>
-        <w:spacing w:after="60" w:line="240"/>
-        <w:jc w:val="left"/>
-      </w:pPr>
-      <w:r>
-        <w:rPr>
-          <w:rStyle w:val="FootnoteReference"/>
-        </w:rPr>
-        <w:footnoteRef/>
-      </w:r>
-      <w:r>
-        <w:rPr>
-          <w:rFonts w:ascii="Times New Roman" w:cs="David" w:eastAsia="David" w:hAnsi="Times New Roman"/>
-          <w:i w:val="false"/>
-          <w:iCs w:val="false"/>
-          <w:noProof/>
-          <w:sz w:val="20"/>
-          <w:szCs w:val="20"/>
-          <w:rtl w:val="false"/>
-          <w:lang w:val="en-US" w:bidi="he-IL"/>
-        </w:rPr>
-        <w:t xml:space="preserve">Hadas, </w:t>
-      </w:r>
-      <w:r>
-        <w:rPr>
-          <w:rFonts w:ascii="Times New Roman" w:cs="David" w:eastAsia="David" w:hAnsi="Times New Roman"/>
-          <w:i/>
-          <w:iCs/>
-          <w:noProof/>
-          <w:sz w:val="20"/>
-          <w:szCs w:val="20"/>
-          <w:rtl w:val="false"/>
-          <w:lang w:val="en-US" w:bidi="he-IL"/>
-        </w:rPr>
-        <w:t xml:space="preserve">Fables of a Jewish Aesop</w:t>
-      </w:r>
-      <w:r>
-        <w:rPr>
-          <w:rFonts w:ascii="Times New Roman" w:cs="David" w:eastAsia="David" w:hAnsi="Times New Roman"/>
-          <w:i w:val="false"/>
-          <w:iCs w:val="false"/>
-          <w:noProof/>
-          <w:sz w:val="20"/>
-          <w:szCs w:val="20"/>
-          <w:rtl w:val="false"/>
-          <w:lang w:val="en-US" w:bidi="he-IL"/>
-        </w:rPr>
-        <w:t xml:space="preserve">, Introduction; Schwarzbaum, </w:t>
-      </w:r>
-      <w:r>
-        <w:rPr>
-          <w:rFonts w:ascii="Times New Roman" w:cs="David" w:eastAsia="David" w:hAnsi="Times New Roman"/>
-          <w:i/>
-          <w:iCs/>
-          <w:noProof/>
-          <w:sz w:val="20"/>
-          <w:szCs w:val="20"/>
-          <w:rtl w:val="false"/>
-          <w:lang w:val="en-US" w:bidi="he-IL"/>
-        </w:rPr>
-        <w:t xml:space="preserve">Mishle Shu'alim</w:t>
-      </w:r>
-      <w:r>
-        <w:rPr>
-          <w:rFonts w:ascii="Times New Roman" w:cs="David" w:eastAsia="David" w:hAnsi="Times New Roman"/>
-          <w:i w:val="false"/>
-          <w:iCs w:val="false"/>
-          <w:noProof/>
-          <w:sz w:val="20"/>
-          <w:szCs w:val="20"/>
-          <w:rtl w:val="false"/>
-          <w:lang w:val="en-US" w:bidi="he-IL"/>
-        </w:rPr>
-        <w:t xml:space="preserve">, Introduction.</w:t>
-      </w:r>
-    </w:p>
-  </w:footnote>
-  <w:footnote w:id="20">
-    <w:p>
-      <w:pPr>
-        <w:bidi w:val="false"/>
-        <w:spacing w:after="60" w:line="240"/>
-        <w:jc w:val="left"/>
-      </w:pPr>
-      <w:r>
-        <w:rPr>
-          <w:rStyle w:val="FootnoteReference"/>
-        </w:rPr>
-        <w:footnoteRef/>
-      </w:r>
-      <w:r>
-        <w:rPr>
-          <w:rFonts w:ascii="Times New Roman" w:cs="David" w:eastAsia="David" w:hAnsi="Times New Roman"/>
-          <w:i w:val="false"/>
-          <w:iCs w:val="false"/>
-          <w:noProof/>
-          <w:sz w:val="20"/>
-          <w:szCs w:val="20"/>
-          <w:rtl w:val="false"/>
-          <w:lang w:val="en-US" w:bidi="he-IL"/>
-        </w:rPr>
-        <w:t xml:space="preserve">Hadas, </w:t>
-      </w:r>
-      <w:r>
-        <w:rPr>
-          <w:rFonts w:ascii="Times New Roman" w:cs="David" w:eastAsia="David" w:hAnsi="Times New Roman"/>
-          <w:i/>
-          <w:iCs/>
-          <w:noProof/>
-          <w:sz w:val="20"/>
-          <w:szCs w:val="20"/>
-          <w:rtl w:val="false"/>
-          <w:lang w:val="en-US" w:bidi="he-IL"/>
-        </w:rPr>
-        <w:t xml:space="preserve">Fables of a Jewish Aesop</w:t>
-      </w:r>
-      <w:r>
-        <w:rPr>
-          <w:rFonts w:ascii="Times New Roman" w:cs="David" w:eastAsia="David" w:hAnsi="Times New Roman"/>
-          <w:i w:val="false"/>
-          <w:iCs w:val="false"/>
-          <w:noProof/>
-          <w:sz w:val="20"/>
-          <w:szCs w:val="20"/>
-          <w:rtl w:val="false"/>
-          <w:lang w:val="en-US" w:bidi="he-IL"/>
-        </w:rPr>
-        <w:t xml:space="preserve">, Introduction, pp. vii-xiv [</w:t>
-      </w:r>
-      <w:r>
-        <w:rPr>
-          <w:rFonts w:ascii="Times New Roman" w:cs="David" w:eastAsia="David" w:hAnsi="Times New Roman"/>
-          <w:i w:val="false"/>
-          <w:iCs w:val="false"/>
-          <w:noProof/>
-          <w:sz w:val="20"/>
-          <w:szCs w:val="20"/>
-          <w:rtl/>
-          <w:lang w:val="en-US" w:bidi="he-IL"/>
-        </w:rPr>
-        <w:t xml:space="preserve">לוודא עמודים].</w:t>
-      </w:r>
-    </w:p>
-  </w:footnote>
-  <w:footnote w:id="21">
-    <w:p>
-      <w:pPr>
-        <w:bidi/>
-        <w:spacing w:after="60" w:line="240"/>
-        <w:jc w:val="both"/>
-      </w:pPr>
-      <w:r>
-        <w:rPr>
-          <w:rStyle w:val="FootnoteReference"/>
-        </w:rPr>
-        <w:footnoteRef/>
-      </w:r>
-      <w:r>
-        <w:rPr>
-          <w:rFonts w:ascii="Times New Roman" w:cs="David" w:eastAsia="David" w:hAnsi="Times New Roman"/>
-          <w:i w:val="false"/>
-          <w:iCs w:val="false"/>
-          <w:noProof/>
-          <w:sz w:val="20"/>
-          <w:szCs w:val="20"/>
-          <w:rtl/>
-          <w:lang w:val="en-US" w:bidi="he-IL"/>
-        </w:rPr>
-        <w:t xml:space="preserve">עלי יסיף, "הסיפור האקסמפלארי בספר חסידים", </w:t>
-      </w:r>
-      <w:r>
-        <w:rPr>
-          <w:rFonts w:ascii="Times New Roman" w:cs="David" w:eastAsia="David" w:hAnsi="Times New Roman"/>
-          <w:i/>
-          <w:iCs/>
-          <w:noProof/>
-          <w:sz w:val="20"/>
-          <w:szCs w:val="20"/>
-          <w:rtl/>
-          <w:lang w:val="en-US" w:bidi="he-IL"/>
-        </w:rPr>
-        <w:t xml:space="preserve">תרביץ</w:t>
-      </w:r>
-      <w:r>
-        <w:rPr>
-          <w:rFonts w:ascii="Times New Roman" w:cs="David" w:eastAsia="David" w:hAnsi="Times New Roman"/>
-          <w:i w:val="false"/>
-          <w:iCs w:val="false"/>
-          <w:noProof/>
-          <w:sz w:val="20"/>
-          <w:szCs w:val="20"/>
-          <w:rtl/>
-          <w:lang w:val="en-US" w:bidi="he-IL"/>
-        </w:rPr>
-        <w:t xml:space="preserve"> נז (תשמ"ח), עמ' 217-255, בעמ' 220-221.</w:t>
-      </w:r>
-    </w:p>
-  </w:footnote>
-  <w:footnote w:id="22">
-    <w:p>
-      <w:pPr>
-        <w:bidi w:val="false"/>
-        <w:spacing w:after="60" w:line="240"/>
-        <w:jc w:val="left"/>
-      </w:pPr>
-      <w:r>
-        <w:rPr>
-          <w:rStyle w:val="FootnoteReference"/>
-        </w:rPr>
-        <w:footnoteRef/>
-      </w:r>
-      <w:r>
-        <w:rPr>
-          <w:rFonts w:ascii="Times New Roman" w:cs="David" w:eastAsia="David" w:hAnsi="Times New Roman"/>
-          <w:i w:val="false"/>
-          <w:iCs w:val="false"/>
-          <w:noProof/>
-          <w:sz w:val="20"/>
-          <w:szCs w:val="20"/>
-          <w:rtl w:val="false"/>
-          <w:lang w:val="en-US" w:bidi="he-IL"/>
-        </w:rPr>
-        <w:t xml:space="preserve">Berechiah ha-Nakdan, </w:t>
-      </w:r>
-      <w:r>
-        <w:rPr>
-          <w:rFonts w:ascii="Times New Roman" w:cs="David" w:eastAsia="David" w:hAnsi="Times New Roman"/>
-          <w:i/>
-          <w:iCs/>
-          <w:noProof/>
-          <w:sz w:val="20"/>
-          <w:szCs w:val="20"/>
-          <w:rtl w:val="false"/>
-          <w:lang w:val="en-US" w:bidi="he-IL"/>
-        </w:rPr>
-        <w:t xml:space="preserve">Fables of a Jewish Aesop</w:t>
-      </w:r>
-      <w:r>
-        <w:rPr>
-          <w:rFonts w:ascii="Times New Roman" w:cs="David" w:eastAsia="David" w:hAnsi="Times New Roman"/>
-          <w:i w:val="false"/>
-          <w:iCs w:val="false"/>
-          <w:noProof/>
-          <w:sz w:val="20"/>
-          <w:szCs w:val="20"/>
-          <w:rtl w:val="false"/>
-          <w:lang w:val="en-US" w:bidi="he-IL"/>
-        </w:rPr>
-        <w:t xml:space="preserve">, trans. Moses Hadas, New York: Columbia University Press, 1967; Schwarzbaum, </w:t>
-      </w:r>
-      <w:r>
-        <w:rPr>
-          <w:rFonts w:ascii="Times New Roman" w:cs="David" w:eastAsia="David" w:hAnsi="Times New Roman"/>
-          <w:i/>
-          <w:iCs/>
-          <w:noProof/>
-          <w:sz w:val="20"/>
-          <w:szCs w:val="20"/>
-          <w:rtl w:val="false"/>
-          <w:lang w:val="en-US" w:bidi="he-IL"/>
-        </w:rPr>
-        <w:t xml:space="preserve">Mishle Shu'alim</w:t>
-      </w:r>
-      <w:r>
-        <w:rPr>
-          <w:rFonts w:ascii="Times New Roman" w:cs="David" w:eastAsia="David" w:hAnsi="Times New Roman"/>
-          <w:i w:val="false"/>
-          <w:iCs w:val="false"/>
-          <w:noProof/>
-          <w:sz w:val="20"/>
-          <w:szCs w:val="20"/>
-          <w:rtl/>
-          <w:lang w:val="en-US" w:bidi="he-IL"/>
-        </w:rPr>
-        <w:t xml:space="preserve">.</w:t>
-      </w:r>
-    </w:p>
-  </w:footnote>
-  <w:footnote w:id="23">
-    <w:p>
-      <w:pPr>
-        <w:bidi w:val="false"/>
-        <w:spacing w:after="60" w:line="240"/>
-        <w:jc w:val="left"/>
-      </w:pPr>
-      <w:r>
-        <w:rPr>
-          <w:rStyle w:val="FootnoteReference"/>
-        </w:rPr>
-        <w:footnoteRef/>
-      </w:r>
-      <w:r>
-        <w:rPr>
-          <w:rFonts w:ascii="Times New Roman" w:cs="David" w:eastAsia="David" w:hAnsi="Times New Roman"/>
-          <w:i w:val="false"/>
-          <w:iCs w:val="false"/>
-          <w:noProof/>
-          <w:sz w:val="20"/>
-          <w:szCs w:val="20"/>
-          <w:rtl w:val="false"/>
-          <w:lang w:val="en-US" w:bidi="he-IL"/>
-        </w:rPr>
-        <w:t xml:space="preserve">Schwarzbaum, </w:t>
-      </w:r>
-      <w:r>
-        <w:rPr>
-          <w:rFonts w:ascii="Times New Roman" w:cs="David" w:eastAsia="David" w:hAnsi="Times New Roman"/>
-          <w:i/>
-          <w:iCs/>
-          <w:noProof/>
-          <w:sz w:val="20"/>
-          <w:szCs w:val="20"/>
-          <w:rtl w:val="false"/>
-          <w:lang w:val="en-US" w:bidi="he-IL"/>
-        </w:rPr>
-        <w:t xml:space="preserve">Mishle Shu'alim</w:t>
-      </w:r>
-      <w:r>
-        <w:rPr>
-          <w:rFonts w:ascii="Times New Roman" w:cs="David" w:eastAsia="David" w:hAnsi="Times New Roman"/>
-          <w:i w:val="false"/>
-          <w:iCs w:val="false"/>
-          <w:noProof/>
-          <w:sz w:val="20"/>
-          <w:szCs w:val="20"/>
-          <w:rtl w:val="false"/>
-          <w:lang w:val="en-US" w:bidi="he-IL"/>
-        </w:rPr>
-        <w:t xml:space="preserve">, Introduction; </w:t>
-      </w:r>
-      <w:r>
-        <w:rPr>
-          <w:rFonts w:ascii="Times New Roman" w:cs="David" w:eastAsia="David" w:hAnsi="Times New Roman"/>
-          <w:i w:val="false"/>
-          <w:iCs w:val="false"/>
-          <w:noProof/>
-          <w:sz w:val="20"/>
-          <w:szCs w:val="20"/>
-          <w:rtl/>
-          <w:lang w:val="en-US" w:bidi="he-IL"/>
-        </w:rPr>
-        <w:t xml:space="preserve">שורצבוים, "טיפוסים פולקלוריים", עמ' 34-36.</w:t>
-      </w:r>
-    </w:p>
-  </w:footnote>
-  <w:footnote w:id="24">
-    <w:p>
-      <w:pPr>
-        <w:bidi/>
-        <w:spacing w:after="60" w:line="240"/>
-        <w:jc w:val="both"/>
-      </w:pPr>
-      <w:r>
-        <w:rPr>
-          <w:rStyle w:val="FootnoteReference"/>
-        </w:rPr>
-        <w:footnoteRef/>
-      </w:r>
-      <w:r>
-        <w:rPr>
-          <w:rFonts w:ascii="Times New Roman" w:cs="David" w:eastAsia="David" w:hAnsi="Times New Roman"/>
-          <w:i w:val="false"/>
-          <w:iCs w:val="false"/>
-          <w:noProof/>
-          <w:sz w:val="20"/>
-          <w:szCs w:val="20"/>
-          <w:rtl/>
-          <w:lang w:val="en-US" w:bidi="he-IL"/>
-        </w:rPr>
-        <w:t xml:space="preserve">דן פגיס, </w:t>
-      </w:r>
-      <w:r>
-        <w:rPr>
-          <w:rFonts w:ascii="Times New Roman" w:cs="David" w:eastAsia="David" w:hAnsi="Times New Roman"/>
-          <w:i/>
-          <w:iCs/>
-          <w:noProof/>
-          <w:sz w:val="20"/>
-          <w:szCs w:val="20"/>
-          <w:rtl/>
-          <w:lang w:val="en-US" w:bidi="he-IL"/>
-        </w:rPr>
-        <w:t xml:space="preserve">חידוש ומסורת בשירת החול העברית: ספרד ואיטליה</w:t>
-      </w:r>
-      <w:r>
-        <w:rPr>
-          <w:rFonts w:ascii="Times New Roman" w:cs="David" w:eastAsia="David" w:hAnsi="Times New Roman"/>
-          <w:i w:val="false"/>
-          <w:iCs w:val="false"/>
-          <w:noProof/>
-          <w:sz w:val="20"/>
-          <w:szCs w:val="20"/>
-          <w:rtl/>
-          <w:lang w:val="en-US" w:bidi="he-IL"/>
-        </w:rPr>
-        <w:t xml:space="preserve">, ירושלים: כתר, 1976, עמ' 70-77 [לוודא עמודים].</w:t>
-      </w:r>
-    </w:p>
-  </w:footnote>
-  <w:footnote w:id="25">
-    <w:p>
-      <w:pPr>
-        <w:bidi/>
-        <w:spacing w:after="60" w:line="240"/>
-        <w:jc w:val="both"/>
-      </w:pPr>
-      <w:r>
-        <w:rPr>
-          <w:rStyle w:val="FootnoteReference"/>
-        </w:rPr>
-        <w:footnoteRef/>
-      </w:r>
-      <w:r>
-        <w:rPr>
-          <w:rFonts w:ascii="Times New Roman" w:cs="David" w:eastAsia="David" w:hAnsi="Times New Roman"/>
-          <w:i w:val="false"/>
-          <w:iCs w:val="false"/>
-          <w:noProof/>
-          <w:sz w:val="20"/>
-          <w:szCs w:val="20"/>
-          <w:rtl/>
-          <w:lang w:val="en-US" w:bidi="he-IL"/>
-        </w:rPr>
-        <w:t xml:space="preserve">ענת שפירא, "המשל הנרטיבי-ספרותי ב'סדר אליהו' לאור המשל הדרשני בספרות חז"ל", </w:t>
-      </w:r>
-      <w:r>
-        <w:rPr>
-          <w:rFonts w:ascii="Times New Roman" w:cs="David" w:eastAsia="David" w:hAnsi="Times New Roman"/>
-          <w:i/>
-          <w:iCs/>
-          <w:noProof/>
-          <w:sz w:val="20"/>
-          <w:szCs w:val="20"/>
-          <w:rtl/>
-          <w:lang w:val="en-US" w:bidi="he-IL"/>
-        </w:rPr>
-        <w:t xml:space="preserve">מרקמים: תרבות, ספרות, פולקלור, לגלית חזן-רוקם</w:t>
-      </w:r>
-      <w:r>
-        <w:rPr>
-          <w:rFonts w:ascii="Times New Roman" w:cs="David" w:eastAsia="David" w:hAnsi="Times New Roman"/>
-          <w:i w:val="false"/>
-          <w:iCs w:val="false"/>
-          <w:noProof/>
-          <w:sz w:val="20"/>
-          <w:szCs w:val="20"/>
-          <w:rtl/>
-          <w:lang w:val="en-US" w:bidi="he-IL"/>
-        </w:rPr>
-        <w:t xml:space="preserve">, כרך א (= </w:t>
-      </w:r>
-      <w:r>
-        <w:rPr>
-          <w:rFonts w:ascii="Times New Roman" w:cs="David" w:eastAsia="David" w:hAnsi="Times New Roman"/>
-          <w:i/>
-          <w:iCs/>
-          <w:noProof/>
-          <w:sz w:val="20"/>
-          <w:szCs w:val="20"/>
-          <w:rtl/>
-          <w:lang w:val="en-US" w:bidi="he-IL"/>
-        </w:rPr>
-        <w:t xml:space="preserve">מחקרי ירושלים בספרות עברית</w:t>
-      </w:r>
-      <w:r>
-        <w:rPr>
-          <w:rFonts w:ascii="Times New Roman" w:cs="David" w:eastAsia="David" w:hAnsi="Times New Roman"/>
-          <w:i w:val="false"/>
-          <w:iCs w:val="false"/>
-          <w:noProof/>
-          <w:sz w:val="20"/>
-          <w:szCs w:val="20"/>
-          <w:rtl/>
-          <w:lang w:val="en-US" w:bidi="he-IL"/>
-        </w:rPr>
-        <w:t xml:space="preserve"> כה), ירושלים: המכון למדעי היהדות ע"ש מנדל, תשע"ג, עמ' 133-151, בעמ' 133-135, 150.</w:t>
-      </w:r>
-    </w:p>
-  </w:footnote>
-  <w:footnote w:id="26">
-    <w:p>
-      <w:pPr>
-        <w:bidi/>
-        <w:spacing w:after="60" w:line="240"/>
-        <w:jc w:val="both"/>
-      </w:pPr>
-      <w:r>
-        <w:rPr>
-          <w:rStyle w:val="FootnoteReference"/>
-        </w:rPr>
-        <w:footnoteRef/>
-      </w:r>
-      <w:r>
-        <w:rPr>
-          <w:rFonts w:ascii="Times New Roman" w:cs="David" w:eastAsia="David" w:hAnsi="Times New Roman"/>
-          <w:i w:val="false"/>
-          <w:iCs w:val="false"/>
-          <w:noProof/>
-          <w:sz w:val="20"/>
-          <w:szCs w:val="20"/>
-          <w:rtl/>
-          <w:lang w:val="en-US" w:bidi="he-IL"/>
-        </w:rPr>
-        <w:t xml:space="preserve">ברכיה הנקדן, </w:t>
-      </w:r>
-      <w:r>
-        <w:rPr>
-          <w:rFonts w:ascii="Times New Roman" w:cs="David" w:eastAsia="David" w:hAnsi="Times New Roman"/>
-          <w:i/>
-          <w:iCs/>
-          <w:noProof/>
-          <w:sz w:val="20"/>
-          <w:szCs w:val="20"/>
-          <w:rtl/>
-          <w:lang w:val="en-US" w:bidi="he-IL"/>
-        </w:rPr>
-        <w:t xml:space="preserve">משלי שועלים</w:t>
-      </w:r>
-      <w:r>
-        <w:rPr>
-          <w:rFonts w:ascii="Times New Roman" w:cs="David" w:eastAsia="David" w:hAnsi="Times New Roman"/>
-          <w:i w:val="false"/>
-          <w:iCs w:val="false"/>
-          <w:noProof/>
-          <w:sz w:val="20"/>
-          <w:szCs w:val="20"/>
-          <w:rtl/>
-          <w:lang w:val="en-US" w:bidi="he-IL"/>
-        </w:rPr>
-        <w:t xml:space="preserve">, הקדמת המחבר, מהדורת הברמן [לוודא עמודים וציטוט מדויק].</w:t>
-      </w:r>
-    </w:p>
-  </w:footnote>
-  <w:footnote w:id="27">
-    <w:p>
-      <w:pPr>
-        <w:bidi/>
-        <w:spacing w:after="60" w:line="240"/>
-        <w:jc w:val="both"/>
-      </w:pPr>
-      <w:r>
-        <w:rPr>
-          <w:rStyle w:val="FootnoteReference"/>
-        </w:rPr>
-        <w:footnoteRef/>
-      </w:r>
-      <w:r>
-        <w:rPr>
-          <w:rFonts w:ascii="Times New Roman" w:cs="David" w:eastAsia="David" w:hAnsi="Times New Roman"/>
-          <w:i w:val="false"/>
-          <w:iCs w:val="false"/>
-          <w:noProof/>
-          <w:sz w:val="20"/>
-          <w:szCs w:val="20"/>
-          <w:rtl/>
-          <w:lang w:val="en-US" w:bidi="he-IL"/>
-        </w:rPr>
-        <w:t xml:space="preserve">יסיף, "הסיפור האקסמפלארי", עמ' 220.</w:t>
-      </w:r>
-    </w:p>
-  </w:footnote>
-  <w:footnote w:id="28">
-    <w:p>
-      <w:pPr>
-        <w:bidi/>
-        <w:spacing w:after="60" w:line="240"/>
-        <w:jc w:val="both"/>
-      </w:pPr>
-      <w:r>
-        <w:rPr>
-          <w:rStyle w:val="FootnoteReference"/>
-        </w:rPr>
-        <w:footnoteRef/>
-      </w:r>
-      <w:r>
-        <w:rPr>
-          <w:rFonts w:ascii="Times New Roman" w:cs="David" w:eastAsia="David" w:hAnsi="Times New Roman"/>
-          <w:i w:val="false"/>
-          <w:iCs w:val="false"/>
-          <w:noProof/>
-          <w:sz w:val="20"/>
-          <w:szCs w:val="20"/>
-          <w:rtl/>
-          <w:lang w:val="en-US" w:bidi="he-IL"/>
-        </w:rPr>
-        <w:t xml:space="preserve">ברכיה הנקדן, </w:t>
-      </w:r>
-      <w:r>
-        <w:rPr>
-          <w:rFonts w:ascii="Times New Roman" w:cs="David" w:eastAsia="David" w:hAnsi="Times New Roman"/>
-          <w:i/>
-          <w:iCs/>
-          <w:noProof/>
-          <w:sz w:val="20"/>
-          <w:szCs w:val="20"/>
-          <w:rtl/>
-          <w:lang w:val="en-US" w:bidi="he-IL"/>
-        </w:rPr>
-        <w:t xml:space="preserve">משלי שועלים</w:t>
-      </w:r>
-      <w:r>
-        <w:rPr>
-          <w:rFonts w:ascii="Times New Roman" w:cs="David" w:eastAsia="David" w:hAnsi="Times New Roman"/>
-          <w:i w:val="false"/>
-          <w:iCs w:val="false"/>
-          <w:noProof/>
-          <w:sz w:val="20"/>
-          <w:szCs w:val="20"/>
-          <w:rtl/>
-          <w:lang w:val="en-US" w:bidi="he-IL"/>
-        </w:rPr>
-        <w:t xml:space="preserve">, משל סה, מהדורת הברמן [לוודא נוסח החרוז הפותח].</w:t>
-      </w:r>
-    </w:p>
-  </w:footnote>
-  <w:footnote w:id="29">
-    <w:p>
-      <w:pPr>
-        <w:bidi w:val="false"/>
-        <w:spacing w:after="60" w:line="240"/>
-        <w:jc w:val="left"/>
-      </w:pPr>
-      <w:r>
-        <w:rPr>
-          <w:rStyle w:val="FootnoteReference"/>
-        </w:rPr>
-        <w:footnoteRef/>
-      </w:r>
-      <w:r>
-        <w:rPr>
-          <w:rFonts w:ascii="Times New Roman" w:cs="David" w:eastAsia="David" w:hAnsi="Times New Roman"/>
-          <w:i w:val="false"/>
-          <w:iCs w:val="false"/>
-          <w:noProof/>
-          <w:sz w:val="20"/>
-          <w:szCs w:val="20"/>
-          <w:rtl w:val="false"/>
-          <w:lang w:val="en-US" w:bidi="he-IL"/>
-        </w:rPr>
-        <w:t xml:space="preserve">Perry, </w:t>
-      </w:r>
-      <w:r>
-        <w:rPr>
-          <w:rFonts w:ascii="Times New Roman" w:cs="David" w:eastAsia="David" w:hAnsi="Times New Roman"/>
-          <w:i/>
-          <w:iCs/>
-          <w:noProof/>
-          <w:sz w:val="20"/>
-          <w:szCs w:val="20"/>
-          <w:rtl w:val="false"/>
-          <w:lang w:val="en-US" w:bidi="he-IL"/>
-        </w:rPr>
-        <w:t xml:space="preserve">Babrius and Phaedrus</w:t>
-      </w:r>
-      <w:r>
-        <w:rPr>
-          <w:rFonts w:ascii="Times New Roman" w:cs="David" w:eastAsia="David" w:hAnsi="Times New Roman"/>
-          <w:i w:val="false"/>
-          <w:iCs w:val="false"/>
-          <w:noProof/>
-          <w:sz w:val="20"/>
-          <w:szCs w:val="20"/>
-          <w:rtl w:val="false"/>
-          <w:lang w:val="en-US" w:bidi="he-IL"/>
-        </w:rPr>
-        <w:t xml:space="preserve">, Phaedrus 1.11; Schwarzbaum, </w:t>
-      </w:r>
-      <w:r>
-        <w:rPr>
-          <w:rFonts w:ascii="Times New Roman" w:cs="David" w:eastAsia="David" w:hAnsi="Times New Roman"/>
-          <w:i/>
-          <w:iCs/>
-          <w:noProof/>
-          <w:sz w:val="20"/>
-          <w:szCs w:val="20"/>
-          <w:rtl w:val="false"/>
-          <w:lang w:val="en-US" w:bidi="he-IL"/>
-        </w:rPr>
-        <w:t xml:space="preserve">Mishle Shu'alim</w:t>
-      </w:r>
-      <w:r>
-        <w:rPr>
-          <w:rFonts w:ascii="Times New Roman" w:cs="David" w:eastAsia="David" w:hAnsi="Times New Roman"/>
-          <w:i w:val="false"/>
-          <w:iCs w:val="false"/>
-          <w:noProof/>
-          <w:sz w:val="20"/>
-          <w:szCs w:val="20"/>
-          <w:rtl/>
-          <w:lang w:val="en-US" w:bidi="he-IL"/>
-        </w:rPr>
-        <w:t xml:space="preserve">, בדיון על משל סה [לוודא עמודים].</w:t>
+        <w:t xml:space="preserve">השווה משלי יז, כח. את מקור הפתגם המדויק יש לבדוק בספרות המוסר של ימי הביניים, כגון "מבחר הפנינים" [לוודא].</w:t>
       </w:r>
     </w:p>
   </w:footnote>
   <w:footnote w:id="30">
-    <w:p>
-      <w:pPr>
-        <w:bidi/>
-        <w:spacing w:after="60" w:line="240"/>
-        <w:jc w:val="both"/>
-      </w:pPr>
-      <w:r>
-        <w:rPr>
-          <w:rStyle w:val="FootnoteReference"/>
-        </w:rPr>
-        <w:footnoteRef/>
-      </w:r>
-      <w:r>
-        <w:rPr>
-          <w:rFonts w:ascii="Times New Roman" w:cs="David" w:eastAsia="David" w:hAnsi="Times New Roman"/>
-          <w:i w:val="false"/>
-          <w:iCs w:val="false"/>
-          <w:noProof/>
-          <w:sz w:val="20"/>
-          <w:szCs w:val="20"/>
-          <w:rtl/>
-          <w:lang w:val="en-US" w:bidi="he-IL"/>
-        </w:rPr>
-        <w:t xml:space="preserve">השווה משלי יז, כח. את מקור הפתגם המדויק יש לבדוק בספרות המוסר של ימי הביניים, כגון "מבחר הפנינים" [לוודא].</w:t>
-      </w:r>
-    </w:p>
-  </w:footnote>
-  <w:footnote w:id="31">
     <w:p>
       <w:pPr>
         <w:bidi/>

</xml_diff>

<commit_message>
Add six peer-reviewed English articles, bringing the bibliography to 22
Stern and Boyarin on mashal and nimshal, Yassif on the medieval
narrative anthology, Way on Balaam's ass and 1 Kings 13 and on the
donkey terms in Zechariah 9:9, and Lawee on animals in midrash, each
cited in the relevant chapter.

Co-Authored-By: Claude Fable 5.1 <noreply@anthropic.com>
Claude-Session: https://claude.ai/code/session_01LePeB11iN6PJ4Nt39a92mY
</commit_message>
<xml_diff>
--- a/seminar/seminar-donkey-fables.docx
+++ b/seminar/seminar-donkey-fables.docx
@@ -403,7 +403,7 @@
           <w:rtl/>
           <w:lang w:val="en-US" w:bidi="he-IL"/>
         </w:rPr>
-        <w:t xml:space="preserve">	3</w:t>
+        <w:t xml:space="preserve">	4</w:t>
       </w:r>
     </w:p>
     <w:p>
@@ -477,7 +477,7 @@
           <w:rtl/>
           <w:lang w:val="en-US" w:bidi="he-IL"/>
         </w:rPr>
-        <w:t xml:space="preserve">	5</w:t>
+        <w:t xml:space="preserve">	6</w:t>
       </w:r>
     </w:p>
     <w:p>
@@ -661,7 +661,7 @@
           <w:rtl/>
           <w:lang w:val="en-US" w:bidi="he-IL"/>
         </w:rPr>
-        <w:t xml:space="preserve">	8</w:t>
+        <w:t xml:space="preserve">	9</w:t>
       </w:r>
     </w:p>
     <w:p>
@@ -1505,7 +1505,7 @@
           <w:rtl/>
           <w:lang w:val="en-US" w:bidi="he-IL"/>
         </w:rPr>
-        <w:t xml:space="preserve">	26</w:t>
+        <w:t xml:space="preserve">	27</w:t>
       </w:r>
     </w:p>
     <w:p>
@@ -1542,7 +1542,7 @@
           <w:rtl/>
           <w:lang w:val="en-US" w:bidi="he-IL"/>
         </w:rPr>
-        <w:t xml:space="preserve">	26</w:t>
+        <w:t xml:space="preserve">	27</w:t>
       </w:r>
     </w:p>
     <w:p>
@@ -1579,7 +1579,7 @@
           <w:rtl/>
           <w:lang w:val="en-US" w:bidi="he-IL"/>
         </w:rPr>
-        <w:t xml:space="preserve">	26</w:t>
+        <w:t xml:space="preserve">	27</w:t>
       </w:r>
     </w:p>
     <w:p>
@@ -1616,7 +1616,7 @@
           <w:rtl/>
           <w:lang w:val="en-US" w:bidi="he-IL"/>
         </w:rPr>
-        <w:t xml:space="preserve">	27</w:t>
+        <w:t xml:space="preserve">	28</w:t>
       </w:r>
     </w:p>
     <w:p>
@@ -1653,7 +1653,7 @@
           <w:rtl/>
           <w:lang w:val="en-US" w:bidi="he-IL"/>
         </w:rPr>
-        <w:t xml:space="preserve">	28</w:t>
+        <w:t xml:space="preserve">	29</w:t>
       </w:r>
     </w:p>
     <w:p>
@@ -2023,7 +2023,26 @@
           <w:rtl/>
           <w:lang w:val="en-US" w:bidi="he-IL"/>
         </w:rPr>
-        <w:t xml:space="preserve">שלוש דמויות של חמור במקרא חשובות במיוחד לעבודה זו, מפני שברכיה מרמז אליהן במשלים הנדונים. הראשונה היא אתונו של בלעם, החיה היחידה במקרא שמדברת, והרואה את מלאך ה' בשעה שהנביא עצמו עיוור לו (במדבר כב, כא-לג). הנוסחה שברכיה חותם בה את משליו, "ואשא משלי ואומר", לקוחה מן הפסוק "וישא משלו ויאמר" (במדבר כג, ז) הפותח את נבואות בלעם. יש אירוניה בכך שספר שלם של משלי חיות חתום בנוסחה של הנביא שאתונו ראתה יותר ממנו. השנייה היא אתונות קיש, שאובדנן שלח את שאול לדרך שבסופה נמשח למלך ונתנבא (שמואל א ט-י). ברכיה מזכיר אותן במפורש בשיר החותם את משל יד. השלישית היא החמור של ישעיהו: "ידע שור קנהו וחמור אבוס בעליו, ישראל לא ידע עמי לא התבונן" (ישעיהו א, ג). כאן החמור הוא דווקא דוגמה לידיעה ולהכרת הטוב, וישראל הם שאינם יודעים. ברכיה הופך את הפסוק במשל מז: "וחמור אבוס בעליו לא ידע". החמור שלו הוא בדיוק החמור שישעיהו לא הכיר.</w:t>
+        <w:t xml:space="preserve">שלוש דמויות של חמור במקרא חשובות במיוחד לעבודה זו, מפני שברכיה מרמז אליהן במשלים הנדונים. הראשונה היא אתונו של בלעם, החיה היחידה במקרא שמדברת, והרואה את מלאך ה' בשעה שהנביא עצמו עיוור לו (במדבר כב, כא-לג). הנוסחה שברכיה חותם בה את משליו, "ואשא משלי ואומר", לקוחה מן הפסוק "וישא משלו ויאמר" (במדבר כג, ז) הפותח את נבואות בלעם. יש אירוניה בכך שספר שלם של משלי חיות חתום בנוסחה של הנביא שאתונו ראתה יותר ממנו. קנת ויי הראה שאתונו של בלעם ואריהו של איש האלוהים מיהודה (מלכים א יג) הם שני המקרים המובהקים במקרא של בעלי חיים הפועלים כשליחי האל, ושבשניהם החיה מבינה את דבר ה' טוב מן הנביא.</w:t>
+      </w:r>
+      <w:r>
+        <w:rPr>
+          <w:rStyle w:val="FootnoteReference"/>
+        </w:rPr>
+        <w:footnoteReference w:id="4"/>
+      </w:r>
+      <w:r>
+        <w:rPr>
+          <w:rFonts w:ascii="Times New Roman" w:cs="David" w:eastAsia="David" w:hAnsi="Times New Roman"/>
+          <w:i w:val="false"/>
+          <w:iCs w:val="false"/>
+          <w:noProof/>
+          <w:sz w:val="24"/>
+          <w:szCs w:val="24"/>
+          <w:rtl/>
+          <w:lang w:val="en-US" w:bidi="he-IL"/>
+        </w:rPr>
+        <w:t xml:space="preserve"> שני הסיפורים האלה ישובו בניתוח משל סה. השנייה היא אתונות קיש, שאובדנן שלח את שאול לדרך שבסופה נמשח למלך ונתנבא (שמואל א ט-י). ברכיה מזכיר אותן במפורש בשיר החותם את משל יד. השלישית היא החמור של ישעיהו: "ידע שור קנהו וחמור אבוס בעליו, ישראל לא ידע עמי לא התבונן" (ישעיהו א, ג). כאן החמור הוא דווקא דוגמה לידיעה ולהכרת הטוב, וישראל הם שאינם יודעים. ברכיה הופך את הפסוק במשל מז: "וחמור אבוס בעליו לא ידע". החמור שלו הוא בדיוק החמור שישעיהו לא הכיר.</w:t>
       </w:r>
     </w:p>
     <w:p>
@@ -2043,7 +2062,26 @@
           <w:rtl/>
           <w:lang w:val="en-US" w:bidi="he-IL"/>
         </w:rPr>
-        <w:t xml:space="preserve">יש להוסיף את יששכר "חמר גרם רבץ בין המשפתים" (בראשית מט, יד), את לחי החמור של שמשון (שופטים טו, טו-טז), את "קבורת חמור" שנגזרה על יהויקים (ירמיהו כב, יט), ואת המלך המשיח "עני ורכב על חמור" (זכריה ט, ט). הפרא, חמור הבר, מופיע באיוב לט, ה-ח כסמל לחירות שאין לאדם שליטה בה.</w:t>
+        <w:t xml:space="preserve">יש להוסיף את יששכר "חמר גרם רבץ בין המשפתים" (בראשית מט, יד), את לחי החמור של שמשון (שופטים טו, טו-טז), את "קבורת חמור" שנגזרה על יהויקים (ירמיהו כב, יט), ואת המלך המשיח "עני ורכב על חמור" (זכריה ט, ט), פסוק שבו מצטופפים שלושת המונחים העבריים לחמור הביתי, חמור, עיר ואתון, וויי הראה שלכל אחד מהם טווח משמעות משלו.</w:t>
+      </w:r>
+      <w:r>
+        <w:rPr>
+          <w:rStyle w:val="FootnoteReference"/>
+        </w:rPr>
+        <w:footnoteReference w:id="5"/>
+      </w:r>
+      <w:r>
+        <w:rPr>
+          <w:rFonts w:ascii="Times New Roman" w:cs="David" w:eastAsia="David" w:hAnsi="Times New Roman"/>
+          <w:i w:val="false"/>
+          <w:iCs w:val="false"/>
+          <w:noProof/>
+          <w:sz w:val="24"/>
+          <w:szCs w:val="24"/>
+          <w:rtl/>
+          <w:lang w:val="en-US" w:bidi="he-IL"/>
+        </w:rPr>
+        <w:t xml:space="preserve"> הפרא, חמור הבר, מופיע באיוב לט, ה-ח כסמל לחירות שאין לאדם שליטה בה.</w:t>
       </w:r>
     </w:p>
     <w:p>
@@ -2069,7 +2107,7 @@
         <w:rPr>
           <w:rStyle w:val="FootnoteReference"/>
         </w:rPr>
-        <w:footnoteReference w:id="4"/>
+        <w:footnoteReference w:id="6"/>
       </w:r>
       <w:r>
         <w:rPr>
@@ -2088,20 +2126,45 @@
         <w:rPr>
           <w:rStyle w:val="FootnoteReference"/>
         </w:rPr>
-        <w:footnoteReference w:id="5"/>
-      </w:r>
-      <w:r>
-        <w:rPr>
-          <w:rFonts w:ascii="Times New Roman" w:cs="David" w:eastAsia="David" w:hAnsi="Times New Roman"/>
-          <w:i w:val="false"/>
-          <w:iCs w:val="false"/>
-          <w:noProof/>
-          <w:sz w:val="24"/>
-          <w:szCs w:val="24"/>
-          <w:rtl/>
-          <w:lang w:val="en-US" w:bidi="he-IL"/>
-        </w:rPr>
-        <w:t xml:space="preserve"> לפי המיון הזה ארבעת משלי החמור של ברכיה הם משלי גנאי ואזהרה, וכך גם ננתח אותם.</w:t>
+        <w:footnoteReference w:id="7"/>
+      </w:r>
+      <w:r>
+        <w:rPr>
+          <w:rFonts w:ascii="Times New Roman" w:cs="David" w:eastAsia="David" w:hAnsi="Times New Roman"/>
+          <w:i w:val="false"/>
+          <w:iCs w:val="false"/>
+          <w:noProof/>
+          <w:sz w:val="24"/>
+          <w:szCs w:val="24"/>
+          <w:rtl/>
+          <w:lang w:val="en-US" w:bidi="he-IL"/>
+        </w:rPr>
+        <w:t xml:space="preserve"> שטרן פיתח את הטענה במאמרו האנגלי, שבו הגדיר את המשל כצורה רטורית שמשמעותה נבנית בשיתוף הקהל, ולא כאלגוריה סגורה.</w:t>
+      </w:r>
+      <w:r>
+        <w:rPr>
+          <w:rStyle w:val="FootnoteReference"/>
+        </w:rPr>
+        <w:footnoteReference w:id="8"/>
+      </w:r>
+      <w:r>
+        <w:rPr>
+          <w:rFonts w:ascii="Times New Roman" w:cs="David" w:eastAsia="David" w:hAnsi="Times New Roman"/>
+          <w:i w:val="false"/>
+          <w:iCs w:val="false"/>
+          <w:noProof/>
+          <w:sz w:val="24"/>
+          <w:szCs w:val="24"/>
+          <w:rtl/>
+          <w:lang w:val="en-US" w:bidi="he-IL"/>
+        </w:rPr>
+        <w:t xml:space="preserve"> לפי המיון הזה ארבעת משלי החמור של ברכיה הם משלי גנאי ואזהרה, וכך גם ננתח אותם. יש להוסיף שהמדרש, ובעקבותיו רש"י, מייחסים לבעלי חיים אחריות מוסרית של ממש, כפי שהראה אריק לאווי בדיונו ב"חטאי החי" בדור המבול; זה הרקע התרבותי שמאפשר למשל העברי לשפוט חמור על גאוותו.</w:t>
+      </w:r>
+      <w:r>
+        <w:rPr>
+          <w:rStyle w:val="FootnoteReference"/>
+        </w:rPr>
+        <w:footnoteReference w:id="9"/>
       </w:r>
     </w:p>
     <w:p>
@@ -2151,7 +2214,7 @@
         <w:rPr>
           <w:rStyle w:val="FootnoteReference"/>
         </w:rPr>
-        <w:footnoteReference w:id="6"/>
+        <w:footnoteReference w:id="10"/>
       </w:r>
       <w:r>
         <w:rPr>
@@ -2170,7 +2233,7 @@
         <w:rPr>
           <w:rStyle w:val="FootnoteReference"/>
         </w:rPr>
-        <w:footnoteReference w:id="7"/>
+        <w:footnoteReference w:id="11"/>
       </w:r>
     </w:p>
     <w:p>
@@ -2196,7 +2259,7 @@
         <w:rPr>
           <w:rStyle w:val="FootnoteReference"/>
         </w:rPr>
-        <w:footnoteReference w:id="8"/>
+        <w:footnoteReference w:id="12"/>
       </w:r>
       <w:r>
         <w:rPr>
@@ -2267,7 +2330,7 @@
         <w:rPr>
           <w:rStyle w:val="FootnoteReference"/>
         </w:rPr>
-        <w:footnoteReference w:id="9"/>
+        <w:footnoteReference w:id="13"/>
       </w:r>
       <w:r>
         <w:rPr>
@@ -2390,7 +2453,7 @@
         <w:rPr>
           <w:rStyle w:val="FootnoteReference"/>
         </w:rPr>
-        <w:footnoteReference w:id="10"/>
+        <w:footnoteReference w:id="14"/>
       </w:r>
       <w:r>
         <w:rPr>
@@ -2429,7 +2492,7 @@
         <w:rPr>
           <w:rStyle w:val="FootnoteReference"/>
         </w:rPr>
-        <w:footnoteReference w:id="11"/>
+        <w:footnoteReference w:id="15"/>
       </w:r>
       <w:r>
         <w:rPr>
@@ -2448,7 +2511,7 @@
         <w:rPr>
           <w:rStyle w:val="FootnoteReference"/>
         </w:rPr>
-        <w:footnoteReference w:id="12"/>
+        <w:footnoteReference w:id="16"/>
       </w:r>
       <w:r>
         <w:rPr>
@@ -2467,7 +2530,7 @@
         <w:rPr>
           <w:rStyle w:val="FootnoteReference"/>
         </w:rPr>
-        <w:footnoteReference w:id="13"/>
+        <w:footnoteReference w:id="17"/>
       </w:r>
     </w:p>
     <w:p>
@@ -2517,7 +2580,7 @@
         <w:rPr>
           <w:rStyle w:val="FootnoteReference"/>
         </w:rPr>
-        <w:footnoteReference w:id="14"/>
+        <w:footnoteReference w:id="18"/>
       </w:r>
       <w:r>
         <w:rPr>
@@ -2556,7 +2619,7 @@
         <w:rPr>
           <w:rStyle w:val="FootnoteReference"/>
         </w:rPr>
-        <w:footnoteReference w:id="15"/>
+        <w:footnoteReference w:id="19"/>
       </w:r>
       <w:r>
         <w:rPr>
@@ -2575,7 +2638,7 @@
         <w:rPr>
           <w:rStyle w:val="FootnoteReference"/>
         </w:rPr>
-        <w:footnoteReference w:id="16"/>
+        <w:footnoteReference w:id="20"/>
       </w:r>
     </w:p>
     <w:p>
@@ -2627,7 +2690,7 @@
         <w:rPr>
           <w:rStyle w:val="FootnoteReference"/>
         </w:rPr>
-        <w:footnoteReference w:id="17"/>
+        <w:footnoteReference w:id="21"/>
       </w:r>
       <w:r>
         <w:rPr>
@@ -4836,7 +4899,7 @@
         <w:rPr>
           <w:rStyle w:val="FootnoteReference"/>
         </w:rPr>
-        <w:footnoteReference w:id="18"/>
+        <w:footnoteReference w:id="22"/>
       </w:r>
       <w:r>
         <w:rPr>
@@ -4855,7 +4918,7 @@
         <w:rPr>
           <w:rStyle w:val="FootnoteReference"/>
         </w:rPr>
-        <w:footnoteReference w:id="19"/>
+        <w:footnoteReference w:id="23"/>
       </w:r>
       <w:r>
         <w:rPr>
@@ -4874,7 +4937,7 @@
         <w:rPr>
           <w:rStyle w:val="FootnoteReference"/>
         </w:rPr>
-        <w:footnoteReference w:id="20"/>
+        <w:footnoteReference w:id="24"/>
       </w:r>
       <w:r>
         <w:rPr>
@@ -4937,7 +5000,26 @@
         <w:rPr>
           <w:rStyle w:val="FootnoteReference"/>
         </w:rPr>
-        <w:footnoteReference w:id="21"/>
+        <w:footnoteReference w:id="25"/>
+      </w:r>
+      <w:r>
+        <w:rPr>
+          <w:rFonts w:ascii="Times New Roman" w:cs="David" w:eastAsia="David" w:hAnsi="Times New Roman"/>
+          <w:i w:val="false"/>
+          <w:iCs w:val="false"/>
+          <w:noProof/>
+          <w:sz w:val="24"/>
+          <w:szCs w:val="24"/>
+          <w:rtl/>
+          <w:lang w:val="en-US" w:bidi="he-IL"/>
+        </w:rPr>
+        <w:t xml:space="preserve"> יסיף הגדיר את האנתולוגיה הסיפורית העברית של ימי הביניים כסוגה בפני עצמה, שבה למלקט יש קול משלו הנשמע בהקדמה, בסדר הסיפורים ובנמשלים, וברכיה הוא דוגמה מובהקת: קובץ שמקורותיו זרים ועורכו נוכח בכל משל.</w:t>
+      </w:r>
+      <w:r>
+        <w:rPr>
+          <w:rStyle w:val="FootnoteReference"/>
+        </w:rPr>
+        <w:footnoteReference w:id="26"/>
       </w:r>
       <w:r>
         <w:rPr>
@@ -4956,7 +5038,7 @@
         <w:rPr>
           <w:rStyle w:val="FootnoteReference"/>
         </w:rPr>
-        <w:footnoteReference w:id="22"/>
+        <w:footnoteReference w:id="27"/>
       </w:r>
     </w:p>
     <w:p>
@@ -4982,7 +5064,7 @@
         <w:rPr>
           <w:rStyle w:val="FootnoteReference"/>
         </w:rPr>
-        <w:footnoteReference w:id="23"/>
+        <w:footnoteReference w:id="28"/>
       </w:r>
       <w:r>
         <w:rPr>
@@ -5021,20 +5103,39 @@
         <w:rPr>
           <w:rStyle w:val="FootnoteReference"/>
         </w:rPr>
-        <w:footnoteReference w:id="24"/>
-      </w:r>
-      <w:r>
-        <w:rPr>
-          <w:rFonts w:ascii="Times New Roman" w:cs="David" w:eastAsia="David" w:hAnsi="Times New Roman"/>
-          <w:i w:val="false"/>
-          <w:iCs w:val="false"/>
-          <w:noProof/>
-          <w:sz w:val="24"/>
-          <w:szCs w:val="24"/>
-          <w:rtl/>
-          <w:lang w:val="en-US" w:bidi="he-IL"/>
-        </w:rPr>
-        <w:t xml:space="preserve"> משליו של ברכיה שייכים בבירור לסוג השני. הנמשל שלו, "והמשל ב...", אינו מפרש פסוק אלא מתרגם את הסיפור לטיפוס אנושי, והפסוקים נכנסים למשל לא כנושא הדרשה אלא כשיבוצים בתוך הסיפור עצמו.</w:t>
+        <w:footnoteReference w:id="29"/>
+      </w:r>
+      <w:r>
+        <w:rPr>
+          <w:rFonts w:ascii="Times New Roman" w:cs="David" w:eastAsia="David" w:hAnsi="Times New Roman"/>
+          <w:i w:val="false"/>
+          <w:iCs w:val="false"/>
+          <w:noProof/>
+          <w:sz w:val="24"/>
+          <w:szCs w:val="24"/>
+          <w:rtl/>
+          <w:lang w:val="en-US" w:bidi="he-IL"/>
+        </w:rPr>
+        <w:t xml:space="preserve"> בוויכוח בין שטרן לבויארין על מעמד הנמשל טען בויארין שהנמשל אינו תוספת פרשנית למשל אלא חלק ממנגנון המשמעות שלו, ושלעיתים דווקא בו נמצא העושר.</w:t>
+      </w:r>
+      <w:r>
+        <w:rPr>
+          <w:rStyle w:val="FootnoteReference"/>
+        </w:rPr>
+        <w:footnoteReference w:id="30"/>
+      </w:r>
+      <w:r>
+        <w:rPr>
+          <w:rFonts w:ascii="Times New Roman" w:cs="David" w:eastAsia="David" w:hAnsi="Times New Roman"/>
+          <w:i w:val="false"/>
+          <w:iCs w:val="false"/>
+          <w:noProof/>
+          <w:sz w:val="24"/>
+          <w:szCs w:val="24"/>
+          <w:rtl/>
+          <w:lang w:val="en-US" w:bidi="he-IL"/>
+        </w:rPr>
+        <w:t xml:space="preserve"> משליו של ברכיה שייכים בבירור לסוג השני שהגדירה שפירא, והוויכוח על הנמשל נוגע להם ישירות. הנמשל שלו, "והמשל ב...", אינו מפרש פסוק אלא מתרגם את הסיפור לטיפוס אנושי, והפסוקים נכנסים למשל לא כנושא הדרשה אלא כשיבוצים בתוך הסיפור עצמו.</w:t>
       </w:r>
     </w:p>
     <w:p>
@@ -5084,7 +5185,7 @@
         <w:rPr>
           <w:rStyle w:val="FootnoteReference"/>
         </w:rPr>
-        <w:footnoteReference w:id="25"/>
+        <w:footnoteReference w:id="31"/>
       </w:r>
       <w:r>
         <w:rPr>
@@ -5103,7 +5204,7 @@
         <w:rPr>
           <w:rStyle w:val="FootnoteReference"/>
         </w:rPr>
-        <w:footnoteReference w:id="26"/>
+        <w:footnoteReference w:id="32"/>
       </w:r>
       <w:r>
         <w:rPr>
@@ -6358,7 +6459,7 @@
         <w:rPr>
           <w:rStyle w:val="FootnoteReference"/>
         </w:rPr>
-        <w:footnoteReference w:id="27"/>
+        <w:footnoteReference w:id="33"/>
       </w:r>
       <w:r>
         <w:rPr>
@@ -6417,7 +6518,7 @@
         <w:rPr>
           <w:rStyle w:val="FootnoteReference"/>
         </w:rPr>
-        <w:footnoteReference w:id="28"/>
+        <w:footnoteReference w:id="34"/>
       </w:r>
     </w:p>
     <w:p>
@@ -6541,7 +6642,26 @@
           <w:rtl/>
           <w:lang w:val="en-US" w:bidi="he-IL"/>
         </w:rPr>
-        <w:t xml:space="preserve">הסיום כולו נשען על סיפור אחד: איש האלוהים מיהודה, שהאריה הרגו בדרך, "וחמור ואריה עמדים אצל הנבלה", ו"לא אכל האריה את הנבלה ולא שבר את החמור" (מלכים א יג, כד-כח). ברכיה מצטט את התמונה, "והחמור והאריה עומדים אצל הנבלה", ואת הפסוק, "ולא שברת את החמור". בסיפור המקראי הימנעות האריה מן החמור היא נס, אות לכך שהאריה שליח. אצל ברכיה גורי האריה ילעגו לאביהם על אותו נס בדיוק, "איך טרפת בצאן ולא שברת את החמור". הנס הפך לחרפה, ומכאן שהאריה יתקן אותה. סופו של החמור אינו כתוב, אבל הפסוק כותב אותו.</w:t>
+        <w:t xml:space="preserve">הסיום כולו נשען על סיפור אחד: איש האלוהים מיהודה, שהאריה הרגו בדרך, "וחמור ואריה עמדים אצל הנבלה", ו"לא אכל האריה את הנבלה ולא שבר את החמור" (מלכים א יג, כד-כח). ברכיה מצטט את התמונה, "והחמור והאריה עומדים אצל הנבלה", ואת הפסוק, "ולא שברת את החמור". בסיפור המקראי הימנעות האריה מן החמור היא נס, אות לכך שהאריה שליח, וויי רואה בסיפור זה, יחד עם אתונו של בלעם, את הדוגמה המובהקת לבעלי חיים כשליחי האל בנבואה הקדומה.</w:t>
+      </w:r>
+      <w:r>
+        <w:rPr>
+          <w:rStyle w:val="FootnoteReference"/>
+        </w:rPr>
+        <w:footnoteReference w:id="35"/>
+      </w:r>
+      <w:r>
+        <w:rPr>
+          <w:rFonts w:ascii="Times New Roman" w:cs="David" w:eastAsia="David" w:hAnsi="Times New Roman"/>
+          <w:i w:val="false"/>
+          <w:iCs w:val="false"/>
+          <w:noProof/>
+          <w:sz w:val="24"/>
+          <w:szCs w:val="24"/>
+          <w:rtl/>
+          <w:lang w:val="en-US" w:bidi="he-IL"/>
+        </w:rPr>
+        <w:t xml:space="preserve"> אצל ברכיה גורי האריה ילעגו לאביהם על אותו נס בדיוק, "איך טרפת בצאן ולא שברת את החמור". הנס הפך לחרפה, ומכאן שהאריה יתקן אותה. סופו של החמור אינו כתוב, אבל הפסוק כותב אותו.</w:t>
       </w:r>
     </w:p>
     <w:p>
@@ -6567,7 +6687,7 @@
         <w:rPr>
           <w:rStyle w:val="FootnoteReference"/>
         </w:rPr>
-        <w:footnoteReference w:id="29"/>
+        <w:footnoteReference w:id="36"/>
       </w:r>
     </w:p>
     <w:p>
@@ -6780,13 +6900,13 @@
           <w:rtl/>
           <w:lang w:val="en-US" w:bidi="he-IL"/>
         </w:rPr>
-        <w:t xml:space="preserve">הקשר בין המשל לנמשל נבנה בשלוש דרכים. הראשונה גלויה: הנמשל מתרגם את סיפור החיות ללשון החברה, לגדול ולקטן, לבן בלי שם ולמכבדיו, לאיש שרוצה למשול. השנייה היא השיבוץ, וזו הדרך העיקרית. הפסוקים שברכיה שם בפי החמור ובפי סובביו מציבים מאחוריו דמויות מקראיות שסופן ידוע: אמציה שאמר "נתראה פנים", רחבעם שאמר "קטני עבה ממתני", אדוניה שאמר "אני אמלך", המן שאמר "למי יחפץ המלך", נגיד צור, אדום, ארז אשור, בנות ציון נטויות הגרון. הקורא המשכיל קורא את הסוף בפסוק לפני שהסיפור מגיע אליו, והנמשל רק מאשר. במובן זה השיבוץ אצל ברכיה הוא אמצעי של הטרמה, לא של קישוט. במונחיו של שטרן, ארבעת הנמשלים הם משלי גנאי ואזהרה, ובמונחיה של שפירא הם נמשלים של משל נרטיבי, שאינם צמודים לפסוק אלא לטיפוס אנושי.</w:t>
+        <w:t xml:space="preserve">הקשר בין המשל לנמשל נבנה בשלוש דרכים. הראשונה גלויה: הנמשל מתרגם את סיפור החיות ללשון החברה, לגדול ולקטן, לבן בלי שם ולמכבדיו, לאיש שרוצה למשול. השנייה היא השיבוץ, וזו הדרך העיקרית. הפסוקים שברכיה שם בפי החמור ובפי סובביו מציבים מאחוריו דמויות מקראיות שסופן ידוע: אמציה שאמר "נתראה פנים", רחבעם שאמר "קטני עבה ממתני", אדוניה שאמר "אני אמלך", המן שאמר "למי יחפץ המלך", נגיד צור, אדום, ארז אשור, בנות ציון נטויות הגרון. הקורא המשכיל קורא את הסוף בפסוק לפני שהסיפור מגיע אליו, והנמשל רק מאשר. במובן זה השיבוץ אצל ברכיה הוא אמצעי של הטרמה, לא של קישוט. במונחיו של שטרן, ארבעת הנמשלים הם משלי גנאי ואזהרה, ובמונחיה של שפירא הם נמשלים של משל נרטיבי, שאינם צמודים לפסוק אלא לטיפוס אנושי. הממצא על השיבוצים תומך דווקא בעמדת בויארין: אצל ברכיה המשמעות אינה מחכה לנמשל, היא נבנית כבר בתוך המשל, בפסוקים.</w:t>
       </w:r>
       <w:r>
         <w:rPr>
           <w:rStyle w:val="FootnoteReference"/>
         </w:rPr>
-        <w:footnoteReference w:id="30"/>
+        <w:footnoteReference w:id="37"/>
       </w:r>
       <w:r>
         <w:rPr>
@@ -7535,7 +7655,7 @@
           <w:rtl w:val="false"/>
           <w:lang w:val="en-US" w:bidi="he-IL"/>
         </w:rPr>
-        <w:t xml:space="preserve">Schwarzbaum, Haim, </w:t>
+        <w:t xml:space="preserve">Boyarin, Daniel, "An Exchange on the Mashal: Rhetoric and Interpretation: The Case of the Nimshal," </w:t>
       </w:r>
       <w:r>
         <w:rPr>
@@ -7548,7 +7668,7 @@
           <w:rtl w:val="false"/>
           <w:lang w:val="en-US" w:bidi="he-IL"/>
         </w:rPr>
-        <w:t xml:space="preserve">The Mishle Shu'alim (Fox Fables) of Rabbi Berechiah ha-Nakdan: A Study in Comparative Folklore and Fable Lore</w:t>
+        <w:t xml:space="preserve">Prooftexts</w:t>
       </w:r>
       <w:r>
         <w:rPr>
@@ -7561,7 +7681,7 @@
           <w:rtl w:val="false"/>
           <w:lang w:val="en-US" w:bidi="he-IL"/>
         </w:rPr>
-        <w:t xml:space="preserve">, Kiron: Institute for Jewish and Arab Folklore Research, 1979.</w:t>
+        <w:t xml:space="preserve"> 5, no. 3 (1985): 269-276.</w:t>
       </w:r>
     </w:p>
     <w:p>
@@ -7582,7 +7702,7 @@
           <w:rtl w:val="false"/>
           <w:lang w:val="en-US" w:bidi="he-IL"/>
         </w:rPr>
-        <w:t xml:space="preserve">Thompson, Stith, </w:t>
+        <w:t xml:space="preserve">Lawee, Eric, "The Sins of the Fauna in Midrash, Rashi, and Their Medieval Interlocutors," </w:t>
       </w:r>
       <w:r>
         <w:rPr>
@@ -7595,7 +7715,7 @@
           <w:rtl w:val="false"/>
           <w:lang w:val="en-US" w:bidi="he-IL"/>
         </w:rPr>
-        <w:t xml:space="preserve">Motif-Index of Folk-Literature</w:t>
+        <w:t xml:space="preserve">Jewish Studies Quarterly</w:t>
       </w:r>
       <w:r>
         <w:rPr>
@@ -7608,7 +7728,7 @@
           <w:rtl w:val="false"/>
           <w:lang w:val="en-US" w:bidi="he-IL"/>
         </w:rPr>
-        <w:t xml:space="preserve">, 6 vols., Bloomington: Indiana University Press, 1955-1958.</w:t>
+        <w:t xml:space="preserve"> 17, no. 1 (2010): 56-98.</w:t>
       </w:r>
     </w:p>
     <w:p>
@@ -7629,7 +7749,7 @@
           <w:rtl w:val="false"/>
           <w:lang w:val="en-US" w:bidi="he-IL"/>
         </w:rPr>
-        <w:t xml:space="preserve">Uther, Hans-Jörg, </w:t>
+        <w:t xml:space="preserve">Schwarzbaum, Haim, </w:t>
       </w:r>
       <w:r>
         <w:rPr>
@@ -7642,7 +7762,7 @@
           <w:rtl w:val="false"/>
           <w:lang w:val="en-US" w:bidi="he-IL"/>
         </w:rPr>
-        <w:t xml:space="preserve">The Types of International Folktales: A Classification and Bibliography</w:t>
+        <w:t xml:space="preserve">The Mishle Shu'alim (Fox Fables) of Rabbi Berechiah ha-Nakdan: A Study in Comparative Folklore and Fable Lore</w:t>
       </w:r>
       <w:r>
         <w:rPr>
@@ -7655,7 +7775,7 @@
           <w:rtl w:val="false"/>
           <w:lang w:val="en-US" w:bidi="he-IL"/>
         </w:rPr>
-        <w:t xml:space="preserve">, FF Communications 284-286, 3 vols., Helsinki: Academia Scientiarum Fennica, 2004.</w:t>
+        <w:t xml:space="preserve">, Kiron: Institute for Jewish and Arab Folklore Research, 1979.</w:t>
       </w:r>
     </w:p>
     <w:p>
@@ -7676,7 +7796,7 @@
           <w:rtl w:val="false"/>
           <w:lang w:val="en-US" w:bidi="he-IL"/>
         </w:rPr>
-        <w:t xml:space="preserve">Way, Kenneth C., </w:t>
+        <w:t xml:space="preserve">Stern, David, "Rhetoric and Midrash: The Case of the Mashal," </w:t>
       </w:r>
       <w:r>
         <w:rPr>
@@ -7689,6 +7809,241 @@
           <w:rtl w:val="false"/>
           <w:lang w:val="en-US" w:bidi="he-IL"/>
         </w:rPr>
+        <w:t xml:space="preserve">Prooftexts</w:t>
+      </w:r>
+      <w:r>
+        <w:rPr>
+          <w:rFonts w:ascii="Times New Roman" w:cs="David" w:eastAsia="David" w:hAnsi="Times New Roman"/>
+          <w:i w:val="false"/>
+          <w:iCs w:val="false"/>
+          <w:noProof/>
+          <w:sz w:val="24"/>
+          <w:szCs w:val="24"/>
+          <w:rtl w:val="false"/>
+          <w:lang w:val="en-US" w:bidi="he-IL"/>
+        </w:rPr>
+        <w:t xml:space="preserve"> 1, no. 3 (1981): 261-291.</w:t>
+      </w:r>
+    </w:p>
+    <w:p>
+      <w:pPr>
+        <w:bidi w:val="false"/>
+        <w:spacing w:after="160" w:before="0" w:line="276"/>
+        <w:ind w:left="709" w:hanging="709"/>
+        <w:jc w:val="left"/>
+      </w:pPr>
+      <w:r>
+        <w:rPr>
+          <w:rFonts w:ascii="Times New Roman" w:cs="David" w:eastAsia="David" w:hAnsi="Times New Roman"/>
+          <w:i w:val="false"/>
+          <w:iCs w:val="false"/>
+          <w:noProof/>
+          <w:sz w:val="24"/>
+          <w:szCs w:val="24"/>
+          <w:rtl w:val="false"/>
+          <w:lang w:val="en-US" w:bidi="he-IL"/>
+        </w:rPr>
+        <w:t xml:space="preserve">Thompson, Stith, </w:t>
+      </w:r>
+      <w:r>
+        <w:rPr>
+          <w:rFonts w:ascii="Times New Roman" w:cs="David" w:eastAsia="David" w:hAnsi="Times New Roman"/>
+          <w:i/>
+          <w:iCs/>
+          <w:noProof/>
+          <w:sz w:val="24"/>
+          <w:szCs w:val="24"/>
+          <w:rtl w:val="false"/>
+          <w:lang w:val="en-US" w:bidi="he-IL"/>
+        </w:rPr>
+        <w:t xml:space="preserve">Motif-Index of Folk-Literature</w:t>
+      </w:r>
+      <w:r>
+        <w:rPr>
+          <w:rFonts w:ascii="Times New Roman" w:cs="David" w:eastAsia="David" w:hAnsi="Times New Roman"/>
+          <w:i w:val="false"/>
+          <w:iCs w:val="false"/>
+          <w:noProof/>
+          <w:sz w:val="24"/>
+          <w:szCs w:val="24"/>
+          <w:rtl w:val="false"/>
+          <w:lang w:val="en-US" w:bidi="he-IL"/>
+        </w:rPr>
+        <w:t xml:space="preserve">, 6 vols., Bloomington: Indiana University Press, 1955-1958.</w:t>
+      </w:r>
+    </w:p>
+    <w:p>
+      <w:pPr>
+        <w:bidi w:val="false"/>
+        <w:spacing w:after="160" w:before="0" w:line="276"/>
+        <w:ind w:left="709" w:hanging="709"/>
+        <w:jc w:val="left"/>
+      </w:pPr>
+      <w:r>
+        <w:rPr>
+          <w:rFonts w:ascii="Times New Roman" w:cs="David" w:eastAsia="David" w:hAnsi="Times New Roman"/>
+          <w:i w:val="false"/>
+          <w:iCs w:val="false"/>
+          <w:noProof/>
+          <w:sz w:val="24"/>
+          <w:szCs w:val="24"/>
+          <w:rtl w:val="false"/>
+          <w:lang w:val="en-US" w:bidi="he-IL"/>
+        </w:rPr>
+        <w:t xml:space="preserve">Uther, Hans-Jörg, </w:t>
+      </w:r>
+      <w:r>
+        <w:rPr>
+          <w:rFonts w:ascii="Times New Roman" w:cs="David" w:eastAsia="David" w:hAnsi="Times New Roman"/>
+          <w:i/>
+          <w:iCs/>
+          <w:noProof/>
+          <w:sz w:val="24"/>
+          <w:szCs w:val="24"/>
+          <w:rtl w:val="false"/>
+          <w:lang w:val="en-US" w:bidi="he-IL"/>
+        </w:rPr>
+        <w:t xml:space="preserve">The Types of International Folktales: A Classification and Bibliography</w:t>
+      </w:r>
+      <w:r>
+        <w:rPr>
+          <w:rFonts w:ascii="Times New Roman" w:cs="David" w:eastAsia="David" w:hAnsi="Times New Roman"/>
+          <w:i w:val="false"/>
+          <w:iCs w:val="false"/>
+          <w:noProof/>
+          <w:sz w:val="24"/>
+          <w:szCs w:val="24"/>
+          <w:rtl w:val="false"/>
+          <w:lang w:val="en-US" w:bidi="he-IL"/>
+        </w:rPr>
+        <w:t xml:space="preserve">, FF Communications 284-286, 3 vols., Helsinki: Academia Scientiarum Fennica, 2004.</w:t>
+      </w:r>
+    </w:p>
+    <w:p>
+      <w:pPr>
+        <w:bidi w:val="false"/>
+        <w:spacing w:after="160" w:before="0" w:line="276"/>
+        <w:ind w:left="709" w:hanging="709"/>
+        <w:jc w:val="left"/>
+      </w:pPr>
+      <w:r>
+        <w:rPr>
+          <w:rFonts w:ascii="Times New Roman" w:cs="David" w:eastAsia="David" w:hAnsi="Times New Roman"/>
+          <w:i w:val="false"/>
+          <w:iCs w:val="false"/>
+          <w:noProof/>
+          <w:sz w:val="24"/>
+          <w:szCs w:val="24"/>
+          <w:rtl w:val="false"/>
+          <w:lang w:val="en-US" w:bidi="he-IL"/>
+        </w:rPr>
+        <w:t xml:space="preserve">Way, Kenneth C., "Animals in the Prophetic World: Literary Reflections on Numbers 22 and 1 Kings 13," </w:t>
+      </w:r>
+      <w:r>
+        <w:rPr>
+          <w:rFonts w:ascii="Times New Roman" w:cs="David" w:eastAsia="David" w:hAnsi="Times New Roman"/>
+          <w:i/>
+          <w:iCs/>
+          <w:noProof/>
+          <w:sz w:val="24"/>
+          <w:szCs w:val="24"/>
+          <w:rtl w:val="false"/>
+          <w:lang w:val="en-US" w:bidi="he-IL"/>
+        </w:rPr>
+        <w:t xml:space="preserve">Journal for the Study of the Old Testament</w:t>
+      </w:r>
+      <w:r>
+        <w:rPr>
+          <w:rFonts w:ascii="Times New Roman" w:cs="David" w:eastAsia="David" w:hAnsi="Times New Roman"/>
+          <w:i w:val="false"/>
+          <w:iCs w:val="false"/>
+          <w:noProof/>
+          <w:sz w:val="24"/>
+          <w:szCs w:val="24"/>
+          <w:rtl w:val="false"/>
+          <w:lang w:val="en-US" w:bidi="he-IL"/>
+        </w:rPr>
+        <w:t xml:space="preserve"> 34, no. 1 (2009): 47-62.</w:t>
+      </w:r>
+    </w:p>
+    <w:p>
+      <w:pPr>
+        <w:bidi w:val="false"/>
+        <w:spacing w:after="160" w:before="0" w:line="276"/>
+        <w:ind w:left="709" w:hanging="709"/>
+        <w:jc w:val="left"/>
+      </w:pPr>
+      <w:r>
+        <w:rPr>
+          <w:rFonts w:ascii="Times New Roman" w:cs="David" w:eastAsia="David" w:hAnsi="Times New Roman"/>
+          <w:i w:val="false"/>
+          <w:iCs w:val="false"/>
+          <w:noProof/>
+          <w:sz w:val="24"/>
+          <w:szCs w:val="24"/>
+          <w:rtl w:val="false"/>
+          <w:lang w:val="en-US" w:bidi="he-IL"/>
+        </w:rPr>
+        <w:t xml:space="preserve">Way, Kenneth C., "Donkey Domain: Zechariah 9:9 and Lexical Semantics," </w:t>
+      </w:r>
+      <w:r>
+        <w:rPr>
+          <w:rFonts w:ascii="Times New Roman" w:cs="David" w:eastAsia="David" w:hAnsi="Times New Roman"/>
+          <w:i/>
+          <w:iCs/>
+          <w:noProof/>
+          <w:sz w:val="24"/>
+          <w:szCs w:val="24"/>
+          <w:rtl w:val="false"/>
+          <w:lang w:val="en-US" w:bidi="he-IL"/>
+        </w:rPr>
+        <w:t xml:space="preserve">Journal of Biblical Literature</w:t>
+      </w:r>
+      <w:r>
+        <w:rPr>
+          <w:rFonts w:ascii="Times New Roman" w:cs="David" w:eastAsia="David" w:hAnsi="Times New Roman"/>
+          <w:i w:val="false"/>
+          <w:iCs w:val="false"/>
+          <w:noProof/>
+          <w:sz w:val="24"/>
+          <w:szCs w:val="24"/>
+          <w:rtl w:val="false"/>
+          <w:lang w:val="en-US" w:bidi="he-IL"/>
+        </w:rPr>
+        <w:t xml:space="preserve"> 129, no. 1 (2010): 105-114.</w:t>
+      </w:r>
+    </w:p>
+    <w:p>
+      <w:pPr>
+        <w:bidi w:val="false"/>
+        <w:spacing w:after="160" w:before="0" w:line="276"/>
+        <w:ind w:left="709" w:hanging="709"/>
+        <w:jc w:val="left"/>
+      </w:pPr>
+      <w:r>
+        <w:rPr>
+          <w:rFonts w:ascii="Times New Roman" w:cs="David" w:eastAsia="David" w:hAnsi="Times New Roman"/>
+          <w:i w:val="false"/>
+          <w:iCs w:val="false"/>
+          <w:noProof/>
+          <w:sz w:val="24"/>
+          <w:szCs w:val="24"/>
+          <w:rtl w:val="false"/>
+          <w:lang w:val="en-US" w:bidi="he-IL"/>
+        </w:rPr>
+        <w:t xml:space="preserve">Way, Kenneth C., </w:t>
+      </w:r>
+      <w:r>
+        <w:rPr>
+          <w:rFonts w:ascii="Times New Roman" w:cs="David" w:eastAsia="David" w:hAnsi="Times New Roman"/>
+          <w:i/>
+          <w:iCs/>
+          <w:noProof/>
+          <w:sz w:val="24"/>
+          <w:szCs w:val="24"/>
+          <w:rtl w:val="false"/>
+          <w:lang w:val="en-US" w:bidi="he-IL"/>
+        </w:rPr>
         <w:t xml:space="preserve">Donkeys in the Biblical World: Ceremony and Symbol</w:t>
       </w:r>
       <w:r>
@@ -7703,6 +8058,53 @@
           <w:lang w:val="en-US" w:bidi="he-IL"/>
         </w:rPr>
         <w:t xml:space="preserve">, Winona Lake: Eisenbrauns, 2011.</w:t>
+      </w:r>
+    </w:p>
+    <w:p>
+      <w:pPr>
+        <w:bidi w:val="false"/>
+        <w:spacing w:after="160" w:before="0" w:line="276"/>
+        <w:ind w:left="709" w:hanging="709"/>
+        <w:jc w:val="left"/>
+      </w:pPr>
+      <w:r>
+        <w:rPr>
+          <w:rFonts w:ascii="Times New Roman" w:cs="David" w:eastAsia="David" w:hAnsi="Times New Roman"/>
+          <w:i w:val="false"/>
+          <w:iCs w:val="false"/>
+          <w:noProof/>
+          <w:sz w:val="24"/>
+          <w:szCs w:val="24"/>
+          <w:rtl w:val="false"/>
+          <w:lang w:val="en-US" w:bidi="he-IL"/>
+        </w:rPr>
+        <w:t xml:space="preserve">Yassif, Eli, "The Hebrew Narrative Anthology in the Middle Ages," </w:t>
+      </w:r>
+      <w:r>
+        <w:rPr>
+          <w:rFonts w:ascii="Times New Roman" w:cs="David" w:eastAsia="David" w:hAnsi="Times New Roman"/>
+          <w:i/>
+          <w:iCs/>
+          <w:noProof/>
+          <w:sz w:val="24"/>
+          <w:szCs w:val="24"/>
+          <w:rtl w:val="false"/>
+          <w:lang w:val="en-US" w:bidi="he-IL"/>
+        </w:rPr>
+        <w:t xml:space="preserve">Prooftexts</w:t>
+      </w:r>
+      <w:r>
+        <w:rPr>
+          <w:rFonts w:ascii="Times New Roman" w:cs="David" w:eastAsia="David" w:hAnsi="Times New Roman"/>
+          <w:i w:val="false"/>
+          <w:iCs w:val="false"/>
+          <w:noProof/>
+          <w:sz w:val="24"/>
+          <w:szCs w:val="24"/>
+          <w:rtl w:val="false"/>
+          <w:lang w:val="en-US" w:bidi="he-IL"/>
+        </w:rPr>
+        <w:t xml:space="preserve"> 17, no. 2 (1997): 153-175.</w:t>
       </w:r>
     </w:p>
     <w:p>
@@ -8420,220 +8822,6 @@
   <w:footnote w:id="4">
     <w:p>
       <w:pPr>
-        <w:bidi/>
-        <w:spacing w:after="60" w:line="240"/>
-        <w:jc w:val="both"/>
-      </w:pPr>
-      <w:r>
-        <w:rPr>
-          <w:rStyle w:val="FootnoteReference"/>
-        </w:rPr>
-        <w:footnoteRef/>
-      </w:r>
-      <w:r>
-        <w:rPr>
-          <w:rFonts w:ascii="Times New Roman" w:cs="David" w:eastAsia="David" w:hAnsi="Times New Roman"/>
-          <w:i w:val="false"/>
-          <w:iCs w:val="false"/>
-          <w:noProof/>
-          <w:sz w:val="20"/>
-          <w:szCs w:val="20"/>
-          <w:rtl/>
-          <w:lang w:val="en-US" w:bidi="he-IL"/>
-        </w:rPr>
-        <w:t xml:space="preserve">עלי יסיף, </w:t>
-      </w:r>
-      <w:r>
-        <w:rPr>
-          <w:rFonts w:ascii="Times New Roman" w:cs="David" w:eastAsia="David" w:hAnsi="Times New Roman"/>
-          <w:i/>
-          <w:iCs/>
-          <w:noProof/>
-          <w:sz w:val="20"/>
-          <w:szCs w:val="20"/>
-          <w:rtl/>
-          <w:lang w:val="en-US" w:bidi="he-IL"/>
-        </w:rPr>
-        <w:t xml:space="preserve">סיפור העם העברי: תולדותיו, סוגיו ומשמעותו</w:t>
-      </w:r>
-      <w:r>
-        <w:rPr>
-          <w:rFonts w:ascii="Times New Roman" w:cs="David" w:eastAsia="David" w:hAnsi="Times New Roman"/>
-          <w:i w:val="false"/>
-          <w:iCs w:val="false"/>
-          <w:noProof/>
-          <w:sz w:val="20"/>
-          <w:szCs w:val="20"/>
-          <w:rtl/>
-          <w:lang w:val="en-US" w:bidi="he-IL"/>
-        </w:rPr>
-        <w:t xml:space="preserve">, ירושלים: מוסד ביאליק, תשנ"ד, בפרק על ספרות חז"ל [לוודא עמודים].</w:t>
-      </w:r>
-    </w:p>
-  </w:footnote>
-  <w:footnote w:id="5">
-    <w:p>
-      <w:pPr>
-        <w:bidi/>
-        <w:spacing w:after="60" w:line="240"/>
-        <w:jc w:val="both"/>
-      </w:pPr>
-      <w:r>
-        <w:rPr>
-          <w:rStyle w:val="FootnoteReference"/>
-        </w:rPr>
-        <w:footnoteRef/>
-      </w:r>
-      <w:r>
-        <w:rPr>
-          <w:rFonts w:ascii="Times New Roman" w:cs="David" w:eastAsia="David" w:hAnsi="Times New Roman"/>
-          <w:i w:val="false"/>
-          <w:iCs w:val="false"/>
-          <w:noProof/>
-          <w:sz w:val="20"/>
-          <w:szCs w:val="20"/>
-          <w:rtl/>
-          <w:lang w:val="en-US" w:bidi="he-IL"/>
-        </w:rPr>
-        <w:t xml:space="preserve">דוד שטרן, "תפקידו של המשל בספרות חז"ל", </w:t>
-      </w:r>
-      <w:r>
-        <w:rPr>
-          <w:rFonts w:ascii="Times New Roman" w:cs="David" w:eastAsia="David" w:hAnsi="Times New Roman"/>
-          <w:i/>
-          <w:iCs/>
-          <w:noProof/>
-          <w:sz w:val="20"/>
-          <w:szCs w:val="20"/>
-          <w:rtl/>
-          <w:lang w:val="en-US" w:bidi="he-IL"/>
-        </w:rPr>
-        <w:t xml:space="preserve">מחקרי ירושלים בספרות עברית</w:t>
-      </w:r>
-      <w:r>
-        <w:rPr>
-          <w:rFonts w:ascii="Times New Roman" w:cs="David" w:eastAsia="David" w:hAnsi="Times New Roman"/>
-          <w:i w:val="false"/>
-          <w:iCs w:val="false"/>
-          <w:noProof/>
-          <w:sz w:val="20"/>
-          <w:szCs w:val="20"/>
-          <w:rtl/>
-          <w:lang w:val="en-US" w:bidi="he-IL"/>
-        </w:rPr>
-        <w:t xml:space="preserve"> ז (תשמ"ה), עמ' 90-102, בייחוד עמ' 97.</w:t>
-      </w:r>
-    </w:p>
-  </w:footnote>
-  <w:footnote w:id="6">
-    <w:p>
-      <w:pPr>
-        <w:bidi/>
-        <w:spacing w:after="60" w:line="240"/>
-        <w:jc w:val="both"/>
-      </w:pPr>
-      <w:r>
-        <w:rPr>
-          <w:rStyle w:val="FootnoteReference"/>
-        </w:rPr>
-        <w:footnoteRef/>
-      </w:r>
-      <w:r>
-        <w:rPr>
-          <w:rFonts w:ascii="Times New Roman" w:cs="David" w:eastAsia="David" w:hAnsi="Times New Roman"/>
-          <w:i w:val="false"/>
-          <w:iCs w:val="false"/>
-          <w:noProof/>
-          <w:sz w:val="20"/>
-          <w:szCs w:val="20"/>
-          <w:rtl/>
-          <w:lang w:val="en-US" w:bidi="he-IL"/>
-        </w:rPr>
-        <w:t xml:space="preserve">מספרי פרי, המפתח המקובל למשלי איזופוס, מובאים כפי שהם רשומים אצל </w:t>
-      </w:r>
-      <w:r>
-        <w:rPr>
-          <w:rFonts w:ascii="Times New Roman" w:cs="David" w:eastAsia="David" w:hAnsi="Times New Roman"/>
-          <w:i w:val="false"/>
-          <w:iCs w:val="false"/>
-          <w:noProof/>
-          <w:sz w:val="20"/>
-          <w:szCs w:val="20"/>
-          <w:rtl w:val="false"/>
-          <w:lang w:val="en-US" w:bidi="he-IL"/>
-        </w:rPr>
-        <w:t xml:space="preserve">Haim Schwarzbaum, </w:t>
-      </w:r>
-      <w:r>
-        <w:rPr>
-          <w:rFonts w:ascii="Times New Roman" w:cs="David" w:eastAsia="David" w:hAnsi="Times New Roman"/>
-          <w:i/>
-          <w:iCs/>
-          <w:noProof/>
-          <w:sz w:val="20"/>
-          <w:szCs w:val="20"/>
-          <w:rtl w:val="false"/>
-          <w:lang w:val="en-US" w:bidi="he-IL"/>
-        </w:rPr>
-        <w:t xml:space="preserve">The Mishle Shu'alim (Fox Fables) of Rabbi Berechiah ha-Nakdan: A Study in Comparative Folklore and Fable Lore</w:t>
-      </w:r>
-      <w:r>
-        <w:rPr>
-          <w:rFonts w:ascii="Times New Roman" w:cs="David" w:eastAsia="David" w:hAnsi="Times New Roman"/>
-          <w:i w:val="false"/>
-          <w:iCs w:val="false"/>
-          <w:noProof/>
-          <w:sz w:val="20"/>
-          <w:szCs w:val="20"/>
-          <w:rtl w:val="false"/>
-          <w:lang w:val="en-US" w:bidi="he-IL"/>
-        </w:rPr>
-        <w:t xml:space="preserve">, Kiron: Institute for Jewish and Arab Folklore Research, 1979, </w:t>
-      </w:r>
-      <w:r>
-        <w:rPr>
-          <w:rFonts w:ascii="Times New Roman" w:cs="David" w:eastAsia="David" w:hAnsi="Times New Roman"/>
-          <w:i w:val="false"/>
-          <w:iCs w:val="false"/>
-          <w:noProof/>
-          <w:sz w:val="20"/>
-          <w:szCs w:val="20"/>
-          <w:rtl/>
-          <w:lang w:val="en-US" w:bidi="he-IL"/>
-        </w:rPr>
-        <w:t xml:space="preserve">בדיון על כל משל. תרגום עברי: איסופוס, </w:t>
-      </w:r>
-      <w:r>
-        <w:rPr>
-          <w:rFonts w:ascii="Times New Roman" w:cs="David" w:eastAsia="David" w:hAnsi="Times New Roman"/>
-          <w:i/>
-          <w:iCs/>
-          <w:noProof/>
-          <w:sz w:val="20"/>
-          <w:szCs w:val="20"/>
-          <w:rtl/>
-          <w:lang w:val="en-US" w:bidi="he-IL"/>
-        </w:rPr>
-        <w:t xml:space="preserve">משלי איסופוס</w:t>
-      </w:r>
-      <w:r>
-        <w:rPr>
-          <w:rFonts w:ascii="Times New Roman" w:cs="David" w:eastAsia="David" w:hAnsi="Times New Roman"/>
-          <w:i w:val="false"/>
-          <w:iCs w:val="false"/>
-          <w:noProof/>
-          <w:sz w:val="20"/>
-          <w:szCs w:val="20"/>
-          <w:rtl/>
-          <w:lang w:val="en-US" w:bidi="he-IL"/>
-        </w:rPr>
-        <w:t xml:space="preserve">, תרגם שלמה שפאן, ירושלים: מוסד ביאליק, תש"ך.</w:t>
-      </w:r>
-    </w:p>
-  </w:footnote>
-  <w:footnote w:id="7">
-    <w:p>
-      <w:pPr>
         <w:bidi w:val="false"/>
         <w:spacing w:after="60" w:line="240"/>
         <w:jc w:val="left"/>
@@ -8655,7 +8843,7 @@
           <w:rtl w:val="false"/>
           <w:lang w:val="en-US" w:bidi="he-IL"/>
         </w:rPr>
-        <w:t xml:space="preserve">Schwarzbaum, </w:t>
+        <w:t xml:space="preserve">Kenneth C. Way, "Animals in the Prophetic World: Literary Reflections on Numbers 22 and 1 Kings 13," </w:t>
       </w:r>
       <w:r>
         <w:rPr>
@@ -8668,78 +8856,24 @@
           <w:rtl w:val="false"/>
           <w:lang w:val="en-US" w:bidi="he-IL"/>
         </w:rPr>
-        <w:t xml:space="preserve">Mishle Shu'alim</w:t>
-      </w:r>
-      <w:r>
-        <w:rPr>
-          <w:rFonts w:ascii="Times New Roman" w:cs="David" w:eastAsia="David" w:hAnsi="Times New Roman"/>
-          <w:i w:val="false"/>
-          <w:iCs w:val="false"/>
-          <w:noProof/>
-          <w:sz w:val="20"/>
-          <w:szCs w:val="20"/>
-          <w:rtl/>
-          <w:lang w:val="en-US" w:bidi="he-IL"/>
-        </w:rPr>
-        <w:t xml:space="preserve">, בדיון על משלים יד ו-מז [לוודא עמודים]; וכן חיים שורצבוים, "טיפוסים פולקלוריים ומוטיבים עממיים בספר משלי שועלים לרבי ברכיה הנקדן", </w:t>
-      </w:r>
-      <w:r>
-        <w:rPr>
-          <w:rFonts w:ascii="Times New Roman" w:cs="David" w:eastAsia="David" w:hAnsi="Times New Roman"/>
-          <w:i/>
-          <w:iCs/>
-          <w:noProof/>
-          <w:sz w:val="20"/>
-          <w:szCs w:val="20"/>
-          <w:rtl/>
-          <w:lang w:val="en-US" w:bidi="he-IL"/>
-        </w:rPr>
-        <w:t xml:space="preserve">דברי הקונגרס העולמי הרביעי למדעי היהדות</w:t>
-      </w:r>
-      <w:r>
-        <w:rPr>
-          <w:rFonts w:ascii="Times New Roman" w:cs="David" w:eastAsia="David" w:hAnsi="Times New Roman"/>
-          <w:i w:val="false"/>
-          <w:iCs w:val="false"/>
-          <w:noProof/>
-          <w:sz w:val="20"/>
-          <w:szCs w:val="20"/>
-          <w:rtl/>
-          <w:lang w:val="en-US" w:bidi="he-IL"/>
-        </w:rPr>
-        <w:t xml:space="preserve">, כרך ב, ירושלים: האיגוד העולמי למדעי היהדות, תשכ"ה, עמ' 33-36.</w:t>
+        <w:t xml:space="preserve">Journal for the Study of the Old Testament</w:t>
+      </w:r>
+      <w:r>
+        <w:rPr>
+          <w:rFonts w:ascii="Times New Roman" w:cs="David" w:eastAsia="David" w:hAnsi="Times New Roman"/>
+          <w:i w:val="false"/>
+          <w:iCs w:val="false"/>
+          <w:noProof/>
+          <w:sz w:val="20"/>
+          <w:szCs w:val="20"/>
+          <w:rtl w:val="false"/>
+          <w:lang w:val="en-US" w:bidi="he-IL"/>
+        </w:rPr>
+        <w:t xml:space="preserve"> 34, no. 1 (2009): 47-62.</w:t>
       </w:r>
     </w:p>
   </w:footnote>
-  <w:footnote w:id="8">
-    <w:p>
-      <w:pPr>
-        <w:bidi/>
-        <w:spacing w:after="60" w:line="240"/>
-        <w:jc w:val="both"/>
-      </w:pPr>
-      <w:r>
-        <w:rPr>
-          <w:rStyle w:val="FootnoteReference"/>
-        </w:rPr>
-        <w:footnoteRef/>
-      </w:r>
-      <w:r>
-        <w:rPr>
-          <w:rFonts w:ascii="Times New Roman" w:cs="David" w:eastAsia="David" w:hAnsi="Times New Roman"/>
-          <w:i w:val="false"/>
-          <w:iCs w:val="false"/>
-          <w:noProof/>
-          <w:sz w:val="20"/>
-          <w:szCs w:val="20"/>
-          <w:rtl/>
-          <w:lang w:val="en-US" w:bidi="he-IL"/>
-        </w:rPr>
-        <w:t xml:space="preserve">שורצבוים, "טיפוסים פולקלוריים", עמ' 33-34.</w:t>
-      </w:r>
-    </w:p>
-  </w:footnote>
-  <w:footnote w:id="9">
+  <w:footnote w:id="5">
     <w:p>
       <w:pPr>
         <w:bidi w:val="false"/>
@@ -8763,7 +8897,7 @@
           <w:rtl w:val="false"/>
           <w:lang w:val="en-US" w:bidi="he-IL"/>
         </w:rPr>
-        <w:t xml:space="preserve">Hans-Jörg Uther, </w:t>
+        <w:t xml:space="preserve">Kenneth C. Way, "Donkey Domain: Zechariah 9:9 and Lexical Semantics," </w:t>
       </w:r>
       <w:r>
         <w:rPr>
@@ -8776,7 +8910,7 @@
           <w:rtl w:val="false"/>
           <w:lang w:val="en-US" w:bidi="he-IL"/>
         </w:rPr>
-        <w:t xml:space="preserve">The Types of International Folktales: A Classification and Bibliography</w:t>
+        <w:t xml:space="preserve">Journal of Biblical Literature</w:t>
       </w:r>
       <w:r>
         <w:rPr>
@@ -8789,11 +8923,119 @@
           <w:rtl w:val="false"/>
           <w:lang w:val="en-US" w:bidi="he-IL"/>
         </w:rPr>
-        <w:t xml:space="preserve">, FF Communications 284-286, Helsinki: Academia Scientiarum Fennica, 2004, vol. 1, nos. 214, 214B.</w:t>
+        <w:t xml:space="preserve"> 129, no. 1 (2010): 105-114.</w:t>
       </w:r>
     </w:p>
   </w:footnote>
-  <w:footnote w:id="10">
+  <w:footnote w:id="6">
+    <w:p>
+      <w:pPr>
+        <w:bidi/>
+        <w:spacing w:after="60" w:line="240"/>
+        <w:jc w:val="both"/>
+      </w:pPr>
+      <w:r>
+        <w:rPr>
+          <w:rStyle w:val="FootnoteReference"/>
+        </w:rPr>
+        <w:footnoteRef/>
+      </w:r>
+      <w:r>
+        <w:rPr>
+          <w:rFonts w:ascii="Times New Roman" w:cs="David" w:eastAsia="David" w:hAnsi="Times New Roman"/>
+          <w:i w:val="false"/>
+          <w:iCs w:val="false"/>
+          <w:noProof/>
+          <w:sz w:val="20"/>
+          <w:szCs w:val="20"/>
+          <w:rtl/>
+          <w:lang w:val="en-US" w:bidi="he-IL"/>
+        </w:rPr>
+        <w:t xml:space="preserve">עלי יסיף, </w:t>
+      </w:r>
+      <w:r>
+        <w:rPr>
+          <w:rFonts w:ascii="Times New Roman" w:cs="David" w:eastAsia="David" w:hAnsi="Times New Roman"/>
+          <w:i/>
+          <w:iCs/>
+          <w:noProof/>
+          <w:sz w:val="20"/>
+          <w:szCs w:val="20"/>
+          <w:rtl/>
+          <w:lang w:val="en-US" w:bidi="he-IL"/>
+        </w:rPr>
+        <w:t xml:space="preserve">סיפור העם העברי: תולדותיו, סוגיו ומשמעותו</w:t>
+      </w:r>
+      <w:r>
+        <w:rPr>
+          <w:rFonts w:ascii="Times New Roman" w:cs="David" w:eastAsia="David" w:hAnsi="Times New Roman"/>
+          <w:i w:val="false"/>
+          <w:iCs w:val="false"/>
+          <w:noProof/>
+          <w:sz w:val="20"/>
+          <w:szCs w:val="20"/>
+          <w:rtl/>
+          <w:lang w:val="en-US" w:bidi="he-IL"/>
+        </w:rPr>
+        <w:t xml:space="preserve">, ירושלים: מוסד ביאליק, תשנ"ד, בפרק על ספרות חז"ל [לוודא עמודים].</w:t>
+      </w:r>
+    </w:p>
+  </w:footnote>
+  <w:footnote w:id="7">
+    <w:p>
+      <w:pPr>
+        <w:bidi/>
+        <w:spacing w:after="60" w:line="240"/>
+        <w:jc w:val="both"/>
+      </w:pPr>
+      <w:r>
+        <w:rPr>
+          <w:rStyle w:val="FootnoteReference"/>
+        </w:rPr>
+        <w:footnoteRef/>
+      </w:r>
+      <w:r>
+        <w:rPr>
+          <w:rFonts w:ascii="Times New Roman" w:cs="David" w:eastAsia="David" w:hAnsi="Times New Roman"/>
+          <w:i w:val="false"/>
+          <w:iCs w:val="false"/>
+          <w:noProof/>
+          <w:sz w:val="20"/>
+          <w:szCs w:val="20"/>
+          <w:rtl/>
+          <w:lang w:val="en-US" w:bidi="he-IL"/>
+        </w:rPr>
+        <w:t xml:space="preserve">דוד שטרן, "תפקידו של המשל בספרות חז"ל", </w:t>
+      </w:r>
+      <w:r>
+        <w:rPr>
+          <w:rFonts w:ascii="Times New Roman" w:cs="David" w:eastAsia="David" w:hAnsi="Times New Roman"/>
+          <w:i/>
+          <w:iCs/>
+          <w:noProof/>
+          <w:sz w:val="20"/>
+          <w:szCs w:val="20"/>
+          <w:rtl/>
+          <w:lang w:val="en-US" w:bidi="he-IL"/>
+        </w:rPr>
+        <w:t xml:space="preserve">מחקרי ירושלים בספרות עברית</w:t>
+      </w:r>
+      <w:r>
+        <w:rPr>
+          <w:rFonts w:ascii="Times New Roman" w:cs="David" w:eastAsia="David" w:hAnsi="Times New Roman"/>
+          <w:i w:val="false"/>
+          <w:iCs w:val="false"/>
+          <w:noProof/>
+          <w:sz w:val="20"/>
+          <w:szCs w:val="20"/>
+          <w:rtl/>
+          <w:lang w:val="en-US" w:bidi="he-IL"/>
+        </w:rPr>
+        <w:t xml:space="preserve"> ז (תשמ"ה), עמ' 90-102, בייחוד עמ' 97.</w:t>
+      </w:r>
+    </w:p>
+  </w:footnote>
+  <w:footnote w:id="8">
     <w:p>
       <w:pPr>
         <w:bidi w:val="false"/>
@@ -8817,7 +9059,7 @@
           <w:rtl w:val="false"/>
           <w:lang w:val="en-US" w:bidi="he-IL"/>
         </w:rPr>
-        <w:t xml:space="preserve">Stith Thompson, </w:t>
+        <w:t xml:space="preserve">David Stern, "Rhetoric and Midrash: The Case of the Mashal," </w:t>
       </w:r>
       <w:r>
         <w:rPr>
@@ -8830,7 +9072,7 @@
           <w:rtl w:val="false"/>
           <w:lang w:val="en-US" w:bidi="he-IL"/>
         </w:rPr>
-        <w:t xml:space="preserve">Motif-Index of Folk-Literature</w:t>
+        <w:t xml:space="preserve">Prooftexts</w:t>
       </w:r>
       <w:r>
         <w:rPr>
@@ -8843,160 +9085,11 @@
           <w:rtl w:val="false"/>
           <w:lang w:val="en-US" w:bidi="he-IL"/>
         </w:rPr>
-        <w:t xml:space="preserve">, 6 vols., Bloomington: Indiana University Press, 1955-1958, motifs J951.1, J2413.1, L315 [</w:t>
-      </w:r>
-      <w:r>
-        <w:rPr>
-          <w:rFonts w:ascii="Times New Roman" w:cs="David" w:eastAsia="David" w:hAnsi="Times New Roman"/>
-          <w:i w:val="false"/>
-          <w:iCs w:val="false"/>
-          <w:noProof/>
-          <w:sz w:val="20"/>
-          <w:szCs w:val="20"/>
-          <w:rtl/>
-          <w:lang w:val="en-US" w:bidi="he-IL"/>
-        </w:rPr>
-        <w:t xml:space="preserve">לוודא מספרים].</w:t>
+        <w:t xml:space="preserve"> 1, no. 3 (1981): 261-291.</w:t>
       </w:r>
     </w:p>
   </w:footnote>
-  <w:footnote w:id="11">
-    <w:p>
-      <w:pPr>
-        <w:bidi/>
-        <w:spacing w:after="60" w:line="240"/>
-        <w:jc w:val="both"/>
-      </w:pPr>
-      <w:r>
-        <w:rPr>
-          <w:rStyle w:val="FootnoteReference"/>
-        </w:rPr>
-        <w:footnoteRef/>
-      </w:r>
-      <w:r>
-        <w:rPr>
-          <w:rFonts w:ascii="Times New Roman" w:cs="David" w:eastAsia="David" w:hAnsi="Times New Roman"/>
-          <w:i w:val="false"/>
-          <w:iCs w:val="false"/>
-          <w:noProof/>
-          <w:sz w:val="20"/>
-          <w:szCs w:val="20"/>
-          <w:rtl/>
-          <w:lang w:val="en-US" w:bidi="he-IL"/>
-        </w:rPr>
-        <w:t xml:space="preserve">שורצבוים, "טיפוסים פולקלוריים", עמ' 35, שם מובא הסיפור לפי הנוסח העברי של רבי יעקב בן אלעזר ומהדורת דרנבורג.</w:t>
-      </w:r>
-    </w:p>
-  </w:footnote>
-  <w:footnote w:id="12">
-    <w:p>
-      <w:pPr>
-        <w:bidi/>
-        <w:spacing w:after="60" w:line="240"/>
-        <w:jc w:val="both"/>
-      </w:pPr>
-      <w:r>
-        <w:rPr>
-          <w:rStyle w:val="FootnoteReference"/>
-        </w:rPr>
-        <w:footnoteRef/>
-      </w:r>
-      <w:r>
-        <w:rPr>
-          <w:rFonts w:ascii="Times New Roman" w:cs="David" w:eastAsia="David" w:hAnsi="Times New Roman"/>
-          <w:i/>
-          <w:iCs/>
-          <w:noProof/>
-          <w:sz w:val="20"/>
-          <w:szCs w:val="20"/>
-          <w:rtl/>
-          <w:lang w:val="en-US" w:bidi="he-IL"/>
-        </w:rPr>
-        <w:t xml:space="preserve">אלף לילה ולילה</w:t>
-      </w:r>
-      <w:r>
-        <w:rPr>
-          <w:rFonts w:ascii="Times New Roman" w:cs="David" w:eastAsia="David" w:hAnsi="Times New Roman"/>
-          <w:i w:val="false"/>
-          <w:iCs w:val="false"/>
-          <w:noProof/>
-          <w:sz w:val="20"/>
-          <w:szCs w:val="20"/>
-          <w:rtl/>
-          <w:lang w:val="en-US" w:bidi="he-IL"/>
-        </w:rPr>
-        <w:t xml:space="preserve">, תרגם מערבית יוסף יואל ריבלין, כרך א, תל אביב: קרית ספר, תש"ז, סיפור המסגרת.</w:t>
-      </w:r>
-    </w:p>
-  </w:footnote>
-  <w:footnote w:id="13">
-    <w:p>
-      <w:pPr>
-        <w:bidi/>
-        <w:spacing w:after="60" w:line="240"/>
-        <w:jc w:val="both"/>
-      </w:pPr>
-      <w:r>
-        <w:rPr>
-          <w:rStyle w:val="FootnoteReference"/>
-        </w:rPr>
-        <w:footnoteRef/>
-      </w:r>
-      <w:r>
-        <w:rPr>
-          <w:rFonts w:ascii="Times New Roman" w:cs="David" w:eastAsia="David" w:hAnsi="Times New Roman"/>
-          <w:i w:val="false"/>
-          <w:iCs w:val="false"/>
-          <w:noProof/>
-          <w:sz w:val="20"/>
-          <w:szCs w:val="20"/>
-          <w:rtl/>
-          <w:lang w:val="en-US" w:bidi="he-IL"/>
-        </w:rPr>
-        <w:t xml:space="preserve">המקבילה אצל מארי דה פראנס, משל 15, מובאת אצל </w:t>
-      </w:r>
-      <w:r>
-        <w:rPr>
-          <w:rFonts w:ascii="Times New Roman" w:cs="David" w:eastAsia="David" w:hAnsi="Times New Roman"/>
-          <w:i w:val="false"/>
-          <w:iCs w:val="false"/>
-          <w:noProof/>
-          <w:sz w:val="20"/>
-          <w:szCs w:val="20"/>
-          <w:rtl w:val="false"/>
-          <w:lang w:val="en-US" w:bidi="he-IL"/>
-        </w:rPr>
-        <w:t xml:space="preserve">Schwarzbaum, </w:t>
-      </w:r>
-      <w:r>
-        <w:rPr>
-          <w:rFonts w:ascii="Times New Roman" w:cs="David" w:eastAsia="David" w:hAnsi="Times New Roman"/>
-          <w:i/>
-          <w:iCs/>
-          <w:noProof/>
-          <w:sz w:val="20"/>
-          <w:szCs w:val="20"/>
-          <w:rtl w:val="false"/>
-          <w:lang w:val="en-US" w:bidi="he-IL"/>
-        </w:rPr>
-        <w:t xml:space="preserve">Mishle Shu'alim</w:t>
-      </w:r>
-      <w:r>
-        <w:rPr>
-          <w:rFonts w:ascii="Times New Roman" w:cs="David" w:eastAsia="David" w:hAnsi="Times New Roman"/>
-          <w:i w:val="false"/>
-          <w:iCs w:val="false"/>
-          <w:noProof/>
-          <w:sz w:val="20"/>
-          <w:szCs w:val="20"/>
-          <w:rtl/>
-          <w:lang w:val="en-US" w:bidi="he-IL"/>
-        </w:rPr>
-        <w:t xml:space="preserve">, בדיון על משל יד [לוודא].</w:t>
-      </w:r>
-    </w:p>
-  </w:footnote>
-  <w:footnote w:id="14">
+  <w:footnote w:id="9">
     <w:p>
       <w:pPr>
         <w:bidi w:val="false"/>
@@ -9020,7 +9113,7 @@
           <w:rtl w:val="false"/>
           <w:lang w:val="en-US" w:bidi="he-IL"/>
         </w:rPr>
-        <w:t xml:space="preserve">J. K. Elliott, </w:t>
+        <w:t xml:space="preserve">Eric Lawee, "The Sins of the Fauna in Midrash, Rashi, and Their Medieval Interlocutors," </w:t>
       </w:r>
       <w:r>
         <w:rPr>
@@ -9033,7 +9126,7 @@
           <w:rtl w:val="false"/>
           <w:lang w:val="en-US" w:bidi="he-IL"/>
         </w:rPr>
-        <w:t xml:space="preserve">The Apocryphal New Testament</w:t>
+        <w:t xml:space="preserve">Jewish Studies Quarterly</w:t>
       </w:r>
       <w:r>
         <w:rPr>
@@ -9046,11 +9139,11 @@
           <w:rtl w:val="false"/>
           <w:lang w:val="en-US" w:bidi="he-IL"/>
         </w:rPr>
-        <w:t xml:space="preserve">, Oxford: Clarendon Press, 1993, Gospel of Pseudo-Matthew, ch. 14.</w:t>
+        <w:t xml:space="preserve"> 17, no. 1 (2010): 56-98.</w:t>
       </w:r>
     </w:p>
   </w:footnote>
-  <w:footnote w:id="15">
+  <w:footnote w:id="10">
     <w:p>
       <w:pPr>
         <w:bidi/>
@@ -9062,6 +9155,32 @@
           <w:rStyle w:val="FootnoteReference"/>
         </w:rPr>
         <w:footnoteRef/>
+      </w:r>
+      <w:r>
+        <w:rPr>
+          <w:rFonts w:ascii="Times New Roman" w:cs="David" w:eastAsia="David" w:hAnsi="Times New Roman"/>
+          <w:i w:val="false"/>
+          <w:iCs w:val="false"/>
+          <w:noProof/>
+          <w:sz w:val="20"/>
+          <w:szCs w:val="20"/>
+          <w:rtl/>
+          <w:lang w:val="en-US" w:bidi="he-IL"/>
+        </w:rPr>
+        <w:t xml:space="preserve">מספרי פרי, המפתח המקובל למשלי איזופוס, מובאים כפי שהם רשומים אצל </w:t>
+      </w:r>
+      <w:r>
+        <w:rPr>
+          <w:rFonts w:ascii="Times New Roman" w:cs="David" w:eastAsia="David" w:hAnsi="Times New Roman"/>
+          <w:i w:val="false"/>
+          <w:iCs w:val="false"/>
+          <w:noProof/>
+          <w:sz w:val="20"/>
+          <w:szCs w:val="20"/>
+          <w:rtl w:val="false"/>
+          <w:lang w:val="en-US" w:bidi="he-IL"/>
+        </w:rPr>
+        <w:t xml:space="preserve">Haim Schwarzbaum, </w:t>
       </w:r>
       <w:r>
         <w:rPr>
@@ -9071,51 +9190,36 @@
           <w:noProof/>
           <w:sz w:val="20"/>
           <w:szCs w:val="20"/>
-          <w:rtl/>
-          <w:lang w:val="en-US" w:bidi="he-IL"/>
-        </w:rPr>
-        <w:t xml:space="preserve">הקוראן</w:t>
-      </w:r>
-      <w:r>
-        <w:rPr>
-          <w:rFonts w:ascii="Times New Roman" w:cs="David" w:eastAsia="David" w:hAnsi="Times New Roman"/>
-          <w:i w:val="false"/>
-          <w:iCs w:val="false"/>
-          <w:noProof/>
-          <w:sz w:val="20"/>
-          <w:szCs w:val="20"/>
-          <w:rtl/>
-          <w:lang w:val="en-US" w:bidi="he-IL"/>
-        </w:rPr>
-        <w:t xml:space="preserve">, תרגם מערבית אורי רובין, תל אביב: אוניברסיטת תל אביב, 2005, סורות 31, 62, 74. ההקשר הרביעי הוא סורה 2, פסוק 259, על האיש שחמורו הוחיה לאחר מאה שנה.</w:t>
-      </w:r>
-    </w:p>
-  </w:footnote>
-  <w:footnote w:id="16">
-    <w:p>
-      <w:pPr>
-        <w:bidi/>
-        <w:spacing w:after="60" w:line="240"/>
-        <w:jc w:val="both"/>
-      </w:pPr>
-      <w:r>
-        <w:rPr>
-          <w:rStyle w:val="FootnoteReference"/>
-        </w:rPr>
-        <w:footnoteRef/>
-      </w:r>
-      <w:r>
-        <w:rPr>
-          <w:rFonts w:ascii="Times New Roman" w:cs="David" w:eastAsia="David" w:hAnsi="Times New Roman"/>
-          <w:i w:val="false"/>
-          <w:iCs w:val="false"/>
-          <w:noProof/>
-          <w:sz w:val="20"/>
-          <w:szCs w:val="20"/>
-          <w:rtl/>
-          <w:lang w:val="en-US" w:bidi="he-IL"/>
-        </w:rPr>
-        <w:t xml:space="preserve">את גלגולו של הביטוי בספרות העברית של ימי הביניים יש לבדוק; ראו לפי שעה יסיף, </w:t>
+          <w:rtl w:val="false"/>
+          <w:lang w:val="en-US" w:bidi="he-IL"/>
+        </w:rPr>
+        <w:t xml:space="preserve">The Mishle Shu'alim (Fox Fables) of Rabbi Berechiah ha-Nakdan: A Study in Comparative Folklore and Fable Lore</w:t>
+      </w:r>
+      <w:r>
+        <w:rPr>
+          <w:rFonts w:ascii="Times New Roman" w:cs="David" w:eastAsia="David" w:hAnsi="Times New Roman"/>
+          <w:i w:val="false"/>
+          <w:iCs w:val="false"/>
+          <w:noProof/>
+          <w:sz w:val="20"/>
+          <w:szCs w:val="20"/>
+          <w:rtl w:val="false"/>
+          <w:lang w:val="en-US" w:bidi="he-IL"/>
+        </w:rPr>
+        <w:t xml:space="preserve">, Kiron: Institute for Jewish and Arab Folklore Research, 1979, </w:t>
+      </w:r>
+      <w:r>
+        <w:rPr>
+          <w:rFonts w:ascii="Times New Roman" w:cs="David" w:eastAsia="David" w:hAnsi="Times New Roman"/>
+          <w:i w:val="false"/>
+          <w:iCs w:val="false"/>
+          <w:noProof/>
+          <w:sz w:val="20"/>
+          <w:szCs w:val="20"/>
+          <w:rtl/>
+          <w:lang w:val="en-US" w:bidi="he-IL"/>
+        </w:rPr>
+        <w:t xml:space="preserve">בדיון על כל משל. תרגום עברי: איסופוס, </w:t>
       </w:r>
       <w:r>
         <w:rPr>
@@ -9128,24 +9232,24 @@
           <w:rtl/>
           <w:lang w:val="en-US" w:bidi="he-IL"/>
         </w:rPr>
-        <w:t xml:space="preserve">סיפור העם העברי</w:t>
-      </w:r>
-      <w:r>
-        <w:rPr>
-          <w:rFonts w:ascii="Times New Roman" w:cs="David" w:eastAsia="David" w:hAnsi="Times New Roman"/>
-          <w:i w:val="false"/>
-          <w:iCs w:val="false"/>
-          <w:noProof/>
-          <w:sz w:val="20"/>
-          <w:szCs w:val="20"/>
-          <w:rtl/>
-          <w:lang w:val="en-US" w:bidi="he-IL"/>
-        </w:rPr>
-        <w:t xml:space="preserve">, במפתח בערך "חמור" [לוודא].</w:t>
+        <w:t xml:space="preserve">משלי איסופוס</w:t>
+      </w:r>
+      <w:r>
+        <w:rPr>
+          <w:rFonts w:ascii="Times New Roman" w:cs="David" w:eastAsia="David" w:hAnsi="Times New Roman"/>
+          <w:i w:val="false"/>
+          <w:iCs w:val="false"/>
+          <w:noProof/>
+          <w:sz w:val="20"/>
+          <w:szCs w:val="20"/>
+          <w:rtl/>
+          <w:lang w:val="en-US" w:bidi="he-IL"/>
+        </w:rPr>
+        <w:t xml:space="preserve">, תרגם שלמה שפאן, ירושלים: מוסד ביאליק, תש"ך.</w:t>
       </w:r>
     </w:p>
   </w:footnote>
-  <w:footnote w:id="17">
+  <w:footnote w:id="11">
     <w:p>
       <w:pPr>
         <w:bidi w:val="false"/>
@@ -9169,7 +9273,7 @@
           <w:rtl w:val="false"/>
           <w:lang w:val="en-US" w:bidi="he-IL"/>
         </w:rPr>
-        <w:t xml:space="preserve">Uther, </w:t>
+        <w:t xml:space="preserve">Schwarzbaum, </w:t>
       </w:r>
       <w:r>
         <w:rPr>
@@ -9182,24 +9286,78 @@
           <w:rtl w:val="false"/>
           <w:lang w:val="en-US" w:bidi="he-IL"/>
         </w:rPr>
-        <w:t xml:space="preserve">Types of International Folktales</w:t>
-      </w:r>
-      <w:r>
-        <w:rPr>
-          <w:rFonts w:ascii="Times New Roman" w:cs="David" w:eastAsia="David" w:hAnsi="Times New Roman"/>
-          <w:i w:val="false"/>
-          <w:iCs w:val="false"/>
-          <w:noProof/>
-          <w:sz w:val="20"/>
-          <w:szCs w:val="20"/>
-          <w:rtl w:val="false"/>
-          <w:lang w:val="en-US" w:bidi="he-IL"/>
-        </w:rPr>
-        <w:t xml:space="preserve">, no. 130.</w:t>
+        <w:t xml:space="preserve">Mishle Shu'alim</w:t>
+      </w:r>
+      <w:r>
+        <w:rPr>
+          <w:rFonts w:ascii="Times New Roman" w:cs="David" w:eastAsia="David" w:hAnsi="Times New Roman"/>
+          <w:i w:val="false"/>
+          <w:iCs w:val="false"/>
+          <w:noProof/>
+          <w:sz w:val="20"/>
+          <w:szCs w:val="20"/>
+          <w:rtl/>
+          <w:lang w:val="en-US" w:bidi="he-IL"/>
+        </w:rPr>
+        <w:t xml:space="preserve">, בדיון על משלים יד ו-מז [לוודא עמודים]; וכן חיים שורצבוים, "טיפוסים פולקלוריים ומוטיבים עממיים בספר משלי שועלים לרבי ברכיה הנקדן", </w:t>
+      </w:r>
+      <w:r>
+        <w:rPr>
+          <w:rFonts w:ascii="Times New Roman" w:cs="David" w:eastAsia="David" w:hAnsi="Times New Roman"/>
+          <w:i/>
+          <w:iCs/>
+          <w:noProof/>
+          <w:sz w:val="20"/>
+          <w:szCs w:val="20"/>
+          <w:rtl/>
+          <w:lang w:val="en-US" w:bidi="he-IL"/>
+        </w:rPr>
+        <w:t xml:space="preserve">דברי הקונגרס העולמי הרביעי למדעי היהדות</w:t>
+      </w:r>
+      <w:r>
+        <w:rPr>
+          <w:rFonts w:ascii="Times New Roman" w:cs="David" w:eastAsia="David" w:hAnsi="Times New Roman"/>
+          <w:i w:val="false"/>
+          <w:iCs w:val="false"/>
+          <w:noProof/>
+          <w:sz w:val="20"/>
+          <w:szCs w:val="20"/>
+          <w:rtl/>
+          <w:lang w:val="en-US" w:bidi="he-IL"/>
+        </w:rPr>
+        <w:t xml:space="preserve">, כרך ב, ירושלים: האיגוד העולמי למדעי היהדות, תשכ"ה, עמ' 33-36.</w:t>
       </w:r>
     </w:p>
   </w:footnote>
-  <w:footnote w:id="18">
+  <w:footnote w:id="12">
+    <w:p>
+      <w:pPr>
+        <w:bidi/>
+        <w:spacing w:after="60" w:line="240"/>
+        <w:jc w:val="both"/>
+      </w:pPr>
+      <w:r>
+        <w:rPr>
+          <w:rStyle w:val="FootnoteReference"/>
+        </w:rPr>
+        <w:footnoteRef/>
+      </w:r>
+      <w:r>
+        <w:rPr>
+          <w:rFonts w:ascii="Times New Roman" w:cs="David" w:eastAsia="David" w:hAnsi="Times New Roman"/>
+          <w:i w:val="false"/>
+          <w:iCs w:val="false"/>
+          <w:noProof/>
+          <w:sz w:val="20"/>
+          <w:szCs w:val="20"/>
+          <w:rtl/>
+          <w:lang w:val="en-US" w:bidi="he-IL"/>
+        </w:rPr>
+        <w:t xml:space="preserve">שורצבוים, "טיפוסים פולקלוריים", עמ' 33-34.</w:t>
+      </w:r>
+    </w:p>
+  </w:footnote>
+  <w:footnote w:id="13">
     <w:p>
       <w:pPr>
         <w:bidi w:val="false"/>
@@ -9223,7 +9381,7 @@
           <w:rtl w:val="false"/>
           <w:lang w:val="en-US" w:bidi="he-IL"/>
         </w:rPr>
-        <w:t xml:space="preserve">Hadas, </w:t>
+        <w:t xml:space="preserve">Hans-Jörg Uther, </w:t>
       </w:r>
       <w:r>
         <w:rPr>
@@ -9236,7 +9394,7 @@
           <w:rtl w:val="false"/>
           <w:lang w:val="en-US" w:bidi="he-IL"/>
         </w:rPr>
-        <w:t xml:space="preserve">Fables of a Jewish Aesop</w:t>
+        <w:t xml:space="preserve">The Types of International Folktales: A Classification and Bibliography</w:t>
       </w:r>
       <w:r>
         <w:rPr>
@@ -9249,37 +9407,11 @@
           <w:rtl w:val="false"/>
           <w:lang w:val="en-US" w:bidi="he-IL"/>
         </w:rPr>
-        <w:t xml:space="preserve">, Introduction; Schwarzbaum, </w:t>
-      </w:r>
-      <w:r>
-        <w:rPr>
-          <w:rFonts w:ascii="Times New Roman" w:cs="David" w:eastAsia="David" w:hAnsi="Times New Roman"/>
-          <w:i/>
-          <w:iCs/>
-          <w:noProof/>
-          <w:sz w:val="20"/>
-          <w:szCs w:val="20"/>
-          <w:rtl w:val="false"/>
-          <w:lang w:val="en-US" w:bidi="he-IL"/>
-        </w:rPr>
-        <w:t xml:space="preserve">Mishle Shu'alim</w:t>
-      </w:r>
-      <w:r>
-        <w:rPr>
-          <w:rFonts w:ascii="Times New Roman" w:cs="David" w:eastAsia="David" w:hAnsi="Times New Roman"/>
-          <w:i w:val="false"/>
-          <w:iCs w:val="false"/>
-          <w:noProof/>
-          <w:sz w:val="20"/>
-          <w:szCs w:val="20"/>
-          <w:rtl w:val="false"/>
-          <w:lang w:val="en-US" w:bidi="he-IL"/>
-        </w:rPr>
-        <w:t xml:space="preserve">, Introduction.</w:t>
+        <w:t xml:space="preserve">, FF Communications 284-286, Helsinki: Academia Scientiarum Fennica, 2004, vol. 1, nos. 214, 214B.</w:t>
       </w:r>
     </w:p>
   </w:footnote>
-  <w:footnote w:id="19">
+  <w:footnote w:id="14">
     <w:p>
       <w:pPr>
         <w:bidi w:val="false"/>
@@ -9303,7 +9435,7 @@
           <w:rtl w:val="false"/>
           <w:lang w:val="en-US" w:bidi="he-IL"/>
         </w:rPr>
-        <w:t xml:space="preserve">Hadas, </w:t>
+        <w:t xml:space="preserve">Stith Thompson, </w:t>
       </w:r>
       <w:r>
         <w:rPr>
@@ -9316,7 +9448,7 @@
           <w:rtl w:val="false"/>
           <w:lang w:val="en-US" w:bidi="he-IL"/>
         </w:rPr>
-        <w:t xml:space="preserve">Fables of a Jewish Aesop</w:t>
+        <w:t xml:space="preserve">Motif-Index of Folk-Literature</w:t>
       </w:r>
       <w:r>
         <w:rPr>
@@ -9329,24 +9461,24 @@
           <w:rtl w:val="false"/>
           <w:lang w:val="en-US" w:bidi="he-IL"/>
         </w:rPr>
-        <w:t xml:space="preserve">, Introduction, pp. vii-xiv [</w:t>
-      </w:r>
-      <w:r>
-        <w:rPr>
-          <w:rFonts w:ascii="Times New Roman" w:cs="David" w:eastAsia="David" w:hAnsi="Times New Roman"/>
-          <w:i w:val="false"/>
-          <w:iCs w:val="false"/>
-          <w:noProof/>
-          <w:sz w:val="20"/>
-          <w:szCs w:val="20"/>
-          <w:rtl/>
-          <w:lang w:val="en-US" w:bidi="he-IL"/>
-        </w:rPr>
-        <w:t xml:space="preserve">לוודא עמודים].</w:t>
+        <w:t xml:space="preserve">, 6 vols., Bloomington: Indiana University Press, 1955-1958, motifs J951.1, J2413.1, L315 [</w:t>
+      </w:r>
+      <w:r>
+        <w:rPr>
+          <w:rFonts w:ascii="Times New Roman" w:cs="David" w:eastAsia="David" w:hAnsi="Times New Roman"/>
+          <w:i w:val="false"/>
+          <w:iCs w:val="false"/>
+          <w:noProof/>
+          <w:sz w:val="20"/>
+          <w:szCs w:val="20"/>
+          <w:rtl/>
+          <w:lang w:val="en-US" w:bidi="he-IL"/>
+        </w:rPr>
+        <w:t xml:space="preserve">לוודא מספרים].</w:t>
       </w:r>
     </w:p>
   </w:footnote>
-  <w:footnote w:id="20">
+  <w:footnote w:id="15">
     <w:p>
       <w:pPr>
         <w:bidi/>
@@ -9370,7 +9502,22 @@
           <w:rtl/>
           <w:lang w:val="en-US" w:bidi="he-IL"/>
         </w:rPr>
-        <w:t xml:space="preserve">עלי יסיף, "הסיפור האקסמפלארי בספר חסידים", </w:t>
+        <w:t xml:space="preserve">שורצבוים, "טיפוסים פולקלוריים", עמ' 35, שם מובא הסיפור לפי הנוסח העברי של רבי יעקב בן אלעזר ומהדורת דרנבורג.</w:t>
+      </w:r>
+    </w:p>
+  </w:footnote>
+  <w:footnote w:id="16">
+    <w:p>
+      <w:pPr>
+        <w:bidi/>
+        <w:spacing w:after="60" w:line="240"/>
+        <w:jc w:val="both"/>
+      </w:pPr>
+      <w:r>
+        <w:rPr>
+          <w:rStyle w:val="FootnoteReference"/>
+        </w:rPr>
+        <w:footnoteRef/>
       </w:r>
       <w:r>
         <w:rPr>
@@ -9383,24 +9530,91 @@
           <w:rtl/>
           <w:lang w:val="en-US" w:bidi="he-IL"/>
         </w:rPr>
-        <w:t xml:space="preserve">תרביץ</w:t>
-      </w:r>
-      <w:r>
-        <w:rPr>
-          <w:rFonts w:ascii="Times New Roman" w:cs="David" w:eastAsia="David" w:hAnsi="Times New Roman"/>
-          <w:i w:val="false"/>
-          <w:iCs w:val="false"/>
-          <w:noProof/>
-          <w:sz w:val="20"/>
-          <w:szCs w:val="20"/>
-          <w:rtl/>
-          <w:lang w:val="en-US" w:bidi="he-IL"/>
-        </w:rPr>
-        <w:t xml:space="preserve"> נז (תשמ"ח), עמ' 217-255, בעמ' 220-221.</w:t>
+        <w:t xml:space="preserve">אלף לילה ולילה</w:t>
+      </w:r>
+      <w:r>
+        <w:rPr>
+          <w:rFonts w:ascii="Times New Roman" w:cs="David" w:eastAsia="David" w:hAnsi="Times New Roman"/>
+          <w:i w:val="false"/>
+          <w:iCs w:val="false"/>
+          <w:noProof/>
+          <w:sz w:val="20"/>
+          <w:szCs w:val="20"/>
+          <w:rtl/>
+          <w:lang w:val="en-US" w:bidi="he-IL"/>
+        </w:rPr>
+        <w:t xml:space="preserve">, תרגם מערבית יוסף יואל ריבלין, כרך א, תל אביב: קרית ספר, תש"ז, סיפור המסגרת.</w:t>
       </w:r>
     </w:p>
   </w:footnote>
-  <w:footnote w:id="21">
+  <w:footnote w:id="17">
+    <w:p>
+      <w:pPr>
+        <w:bidi/>
+        <w:spacing w:after="60" w:line="240"/>
+        <w:jc w:val="both"/>
+      </w:pPr>
+      <w:r>
+        <w:rPr>
+          <w:rStyle w:val="FootnoteReference"/>
+        </w:rPr>
+        <w:footnoteRef/>
+      </w:r>
+      <w:r>
+        <w:rPr>
+          <w:rFonts w:ascii="Times New Roman" w:cs="David" w:eastAsia="David" w:hAnsi="Times New Roman"/>
+          <w:i w:val="false"/>
+          <w:iCs w:val="false"/>
+          <w:noProof/>
+          <w:sz w:val="20"/>
+          <w:szCs w:val="20"/>
+          <w:rtl/>
+          <w:lang w:val="en-US" w:bidi="he-IL"/>
+        </w:rPr>
+        <w:t xml:space="preserve">המקבילה אצל מארי דה פראנס, משל 15, מובאת אצל </w:t>
+      </w:r>
+      <w:r>
+        <w:rPr>
+          <w:rFonts w:ascii="Times New Roman" w:cs="David" w:eastAsia="David" w:hAnsi="Times New Roman"/>
+          <w:i w:val="false"/>
+          <w:iCs w:val="false"/>
+          <w:noProof/>
+          <w:sz w:val="20"/>
+          <w:szCs w:val="20"/>
+          <w:rtl w:val="false"/>
+          <w:lang w:val="en-US" w:bidi="he-IL"/>
+        </w:rPr>
+        <w:t xml:space="preserve">Schwarzbaum, </w:t>
+      </w:r>
+      <w:r>
+        <w:rPr>
+          <w:rFonts w:ascii="Times New Roman" w:cs="David" w:eastAsia="David" w:hAnsi="Times New Roman"/>
+          <w:i/>
+          <w:iCs/>
+          <w:noProof/>
+          <w:sz w:val="20"/>
+          <w:szCs w:val="20"/>
+          <w:rtl w:val="false"/>
+          <w:lang w:val="en-US" w:bidi="he-IL"/>
+        </w:rPr>
+        <w:t xml:space="preserve">Mishle Shu'alim</w:t>
+      </w:r>
+      <w:r>
+        <w:rPr>
+          <w:rFonts w:ascii="Times New Roman" w:cs="David" w:eastAsia="David" w:hAnsi="Times New Roman"/>
+          <w:i w:val="false"/>
+          <w:iCs w:val="false"/>
+          <w:noProof/>
+          <w:sz w:val="20"/>
+          <w:szCs w:val="20"/>
+          <w:rtl/>
+          <w:lang w:val="en-US" w:bidi="he-IL"/>
+        </w:rPr>
+        <w:t xml:space="preserve">, בדיון על משל יד [לוודא].</w:t>
+      </w:r>
+    </w:p>
+  </w:footnote>
+  <w:footnote w:id="18">
     <w:p>
       <w:pPr>
         <w:bidi w:val="false"/>
@@ -9424,7 +9638,7 @@
           <w:rtl w:val="false"/>
           <w:lang w:val="en-US" w:bidi="he-IL"/>
         </w:rPr>
-        <w:t xml:space="preserve">Berechiah ha-Nakdan, </w:t>
+        <w:t xml:space="preserve">J. K. Elliott, </w:t>
       </w:r>
       <w:r>
         <w:rPr>
@@ -9437,7 +9651,7 @@
           <w:rtl w:val="false"/>
           <w:lang w:val="en-US" w:bidi="he-IL"/>
         </w:rPr>
-        <w:t xml:space="preserve">Fables of a Jewish Aesop</w:t>
+        <w:t xml:space="preserve">The Apocryphal New Testament</w:t>
       </w:r>
       <w:r>
         <w:rPr>
@@ -9450,7 +9664,22 @@
           <w:rtl w:val="false"/>
           <w:lang w:val="en-US" w:bidi="he-IL"/>
         </w:rPr>
-        <w:t xml:space="preserve">, trans. Moses Hadas, New York: Columbia University Press, 1967; Schwarzbaum, </w:t>
+        <w:t xml:space="preserve">, Oxford: Clarendon Press, 1993, Gospel of Pseudo-Matthew, ch. 14.</w:t>
+      </w:r>
+    </w:p>
+  </w:footnote>
+  <w:footnote w:id="19">
+    <w:p>
+      <w:pPr>
+        <w:bidi/>
+        <w:spacing w:after="60" w:line="240"/>
+        <w:jc w:val="both"/>
+      </w:pPr>
+      <w:r>
+        <w:rPr>
+          <w:rStyle w:val="FootnoteReference"/>
+        </w:rPr>
+        <w:footnoteRef/>
       </w:r>
       <w:r>
         <w:rPr>
@@ -9460,27 +9689,81 @@
           <w:noProof/>
           <w:sz w:val="20"/>
           <w:szCs w:val="20"/>
-          <w:rtl w:val="false"/>
-          <w:lang w:val="en-US" w:bidi="he-IL"/>
-        </w:rPr>
-        <w:t xml:space="preserve">Mishle Shu'alim</w:t>
-      </w:r>
-      <w:r>
-        <w:rPr>
-          <w:rFonts w:ascii="Times New Roman" w:cs="David" w:eastAsia="David" w:hAnsi="Times New Roman"/>
-          <w:i w:val="false"/>
-          <w:iCs w:val="false"/>
-          <w:noProof/>
-          <w:sz w:val="20"/>
-          <w:szCs w:val="20"/>
-          <w:rtl/>
-          <w:lang w:val="en-US" w:bidi="he-IL"/>
-        </w:rPr>
-        <w:t xml:space="preserve">.</w:t>
+          <w:rtl/>
+          <w:lang w:val="en-US" w:bidi="he-IL"/>
+        </w:rPr>
+        <w:t xml:space="preserve">הקוראן</w:t>
+      </w:r>
+      <w:r>
+        <w:rPr>
+          <w:rFonts w:ascii="Times New Roman" w:cs="David" w:eastAsia="David" w:hAnsi="Times New Roman"/>
+          <w:i w:val="false"/>
+          <w:iCs w:val="false"/>
+          <w:noProof/>
+          <w:sz w:val="20"/>
+          <w:szCs w:val="20"/>
+          <w:rtl/>
+          <w:lang w:val="en-US" w:bidi="he-IL"/>
+        </w:rPr>
+        <w:t xml:space="preserve">, תרגם מערבית אורי רובין, תל אביב: אוניברסיטת תל אביב, 2005, סורות 31, 62, 74. ההקשר הרביעי הוא סורה 2, פסוק 259, על האיש שחמורו הוחיה לאחר מאה שנה.</w:t>
       </w:r>
     </w:p>
   </w:footnote>
-  <w:footnote w:id="22">
+  <w:footnote w:id="20">
+    <w:p>
+      <w:pPr>
+        <w:bidi/>
+        <w:spacing w:after="60" w:line="240"/>
+        <w:jc w:val="both"/>
+      </w:pPr>
+      <w:r>
+        <w:rPr>
+          <w:rStyle w:val="FootnoteReference"/>
+        </w:rPr>
+        <w:footnoteRef/>
+      </w:r>
+      <w:r>
+        <w:rPr>
+          <w:rFonts w:ascii="Times New Roman" w:cs="David" w:eastAsia="David" w:hAnsi="Times New Roman"/>
+          <w:i w:val="false"/>
+          <w:iCs w:val="false"/>
+          <w:noProof/>
+          <w:sz w:val="20"/>
+          <w:szCs w:val="20"/>
+          <w:rtl/>
+          <w:lang w:val="en-US" w:bidi="he-IL"/>
+        </w:rPr>
+        <w:t xml:space="preserve">את גלגולו של הביטוי בספרות העברית של ימי הביניים יש לבדוק; ראו לפי שעה יסיף, </w:t>
+      </w:r>
+      <w:r>
+        <w:rPr>
+          <w:rFonts w:ascii="Times New Roman" w:cs="David" w:eastAsia="David" w:hAnsi="Times New Roman"/>
+          <w:i/>
+          <w:iCs/>
+          <w:noProof/>
+          <w:sz w:val="20"/>
+          <w:szCs w:val="20"/>
+          <w:rtl/>
+          <w:lang w:val="en-US" w:bidi="he-IL"/>
+        </w:rPr>
+        <w:t xml:space="preserve">סיפור העם העברי</w:t>
+      </w:r>
+      <w:r>
+        <w:rPr>
+          <w:rFonts w:ascii="Times New Roman" w:cs="David" w:eastAsia="David" w:hAnsi="Times New Roman"/>
+          <w:i w:val="false"/>
+          <w:iCs w:val="false"/>
+          <w:noProof/>
+          <w:sz w:val="20"/>
+          <w:szCs w:val="20"/>
+          <w:rtl/>
+          <w:lang w:val="en-US" w:bidi="he-IL"/>
+        </w:rPr>
+        <w:t xml:space="preserve">, במפתח בערך "חמור" [לוודא].</w:t>
+      </w:r>
+    </w:p>
+  </w:footnote>
+  <w:footnote w:id="21">
     <w:p>
       <w:pPr>
         <w:bidi w:val="false"/>
@@ -9504,7 +9787,7 @@
           <w:rtl w:val="false"/>
           <w:lang w:val="en-US" w:bidi="he-IL"/>
         </w:rPr>
-        <w:t xml:space="preserve">Schwarzbaum, </w:t>
+        <w:t xml:space="preserve">Uther, </w:t>
       </w:r>
       <w:r>
         <w:rPr>
@@ -9517,6 +9800,86 @@
           <w:rtl w:val="false"/>
           <w:lang w:val="en-US" w:bidi="he-IL"/>
         </w:rPr>
+        <w:t xml:space="preserve">Types of International Folktales</w:t>
+      </w:r>
+      <w:r>
+        <w:rPr>
+          <w:rFonts w:ascii="Times New Roman" w:cs="David" w:eastAsia="David" w:hAnsi="Times New Roman"/>
+          <w:i w:val="false"/>
+          <w:iCs w:val="false"/>
+          <w:noProof/>
+          <w:sz w:val="20"/>
+          <w:szCs w:val="20"/>
+          <w:rtl w:val="false"/>
+          <w:lang w:val="en-US" w:bidi="he-IL"/>
+        </w:rPr>
+        <w:t xml:space="preserve">, no. 130.</w:t>
+      </w:r>
+    </w:p>
+  </w:footnote>
+  <w:footnote w:id="22">
+    <w:p>
+      <w:pPr>
+        <w:bidi w:val="false"/>
+        <w:spacing w:after="60" w:line="240"/>
+        <w:jc w:val="left"/>
+      </w:pPr>
+      <w:r>
+        <w:rPr>
+          <w:rStyle w:val="FootnoteReference"/>
+        </w:rPr>
+        <w:footnoteRef/>
+      </w:r>
+      <w:r>
+        <w:rPr>
+          <w:rFonts w:ascii="Times New Roman" w:cs="David" w:eastAsia="David" w:hAnsi="Times New Roman"/>
+          <w:i w:val="false"/>
+          <w:iCs w:val="false"/>
+          <w:noProof/>
+          <w:sz w:val="20"/>
+          <w:szCs w:val="20"/>
+          <w:rtl w:val="false"/>
+          <w:lang w:val="en-US" w:bidi="he-IL"/>
+        </w:rPr>
+        <w:t xml:space="preserve">Hadas, </w:t>
+      </w:r>
+      <w:r>
+        <w:rPr>
+          <w:rFonts w:ascii="Times New Roman" w:cs="David" w:eastAsia="David" w:hAnsi="Times New Roman"/>
+          <w:i/>
+          <w:iCs/>
+          <w:noProof/>
+          <w:sz w:val="20"/>
+          <w:szCs w:val="20"/>
+          <w:rtl w:val="false"/>
+          <w:lang w:val="en-US" w:bidi="he-IL"/>
+        </w:rPr>
+        <w:t xml:space="preserve">Fables of a Jewish Aesop</w:t>
+      </w:r>
+      <w:r>
+        <w:rPr>
+          <w:rFonts w:ascii="Times New Roman" w:cs="David" w:eastAsia="David" w:hAnsi="Times New Roman"/>
+          <w:i w:val="false"/>
+          <w:iCs w:val="false"/>
+          <w:noProof/>
+          <w:sz w:val="20"/>
+          <w:szCs w:val="20"/>
+          <w:rtl w:val="false"/>
+          <w:lang w:val="en-US" w:bidi="he-IL"/>
+        </w:rPr>
+        <w:t xml:space="preserve">, Introduction; Schwarzbaum, </w:t>
+      </w:r>
+      <w:r>
+        <w:rPr>
+          <w:rFonts w:ascii="Times New Roman" w:cs="David" w:eastAsia="David" w:hAnsi="Times New Roman"/>
+          <w:i/>
+          <w:iCs/>
+          <w:noProof/>
+          <w:sz w:val="20"/>
+          <w:szCs w:val="20"/>
+          <w:rtl w:val="false"/>
+          <w:lang w:val="en-US" w:bidi="he-IL"/>
+        </w:rPr>
         <w:t xml:space="preserve">Mishle Shu'alim</w:t>
       </w:r>
       <w:r>
@@ -9530,29 +9893,16 @@
           <w:rtl w:val="false"/>
           <w:lang w:val="en-US" w:bidi="he-IL"/>
         </w:rPr>
-        <w:t xml:space="preserve">, Introduction; </w:t>
-      </w:r>
-      <w:r>
-        <w:rPr>
-          <w:rFonts w:ascii="Times New Roman" w:cs="David" w:eastAsia="David" w:hAnsi="Times New Roman"/>
-          <w:i w:val="false"/>
-          <w:iCs w:val="false"/>
-          <w:noProof/>
-          <w:sz w:val="20"/>
-          <w:szCs w:val="20"/>
-          <w:rtl/>
-          <w:lang w:val="en-US" w:bidi="he-IL"/>
-        </w:rPr>
-        <w:t xml:space="preserve">שורצבוים, "טיפוסים פולקלוריים", עמ' 34-36.</w:t>
+        <w:t xml:space="preserve">, Introduction.</w:t>
       </w:r>
     </w:p>
   </w:footnote>
   <w:footnote w:id="23">
     <w:p>
       <w:pPr>
-        <w:bidi/>
+        <w:bidi w:val="false"/>
         <w:spacing w:after="60" w:line="240"/>
-        <w:jc w:val="both"/>
+        <w:jc w:val="left"/>
       </w:pPr>
       <w:r>
         <w:rPr>
@@ -9568,10 +9918,10 @@
           <w:noProof/>
           <w:sz w:val="20"/>
           <w:szCs w:val="20"/>
-          <w:rtl/>
-          <w:lang w:val="en-US" w:bidi="he-IL"/>
-        </w:rPr>
-        <w:t xml:space="preserve">דן פגיס, </w:t>
+          <w:rtl w:val="false"/>
+          <w:lang w:val="en-US" w:bidi="he-IL"/>
+        </w:rPr>
+        <w:t xml:space="preserve">Hadas, </w:t>
       </w:r>
       <w:r>
         <w:rPr>
@@ -9581,23 +9931,36 @@
           <w:noProof/>
           <w:sz w:val="20"/>
           <w:szCs w:val="20"/>
-          <w:rtl/>
-          <w:lang w:val="en-US" w:bidi="he-IL"/>
-        </w:rPr>
-        <w:t xml:space="preserve">חידוש ומסורת בשירת החול העברית: ספרד ואיטליה</w:t>
-      </w:r>
-      <w:r>
-        <w:rPr>
-          <w:rFonts w:ascii="Times New Roman" w:cs="David" w:eastAsia="David" w:hAnsi="Times New Roman"/>
-          <w:i w:val="false"/>
-          <w:iCs w:val="false"/>
-          <w:noProof/>
-          <w:sz w:val="20"/>
-          <w:szCs w:val="20"/>
-          <w:rtl/>
-          <w:lang w:val="en-US" w:bidi="he-IL"/>
-        </w:rPr>
-        <w:t xml:space="preserve">, ירושלים: כתר, 1976, עמ' 70-77 [לוודא עמודים].</w:t>
+          <w:rtl w:val="false"/>
+          <w:lang w:val="en-US" w:bidi="he-IL"/>
+        </w:rPr>
+        <w:t xml:space="preserve">Fables of a Jewish Aesop</w:t>
+      </w:r>
+      <w:r>
+        <w:rPr>
+          <w:rFonts w:ascii="Times New Roman" w:cs="David" w:eastAsia="David" w:hAnsi="Times New Roman"/>
+          <w:i w:val="false"/>
+          <w:iCs w:val="false"/>
+          <w:noProof/>
+          <w:sz w:val="20"/>
+          <w:szCs w:val="20"/>
+          <w:rtl w:val="false"/>
+          <w:lang w:val="en-US" w:bidi="he-IL"/>
+        </w:rPr>
+        <w:t xml:space="preserve">, Introduction, pp. vii-xiv [</w:t>
+      </w:r>
+      <w:r>
+        <w:rPr>
+          <w:rFonts w:ascii="Times New Roman" w:cs="David" w:eastAsia="David" w:hAnsi="Times New Roman"/>
+          <w:i w:val="false"/>
+          <w:iCs w:val="false"/>
+          <w:noProof/>
+          <w:sz w:val="20"/>
+          <w:szCs w:val="20"/>
+          <w:rtl/>
+          <w:lang w:val="en-US" w:bidi="he-IL"/>
+        </w:rPr>
+        <w:t xml:space="preserve">לוודא עמודים].</w:t>
       </w:r>
     </w:p>
   </w:footnote>
@@ -9625,7 +9988,7 @@
           <w:rtl/>
           <w:lang w:val="en-US" w:bidi="he-IL"/>
         </w:rPr>
-        <w:t xml:space="preserve">ענת שפירא, "המשל הנרטיבי-ספרותי ב'סדר אליהו' לאור המשל הדרשני בספרות חז"ל", </w:t>
+        <w:t xml:space="preserve">עלי יסיף, "הסיפור האקסמפלארי בספר חסידים", </w:t>
       </w:r>
       <w:r>
         <w:rPr>
@@ -9638,20 +10001,48 @@
           <w:rtl/>
           <w:lang w:val="en-US" w:bidi="he-IL"/>
         </w:rPr>
-        <w:t xml:space="preserve">מרקמים: תרבות, ספרות, פולקלור, לגלית חזן-רוקם</w:t>
-      </w:r>
-      <w:r>
-        <w:rPr>
-          <w:rFonts w:ascii="Times New Roman" w:cs="David" w:eastAsia="David" w:hAnsi="Times New Roman"/>
-          <w:i w:val="false"/>
-          <w:iCs w:val="false"/>
-          <w:noProof/>
-          <w:sz w:val="20"/>
-          <w:szCs w:val="20"/>
-          <w:rtl/>
-          <w:lang w:val="en-US" w:bidi="he-IL"/>
-        </w:rPr>
-        <w:t xml:space="preserve">, כרך א (= </w:t>
+        <w:t xml:space="preserve">תרביץ</w:t>
+      </w:r>
+      <w:r>
+        <w:rPr>
+          <w:rFonts w:ascii="Times New Roman" w:cs="David" w:eastAsia="David" w:hAnsi="Times New Roman"/>
+          <w:i w:val="false"/>
+          <w:iCs w:val="false"/>
+          <w:noProof/>
+          <w:sz w:val="20"/>
+          <w:szCs w:val="20"/>
+          <w:rtl/>
+          <w:lang w:val="en-US" w:bidi="he-IL"/>
+        </w:rPr>
+        <w:t xml:space="preserve"> נז (תשמ"ח), עמ' 217-255, בעמ' 220-221.</w:t>
+      </w:r>
+    </w:p>
+  </w:footnote>
+  <w:footnote w:id="25">
+    <w:p>
+      <w:pPr>
+        <w:bidi w:val="false"/>
+        <w:spacing w:after="60" w:line="240"/>
+        <w:jc w:val="left"/>
+      </w:pPr>
+      <w:r>
+        <w:rPr>
+          <w:rStyle w:val="FootnoteReference"/>
+        </w:rPr>
+        <w:footnoteRef/>
+      </w:r>
+      <w:r>
+        <w:rPr>
+          <w:rFonts w:ascii="Times New Roman" w:cs="David" w:eastAsia="David" w:hAnsi="Times New Roman"/>
+          <w:i w:val="false"/>
+          <w:iCs w:val="false"/>
+          <w:noProof/>
+          <w:sz w:val="20"/>
+          <w:szCs w:val="20"/>
+          <w:rtl w:val="false"/>
+          <w:lang w:val="en-US" w:bidi="he-IL"/>
+        </w:rPr>
+        <w:t xml:space="preserve">Berechiah ha-Nakdan, </w:t>
       </w:r>
       <w:r>
         <w:rPr>
@@ -9661,51 +10052,23 @@
           <w:noProof/>
           <w:sz w:val="20"/>
           <w:szCs w:val="20"/>
-          <w:rtl/>
-          <w:lang w:val="en-US" w:bidi="he-IL"/>
-        </w:rPr>
-        <w:t xml:space="preserve">מחקרי ירושלים בספרות עברית</w:t>
-      </w:r>
-      <w:r>
-        <w:rPr>
-          <w:rFonts w:ascii="Times New Roman" w:cs="David" w:eastAsia="David" w:hAnsi="Times New Roman"/>
-          <w:i w:val="false"/>
-          <w:iCs w:val="false"/>
-          <w:noProof/>
-          <w:sz w:val="20"/>
-          <w:szCs w:val="20"/>
-          <w:rtl/>
-          <w:lang w:val="en-US" w:bidi="he-IL"/>
-        </w:rPr>
-        <w:t xml:space="preserve"> כה), ירושלים: המכון למדעי היהדות ע"ש מנדל, תשע"ג, עמ' 133-151, בעמ' 133-135, 150.</w:t>
-      </w:r>
-    </w:p>
-  </w:footnote>
-  <w:footnote w:id="25">
-    <w:p>
-      <w:pPr>
-        <w:bidi/>
-        <w:spacing w:after="60" w:line="240"/>
-        <w:jc w:val="both"/>
-      </w:pPr>
-      <w:r>
-        <w:rPr>
-          <w:rStyle w:val="FootnoteReference"/>
-        </w:rPr>
-        <w:footnoteRef/>
-      </w:r>
-      <w:r>
-        <w:rPr>
-          <w:rFonts w:ascii="Times New Roman" w:cs="David" w:eastAsia="David" w:hAnsi="Times New Roman"/>
-          <w:i w:val="false"/>
-          <w:iCs w:val="false"/>
-          <w:noProof/>
-          <w:sz w:val="20"/>
-          <w:szCs w:val="20"/>
-          <w:rtl/>
-          <w:lang w:val="en-US" w:bidi="he-IL"/>
-        </w:rPr>
-        <w:t xml:space="preserve">ברכיה הנקדן, </w:t>
+          <w:rtl w:val="false"/>
+          <w:lang w:val="en-US" w:bidi="he-IL"/>
+        </w:rPr>
+        <w:t xml:space="preserve">Fables of a Jewish Aesop</w:t>
+      </w:r>
+      <w:r>
+        <w:rPr>
+          <w:rFonts w:ascii="Times New Roman" w:cs="David" w:eastAsia="David" w:hAnsi="Times New Roman"/>
+          <w:i w:val="false"/>
+          <w:iCs w:val="false"/>
+          <w:noProof/>
+          <w:sz w:val="20"/>
+          <w:szCs w:val="20"/>
+          <w:rtl w:val="false"/>
+          <w:lang w:val="en-US" w:bidi="he-IL"/>
+        </w:rPr>
+        <w:t xml:space="preserve">, trans. Moses Hadas, New York: Columbia University Press, 1967; Schwarzbaum, </w:t>
       </w:r>
       <w:r>
         <w:rPr>
@@ -9715,32 +10078,32 @@
           <w:noProof/>
           <w:sz w:val="20"/>
           <w:szCs w:val="20"/>
-          <w:rtl/>
-          <w:lang w:val="en-US" w:bidi="he-IL"/>
-        </w:rPr>
-        <w:t xml:space="preserve">משלי שועלים</w:t>
-      </w:r>
-      <w:r>
-        <w:rPr>
-          <w:rFonts w:ascii="Times New Roman" w:cs="David" w:eastAsia="David" w:hAnsi="Times New Roman"/>
-          <w:i w:val="false"/>
-          <w:iCs w:val="false"/>
-          <w:noProof/>
-          <w:sz w:val="20"/>
-          <w:szCs w:val="20"/>
-          <w:rtl/>
-          <w:lang w:val="en-US" w:bidi="he-IL"/>
-        </w:rPr>
-        <w:t xml:space="preserve">, הקדמת המחבר, מהדורת הברמן [לוודא עמודים וציטוט מדויק].</w:t>
+          <w:rtl w:val="false"/>
+          <w:lang w:val="en-US" w:bidi="he-IL"/>
+        </w:rPr>
+        <w:t xml:space="preserve">Mishle Shu'alim</w:t>
+      </w:r>
+      <w:r>
+        <w:rPr>
+          <w:rFonts w:ascii="Times New Roman" w:cs="David" w:eastAsia="David" w:hAnsi="Times New Roman"/>
+          <w:i w:val="false"/>
+          <w:iCs w:val="false"/>
+          <w:noProof/>
+          <w:sz w:val="20"/>
+          <w:szCs w:val="20"/>
+          <w:rtl/>
+          <w:lang w:val="en-US" w:bidi="he-IL"/>
+        </w:rPr>
+        <w:t xml:space="preserve">.</w:t>
       </w:r>
     </w:p>
   </w:footnote>
   <w:footnote w:id="26">
     <w:p>
       <w:pPr>
-        <w:bidi/>
+        <w:bidi w:val="false"/>
         <w:spacing w:after="60" w:line="240"/>
-        <w:jc w:val="both"/>
+        <w:jc w:val="left"/>
       </w:pPr>
       <w:r>
         <w:rPr>
@@ -9756,19 +10119,45 @@
           <w:noProof/>
           <w:sz w:val="20"/>
           <w:szCs w:val="20"/>
-          <w:rtl/>
-          <w:lang w:val="en-US" w:bidi="he-IL"/>
-        </w:rPr>
-        <w:t xml:space="preserve">יסיף, "הסיפור האקסמפלארי", עמ' 220.</w:t>
+          <w:rtl w:val="false"/>
+          <w:lang w:val="en-US" w:bidi="he-IL"/>
+        </w:rPr>
+        <w:t xml:space="preserve">Eli Yassif, "The Hebrew Narrative Anthology in the Middle Ages," </w:t>
+      </w:r>
+      <w:r>
+        <w:rPr>
+          <w:rFonts w:ascii="Times New Roman" w:cs="David" w:eastAsia="David" w:hAnsi="Times New Roman"/>
+          <w:i/>
+          <w:iCs/>
+          <w:noProof/>
+          <w:sz w:val="20"/>
+          <w:szCs w:val="20"/>
+          <w:rtl w:val="false"/>
+          <w:lang w:val="en-US" w:bidi="he-IL"/>
+        </w:rPr>
+        <w:t xml:space="preserve">Prooftexts</w:t>
+      </w:r>
+      <w:r>
+        <w:rPr>
+          <w:rFonts w:ascii="Times New Roman" w:cs="David" w:eastAsia="David" w:hAnsi="Times New Roman"/>
+          <w:i w:val="false"/>
+          <w:iCs w:val="false"/>
+          <w:noProof/>
+          <w:sz w:val="20"/>
+          <w:szCs w:val="20"/>
+          <w:rtl w:val="false"/>
+          <w:lang w:val="en-US" w:bidi="he-IL"/>
+        </w:rPr>
+        <w:t xml:space="preserve"> 17, no. 2 (1997): 153-175.</w:t>
       </w:r>
     </w:p>
   </w:footnote>
   <w:footnote w:id="27">
     <w:p>
       <w:pPr>
-        <w:bidi/>
+        <w:bidi w:val="false"/>
         <w:spacing w:after="60" w:line="240"/>
-        <w:jc w:val="both"/>
+        <w:jc w:val="left"/>
       </w:pPr>
       <w:r>
         <w:rPr>
@@ -9784,10 +10173,10 @@
           <w:noProof/>
           <w:sz w:val="20"/>
           <w:szCs w:val="20"/>
-          <w:rtl/>
-          <w:lang w:val="en-US" w:bidi="he-IL"/>
-        </w:rPr>
-        <w:t xml:space="preserve">ברכיה הנקדן, </w:t>
+          <w:rtl w:val="false"/>
+          <w:lang w:val="en-US" w:bidi="he-IL"/>
+        </w:rPr>
+        <w:t xml:space="preserve">Schwarzbaum, </w:t>
       </w:r>
       <w:r>
         <w:rPr>
@@ -9797,23 +10186,36 @@
           <w:noProof/>
           <w:sz w:val="20"/>
           <w:szCs w:val="20"/>
-          <w:rtl/>
-          <w:lang w:val="en-US" w:bidi="he-IL"/>
-        </w:rPr>
-        <w:t xml:space="preserve">משלי שועלים</w:t>
-      </w:r>
-      <w:r>
-        <w:rPr>
-          <w:rFonts w:ascii="Times New Roman" w:cs="David" w:eastAsia="David" w:hAnsi="Times New Roman"/>
-          <w:i w:val="false"/>
-          <w:iCs w:val="false"/>
-          <w:noProof/>
-          <w:sz w:val="20"/>
-          <w:szCs w:val="20"/>
-          <w:rtl/>
-          <w:lang w:val="en-US" w:bidi="he-IL"/>
-        </w:rPr>
-        <w:t xml:space="preserve">, משל סה, מהדורת הברמן [לוודא נוסח החרוז הפותח].</w:t>
+          <w:rtl w:val="false"/>
+          <w:lang w:val="en-US" w:bidi="he-IL"/>
+        </w:rPr>
+        <w:t xml:space="preserve">Mishle Shu'alim</w:t>
+      </w:r>
+      <w:r>
+        <w:rPr>
+          <w:rFonts w:ascii="Times New Roman" w:cs="David" w:eastAsia="David" w:hAnsi="Times New Roman"/>
+          <w:i w:val="false"/>
+          <w:iCs w:val="false"/>
+          <w:noProof/>
+          <w:sz w:val="20"/>
+          <w:szCs w:val="20"/>
+          <w:rtl w:val="false"/>
+          <w:lang w:val="en-US" w:bidi="he-IL"/>
+        </w:rPr>
+        <w:t xml:space="preserve">, Introduction; </w:t>
+      </w:r>
+      <w:r>
+        <w:rPr>
+          <w:rFonts w:ascii="Times New Roman" w:cs="David" w:eastAsia="David" w:hAnsi="Times New Roman"/>
+          <w:i w:val="false"/>
+          <w:iCs w:val="false"/>
+          <w:noProof/>
+          <w:sz w:val="20"/>
+          <w:szCs w:val="20"/>
+          <w:rtl/>
+          <w:lang w:val="en-US" w:bidi="he-IL"/>
+        </w:rPr>
+        <w:t xml:space="preserve">שורצבוים, "טיפוסים פולקלוריים", עמ' 34-36.</w:t>
       </w:r>
     </w:p>
   </w:footnote>
@@ -9841,20 +10243,7 @@
           <w:rtl/>
           <w:lang w:val="en-US" w:bidi="he-IL"/>
         </w:rPr>
-        <w:t xml:space="preserve">פדרוס א, יא (פרי 151), לפי </w:t>
-      </w:r>
-      <w:r>
-        <w:rPr>
-          <w:rFonts w:ascii="Times New Roman" w:cs="David" w:eastAsia="David" w:hAnsi="Times New Roman"/>
-          <w:i w:val="false"/>
-          <w:iCs w:val="false"/>
-          <w:noProof/>
-          <w:sz w:val="20"/>
-          <w:szCs w:val="20"/>
-          <w:rtl w:val="false"/>
-          <w:lang w:val="en-US" w:bidi="he-IL"/>
-        </w:rPr>
-        <w:t xml:space="preserve">Schwarzbaum, </w:t>
+        <w:t xml:space="preserve">דן פגיס, </w:t>
       </w:r>
       <w:r>
         <w:rPr>
@@ -9864,23 +10253,23 @@
           <w:noProof/>
           <w:sz w:val="20"/>
           <w:szCs w:val="20"/>
-          <w:rtl w:val="false"/>
-          <w:lang w:val="en-US" w:bidi="he-IL"/>
-        </w:rPr>
-        <w:t xml:space="preserve">Mishle Shu'alim</w:t>
-      </w:r>
-      <w:r>
-        <w:rPr>
-          <w:rFonts w:ascii="Times New Roman" w:cs="David" w:eastAsia="David" w:hAnsi="Times New Roman"/>
-          <w:i w:val="false"/>
-          <w:iCs w:val="false"/>
-          <w:noProof/>
-          <w:sz w:val="20"/>
-          <w:szCs w:val="20"/>
-          <w:rtl/>
-          <w:lang w:val="en-US" w:bidi="he-IL"/>
-        </w:rPr>
-        <w:t xml:space="preserve">, בדיון על משל סה [לוודא עמודים].</w:t>
+          <w:rtl/>
+          <w:lang w:val="en-US" w:bidi="he-IL"/>
+        </w:rPr>
+        <w:t xml:space="preserve">חידוש ומסורת בשירת החול העברית: ספרד ואיטליה</w:t>
+      </w:r>
+      <w:r>
+        <w:rPr>
+          <w:rFonts w:ascii="Times New Roman" w:cs="David" w:eastAsia="David" w:hAnsi="Times New Roman"/>
+          <w:i w:val="false"/>
+          <w:iCs w:val="false"/>
+          <w:noProof/>
+          <w:sz w:val="20"/>
+          <w:szCs w:val="20"/>
+          <w:rtl/>
+          <w:lang w:val="en-US" w:bidi="he-IL"/>
+        </w:rPr>
+        <w:t xml:space="preserve">, ירושלים: כתר, 1976, עמ' 70-77 [לוודא עמודים].</w:t>
       </w:r>
     </w:p>
   </w:footnote>
@@ -9908,16 +10297,68 @@
           <w:rtl/>
           <w:lang w:val="en-US" w:bidi="he-IL"/>
         </w:rPr>
-        <w:t xml:space="preserve">השווה משלי יז, כח. את מקור הפתגם המדויק יש לבדוק בספרות המוסר של ימי הביניים, כגון "מבחר הפנינים" [לוודא].</w:t>
+        <w:t xml:space="preserve">ענת שפירא, "המשל הנרטיבי-ספרותי ב'סדר אליהו' לאור המשל הדרשני בספרות חז"ל", </w:t>
+      </w:r>
+      <w:r>
+        <w:rPr>
+          <w:rFonts w:ascii="Times New Roman" w:cs="David" w:eastAsia="David" w:hAnsi="Times New Roman"/>
+          <w:i/>
+          <w:iCs/>
+          <w:noProof/>
+          <w:sz w:val="20"/>
+          <w:szCs w:val="20"/>
+          <w:rtl/>
+          <w:lang w:val="en-US" w:bidi="he-IL"/>
+        </w:rPr>
+        <w:t xml:space="preserve">מרקמים: תרבות, ספרות, פולקלור, לגלית חזן-רוקם</w:t>
+      </w:r>
+      <w:r>
+        <w:rPr>
+          <w:rFonts w:ascii="Times New Roman" w:cs="David" w:eastAsia="David" w:hAnsi="Times New Roman"/>
+          <w:i w:val="false"/>
+          <w:iCs w:val="false"/>
+          <w:noProof/>
+          <w:sz w:val="20"/>
+          <w:szCs w:val="20"/>
+          <w:rtl/>
+          <w:lang w:val="en-US" w:bidi="he-IL"/>
+        </w:rPr>
+        <w:t xml:space="preserve">, כרך א (= </w:t>
+      </w:r>
+      <w:r>
+        <w:rPr>
+          <w:rFonts w:ascii="Times New Roman" w:cs="David" w:eastAsia="David" w:hAnsi="Times New Roman"/>
+          <w:i/>
+          <w:iCs/>
+          <w:noProof/>
+          <w:sz w:val="20"/>
+          <w:szCs w:val="20"/>
+          <w:rtl/>
+          <w:lang w:val="en-US" w:bidi="he-IL"/>
+        </w:rPr>
+        <w:t xml:space="preserve">מחקרי ירושלים בספרות עברית</w:t>
+      </w:r>
+      <w:r>
+        <w:rPr>
+          <w:rFonts w:ascii="Times New Roman" w:cs="David" w:eastAsia="David" w:hAnsi="Times New Roman"/>
+          <w:i w:val="false"/>
+          <w:iCs w:val="false"/>
+          <w:noProof/>
+          <w:sz w:val="20"/>
+          <w:szCs w:val="20"/>
+          <w:rtl/>
+          <w:lang w:val="en-US" w:bidi="he-IL"/>
+        </w:rPr>
+        <w:t xml:space="preserve"> כה), ירושלים: המכון למדעי היהדות ע"ש מנדל, תשע"ג, עמ' 133-151, בעמ' 133-135, 150.</w:t>
       </w:r>
     </w:p>
   </w:footnote>
   <w:footnote w:id="30">
     <w:p>
       <w:pPr>
-        <w:bidi/>
+        <w:bidi w:val="false"/>
         <w:spacing w:after="60" w:line="240"/>
-        <w:jc w:val="both"/>
+        <w:jc w:val="left"/>
       </w:pPr>
       <w:r>
         <w:rPr>
@@ -9933,10 +10374,349 @@
           <w:noProof/>
           <w:sz w:val="20"/>
           <w:szCs w:val="20"/>
-          <w:rtl/>
-          <w:lang w:val="en-US" w:bidi="he-IL"/>
-        </w:rPr>
-        <w:t xml:space="preserve">שטרן, "תפקידו של המשל", עמ' 97; שפירא, "המשל הנרטיבי-ספרותי", עמ' 150.</w:t>
+          <w:rtl w:val="false"/>
+          <w:lang w:val="en-US" w:bidi="he-IL"/>
+        </w:rPr>
+        <w:t xml:space="preserve">Daniel Boyarin, "An Exchange on the Mashal: Rhetoric and Interpretation: The Case of the Nimshal," </w:t>
+      </w:r>
+      <w:r>
+        <w:rPr>
+          <w:rFonts w:ascii="Times New Roman" w:cs="David" w:eastAsia="David" w:hAnsi="Times New Roman"/>
+          <w:i/>
+          <w:iCs/>
+          <w:noProof/>
+          <w:sz w:val="20"/>
+          <w:szCs w:val="20"/>
+          <w:rtl w:val="false"/>
+          <w:lang w:val="en-US" w:bidi="he-IL"/>
+        </w:rPr>
+        <w:t xml:space="preserve">Prooftexts</w:t>
+      </w:r>
+      <w:r>
+        <w:rPr>
+          <w:rFonts w:ascii="Times New Roman" w:cs="David" w:eastAsia="David" w:hAnsi="Times New Roman"/>
+          <w:i w:val="false"/>
+          <w:iCs w:val="false"/>
+          <w:noProof/>
+          <w:sz w:val="20"/>
+          <w:szCs w:val="20"/>
+          <w:rtl w:val="false"/>
+          <w:lang w:val="en-US" w:bidi="he-IL"/>
+        </w:rPr>
+        <w:t xml:space="preserve"> 5, no. 3 (1985): 269-276.</w:t>
+      </w:r>
+    </w:p>
+  </w:footnote>
+  <w:footnote w:id="31">
+    <w:p>
+      <w:pPr>
+        <w:bidi/>
+        <w:spacing w:after="60" w:line="240"/>
+        <w:jc w:val="both"/>
+      </w:pPr>
+      <w:r>
+        <w:rPr>
+          <w:rStyle w:val="FootnoteReference"/>
+        </w:rPr>
+        <w:footnoteRef/>
+      </w:r>
+      <w:r>
+        <w:rPr>
+          <w:rFonts w:ascii="Times New Roman" w:cs="David" w:eastAsia="David" w:hAnsi="Times New Roman"/>
+          <w:i w:val="false"/>
+          <w:iCs w:val="false"/>
+          <w:noProof/>
+          <w:sz w:val="20"/>
+          <w:szCs w:val="20"/>
+          <w:rtl/>
+          <w:lang w:val="en-US" w:bidi="he-IL"/>
+        </w:rPr>
+        <w:t xml:space="preserve">ברכיה הנקדן, </w:t>
+      </w:r>
+      <w:r>
+        <w:rPr>
+          <w:rFonts w:ascii="Times New Roman" w:cs="David" w:eastAsia="David" w:hAnsi="Times New Roman"/>
+          <w:i/>
+          <w:iCs/>
+          <w:noProof/>
+          <w:sz w:val="20"/>
+          <w:szCs w:val="20"/>
+          <w:rtl/>
+          <w:lang w:val="en-US" w:bidi="he-IL"/>
+        </w:rPr>
+        <w:t xml:space="preserve">משלי שועלים</w:t>
+      </w:r>
+      <w:r>
+        <w:rPr>
+          <w:rFonts w:ascii="Times New Roman" w:cs="David" w:eastAsia="David" w:hAnsi="Times New Roman"/>
+          <w:i w:val="false"/>
+          <w:iCs w:val="false"/>
+          <w:noProof/>
+          <w:sz w:val="20"/>
+          <w:szCs w:val="20"/>
+          <w:rtl/>
+          <w:lang w:val="en-US" w:bidi="he-IL"/>
+        </w:rPr>
+        <w:t xml:space="preserve">, הקדמת המחבר, מהדורת הברמן [לוודא עמודים וציטוט מדויק].</w:t>
+      </w:r>
+    </w:p>
+  </w:footnote>
+  <w:footnote w:id="32">
+    <w:p>
+      <w:pPr>
+        <w:bidi/>
+        <w:spacing w:after="60" w:line="240"/>
+        <w:jc w:val="both"/>
+      </w:pPr>
+      <w:r>
+        <w:rPr>
+          <w:rStyle w:val="FootnoteReference"/>
+        </w:rPr>
+        <w:footnoteRef/>
+      </w:r>
+      <w:r>
+        <w:rPr>
+          <w:rFonts w:ascii="Times New Roman" w:cs="David" w:eastAsia="David" w:hAnsi="Times New Roman"/>
+          <w:i w:val="false"/>
+          <w:iCs w:val="false"/>
+          <w:noProof/>
+          <w:sz w:val="20"/>
+          <w:szCs w:val="20"/>
+          <w:rtl/>
+          <w:lang w:val="en-US" w:bidi="he-IL"/>
+        </w:rPr>
+        <w:t xml:space="preserve">יסיף, "הסיפור האקסמפלארי", עמ' 220.</w:t>
+      </w:r>
+    </w:p>
+  </w:footnote>
+  <w:footnote w:id="33">
+    <w:p>
+      <w:pPr>
+        <w:bidi/>
+        <w:spacing w:after="60" w:line="240"/>
+        <w:jc w:val="both"/>
+      </w:pPr>
+      <w:r>
+        <w:rPr>
+          <w:rStyle w:val="FootnoteReference"/>
+        </w:rPr>
+        <w:footnoteRef/>
+      </w:r>
+      <w:r>
+        <w:rPr>
+          <w:rFonts w:ascii="Times New Roman" w:cs="David" w:eastAsia="David" w:hAnsi="Times New Roman"/>
+          <w:i w:val="false"/>
+          <w:iCs w:val="false"/>
+          <w:noProof/>
+          <w:sz w:val="20"/>
+          <w:szCs w:val="20"/>
+          <w:rtl/>
+          <w:lang w:val="en-US" w:bidi="he-IL"/>
+        </w:rPr>
+        <w:t xml:space="preserve">ברכיה הנקדן, </w:t>
+      </w:r>
+      <w:r>
+        <w:rPr>
+          <w:rFonts w:ascii="Times New Roman" w:cs="David" w:eastAsia="David" w:hAnsi="Times New Roman"/>
+          <w:i/>
+          <w:iCs/>
+          <w:noProof/>
+          <w:sz w:val="20"/>
+          <w:szCs w:val="20"/>
+          <w:rtl/>
+          <w:lang w:val="en-US" w:bidi="he-IL"/>
+        </w:rPr>
+        <w:t xml:space="preserve">משלי שועלים</w:t>
+      </w:r>
+      <w:r>
+        <w:rPr>
+          <w:rFonts w:ascii="Times New Roman" w:cs="David" w:eastAsia="David" w:hAnsi="Times New Roman"/>
+          <w:i w:val="false"/>
+          <w:iCs w:val="false"/>
+          <w:noProof/>
+          <w:sz w:val="20"/>
+          <w:szCs w:val="20"/>
+          <w:rtl/>
+          <w:lang w:val="en-US" w:bidi="he-IL"/>
+        </w:rPr>
+        <w:t xml:space="preserve">, משל סה, מהדורת הברמן [לוודא נוסח החרוז הפותח].</w:t>
+      </w:r>
+    </w:p>
+  </w:footnote>
+  <w:footnote w:id="34">
+    <w:p>
+      <w:pPr>
+        <w:bidi/>
+        <w:spacing w:after="60" w:line="240"/>
+        <w:jc w:val="both"/>
+      </w:pPr>
+      <w:r>
+        <w:rPr>
+          <w:rStyle w:val="FootnoteReference"/>
+        </w:rPr>
+        <w:footnoteRef/>
+      </w:r>
+      <w:r>
+        <w:rPr>
+          <w:rFonts w:ascii="Times New Roman" w:cs="David" w:eastAsia="David" w:hAnsi="Times New Roman"/>
+          <w:i w:val="false"/>
+          <w:iCs w:val="false"/>
+          <w:noProof/>
+          <w:sz w:val="20"/>
+          <w:szCs w:val="20"/>
+          <w:rtl/>
+          <w:lang w:val="en-US" w:bidi="he-IL"/>
+        </w:rPr>
+        <w:t xml:space="preserve">פדרוס א, יא (פרי 151), לפי </w:t>
+      </w:r>
+      <w:r>
+        <w:rPr>
+          <w:rFonts w:ascii="Times New Roman" w:cs="David" w:eastAsia="David" w:hAnsi="Times New Roman"/>
+          <w:i w:val="false"/>
+          <w:iCs w:val="false"/>
+          <w:noProof/>
+          <w:sz w:val="20"/>
+          <w:szCs w:val="20"/>
+          <w:rtl w:val="false"/>
+          <w:lang w:val="en-US" w:bidi="he-IL"/>
+        </w:rPr>
+        <w:t xml:space="preserve">Schwarzbaum, </w:t>
+      </w:r>
+      <w:r>
+        <w:rPr>
+          <w:rFonts w:ascii="Times New Roman" w:cs="David" w:eastAsia="David" w:hAnsi="Times New Roman"/>
+          <w:i/>
+          <w:iCs/>
+          <w:noProof/>
+          <w:sz w:val="20"/>
+          <w:szCs w:val="20"/>
+          <w:rtl w:val="false"/>
+          <w:lang w:val="en-US" w:bidi="he-IL"/>
+        </w:rPr>
+        <w:t xml:space="preserve">Mishle Shu'alim</w:t>
+      </w:r>
+      <w:r>
+        <w:rPr>
+          <w:rFonts w:ascii="Times New Roman" w:cs="David" w:eastAsia="David" w:hAnsi="Times New Roman"/>
+          <w:i w:val="false"/>
+          <w:iCs w:val="false"/>
+          <w:noProof/>
+          <w:sz w:val="20"/>
+          <w:szCs w:val="20"/>
+          <w:rtl/>
+          <w:lang w:val="en-US" w:bidi="he-IL"/>
+        </w:rPr>
+        <w:t xml:space="preserve">, בדיון על משל סה [לוודא עמודים].</w:t>
+      </w:r>
+    </w:p>
+  </w:footnote>
+  <w:footnote w:id="35">
+    <w:p>
+      <w:pPr>
+        <w:bidi w:val="false"/>
+        <w:spacing w:after="60" w:line="240"/>
+        <w:jc w:val="left"/>
+      </w:pPr>
+      <w:r>
+        <w:rPr>
+          <w:rStyle w:val="FootnoteReference"/>
+        </w:rPr>
+        <w:footnoteRef/>
+      </w:r>
+      <w:r>
+        <w:rPr>
+          <w:rFonts w:ascii="Times New Roman" w:cs="David" w:eastAsia="David" w:hAnsi="Times New Roman"/>
+          <w:i w:val="false"/>
+          <w:iCs w:val="false"/>
+          <w:noProof/>
+          <w:sz w:val="20"/>
+          <w:szCs w:val="20"/>
+          <w:rtl w:val="false"/>
+          <w:lang w:val="en-US" w:bidi="he-IL"/>
+        </w:rPr>
+        <w:t xml:space="preserve">Way, "Animals in the Prophetic World," pp. 55-60 [</w:t>
+      </w:r>
+      <w:r>
+        <w:rPr>
+          <w:rFonts w:ascii="Times New Roman" w:cs="David" w:eastAsia="David" w:hAnsi="Times New Roman"/>
+          <w:i w:val="false"/>
+          <w:iCs w:val="false"/>
+          <w:noProof/>
+          <w:sz w:val="20"/>
+          <w:szCs w:val="20"/>
+          <w:rtl/>
+          <w:lang w:val="en-US" w:bidi="he-IL"/>
+        </w:rPr>
+        <w:t xml:space="preserve">לוודא עמודים].</w:t>
+      </w:r>
+    </w:p>
+  </w:footnote>
+  <w:footnote w:id="36">
+    <w:p>
+      <w:pPr>
+        <w:bidi/>
+        <w:spacing w:after="60" w:line="240"/>
+        <w:jc w:val="both"/>
+      </w:pPr>
+      <w:r>
+        <w:rPr>
+          <w:rStyle w:val="FootnoteReference"/>
+        </w:rPr>
+        <w:footnoteRef/>
+      </w:r>
+      <w:r>
+        <w:rPr>
+          <w:rFonts w:ascii="Times New Roman" w:cs="David" w:eastAsia="David" w:hAnsi="Times New Roman"/>
+          <w:i w:val="false"/>
+          <w:iCs w:val="false"/>
+          <w:noProof/>
+          <w:sz w:val="20"/>
+          <w:szCs w:val="20"/>
+          <w:rtl/>
+          <w:lang w:val="en-US" w:bidi="he-IL"/>
+        </w:rPr>
+        <w:t xml:space="preserve">השווה משלי יז, כח. את מקור הפתגם המדויק יש לבדוק בספרות המוסר של ימי הביניים, כגון "מבחר הפנינים" [לוודא].</w:t>
+      </w:r>
+    </w:p>
+  </w:footnote>
+  <w:footnote w:id="37">
+    <w:p>
+      <w:pPr>
+        <w:bidi/>
+        <w:spacing w:after="60" w:line="240"/>
+        <w:jc w:val="both"/>
+      </w:pPr>
+      <w:r>
+        <w:rPr>
+          <w:rStyle w:val="FootnoteReference"/>
+        </w:rPr>
+        <w:footnoteRef/>
+      </w:r>
+      <w:r>
+        <w:rPr>
+          <w:rFonts w:ascii="Times New Roman" w:cs="David" w:eastAsia="David" w:hAnsi="Times New Roman"/>
+          <w:i w:val="false"/>
+          <w:iCs w:val="false"/>
+          <w:noProof/>
+          <w:sz w:val="20"/>
+          <w:szCs w:val="20"/>
+          <w:rtl/>
+          <w:lang w:val="en-US" w:bidi="he-IL"/>
+        </w:rPr>
+        <w:t xml:space="preserve">שטרן, "תפקידו של המשל", עמ' 97; שפירא, "המשל הנרטיבי-ספרותי", עמ' 150; </w:t>
+      </w:r>
+      <w:r>
+        <w:rPr>
+          <w:rFonts w:ascii="Times New Roman" w:cs="David" w:eastAsia="David" w:hAnsi="Times New Roman"/>
+          <w:i w:val="false"/>
+          <w:iCs w:val="false"/>
+          <w:noProof/>
+          <w:sz w:val="20"/>
+          <w:szCs w:val="20"/>
+          <w:rtl w:val="false"/>
+          <w:lang w:val="en-US" w:bidi="he-IL"/>
+        </w:rPr>
+        <w:t xml:space="preserve">Boyarin, "An Exchange on the Mashal," pp. 269-272.</w:t>
       </w:r>
     </w:p>
   </w:footnote>

</xml_diff>

<commit_message>
Resolve verifiable footnote placeholders
Schwarzbaum entries cited by fable number (the book is arranged that
way), Way 2009 cited by section, and an unsupported sentence on the
'donkey carrying books' idiom removed; remaining placeholders are only
those that need the printed editions.

Co-Authored-By: Claude Fable 5.1 <noreply@anthropic.com>
Claude-Session: https://claude.ai/code/session_01LePeB11iN6PJ4Nt39a92mY
</commit_message>
<xml_diff>
--- a/seminar/seminar-donkey-fables.docx
+++ b/seminar/seminar-donkey-fables.docx
@@ -2621,76 +2621,57 @@
         </w:rPr>
         <w:footnoteReference w:id="19"/>
       </w:r>
-      <w:r>
-        <w:rPr>
-          <w:rFonts w:ascii="Times New Roman" w:cs="David" w:eastAsia="David" w:hAnsi="Times New Roman"/>
-          <w:i w:val="false"/>
-          <w:iCs w:val="false"/>
-          <w:noProof/>
-          <w:sz w:val="24"/>
-          <w:szCs w:val="24"/>
-          <w:rtl/>
-          <w:lang w:val="en-US" w:bidi="he-IL"/>
-        </w:rPr>
-        <w:t xml:space="preserve"> הדימוי "חמור נושא ספרים" עבר מן הערבית לעברית ורווח בספרות המוסר של ימי הביניים ככינוי למי שלמד ולא הבין.</w:t>
+    </w:p>
+    <w:p>
+      <w:pPr>
+        <w:bidi/>
+        <w:spacing w:after="120" w:before="0" w:line="360"/>
+        <w:jc w:val="both"/>
+      </w:pPr>
+      <w:r>
+        <w:rPr>
+          <w:rFonts w:ascii="Times New Roman" w:cs="David" w:eastAsia="David" w:hAnsi="Times New Roman"/>
+          <w:i w:val="false"/>
+          <w:iCs w:val="false"/>
+          <w:noProof/>
+          <w:sz w:val="24"/>
+          <w:szCs w:val="24"/>
+          <w:rtl/>
+          <w:lang w:val="en-US" w:bidi="he-IL"/>
+        </w:rPr>
+        <w:t xml:space="preserve">בפולקלור האירופי המאוחר יותר החמור שומר על שתי פניו. הוא הכסיל שבפתגמים ובבדיחות, אבל הוא גם הפועל הזקן שנזרק אחרי שנות עבודה, כמו החמור של "נגני העיר ברמן" אצל האחים גרים (טיפוס </w:t>
+      </w:r>
+      <w:r>
+        <w:rPr>
+          <w:rFonts w:ascii="Times New Roman" w:cs="David" w:eastAsia="David" w:hAnsi="Times New Roman"/>
+          <w:i w:val="false"/>
+          <w:iCs w:val="false"/>
+          <w:noProof/>
+          <w:sz w:val="24"/>
+          <w:szCs w:val="24"/>
+          <w:rtl w:val="false"/>
+          <w:lang w:val="en-US" w:bidi="he-IL"/>
+        </w:rPr>
+        <w:t xml:space="preserve">ATU 130), </w:t>
+      </w:r>
+      <w:r>
+        <w:rPr>
+          <w:rFonts w:ascii="Times New Roman" w:cs="David" w:eastAsia="David" w:hAnsi="Times New Roman"/>
+          <w:i w:val="false"/>
+          <w:iCs w:val="false"/>
+          <w:noProof/>
+          <w:sz w:val="24"/>
+          <w:szCs w:val="24"/>
+          <w:rtl/>
+          <w:lang w:val="en-US" w:bidi="he-IL"/>
+        </w:rPr>
+        <w:t xml:space="preserve">שמנהיג את החיות המשוחררות.</w:t>
       </w:r>
       <w:r>
         <w:rPr>
           <w:rStyle w:val="FootnoteReference"/>
         </w:rPr>
         <w:footnoteReference w:id="20"/>
-      </w:r>
-    </w:p>
-    <w:p>
-      <w:pPr>
-        <w:bidi/>
-        <w:spacing w:after="120" w:before="0" w:line="360"/>
-        <w:jc w:val="both"/>
-      </w:pPr>
-      <w:r>
-        <w:rPr>
-          <w:rFonts w:ascii="Times New Roman" w:cs="David" w:eastAsia="David" w:hAnsi="Times New Roman"/>
-          <w:i w:val="false"/>
-          <w:iCs w:val="false"/>
-          <w:noProof/>
-          <w:sz w:val="24"/>
-          <w:szCs w:val="24"/>
-          <w:rtl/>
-          <w:lang w:val="en-US" w:bidi="he-IL"/>
-        </w:rPr>
-        <w:t xml:space="preserve">בפולקלור האירופי המאוחר יותר החמור שומר על שתי פניו. הוא הכסיל שבפתגמים ובבדיחות, אבל הוא גם הפועל הזקן שנזרק אחרי שנות עבודה, כמו החמור של "נגני העיר ברמן" אצל האחים גרים (טיפוס </w:t>
-      </w:r>
-      <w:r>
-        <w:rPr>
-          <w:rFonts w:ascii="Times New Roman" w:cs="David" w:eastAsia="David" w:hAnsi="Times New Roman"/>
-          <w:i w:val="false"/>
-          <w:iCs w:val="false"/>
-          <w:noProof/>
-          <w:sz w:val="24"/>
-          <w:szCs w:val="24"/>
-          <w:rtl w:val="false"/>
-          <w:lang w:val="en-US" w:bidi="he-IL"/>
-        </w:rPr>
-        <w:t xml:space="preserve">ATU 130), </w:t>
-      </w:r>
-      <w:r>
-        <w:rPr>
-          <w:rFonts w:ascii="Times New Roman" w:cs="David" w:eastAsia="David" w:hAnsi="Times New Roman"/>
-          <w:i w:val="false"/>
-          <w:iCs w:val="false"/>
-          <w:noProof/>
-          <w:sz w:val="24"/>
-          <w:szCs w:val="24"/>
-          <w:rtl/>
-          <w:lang w:val="en-US" w:bidi="he-IL"/>
-        </w:rPr>
-        <w:t xml:space="preserve">שמנהיג את החיות המשוחררות.</w:t>
-      </w:r>
-      <w:r>
-        <w:rPr>
-          <w:rStyle w:val="FootnoteReference"/>
-        </w:rPr>
-        <w:footnoteReference w:id="21"/>
       </w:r>
       <w:r>
         <w:rPr>
@@ -4899,6 +4880,25 @@
         <w:rPr>
           <w:rStyle w:val="FootnoteReference"/>
         </w:rPr>
+        <w:footnoteReference w:id="21"/>
+      </w:r>
+      <w:r>
+        <w:rPr>
+          <w:rFonts w:ascii="Times New Roman" w:cs="David" w:eastAsia="David" w:hAnsi="Times New Roman"/>
+          <w:i w:val="false"/>
+          <w:iCs w:val="false"/>
+          <w:noProof/>
+          <w:sz w:val="24"/>
+          <w:szCs w:val="24"/>
+          <w:rtl/>
+          <w:lang w:val="en-US" w:bidi="he-IL"/>
+        </w:rPr>
+        <w:t xml:space="preserve"> הכינוי "הנקדן" מעיד על עיסוקו בניקוד ובמסורה, כלומר במלאכת הדיוק בטקסט המקראי, וזו עובדה חשובה להבנת סגנונו: אדם שמקצועו הוא הפסוק ניגש אל המשל החייתי מתוך הפסוק. מלבד משלי שועלים חיבר ברכיה את ספר המוסר "ספר המצרף", עיבד לעברית את "שאלות הטבע" של אדלרד מבאת' בשם "דודי ונכדי", ותרגם ספר על סגולות האבנים.</w:t>
+      </w:r>
+      <w:r>
+        <w:rPr>
+          <w:rStyle w:val="FootnoteReference"/>
+        </w:rPr>
         <w:footnoteReference w:id="22"/>
       </w:r>
       <w:r>
@@ -4912,32 +4912,13 @@
           <w:rtl/>
           <w:lang w:val="en-US" w:bidi="he-IL"/>
         </w:rPr>
-        <w:t xml:space="preserve"> הכינוי "הנקדן" מעיד על עיסוקו בניקוד ובמסורה, כלומר במלאכת הדיוק בטקסט המקראי, וזו עובדה חשובה להבנת סגנונו: אדם שמקצועו הוא הפסוק ניגש אל המשל החייתי מתוך הפסוק. מלבד משלי שועלים חיבר ברכיה את ספר המוסר "ספר המצרף", עיבד לעברית את "שאלות הטבע" של אדלרד מבאת' בשם "דודי ונכדי", ותרגם ספר על סגולות האבנים.</w:t>
+        <w:t xml:space="preserve"> הוא אפוא איש ביניים: בין התרבות הלטינית והצרפתית שסביבו ובין הספרייה העברית שבתוכו, ובמאה השתים עשרה, כשפרחו בצרפת ובאנגליה קובצי משלים בלטינית ובצרפתית עתיקה, כתב את קובץ המשלים שלו בעברית. עלי יסיף הראה שבאותן שנים בדיוק, 1170-1220 בקירוב, שהיו תור הזהב של האקסמפלום הנוצרי, אימץ גם ספר חסידים באשכנז את הסיפור הדידקטי הקצר ועיבר אותו, ושמשלי איזופוס ומשלי בעלי החיים של ימי הביניים נמנים עם מקורותיו של הז'אנר הזה.</w:t>
       </w:r>
       <w:r>
         <w:rPr>
           <w:rStyle w:val="FootnoteReference"/>
         </w:rPr>
         <w:footnoteReference w:id="23"/>
-      </w:r>
-      <w:r>
-        <w:rPr>
-          <w:rFonts w:ascii="Times New Roman" w:cs="David" w:eastAsia="David" w:hAnsi="Times New Roman"/>
-          <w:i w:val="false"/>
-          <w:iCs w:val="false"/>
-          <w:noProof/>
-          <w:sz w:val="24"/>
-          <w:szCs w:val="24"/>
-          <w:rtl/>
-          <w:lang w:val="en-US" w:bidi="he-IL"/>
-        </w:rPr>
-        <w:t xml:space="preserve"> הוא אפוא איש ביניים: בין התרבות הלטינית והצרפתית שסביבו ובין הספרייה העברית שבתוכו, ובמאה השתים עשרה, כשפרחו בצרפת ובאנגליה קובצי משלים בלטינית ובצרפתית עתיקה, כתב את קובץ המשלים שלו בעברית. עלי יסיף הראה שבאותן שנים בדיוק, 1170-1220 בקירוב, שהיו תור הזהב של האקסמפלום הנוצרי, אימץ גם ספר חסידים באשכנז את הסיפור הדידקטי הקצר ועיבר אותו, ושמשלי איזופוס ומשלי בעלי החיים של ימי הביניים נמנים עם מקורותיו של הז'אנר הזה.</w:t>
-      </w:r>
-      <w:r>
-        <w:rPr>
-          <w:rStyle w:val="FootnoteReference"/>
-        </w:rPr>
-        <w:footnoteReference w:id="24"/>
       </w:r>
       <w:r>
         <w:rPr>
@@ -5000,6 +4981,25 @@
         <w:rPr>
           <w:rStyle w:val="FootnoteReference"/>
         </w:rPr>
+        <w:footnoteReference w:id="24"/>
+      </w:r>
+      <w:r>
+        <w:rPr>
+          <w:rFonts w:ascii="Times New Roman" w:cs="David" w:eastAsia="David" w:hAnsi="Times New Roman"/>
+          <w:i w:val="false"/>
+          <w:iCs w:val="false"/>
+          <w:noProof/>
+          <w:sz w:val="24"/>
+          <w:szCs w:val="24"/>
+          <w:rtl/>
+          <w:lang w:val="en-US" w:bidi="he-IL"/>
+        </w:rPr>
+        <w:t xml:space="preserve"> יסיף הגדיר את האנתולוגיה הסיפורית העברית של ימי הביניים כסוגה בפני עצמה, שבה למלקט יש קול משלו הנשמע בהקדמה, בסדר הסיפורים ובנמשלים, וברכיה הוא דוגמה מובהקת: קובץ שמקורותיו זרים ועורכו נוכח בכל משל.</w:t>
+      </w:r>
+      <w:r>
+        <w:rPr>
+          <w:rStyle w:val="FootnoteReference"/>
+        </w:rPr>
         <w:footnoteReference w:id="25"/>
       </w:r>
       <w:r>
@@ -5013,7 +5013,7 @@
           <w:rtl/>
           <w:lang w:val="en-US" w:bidi="he-IL"/>
         </w:rPr>
-        <w:t xml:space="preserve"> יסיף הגדיר את האנתולוגיה הסיפורית העברית של ימי הביניים כסוגה בפני עצמה, שבה למלקט יש קול משלו הנשמע בהקדמה, בסדר הסיפורים ובנמשלים, וברכיה הוא דוגמה מובהקת: קובץ שמקורותיו זרים ועורכו נוכח בכל משל.</w:t>
+        <w:t xml:space="preserve"> השם עצמו לקוח מן התלמוד: על רבי מאיר נאמר שהיו לו שלוש מאות משלי שועלים (בבלי סנהדרין לח ע"ב), ועל רבן יוחנן בן זכאי שידע "משלות שועלים" (בבלי סוכה כח ע"א). ברכיה מציב את עצמו במודע כממשיך המסורת הזאת, אף על פי שרוב משליו לקוחים ממקורות לטיניים וצרפתיים: קובצי "רומולוס", שהם העיבודים הלטיניים של פדרוס, משלי אביאנוס, וכנראה גם קובץ המשלים הצרפתי של מארי דה פראנס. שורצבוים הראה שברכיה לא תרגם אלא עיבד: הוא משנה סיומים, מוסיף נמשלים, ומחליף את הצבע האלילי בצבע מקראי.</w:t>
       </w:r>
       <w:r>
         <w:rPr>
@@ -5021,18 +5021,25 @@
         </w:rPr>
         <w:footnoteReference w:id="26"/>
       </w:r>
-      <w:r>
-        <w:rPr>
-          <w:rFonts w:ascii="Times New Roman" w:cs="David" w:eastAsia="David" w:hAnsi="Times New Roman"/>
-          <w:i w:val="false"/>
-          <w:iCs w:val="false"/>
-          <w:noProof/>
-          <w:sz w:val="24"/>
-          <w:szCs w:val="24"/>
-          <w:rtl/>
-          <w:lang w:val="en-US" w:bidi="he-IL"/>
-        </w:rPr>
-        <w:t xml:space="preserve"> השם עצמו לקוח מן התלמוד: על רבי מאיר נאמר שהיו לו שלוש מאות משלי שועלים (בבלי סנהדרין לח ע"ב), ועל רבן יוחנן בן זכאי שידע "משלות שועלים" (בבלי סוכה כח ע"א). ברכיה מציב את עצמו במודע כממשיך המסורת הזאת, אף על פי שרוב משליו לקוחים ממקורות לטיניים וצרפתיים: קובצי "רומולוס", שהם העיבודים הלטיניים של פדרוס, משלי אביאנוס, וכנראה גם קובץ המשלים הצרפתי של מארי דה פראנס. שורצבוים הראה שברכיה לא תרגם אלא עיבד: הוא משנה סיומים, מוסיף נמשלים, ומחליף את הצבע האלילי בצבע מקראי.</w:t>
+    </w:p>
+    <w:p>
+      <w:pPr>
+        <w:bidi/>
+        <w:spacing w:after="120" w:before="0" w:line="360"/>
+        <w:jc w:val="both"/>
+      </w:pPr>
+      <w:r>
+        <w:rPr>
+          <w:rFonts w:ascii="Times New Roman" w:cs="David" w:eastAsia="David" w:hAnsi="Times New Roman"/>
+          <w:i w:val="false"/>
+          <w:iCs w:val="false"/>
+          <w:noProof/>
+          <w:sz w:val="24"/>
+          <w:szCs w:val="24"/>
+          <w:rtl/>
+          <w:lang w:val="en-US" w:bidi="he-IL"/>
+        </w:rPr>
+        <w:t xml:space="preserve">המבנה של כל משל קבוע ברובו. הוא נפתח בחרוז מוסרי קצר, שהוא מעין כותרת רעיונית. אחריו בא גוף הסיפור בפרוזה מחורזת. "והמשל" הוא הנמשל, שבו מפרש המחבר את הסיפור על בני אדם. במשלים רבים באה גם חתימה בשיר שקול קצר הפותח ב"ואשא משלי ואומר". שניים מארבעת המשלים הנדונים בעבודה מכילים את כל ארבעת החלקים; במשל הצרעה ובמשל סה אין שיר חותם. הסגנון הוא פרוזה מחורזת שכמעט כל צלע שלה נשענת על שיבוץ, כלומר על שילוב לשון המקרא בתוך משפט חדש, לעיתים תוך שינוי משמעות. דן פגיס תיאר את השיבוץ כאמצעי מרכזי בפואטיקה העברית של ימי הביניים, שבו הקורא המשכיל מזהה את הפסוק ונהנה מן הפער בין ההקשר המקורי ובין ההקשר החדש.</w:t>
       </w:r>
       <w:r>
         <w:rPr>
@@ -5040,6 +5047,19 @@
         </w:rPr>
         <w:footnoteReference w:id="27"/>
       </w:r>
+      <w:r>
+        <w:rPr>
+          <w:rFonts w:ascii="Times New Roman" w:cs="David" w:eastAsia="David" w:hAnsi="Times New Roman"/>
+          <w:i w:val="false"/>
+          <w:iCs w:val="false"/>
+          <w:noProof/>
+          <w:sz w:val="24"/>
+          <w:szCs w:val="24"/>
+          <w:rtl/>
+          <w:lang w:val="en-US" w:bidi="he-IL"/>
+        </w:rPr>
+        <w:t xml:space="preserve"> במשלי שועלים הפער הזה הוא לב העניין. כשחמור מדבר בלשונו של רחבעם, הקורא יודע איך זה ייגמר.</w:t>
+      </w:r>
     </w:p>
     <w:p>
       <w:pPr>
@@ -5058,7 +5078,7 @@
           <w:rtl/>
           <w:lang w:val="en-US" w:bidi="he-IL"/>
         </w:rPr>
-        <w:t xml:space="preserve">המבנה של כל משל קבוע ברובו. הוא נפתח בחרוז מוסרי קצר, שהוא מעין כותרת רעיונית. אחריו בא גוף הסיפור בפרוזה מחורזת. "והמשל" הוא הנמשל, שבו מפרש המחבר את הסיפור על בני אדם. במשלים רבים באה גם חתימה בשיר שקול קצר הפותח ב"ואשא משלי ואומר". שניים מארבעת המשלים הנדונים בעבודה מכילים את כל ארבעת החלקים; במשל הצרעה ובמשל סה אין שיר חותם. הסגנון הוא פרוזה מחורזת שכמעט כל צלע שלה נשענת על שיבוץ, כלומר על שילוב לשון המקרא בתוך משפט חדש, לעיתים תוך שינוי משמעות. דן פגיס תיאר את השיבוץ כאמצעי מרכזי בפואטיקה העברית של ימי הביניים, שבו הקורא המשכיל מזהה את הפסוק ונהנה מן הפער בין ההקשר המקורי ובין ההקשר החדש.</w:t>
+        <w:t xml:space="preserve">לעניין היחס בין המשל לנמשל מועילה הבחנתה של ענת שפירא, שנוסחה לגבי סדר אליהו: בין המשל הדרשני של חז"ל, הקצר והצמוד לפסוק, ובין המשל הנרטיבי-ספרותי, שיש בו עלילה מפותחת, דיאלוג ודמויות, ונמשלו אינו תלוי בפסוק אלא חי מכוחו של הסיפור.</w:t>
       </w:r>
       <w:r>
         <w:rPr>
@@ -5077,52 +5097,13 @@
           <w:rtl/>
           <w:lang w:val="en-US" w:bidi="he-IL"/>
         </w:rPr>
-        <w:t xml:space="preserve"> במשלי שועלים הפער הזה הוא לב העניין. כשחמור מדבר בלשונו של רחבעם, הקורא יודע איך זה ייגמר.</w:t>
-      </w:r>
-    </w:p>
-    <w:p>
-      <w:pPr>
-        <w:bidi/>
-        <w:spacing w:after="120" w:before="0" w:line="360"/>
-        <w:jc w:val="both"/>
-      </w:pPr>
-      <w:r>
-        <w:rPr>
-          <w:rFonts w:ascii="Times New Roman" w:cs="David" w:eastAsia="David" w:hAnsi="Times New Roman"/>
-          <w:i w:val="false"/>
-          <w:iCs w:val="false"/>
-          <w:noProof/>
-          <w:sz w:val="24"/>
-          <w:szCs w:val="24"/>
-          <w:rtl/>
-          <w:lang w:val="en-US" w:bidi="he-IL"/>
-        </w:rPr>
-        <w:t xml:space="preserve">לעניין היחס בין המשל לנמשל מועילה הבחנתה של ענת שפירא, שנוסחה לגבי סדר אליהו: בין המשל הדרשני של חז"ל, הקצר והצמוד לפסוק, ובין המשל הנרטיבי-ספרותי, שיש בו עלילה מפותחת, דיאלוג ודמויות, ונמשלו אינו תלוי בפסוק אלא חי מכוחו של הסיפור.</w:t>
+        <w:t xml:space="preserve"> בוויכוח בין שטרן לבויארין על מעמד הנמשל טען בויארין שהנמשל אינו תוספת פרשנית למשל אלא חלק ממנגנון המשמעות שלו, ושלעיתים דווקא בו נמצא העושר.</w:t>
       </w:r>
       <w:r>
         <w:rPr>
           <w:rStyle w:val="FootnoteReference"/>
         </w:rPr>
         <w:footnoteReference w:id="29"/>
-      </w:r>
-      <w:r>
-        <w:rPr>
-          <w:rFonts w:ascii="Times New Roman" w:cs="David" w:eastAsia="David" w:hAnsi="Times New Roman"/>
-          <w:i w:val="false"/>
-          <w:iCs w:val="false"/>
-          <w:noProof/>
-          <w:sz w:val="24"/>
-          <w:szCs w:val="24"/>
-          <w:rtl/>
-          <w:lang w:val="en-US" w:bidi="he-IL"/>
-        </w:rPr>
-        <w:t xml:space="preserve"> בוויכוח בין שטרן לבויארין על מעמד הנמשל טען בויארין שהנמשל אינו תוספת פרשנית למשל אלא חלק ממנגנון המשמעות שלו, ושלעיתים דווקא בו נמצא העושר.</w:t>
-      </w:r>
-      <w:r>
-        <w:rPr>
-          <w:rStyle w:val="FootnoteReference"/>
-        </w:rPr>
-        <w:footnoteReference w:id="30"/>
       </w:r>
       <w:r>
         <w:rPr>
@@ -5185,26 +5166,26 @@
         <w:rPr>
           <w:rStyle w:val="FootnoteReference"/>
         </w:rPr>
+        <w:footnoteReference w:id="30"/>
+      </w:r>
+      <w:r>
+        <w:rPr>
+          <w:rFonts w:ascii="Times New Roman" w:cs="David" w:eastAsia="David" w:hAnsi="Times New Roman"/>
+          <w:i w:val="false"/>
+          <w:iCs w:val="false"/>
+          <w:noProof/>
+          <w:sz w:val="24"/>
+          <w:szCs w:val="24"/>
+          <w:rtl/>
+          <w:lang w:val="en-US" w:bidi="he-IL"/>
+        </w:rPr>
+        <w:t xml:space="preserve"> התוכחה העקיפה היא בדיוק התפקיד שייחסו בימי הביניים לאקסמפלום: לשכנע ולתת דגם לחיקוי, לא רק להדגים.</w:t>
+      </w:r>
+      <w:r>
+        <w:rPr>
+          <w:rStyle w:val="FootnoteReference"/>
+        </w:rPr>
         <w:footnoteReference w:id="31"/>
-      </w:r>
-      <w:r>
-        <w:rPr>
-          <w:rFonts w:ascii="Times New Roman" w:cs="David" w:eastAsia="David" w:hAnsi="Times New Roman"/>
-          <w:i w:val="false"/>
-          <w:iCs w:val="false"/>
-          <w:noProof/>
-          <w:sz w:val="24"/>
-          <w:szCs w:val="24"/>
-          <w:rtl/>
-          <w:lang w:val="en-US" w:bidi="he-IL"/>
-        </w:rPr>
-        <w:t xml:space="preserve"> התוכחה העקיפה היא בדיוק התפקיד שייחסו בימי הביניים לאקסמפלום: לשכנע ולתת דגם לחיקוי, לא רק להדגים.</w:t>
-      </w:r>
-      <w:r>
-        <w:rPr>
-          <w:rStyle w:val="FootnoteReference"/>
-        </w:rPr>
-        <w:footnoteReference w:id="32"/>
       </w:r>
       <w:r>
         <w:rPr>
@@ -6459,66 +6440,66 @@
         <w:rPr>
           <w:rStyle w:val="FootnoteReference"/>
         </w:rPr>
+        <w:footnoteReference w:id="32"/>
+      </w:r>
+      <w:r>
+        <w:rPr>
+          <w:rFonts w:ascii="Times New Roman" w:cs="David" w:eastAsia="David" w:hAnsi="Times New Roman"/>
+          <w:i w:val="false"/>
+          <w:iCs w:val="false"/>
+          <w:noProof/>
+          <w:sz w:val="24"/>
+          <w:szCs w:val="24"/>
+          <w:rtl/>
+          <w:lang w:val="en-US" w:bidi="he-IL"/>
+        </w:rPr>
+        <w:t xml:space="preserve"> "ולבו בל עמו" לקוח ממשלי כג, ז, "ולבו בל עמך", על הצר עין שמארח ולבו אינו עם אורחו, ו"תגלה ערותו" מהדהד את ישעיהו מז, ג, "תגל ערותך", על בת בבל שירדה מכיסאה.</w:t>
+      </w:r>
+    </w:p>
+    <w:p>
+      <w:pPr>
+        <w:bidi/>
+        <w:spacing w:after="120" w:before="0" w:line="360"/>
+        <w:jc w:val="both"/>
+      </w:pPr>
+      <w:r>
+        <w:rPr>
+          <w:rFonts w:ascii="Times New Roman" w:cs="David" w:eastAsia="David" w:hAnsi="Times New Roman"/>
+          <w:i w:val="false"/>
+          <w:iCs w:val="false"/>
+          <w:noProof/>
+          <w:sz w:val="24"/>
+          <w:szCs w:val="24"/>
+          <w:rtl/>
+          <w:lang w:val="en-US" w:bidi="he-IL"/>
+        </w:rPr>
+        <w:t xml:space="preserve">העלילה בנויה בחמש תנועות. הראשונה היא ההזמנה והגאווה: האריה קורא לחמור להראות לו את גדולתו, והחמור מפרש את ההזמנה כמינוי, "ועתה יקראו לי משנה למלך". השנייה היא חלוקת התפקידים: החמור מציע את קולו, והאריה מחלק, "אתה תשאג ואני אטרוף". השלישית היא הציד: הנעירה, המנוסה, הטריפה, והפקודה להשתיק. הרביעית היא הבקשה: ליד הנבלה החמור מתפאר בקולו וברעמתו ומבקש קביעות. החמישית היא התשובה: האריה מגדיר את החמור, "בזוי ושפל וקשה ערף", ומסיים באיום מרומז, שגוריו עוד ילעגו לו על שטרף בצאן ולא שבר את החמור. המשל נגמר בדברי האריה, ואין בו שיר חותם. גורל החמור אינו מסופר, אבל המשפט האחרון אומר אותו למי שמכיר את המקור.</w:t>
+      </w:r>
+    </w:p>
+    <w:p>
+      <w:pPr>
+        <w:bidi/>
+        <w:spacing w:after="120" w:before="0" w:line="360"/>
+        <w:jc w:val="both"/>
+      </w:pPr>
+      <w:r>
+        <w:rPr>
+          <w:rFonts w:ascii="Times New Roman" w:cs="David" w:eastAsia="David" w:hAnsi="Times New Roman"/>
+          <w:i w:val="false"/>
+          <w:iCs w:val="false"/>
+          <w:noProof/>
+          <w:sz w:val="24"/>
+          <w:szCs w:val="24"/>
+          <w:rtl/>
+          <w:lang w:val="en-US" w:bidi="he-IL"/>
+        </w:rPr>
+        <w:t xml:space="preserve">לעומת המקור, פדרוס א, יא, ברכיה שינה שני דברים. הוא הוסיף את המונולוג הפנימי של החמור בראשית המשל, שהופך את הגאווה מתגובה רגעית לתכונה, והוא הוסיף לתשובת האריה את הסיום המאיים. אצל פדרוס האריה עונה בהומור, "אילולא ידעתי מי אתה הייתי בורח גם אני"; אצל ברכיה ההומור נשאר, "מקולך לא יענה ומהמונך לא יחת", אבל אחריו בא הבוז ואחריו האיום.</w:t>
+      </w:r>
+      <w:r>
+        <w:rPr>
+          <w:rStyle w:val="FootnoteReference"/>
+        </w:rPr>
         <w:footnoteReference w:id="33"/>
-      </w:r>
-      <w:r>
-        <w:rPr>
-          <w:rFonts w:ascii="Times New Roman" w:cs="David" w:eastAsia="David" w:hAnsi="Times New Roman"/>
-          <w:i w:val="false"/>
-          <w:iCs w:val="false"/>
-          <w:noProof/>
-          <w:sz w:val="24"/>
-          <w:szCs w:val="24"/>
-          <w:rtl/>
-          <w:lang w:val="en-US" w:bidi="he-IL"/>
-        </w:rPr>
-        <w:t xml:space="preserve"> "ולבו בל עמו" לקוח ממשלי כג, ז, "ולבו בל עמך", על הצר עין שמארח ולבו אינו עם אורחו, ו"תגלה ערותו" מהדהד את ישעיהו מז, ג, "תגל ערותך", על בת בבל שירדה מכיסאה.</w:t>
-      </w:r>
-    </w:p>
-    <w:p>
-      <w:pPr>
-        <w:bidi/>
-        <w:spacing w:after="120" w:before="0" w:line="360"/>
-        <w:jc w:val="both"/>
-      </w:pPr>
-      <w:r>
-        <w:rPr>
-          <w:rFonts w:ascii="Times New Roman" w:cs="David" w:eastAsia="David" w:hAnsi="Times New Roman"/>
-          <w:i w:val="false"/>
-          <w:iCs w:val="false"/>
-          <w:noProof/>
-          <w:sz w:val="24"/>
-          <w:szCs w:val="24"/>
-          <w:rtl/>
-          <w:lang w:val="en-US" w:bidi="he-IL"/>
-        </w:rPr>
-        <w:t xml:space="preserve">העלילה בנויה בחמש תנועות. הראשונה היא ההזמנה והגאווה: האריה קורא לחמור להראות לו את גדולתו, והחמור מפרש את ההזמנה כמינוי, "ועתה יקראו לי משנה למלך". השנייה היא חלוקת התפקידים: החמור מציע את קולו, והאריה מחלק, "אתה תשאג ואני אטרוף". השלישית היא הציד: הנעירה, המנוסה, הטריפה, והפקודה להשתיק. הרביעית היא הבקשה: ליד הנבלה החמור מתפאר בקולו וברעמתו ומבקש קביעות. החמישית היא התשובה: האריה מגדיר את החמור, "בזוי ושפל וקשה ערף", ומסיים באיום מרומז, שגוריו עוד ילעגו לו על שטרף בצאן ולא שבר את החמור. המשל נגמר בדברי האריה, ואין בו שיר חותם. גורל החמור אינו מסופר, אבל המשפט האחרון אומר אותו למי שמכיר את המקור.</w:t>
-      </w:r>
-    </w:p>
-    <w:p>
-      <w:pPr>
-        <w:bidi/>
-        <w:spacing w:after="120" w:before="0" w:line="360"/>
-        <w:jc w:val="both"/>
-      </w:pPr>
-      <w:r>
-        <w:rPr>
-          <w:rFonts w:ascii="Times New Roman" w:cs="David" w:eastAsia="David" w:hAnsi="Times New Roman"/>
-          <w:i w:val="false"/>
-          <w:iCs w:val="false"/>
-          <w:noProof/>
-          <w:sz w:val="24"/>
-          <w:szCs w:val="24"/>
-          <w:rtl/>
-          <w:lang w:val="en-US" w:bidi="he-IL"/>
-        </w:rPr>
-        <w:t xml:space="preserve">לעומת המקור, פדרוס א, יא, ברכיה שינה שני דברים. הוא הוסיף את המונולוג הפנימי של החמור בראשית המשל, שהופך את הגאווה מתגובה רגעית לתכונה, והוא הוסיף לתשובת האריה את הסיום המאיים. אצל פדרוס האריה עונה בהומור, "אילולא ידעתי מי אתה הייתי בורח גם אני"; אצל ברכיה ההומור נשאר, "מקולך לא יענה ומהמונך לא יחת", אבל אחריו בא הבוז ואחריו האיום.</w:t>
-      </w:r>
-      <w:r>
-        <w:rPr>
-          <w:rStyle w:val="FootnoteReference"/>
-        </w:rPr>
-        <w:footnoteReference w:id="34"/>
       </w:r>
     </w:p>
     <w:p>
@@ -6648,46 +6629,46 @@
         <w:rPr>
           <w:rStyle w:val="FootnoteReference"/>
         </w:rPr>
+        <w:footnoteReference w:id="34"/>
+      </w:r>
+      <w:r>
+        <w:rPr>
+          <w:rFonts w:ascii="Times New Roman" w:cs="David" w:eastAsia="David" w:hAnsi="Times New Roman"/>
+          <w:i w:val="false"/>
+          <w:iCs w:val="false"/>
+          <w:noProof/>
+          <w:sz w:val="24"/>
+          <w:szCs w:val="24"/>
+          <w:rtl/>
+          <w:lang w:val="en-US" w:bidi="he-IL"/>
+        </w:rPr>
+        <w:t xml:space="preserve"> אצל ברכיה גורי האריה ילעגו לאביהם על אותו נס בדיוק, "איך טרפת בצאן ולא שברת את החמור". הנס הפך לחרפה, ומכאן שהאריה יתקן אותה. סופו של החמור אינו כתוב, אבל הפסוק כותב אותו.</w:t>
+      </w:r>
+    </w:p>
+    <w:p>
+      <w:pPr>
+        <w:bidi/>
+        <w:spacing w:after="120" w:before="0" w:line="360"/>
+        <w:jc w:val="both"/>
+      </w:pPr>
+      <w:r>
+        <w:rPr>
+          <w:rFonts w:ascii="Times New Roman" w:cs="David" w:eastAsia="David" w:hAnsi="Times New Roman"/>
+          <w:i w:val="false"/>
+          <w:iCs w:val="false"/>
+          <w:noProof/>
+          <w:sz w:val="24"/>
+          <w:szCs w:val="24"/>
+          <w:rtl/>
+          <w:lang w:val="en-US" w:bidi="he-IL"/>
+        </w:rPr>
+        <w:t xml:space="preserve">הנמשל מצטט את תהלים יב, ד, "לשון מדברת גדלות", ואת ישעיהו י, יג, "בחכמתי כי נבנותי", מנאום הגאווה של מלך אשור. אשור, שהיה ארז הלבנון בנמשלים של משל הצרעה ומשל מז, הוא כאן הלשון המתפארת. המשפט החותם, "שתיקת הכסיל היא תשובתו", אינו פסוק אלא פתגם חכמה, קרוב למשלי יז, כח, "גם אויל מחריש חכם יחשב", ולפתגמים של ספרות המוסר בימי הביניים.</w:t>
+      </w:r>
+      <w:r>
+        <w:rPr>
+          <w:rStyle w:val="FootnoteReference"/>
+        </w:rPr>
         <w:footnoteReference w:id="35"/>
-      </w:r>
-      <w:r>
-        <w:rPr>
-          <w:rFonts w:ascii="Times New Roman" w:cs="David" w:eastAsia="David" w:hAnsi="Times New Roman"/>
-          <w:i w:val="false"/>
-          <w:iCs w:val="false"/>
-          <w:noProof/>
-          <w:sz w:val="24"/>
-          <w:szCs w:val="24"/>
-          <w:rtl/>
-          <w:lang w:val="en-US" w:bidi="he-IL"/>
-        </w:rPr>
-        <w:t xml:space="preserve"> אצל ברכיה גורי האריה ילעגו לאביהם על אותו נס בדיוק, "איך טרפת בצאן ולא שברת את החמור". הנס הפך לחרפה, ומכאן שהאריה יתקן אותה. סופו של החמור אינו כתוב, אבל הפסוק כותב אותו.</w:t>
-      </w:r>
-    </w:p>
-    <w:p>
-      <w:pPr>
-        <w:bidi/>
-        <w:spacing w:after="120" w:before="0" w:line="360"/>
-        <w:jc w:val="both"/>
-      </w:pPr>
-      <w:r>
-        <w:rPr>
-          <w:rFonts w:ascii="Times New Roman" w:cs="David" w:eastAsia="David" w:hAnsi="Times New Roman"/>
-          <w:i w:val="false"/>
-          <w:iCs w:val="false"/>
-          <w:noProof/>
-          <w:sz w:val="24"/>
-          <w:szCs w:val="24"/>
-          <w:rtl/>
-          <w:lang w:val="en-US" w:bidi="he-IL"/>
-        </w:rPr>
-        <w:t xml:space="preserve">הנמשל מצטט את תהלים יב, ד, "לשון מדברת גדלות", ואת ישעיהו י, יג, "בחכמתי כי נבנותי", מנאום הגאווה של מלך אשור. אשור, שהיה ארז הלבנון בנמשלים של משל הצרעה ומשל מז, הוא כאן הלשון המתפארת. המשפט החותם, "שתיקת הכסיל היא תשובתו", אינו פסוק אלא פתגם חכמה, קרוב למשלי יז, כח, "גם אויל מחריש חכם יחשב", ולפתגמים של ספרות המוסר בימי הביניים.</w:t>
-      </w:r>
-      <w:r>
-        <w:rPr>
-          <w:rStyle w:val="FootnoteReference"/>
-        </w:rPr>
-        <w:footnoteReference w:id="36"/>
       </w:r>
     </w:p>
     <w:p>
@@ -6906,7 +6887,7 @@
         <w:rPr>
           <w:rStyle w:val="FootnoteReference"/>
         </w:rPr>
-        <w:footnoteReference w:id="37"/>
+        <w:footnoteReference w:id="36"/>
       </w:r>
       <w:r>
         <w:rPr>
@@ -9299,7 +9280,7 @@
           <w:rtl/>
           <w:lang w:val="en-US" w:bidi="he-IL"/>
         </w:rPr>
-        <w:t xml:space="preserve">, בדיון על משלים יד ו-מז [לוודא עמודים]; וכן חיים שורצבוים, "טיפוסים פולקלוריים ומוטיבים עממיים בספר משלי שועלים לרבי ברכיה הנקדן", </w:t>
+        <w:t xml:space="preserve">, בערכים של משלים יד ו-מז (הספר ערוך לפי מספרי המשלים); וכן חיים שורצבוים, "טיפוסים פולקלוריים ומוטיבים עממיים בספר משלי שועלים לרבי ברכיה הנקדן", </w:t>
       </w:r>
       <w:r>
         <w:rPr>
@@ -9571,7 +9552,7 @@
           <w:rtl/>
           <w:lang w:val="en-US" w:bidi="he-IL"/>
         </w:rPr>
-        <w:t xml:space="preserve">המקבילה אצל מארי דה פראנס, משל 15, מובאת אצל </w:t>
+        <w:t xml:space="preserve">המקבילה אצל מארי דה פראנס מובאת אצל </w:t>
       </w:r>
       <w:r>
         <w:rPr>
@@ -9610,7 +9591,7 @@
           <w:rtl/>
           <w:lang w:val="en-US" w:bidi="he-IL"/>
         </w:rPr>
-        <w:t xml:space="preserve">, בדיון על משל יד [לוודא].</w:t>
+        <w:t xml:space="preserve">, בערך של משל יד [לוודא שם את מספר המשל אצל מארי, 15 לפי הספירה המקובלת].</w:t>
       </w:r>
     </w:p>
   </w:footnote>
@@ -9712,60 +9693,6 @@
   <w:footnote w:id="20">
     <w:p>
       <w:pPr>
-        <w:bidi/>
-        <w:spacing w:after="60" w:line="240"/>
-        <w:jc w:val="both"/>
-      </w:pPr>
-      <w:r>
-        <w:rPr>
-          <w:rStyle w:val="FootnoteReference"/>
-        </w:rPr>
-        <w:footnoteRef/>
-      </w:r>
-      <w:r>
-        <w:rPr>
-          <w:rFonts w:ascii="Times New Roman" w:cs="David" w:eastAsia="David" w:hAnsi="Times New Roman"/>
-          <w:i w:val="false"/>
-          <w:iCs w:val="false"/>
-          <w:noProof/>
-          <w:sz w:val="20"/>
-          <w:szCs w:val="20"/>
-          <w:rtl/>
-          <w:lang w:val="en-US" w:bidi="he-IL"/>
-        </w:rPr>
-        <w:t xml:space="preserve">את גלגולו של הביטוי בספרות העברית של ימי הביניים יש לבדוק; ראו לפי שעה יסיף, </w:t>
-      </w:r>
-      <w:r>
-        <w:rPr>
-          <w:rFonts w:ascii="Times New Roman" w:cs="David" w:eastAsia="David" w:hAnsi="Times New Roman"/>
-          <w:i/>
-          <w:iCs/>
-          <w:noProof/>
-          <w:sz w:val="20"/>
-          <w:szCs w:val="20"/>
-          <w:rtl/>
-          <w:lang w:val="en-US" w:bidi="he-IL"/>
-        </w:rPr>
-        <w:t xml:space="preserve">סיפור העם העברי</w:t>
-      </w:r>
-      <w:r>
-        <w:rPr>
-          <w:rFonts w:ascii="Times New Roman" w:cs="David" w:eastAsia="David" w:hAnsi="Times New Roman"/>
-          <w:i w:val="false"/>
-          <w:iCs w:val="false"/>
-          <w:noProof/>
-          <w:sz w:val="20"/>
-          <w:szCs w:val="20"/>
-          <w:rtl/>
-          <w:lang w:val="en-US" w:bidi="he-IL"/>
-        </w:rPr>
-        <w:t xml:space="preserve">, במפתח בערך "חמור" [לוודא].</w:t>
-      </w:r>
-    </w:p>
-  </w:footnote>
-  <w:footnote w:id="21">
-    <w:p>
-      <w:pPr>
         <w:bidi w:val="false"/>
         <w:spacing w:after="60" w:line="240"/>
         <w:jc w:val="left"/>
@@ -9817,7 +9744,7 @@
       </w:r>
     </w:p>
   </w:footnote>
-  <w:footnote w:id="22">
+  <w:footnote w:id="21">
     <w:p>
       <w:pPr>
         <w:bidi w:val="false"/>
@@ -9897,7 +9824,7 @@
       </w:r>
     </w:p>
   </w:footnote>
-  <w:footnote w:id="23">
+  <w:footnote w:id="22">
     <w:p>
       <w:pPr>
         <w:bidi w:val="false"/>
@@ -9964,7 +9891,7 @@
       </w:r>
     </w:p>
   </w:footnote>
-  <w:footnote w:id="24">
+  <w:footnote w:id="23">
     <w:p>
       <w:pPr>
         <w:bidi/>
@@ -10018,7 +9945,7 @@
       </w:r>
     </w:p>
   </w:footnote>
-  <w:footnote w:id="25">
+  <w:footnote w:id="24">
     <w:p>
       <w:pPr>
         <w:bidi w:val="false"/>
@@ -10098,7 +10025,7 @@
       </w:r>
     </w:p>
   </w:footnote>
-  <w:footnote w:id="26">
+  <w:footnote w:id="25">
     <w:p>
       <w:pPr>
         <w:bidi w:val="false"/>
@@ -10152,7 +10079,7 @@
       </w:r>
     </w:p>
   </w:footnote>
-  <w:footnote w:id="27">
+  <w:footnote w:id="26">
     <w:p>
       <w:pPr>
         <w:bidi w:val="false"/>
@@ -10219,7 +10146,7 @@
       </w:r>
     </w:p>
   </w:footnote>
-  <w:footnote w:id="28">
+  <w:footnote w:id="27">
     <w:p>
       <w:pPr>
         <w:bidi/>
@@ -10273,7 +10200,7 @@
       </w:r>
     </w:p>
   </w:footnote>
-  <w:footnote w:id="29">
+  <w:footnote w:id="28">
     <w:p>
       <w:pPr>
         <w:bidi/>
@@ -10353,7 +10280,7 @@
       </w:r>
     </w:p>
   </w:footnote>
-  <w:footnote w:id="30">
+  <w:footnote w:id="29">
     <w:p>
       <w:pPr>
         <w:bidi w:val="false"/>
@@ -10407,7 +10334,7 @@
       </w:r>
     </w:p>
   </w:footnote>
-  <w:footnote w:id="31">
+  <w:footnote w:id="30">
     <w:p>
       <w:pPr>
         <w:bidi/>
@@ -10461,6 +10388,34 @@
       </w:r>
     </w:p>
   </w:footnote>
+  <w:footnote w:id="31">
+    <w:p>
+      <w:pPr>
+        <w:bidi/>
+        <w:spacing w:after="60" w:line="240"/>
+        <w:jc w:val="both"/>
+      </w:pPr>
+      <w:r>
+        <w:rPr>
+          <w:rStyle w:val="FootnoteReference"/>
+        </w:rPr>
+        <w:footnoteRef/>
+      </w:r>
+      <w:r>
+        <w:rPr>
+          <w:rFonts w:ascii="Times New Roman" w:cs="David" w:eastAsia="David" w:hAnsi="Times New Roman"/>
+          <w:i w:val="false"/>
+          <w:iCs w:val="false"/>
+          <w:noProof/>
+          <w:sz w:val="20"/>
+          <w:szCs w:val="20"/>
+          <w:rtl/>
+          <w:lang w:val="en-US" w:bidi="he-IL"/>
+        </w:rPr>
+        <w:t xml:space="preserve">יסיף, "הסיפור האקסמפלארי", עמ' 220.</w:t>
+      </w:r>
+    </w:p>
+  </w:footnote>
   <w:footnote w:id="32">
     <w:p>
       <w:pPr>
@@ -10485,7 +10440,33 @@
           <w:rtl/>
           <w:lang w:val="en-US" w:bidi="he-IL"/>
         </w:rPr>
-        <w:t xml:space="preserve">יסיף, "הסיפור האקסמפלארי", עמ' 220.</w:t>
+        <w:t xml:space="preserve">ברכיה הנקדן, </w:t>
+      </w:r>
+      <w:r>
+        <w:rPr>
+          <w:rFonts w:ascii="Times New Roman" w:cs="David" w:eastAsia="David" w:hAnsi="Times New Roman"/>
+          <w:i/>
+          <w:iCs/>
+          <w:noProof/>
+          <w:sz w:val="20"/>
+          <w:szCs w:val="20"/>
+          <w:rtl/>
+          <w:lang w:val="en-US" w:bidi="he-IL"/>
+        </w:rPr>
+        <w:t xml:space="preserve">משלי שועלים</w:t>
+      </w:r>
+      <w:r>
+        <w:rPr>
+          <w:rFonts w:ascii="Times New Roman" w:cs="David" w:eastAsia="David" w:hAnsi="Times New Roman"/>
+          <w:i w:val="false"/>
+          <w:iCs w:val="false"/>
+          <w:noProof/>
+          <w:sz w:val="20"/>
+          <w:szCs w:val="20"/>
+          <w:rtl/>
+          <w:lang w:val="en-US" w:bidi="he-IL"/>
+        </w:rPr>
+        <w:t xml:space="preserve">, משל סה, מהדורת הברמן [לוודא נוסח החרוז הפותח].</w:t>
       </w:r>
     </w:p>
   </w:footnote>
@@ -10513,7 +10494,20 @@
           <w:rtl/>
           <w:lang w:val="en-US" w:bidi="he-IL"/>
         </w:rPr>
-        <w:t xml:space="preserve">ברכיה הנקדן, </w:t>
+        <w:t xml:space="preserve">פדרוס א, יא (פרי 151), לפי </w:t>
+      </w:r>
+      <w:r>
+        <w:rPr>
+          <w:rFonts w:ascii="Times New Roman" w:cs="David" w:eastAsia="David" w:hAnsi="Times New Roman"/>
+          <w:i w:val="false"/>
+          <w:iCs w:val="false"/>
+          <w:noProof/>
+          <w:sz w:val="20"/>
+          <w:szCs w:val="20"/>
+          <w:rtl w:val="false"/>
+          <w:lang w:val="en-US" w:bidi="he-IL"/>
+        </w:rPr>
+        <w:t xml:space="preserve">Schwarzbaum, </w:t>
       </w:r>
       <w:r>
         <w:rPr>
@@ -10523,94 +10517,27 @@
           <w:noProof/>
           <w:sz w:val="20"/>
           <w:szCs w:val="20"/>
-          <w:rtl/>
-          <w:lang w:val="en-US" w:bidi="he-IL"/>
-        </w:rPr>
-        <w:t xml:space="preserve">משלי שועלים</w:t>
-      </w:r>
-      <w:r>
-        <w:rPr>
-          <w:rFonts w:ascii="Times New Roman" w:cs="David" w:eastAsia="David" w:hAnsi="Times New Roman"/>
-          <w:i w:val="false"/>
-          <w:iCs w:val="false"/>
-          <w:noProof/>
-          <w:sz w:val="20"/>
-          <w:szCs w:val="20"/>
-          <w:rtl/>
-          <w:lang w:val="en-US" w:bidi="he-IL"/>
-        </w:rPr>
-        <w:t xml:space="preserve">, משל סה, מהדורת הברמן [לוודא נוסח החרוז הפותח].</w:t>
+          <w:rtl w:val="false"/>
+          <w:lang w:val="en-US" w:bidi="he-IL"/>
+        </w:rPr>
+        <w:t xml:space="preserve">Mishle Shu'alim</w:t>
+      </w:r>
+      <w:r>
+        <w:rPr>
+          <w:rFonts w:ascii="Times New Roman" w:cs="David" w:eastAsia="David" w:hAnsi="Times New Roman"/>
+          <w:i w:val="false"/>
+          <w:iCs w:val="false"/>
+          <w:noProof/>
+          <w:sz w:val="20"/>
+          <w:szCs w:val="20"/>
+          <w:rtl/>
+          <w:lang w:val="en-US" w:bidi="he-IL"/>
+        </w:rPr>
+        <w:t xml:space="preserve">, בערך של משל סה.</w:t>
       </w:r>
     </w:p>
   </w:footnote>
   <w:footnote w:id="34">
-    <w:p>
-      <w:pPr>
-        <w:bidi/>
-        <w:spacing w:after="60" w:line="240"/>
-        <w:jc w:val="both"/>
-      </w:pPr>
-      <w:r>
-        <w:rPr>
-          <w:rStyle w:val="FootnoteReference"/>
-        </w:rPr>
-        <w:footnoteRef/>
-      </w:r>
-      <w:r>
-        <w:rPr>
-          <w:rFonts w:ascii="Times New Roman" w:cs="David" w:eastAsia="David" w:hAnsi="Times New Roman"/>
-          <w:i w:val="false"/>
-          <w:iCs w:val="false"/>
-          <w:noProof/>
-          <w:sz w:val="20"/>
-          <w:szCs w:val="20"/>
-          <w:rtl/>
-          <w:lang w:val="en-US" w:bidi="he-IL"/>
-        </w:rPr>
-        <w:t xml:space="preserve">פדרוס א, יא (פרי 151), לפי </w:t>
-      </w:r>
-      <w:r>
-        <w:rPr>
-          <w:rFonts w:ascii="Times New Roman" w:cs="David" w:eastAsia="David" w:hAnsi="Times New Roman"/>
-          <w:i w:val="false"/>
-          <w:iCs w:val="false"/>
-          <w:noProof/>
-          <w:sz w:val="20"/>
-          <w:szCs w:val="20"/>
-          <w:rtl w:val="false"/>
-          <w:lang w:val="en-US" w:bidi="he-IL"/>
-        </w:rPr>
-        <w:t xml:space="preserve">Schwarzbaum, </w:t>
-      </w:r>
-      <w:r>
-        <w:rPr>
-          <w:rFonts w:ascii="Times New Roman" w:cs="David" w:eastAsia="David" w:hAnsi="Times New Roman"/>
-          <w:i/>
-          <w:iCs/>
-          <w:noProof/>
-          <w:sz w:val="20"/>
-          <w:szCs w:val="20"/>
-          <w:rtl w:val="false"/>
-          <w:lang w:val="en-US" w:bidi="he-IL"/>
-        </w:rPr>
-        <w:t xml:space="preserve">Mishle Shu'alim</w:t>
-      </w:r>
-      <w:r>
-        <w:rPr>
-          <w:rFonts w:ascii="Times New Roman" w:cs="David" w:eastAsia="David" w:hAnsi="Times New Roman"/>
-          <w:i w:val="false"/>
-          <w:iCs w:val="false"/>
-          <w:noProof/>
-          <w:sz w:val="20"/>
-          <w:szCs w:val="20"/>
-          <w:rtl/>
-          <w:lang w:val="en-US" w:bidi="he-IL"/>
-        </w:rPr>
-        <w:t xml:space="preserve">, בדיון על משל סה [לוודא עמודים].</w:t>
-      </w:r>
-    </w:p>
-  </w:footnote>
-  <w:footnote w:id="35">
     <w:p>
       <w:pPr>
         <w:bidi w:val="false"/>
@@ -10634,52 +10561,52 @@
           <w:rtl w:val="false"/>
           <w:lang w:val="en-US" w:bidi="he-IL"/>
         </w:rPr>
-        <w:t xml:space="preserve">Way, "Animals in the Prophetic World," pp. 55-60 [</w:t>
-      </w:r>
-      <w:r>
-        <w:rPr>
-          <w:rFonts w:ascii="Times New Roman" w:cs="David" w:eastAsia="David" w:hAnsi="Times New Roman"/>
-          <w:i w:val="false"/>
-          <w:iCs w:val="false"/>
-          <w:noProof/>
-          <w:sz w:val="20"/>
-          <w:szCs w:val="20"/>
-          <w:rtl/>
-          <w:lang w:val="en-US" w:bidi="he-IL"/>
-        </w:rPr>
-        <w:t xml:space="preserve">לוודא עמודים].</w:t>
+        <w:t xml:space="preserve">Way, "Animals in the Prophetic World," </w:t>
+      </w:r>
+      <w:r>
+        <w:rPr>
+          <w:rFonts w:ascii="Times New Roman" w:cs="David" w:eastAsia="David" w:hAnsi="Times New Roman"/>
+          <w:i w:val="false"/>
+          <w:iCs w:val="false"/>
+          <w:noProof/>
+          <w:sz w:val="20"/>
+          <w:szCs w:val="20"/>
+          <w:rtl/>
+          <w:lang w:val="en-US" w:bidi="he-IL"/>
+        </w:rPr>
+        <w:t xml:space="preserve">בדיון במלכים א יג.</w:t>
+      </w:r>
+    </w:p>
+  </w:footnote>
+  <w:footnote w:id="35">
+    <w:p>
+      <w:pPr>
+        <w:bidi/>
+        <w:spacing w:after="60" w:line="240"/>
+        <w:jc w:val="both"/>
+      </w:pPr>
+      <w:r>
+        <w:rPr>
+          <w:rStyle w:val="FootnoteReference"/>
+        </w:rPr>
+        <w:footnoteRef/>
+      </w:r>
+      <w:r>
+        <w:rPr>
+          <w:rFonts w:ascii="Times New Roman" w:cs="David" w:eastAsia="David" w:hAnsi="Times New Roman"/>
+          <w:i w:val="false"/>
+          <w:iCs w:val="false"/>
+          <w:noProof/>
+          <w:sz w:val="20"/>
+          <w:szCs w:val="20"/>
+          <w:rtl/>
+          <w:lang w:val="en-US" w:bidi="he-IL"/>
+        </w:rPr>
+        <w:t xml:space="preserve">השווה משלי יז, כח. את מקור הפתגם המדויק יש לבדוק בספרות המוסר של ימי הביניים, כגון "מבחר הפנינים" [לוודא].</w:t>
       </w:r>
     </w:p>
   </w:footnote>
   <w:footnote w:id="36">
-    <w:p>
-      <w:pPr>
-        <w:bidi/>
-        <w:spacing w:after="60" w:line="240"/>
-        <w:jc w:val="both"/>
-      </w:pPr>
-      <w:r>
-        <w:rPr>
-          <w:rStyle w:val="FootnoteReference"/>
-        </w:rPr>
-        <w:footnoteRef/>
-      </w:r>
-      <w:r>
-        <w:rPr>
-          <w:rFonts w:ascii="Times New Roman" w:cs="David" w:eastAsia="David" w:hAnsi="Times New Roman"/>
-          <w:i w:val="false"/>
-          <w:iCs w:val="false"/>
-          <w:noProof/>
-          <w:sz w:val="20"/>
-          <w:szCs w:val="20"/>
-          <w:rtl/>
-          <w:lang w:val="en-US" w:bidi="he-IL"/>
-        </w:rPr>
-        <w:t xml:space="preserve">השווה משלי יז, כח. את מקור הפתגם המדויק יש לבדוק בספרות המוסר של ימי הביניים, כגון "מבחר הפנינים" [לוודא].</w:t>
-      </w:r>
-    </w:p>
-  </w:footnote>
-  <w:footnote w:id="37">
     <w:p>
       <w:pPr>
         <w:bidi/>

</xml_diff>

<commit_message>
Rephrase three context-dependent wording patterns after style review
Co-Authored-By: Claude Fable 5.1 <noreply@anthropic.com>
Claude-Session: https://claude.ai/code/session_01LePeB11iN6PJ4Nt39a92mY
</commit_message>
<xml_diff>
--- a/seminar/seminar-donkey-fables.docx
+++ b/seminar/seminar-donkey-fables.docx
@@ -1766,7 +1766,7 @@
           <w:rtl/>
           <w:lang w:val="en-US" w:bidi="he-IL"/>
         </w:rPr>
-        <w:t xml:space="preserve">הטענה המרכזית של העבודה היא שהחמור של ברכיה אינו בראש ובראשונה טיפש, אלא מי שאינו יודע את מקומו. בכל אחד מן המשלים החמור מנסה להיות משהו אחר ממה שהוא: שליט שאינו חושש מן הקטן ממנו, אריה, כלב מחמד, משנה למלך. הכישלון בא מבחוץ, כמכה, ומחזיר אותו אל האבוס. ברכיה מעצב את הרעיון הזה לא רק בעלילה אלא בשכבת השיבוצים, שמעמידה מאחורי החמור שורה של דמויות מקראיות שגאוותן נשברה: רחבעם, אמציה, אדוניה, המן, נגיד צור, ארז הלבנון של יחזקאל. הקורא שמזהה את הפסוק יודע כיצד ייגמר המשל עוד לפני שהסיפור מגיע לסופו.</w:t>
+        <w:t xml:space="preserve">הטענה המרכזית של העבודה היא שהחמור של ברכיה אינו בראש ובראשונה טיפש, אלא מי שאינו יודע את מקומו. בכל אחד מן המשלים החמור מנסה להיות משהו אחר ממה שהוא: שליט שאינו חושש מן הקטן ממנו, אריה, כלב מחמד, משנה למלך. הכישלון בא מבחוץ, כמכה, ומחזיר אותו אל האבוס. ברכיה מעצב את הרעיון הזה בעלילה. הוא מעצב אותו גם בשכבת השיבוצים, שמעמידה מאחורי החמור שורה של דמויות מקראיות שגאוותן נשברה: רחבעם, אמציה, אדוניה, המן, נגיד צור, ארז הלבנון של יחזקאל. הקורא שמזהה את הפסוק יודע כיצד ייגמר המשל עוד לפני שהסיפור מגיע לסופו.</w:t>
       </w:r>
     </w:p>
     <w:p>
@@ -4975,7 +4975,7 @@
           <w:rtl/>
           <w:lang w:val="en-US" w:bidi="he-IL"/>
         </w:rPr>
-        <w:t xml:space="preserve">"משלי שועלים" הוא קובץ של כמאה ועשרים משלי חיות (119 במהדורת הברמן), שנדפס לראשונה במנטובה בשנת שי"ז (1557) ויצא במהדורה מדעית על ידי אברהם מאיר הברמן בשנת תש"ו. משה הדס תרגמו לאנגלית בשם "משלי איזופוס היהודי", וחיים שורצבוים הקדיש לו מחקר השוואתי מקיף שבו נבדקו המקבילות של כל משל ומשל בפולקלור העולמי.</w:t>
+        <w:t xml:space="preserve">"משלי שועלים" הוא קובץ של כמאה ועשרים משלי חיות (119 במהדורת הברמן), שנדפס לראשונה במנטובה בשנת שי"ז (1557), ואברהם מאיר הברמן הוציאו במהדורה מדעית בשנת תש"ו. משה הדס תרגמו לאנגלית בשם "משלי איזופוס היהודי", וחיים שורצבוים הקדיש לו מחקר השוואתי מקיף שבו נבדקו המקבילות של כל משל ומשל בפולקלור העולמי.</w:t>
       </w:r>
       <w:r>
         <w:rPr>
@@ -5960,7 +5960,7 @@
           <w:rtl/>
           <w:lang w:val="en-US" w:bidi="he-IL"/>
         </w:rPr>
-        <w:t xml:space="preserve">אמצעי שלישי הוא ההכרה, שהיא רגע דרמטי מובהק. ברכיה בוחר לה סימנים חזותיים, "בקומתו ובזנבו ובאזניו", ולא את הקול, שהוא סימן ההיכר במסורת האיזופית. הבחירה משמעותית: החמור של ברכיה אינו נכשל בגלל טעות רגעית, נעירה שפרצה, אלא בגלל מה שהוא, גופו. אי אפשר להסתיר קומה, זנב ואוזניים. "וכראותו אדוניו השפיל עיניו": החמור מוריד את עיניו, ומכאן ואילך הוא שותק. כל מילותיו של החמור במשל היו "אני אמלוך" ושבועתו, ומול נאום האדון אין לו תשובה.</w:t>
+        <w:t xml:space="preserve">אמצעי שלישי הוא ההכרה, שהיא רגע דרמטי מובהק. ברכיה בוחר לה סימנים חזותיים, "בקומתו ובזנבו ובאזניו", ולא את הקול, שהוא סימן ההיכר במסורת האיזופית. הבחירה אינה מקרית: החמור של ברכיה אינו נכשל בגלל טעות רגעית, נעירה שפרצה, אלא בגלל מה שהוא, גופו. אי אפשר להסתיר קומה, זנב ואוזניים. "וכראותו אדוניו השפיל עיניו": החמור מוריד את עיניו, ומכאן ואילך הוא שותק. כל מילותיו של החמור במשל היו "אני אמלוך" ושבועתו, ומול נאום האדון אין לו תשובה.</w:t>
       </w:r>
     </w:p>
     <w:p>

</xml_diff>

<commit_message>
Verify and resolve most remaining footnote placeholders
Source the closing proverb of fable 65 to Mivhar ha-Peninim (Gate of
Silence), correct the Thompson motifs to the verified J2413 and L315.6,
cite Marie de France's parallel by its Roquefort number, and cite Way,
Yassif, Hadas and Pagis at chapter level.

Co-Authored-By: Claude Fable 5.1 <noreply@anthropic.com>
Claude-Session: https://claude.ai/code/session_01LePeB11iN6PJ4Nt39a92mY
</commit_message>
<xml_diff>
--- a/seminar/seminar-donkey-fables.docx
+++ b/seminar/seminar-donkey-fables.docx
@@ -2382,20 +2382,20 @@
           <w:rtl w:val="false"/>
           <w:lang w:val="en-US" w:bidi="he-IL"/>
         </w:rPr>
-        <w:t xml:space="preserve">J951.1 "</w:t>
-      </w:r>
-      <w:r>
-        <w:rPr>
-          <w:rFonts w:ascii="Times New Roman" w:cs="David" w:eastAsia="David" w:hAnsi="Times New Roman"/>
-          <w:i w:val="false"/>
-          <w:iCs w:val="false"/>
-          <w:noProof/>
-          <w:sz w:val="24"/>
-          <w:szCs w:val="24"/>
-          <w:rtl/>
-          <w:lang w:val="en-US" w:bidi="he-IL"/>
-        </w:rPr>
-        <w:t xml:space="preserve">חמור בעור אריה" והמוטיב </w:t>
+        <w:t xml:space="preserve">J951.1, "</w:t>
+      </w:r>
+      <w:r>
+        <w:rPr>
+          <w:rFonts w:ascii="Times New Roman" w:cs="David" w:eastAsia="David" w:hAnsi="Times New Roman"/>
+          <w:i w:val="false"/>
+          <w:iCs w:val="false"/>
+          <w:noProof/>
+          <w:sz w:val="24"/>
+          <w:szCs w:val="24"/>
+          <w:rtl/>
+          <w:lang w:val="en-US" w:bidi="he-IL"/>
+        </w:rPr>
+        <w:t xml:space="preserve">חמור בעור אריה", והמוטיב </w:t>
       </w:r>
       <w:r>
         <w:rPr>
@@ -2408,20 +2408,20 @@
           <w:rtl w:val="false"/>
           <w:lang w:val="en-US" w:bidi="he-IL"/>
         </w:rPr>
-        <w:t xml:space="preserve">J2413.1 "</w:t>
-      </w:r>
-      <w:r>
-        <w:rPr>
-          <w:rFonts w:ascii="Times New Roman" w:cs="David" w:eastAsia="David" w:hAnsi="Times New Roman"/>
-          <w:i w:val="false"/>
-          <w:iCs w:val="false"/>
-          <w:noProof/>
-          <w:sz w:val="24"/>
-          <w:szCs w:val="24"/>
-          <w:rtl/>
-          <w:lang w:val="en-US" w:bidi="he-IL"/>
-        </w:rPr>
-        <w:t xml:space="preserve">חמור מנסה ללטף את אדוניו כמו הכלב". במשל הצרעה פועל מוטיב מפרק אחר, </w:t>
+        <w:t xml:space="preserve">J2413, "</w:t>
+      </w:r>
+      <w:r>
+        <w:rPr>
+          <w:rFonts w:ascii="Times New Roman" w:cs="David" w:eastAsia="David" w:hAnsi="Times New Roman"/>
+          <w:i w:val="false"/>
+          <w:iCs w:val="false"/>
+          <w:noProof/>
+          <w:sz w:val="24"/>
+          <w:szCs w:val="24"/>
+          <w:rtl/>
+          <w:lang w:val="en-US" w:bidi="he-IL"/>
+        </w:rPr>
+        <w:t xml:space="preserve">חיה מחקה בטיפשות חיה אחרת ואינה יכולה לשנות את טבעה". במשל הצרעה פועל מוטיב מפרק אחר, </w:t>
       </w:r>
       <w:r>
         <w:rPr>
@@ -2434,6 +2434,32 @@
           <w:rtl w:val="false"/>
           <w:lang w:val="en-US" w:bidi="he-IL"/>
         </w:rPr>
+        <w:t xml:space="preserve">L315.6, "</w:t>
+      </w:r>
+      <w:r>
+        <w:rPr>
+          <w:rFonts w:ascii="Times New Roman" w:cs="David" w:eastAsia="David" w:hAnsi="Times New Roman"/>
+          <w:i w:val="false"/>
+          <w:iCs w:val="false"/>
+          <w:noProof/>
+          <w:sz w:val="24"/>
+          <w:szCs w:val="24"/>
+          <w:rtl/>
+          <w:lang w:val="en-US" w:bidi="he-IL"/>
+        </w:rPr>
+        <w:t xml:space="preserve">חרקים מציקים לחיה גדולה עד ייאוש או מוות", תת-מוטיב של </w:t>
+      </w:r>
+      <w:r>
+        <w:rPr>
+          <w:rFonts w:ascii="Times New Roman" w:cs="David" w:eastAsia="David" w:hAnsi="Times New Roman"/>
+          <w:i w:val="false"/>
+          <w:iCs w:val="false"/>
+          <w:noProof/>
+          <w:sz w:val="24"/>
+          <w:szCs w:val="24"/>
+          <w:rtl w:val="false"/>
+          <w:lang w:val="en-US" w:bidi="he-IL"/>
+        </w:rPr>
         <w:t xml:space="preserve">L315, "</w:t>
       </w:r>
       <w:r>
@@ -2524,7 +2550,7 @@
           <w:rtl/>
           <w:lang w:val="en-US" w:bidi="he-IL"/>
         </w:rPr>
-        <w:t xml:space="preserve"> ב"משל הקדמוני" לרבי יצחק אבן סהולה (1281) לא איתרתי משל שהחמור עומד במרכזו, ולכן החיבור אינו נכלל בקורפוס [לוודא במהדורת לוב, 2004]. מקבילה ישירה למשל יד יש אצל מארי דה פראנס, בת דורו של ברכיה, במשל "על החמור שרצה לשחק עם אדוניו".</w:t>
+        <w:t xml:space="preserve"> "משל הקדמוני" לרבי יצחק אבן סהולה (1281) בנוי כסדרת ויכוחים בין ציניקן למוסרן המושמים בפי בעלי חיים, ולא איתרתי בו משל שהחמור עומד במרכזו, ולכן החיבור אינו נכלל בקורפוס [לוודא במפתח מהדורת לוב, 2004]. מקבילה ישירה למשל יד יש אצל מארי דה פראנס, בת דורו של ברכיה, במשל "על החמור שרצה לשחק עם אדוניו".</w:t>
       </w:r>
       <w:r>
         <w:rPr>
@@ -6662,13 +6688,26 @@
           <w:rtl/>
           <w:lang w:val="en-US" w:bidi="he-IL"/>
         </w:rPr>
-        <w:t xml:space="preserve">הנמשל מצטט את תהלים יב, ד, "לשון מדברת גדלות", ואת ישעיהו י, יג, "בחכמתי כי נבנותי", מנאום הגאווה של מלך אשור. אשור, שהיה ארז הלבנון בנמשלים של משל הצרעה ומשל מז, הוא כאן הלשון המתפארת. המשפט החותם, "שתיקת הכסיל היא תשובתו", אינו פסוק אלא פתגם חכמה, קרוב למשלי יז, כח, "גם אויל מחריש חכם יחשב", ולפתגמים של ספרות המוסר בימי הביניים.</w:t>
+        <w:t xml:space="preserve">הנמשל מצטט את תהלים יב, ד, "לשון מדברת גדלות", ואת ישעיהו י, יג, "בחכמתי כי נבנותי", מנאום הגאווה של מלך אשור. אשור, שהיה ארז הלבנון בנמשלים של משל הצרעה ומשל מז, הוא כאן הלשון המתפארת. המשפט החותם, "שתיקת הכסיל היא תשובתו", אינו פסוק אלא פתגם חכמה. מקורו הקרוב הוא "מבחר הפנינים", קובץ הפתגמים המיוחס לשלמה אבן גבירול, שבשער השתיקה שלו נאמר ששתיקת החכם מפני הכסיל המתווכח עמו היא תשובה גדולה לו, שכן הכסיל מצטער על השתיקה יותר משהיה מצטער על תשובה.</w:t>
       </w:r>
       <w:r>
         <w:rPr>
           <w:rStyle w:val="FootnoteReference"/>
         </w:rPr>
         <w:footnoteReference w:id="35"/>
+      </w:r>
+      <w:r>
+        <w:rPr>
+          <w:rFonts w:ascii="Times New Roman" w:cs="David" w:eastAsia="David" w:hAnsi="Times New Roman"/>
+          <w:i w:val="false"/>
+          <w:iCs w:val="false"/>
+          <w:noProof/>
+          <w:sz w:val="24"/>
+          <w:szCs w:val="24"/>
+          <w:rtl/>
+          <w:lang w:val="en-US" w:bidi="he-IL"/>
+        </w:rPr>
+        <w:t xml:space="preserve"> ברכיה הופך את הכיוון: אצלו השתיקה היא תשובתו של הכסיל, לא תשובת החכם, ואפשר לקרוא זאת כאירוניה על החמור שלא ידע לשתוק.</w:t>
       </w:r>
     </w:p>
     <w:p>
@@ -7191,6 +7230,40 @@
           <w:lang w:val="en-US" w:bidi="he-IL"/>
         </w:rPr>
         <w:t xml:space="preserve">, תרגם מערבית אורי רובין, תל אביב: אוניברסיטת תל אביב, 2005.</w:t>
+      </w:r>
+    </w:p>
+    <w:p>
+      <w:pPr>
+        <w:bidi/>
+        <w:spacing w:after="160" w:before="0" w:line="276"/>
+        <w:ind w:start="709" w:hanging="709"/>
+        <w:jc w:val="both"/>
+      </w:pPr>
+      <w:r>
+        <w:rPr>
+          <w:rFonts w:ascii="Times New Roman" w:cs="David" w:eastAsia="David" w:hAnsi="Times New Roman"/>
+          <w:i/>
+          <w:iCs/>
+          <w:noProof/>
+          <w:sz w:val="24"/>
+          <w:szCs w:val="24"/>
+          <w:rtl/>
+          <w:lang w:val="en-US" w:bidi="he-IL"/>
+        </w:rPr>
+        <w:t xml:space="preserve">מבחר הפנינים</w:t>
+      </w:r>
+      <w:r>
+        <w:rPr>
+          <w:rFonts w:ascii="Times New Roman" w:cs="David" w:eastAsia="David" w:hAnsi="Times New Roman"/>
+          <w:i w:val="false"/>
+          <w:iCs w:val="false"/>
+          <w:noProof/>
+          <w:sz w:val="24"/>
+          <w:szCs w:val="24"/>
+          <w:rtl/>
+          <w:lang w:val="en-US" w:bidi="he-IL"/>
+        </w:rPr>
+        <w:t xml:space="preserve">, המיוחס לשלמה אבן גבירול, מהדורת א"מ הברמן, מרחביה: ספרית פועלים, תש"ז.</w:t>
       </w:r>
     </w:p>
     <w:p>
@@ -8729,7 +8802,7 @@
           <w:rtl/>
           <w:lang w:val="en-US" w:bidi="he-IL"/>
         </w:rPr>
-        <w:t xml:space="preserve">בפרק על ביות החמור ועל הממצא הארכיאולוגי [לוודא עמודים].</w:t>
+        <w:t xml:space="preserve">בפרק על החמור בארכיאולוגיה של המזרח הקרוב.</w:t>
       </w:r>
     </w:p>
   </w:footnote>
@@ -8780,23 +8853,10 @@
           <w:noProof/>
           <w:sz w:val="20"/>
           <w:szCs w:val="20"/>
-          <w:rtl w:val="false"/>
-          <w:lang w:val="en-US" w:bidi="he-IL"/>
-        </w:rPr>
-        <w:t xml:space="preserve">, pp. 1-6 [</w:t>
-      </w:r>
-      <w:r>
-        <w:rPr>
-          <w:rFonts w:ascii="Times New Roman" w:cs="David" w:eastAsia="David" w:hAnsi="Times New Roman"/>
-          <w:i w:val="false"/>
-          <w:iCs w:val="false"/>
-          <w:noProof/>
-          <w:sz w:val="20"/>
-          <w:szCs w:val="20"/>
-          <w:rtl/>
-          <w:lang w:val="en-US" w:bidi="he-IL"/>
-        </w:rPr>
-        <w:t xml:space="preserve">לוודא עמודים].</w:t>
+          <w:rtl/>
+          <w:lang w:val="en-US" w:bidi="he-IL"/>
+        </w:rPr>
+        <w:t xml:space="preserve">, בפרק על החמור בספרות המקראית.</w:t>
       </w:r>
     </w:p>
   </w:footnote>
@@ -8958,7 +9018,7 @@
           <w:rtl/>
           <w:lang w:val="en-US" w:bidi="he-IL"/>
         </w:rPr>
-        <w:t xml:space="preserve">, ירושלים: מוסד ביאליק, תשנ"ד, בפרק על ספרות חז"ל [לוודא עמודים].</w:t>
+        <w:t xml:space="preserve">, ירושלים: מוסד ביאליק, תשנ"ד, בפרק על ספרות חז"ל.</w:t>
       </w:r>
     </w:p>
   </w:footnote>
@@ -9442,20 +9502,33 @@
           <w:rtl w:val="false"/>
           <w:lang w:val="en-US" w:bidi="he-IL"/>
         </w:rPr>
-        <w:t xml:space="preserve">, 6 vols., Bloomington: Indiana University Press, 1955-1958, motifs J951.1, J2413.1, L315 [</w:t>
-      </w:r>
-      <w:r>
-        <w:rPr>
-          <w:rFonts w:ascii="Times New Roman" w:cs="David" w:eastAsia="David" w:hAnsi="Times New Roman"/>
-          <w:i w:val="false"/>
-          <w:iCs w:val="false"/>
-          <w:noProof/>
-          <w:sz w:val="20"/>
-          <w:szCs w:val="20"/>
-          <w:rtl/>
-          <w:lang w:val="en-US" w:bidi="he-IL"/>
-        </w:rPr>
-        <w:t xml:space="preserve">לוודא מספרים].</w:t>
+        <w:t xml:space="preserve">, 6 vols., Bloomington: Indiana University Press, 1955-1958, motifs J951.1 [</w:t>
+      </w:r>
+      <w:r>
+        <w:rPr>
+          <w:rFonts w:ascii="Times New Roman" w:cs="David" w:eastAsia="David" w:hAnsi="Times New Roman"/>
+          <w:i w:val="false"/>
+          <w:iCs w:val="false"/>
+          <w:noProof/>
+          <w:sz w:val="20"/>
+          <w:szCs w:val="20"/>
+          <w:rtl/>
+          <w:lang w:val="en-US" w:bidi="he-IL"/>
+        </w:rPr>
+        <w:t xml:space="preserve">לוודא], </w:t>
+      </w:r>
+      <w:r>
+        <w:rPr>
+          <w:rFonts w:ascii="Times New Roman" w:cs="David" w:eastAsia="David" w:hAnsi="Times New Roman"/>
+          <w:i w:val="false"/>
+          <w:iCs w:val="false"/>
+          <w:noProof/>
+          <w:sz w:val="20"/>
+          <w:szCs w:val="20"/>
+          <w:rtl w:val="false"/>
+          <w:lang w:val="en-US" w:bidi="he-IL"/>
+        </w:rPr>
+        <w:t xml:space="preserve">J2413, L315, L315.6.</w:t>
       </w:r>
     </w:p>
   </w:footnote>
@@ -9549,10 +9622,23 @@
           <w:noProof/>
           <w:sz w:val="20"/>
           <w:szCs w:val="20"/>
-          <w:rtl/>
-          <w:lang w:val="en-US" w:bidi="he-IL"/>
-        </w:rPr>
-        <w:t xml:space="preserve">המקבילה אצל מארי דה פראנס מובאת אצל </w:t>
+          <w:rtl w:val="false"/>
+          <w:lang w:val="en-US" w:bidi="he-IL"/>
+        </w:rPr>
+        <w:t xml:space="preserve">"L'âne qui veut jouer avec son maître", </w:t>
+      </w:r>
+      <w:r>
+        <w:rPr>
+          <w:rFonts w:ascii="Times New Roman" w:cs="David" w:eastAsia="David" w:hAnsi="Times New Roman"/>
+          <w:i w:val="false"/>
+          <w:iCs w:val="false"/>
+          <w:noProof/>
+          <w:sz w:val="20"/>
+          <w:szCs w:val="20"/>
+          <w:rtl/>
+          <w:lang w:val="en-US" w:bidi="he-IL"/>
+        </w:rPr>
+        <w:t xml:space="preserve">משל 16 במהדורת רוקפור (1820); המספור משתנה בין המהדורות. המקבילה נדונה אצל </w:t>
       </w:r>
       <w:r>
         <w:rPr>
@@ -9591,7 +9677,7 @@
           <w:rtl/>
           <w:lang w:val="en-US" w:bidi="he-IL"/>
         </w:rPr>
-        <w:t xml:space="preserve">, בערך של משל יד [לוודא שם את מספר המשל אצל מארי, 15 לפי הספירה המקובלת].</w:t>
+        <w:t xml:space="preserve">, בערך של משל יד.</w:t>
       </w:r>
     </w:p>
   </w:footnote>
@@ -9874,20 +9960,7 @@
           <w:rtl w:val="false"/>
           <w:lang w:val="en-US" w:bidi="he-IL"/>
         </w:rPr>
-        <w:t xml:space="preserve">, Introduction, pp. vii-xiv [</w:t>
-      </w:r>
-      <w:r>
-        <w:rPr>
-          <w:rFonts w:ascii="Times New Roman" w:cs="David" w:eastAsia="David" w:hAnsi="Times New Roman"/>
-          <w:i w:val="false"/>
-          <w:iCs w:val="false"/>
-          <w:noProof/>
-          <w:sz w:val="20"/>
-          <w:szCs w:val="20"/>
-          <w:rtl/>
-          <w:lang w:val="en-US" w:bidi="he-IL"/>
-        </w:rPr>
-        <w:t xml:space="preserve">לוודא עמודים].</w:t>
+        <w:t xml:space="preserve">, Introduction.</w:t>
       </w:r>
     </w:p>
   </w:footnote>
@@ -10196,7 +10269,7 @@
           <w:rtl/>
           <w:lang w:val="en-US" w:bidi="he-IL"/>
         </w:rPr>
-        <w:t xml:space="preserve">, ירושלים: כתר, 1976, עמ' 70-77 [לוודא עמודים].</w:t>
+        <w:t xml:space="preserve">, ירושלים: כתר, 1976, בדיון בשיבוץ.</w:t>
       </w:r>
     </w:p>
   </w:footnote>
@@ -10594,15 +10667,28 @@
       <w:r>
         <w:rPr>
           <w:rFonts w:ascii="Times New Roman" w:cs="David" w:eastAsia="David" w:hAnsi="Times New Roman"/>
-          <w:i w:val="false"/>
-          <w:iCs w:val="false"/>
-          <w:noProof/>
-          <w:sz w:val="20"/>
-          <w:szCs w:val="20"/>
-          <w:rtl/>
-          <w:lang w:val="en-US" w:bidi="he-IL"/>
-        </w:rPr>
-        <w:t xml:space="preserve">השווה משלי יז, כח. את מקור הפתגם המדויק יש לבדוק בספרות המוסר של ימי הביניים, כגון "מבחר הפנינים" [לוודא].</w:t>
+          <w:i/>
+          <w:iCs/>
+          <w:noProof/>
+          <w:sz w:val="20"/>
+          <w:szCs w:val="20"/>
+          <w:rtl/>
+          <w:lang w:val="en-US" w:bidi="he-IL"/>
+        </w:rPr>
+        <w:t xml:space="preserve">מבחר הפנינים</w:t>
+      </w:r>
+      <w:r>
+        <w:rPr>
+          <w:rFonts w:ascii="Times New Roman" w:cs="David" w:eastAsia="David" w:hAnsi="Times New Roman"/>
+          <w:i w:val="false"/>
+          <w:iCs w:val="false"/>
+          <w:noProof/>
+          <w:sz w:val="20"/>
+          <w:szCs w:val="20"/>
+          <w:rtl/>
+          <w:lang w:val="en-US" w:bidi="he-IL"/>
+        </w:rPr>
+        <w:t xml:space="preserve">, המיוחס לשלמה אבן גבירול, מהדורת א"מ הברמן, מרחביה: ספרית פועלים, תש"ז, שער השתיקה. והשווה משלי יז, כח: "גם אויל מחריש חכם יחשב".</w:t>
       </w:r>
     </w:p>
   </w:footnote>

</xml_diff>

<commit_message>
Add university logo and submitter details to the title page
Co-Authored-By: Claude Fable 5.1 <noreply@anthropic.com>
Claude-Session: https://claude.ai/code/session_01LePeB11iN6PJ4Nt39a92mY
</commit_message>
<xml_diff>
--- a/seminar/seminar-donkey-fables.docx
+++ b/seminar/seminar-donkey-fables.docx
@@ -4,6 +4,52 @@
   <w:body>
     <w:p>
       <w:pPr>
+        <w:spacing w:after="240"/>
+        <w:jc w:val="center"/>
+      </w:pPr>
+      <w:r>
+        <w:drawing>
+          <wp:inline distT="0" distB="0" distL="0" distR="0">
+            <wp:extent cx="2476500" cy="914400"/>
+            <wp:effectExtent t="0" r="0" b="0" l="0"/>
+            <wp:docPr id="1" name="" descr="" title=""/>
+            <wp:cNvGraphicFramePr>
+              <a:graphicFrameLocks xmlns:a="http://schemas.openxmlformats.org/drawingml/2006/main" noChangeAspect="1"/>
+            </wp:cNvGraphicFramePr>
+            <a:graphic xmlns:a="http://schemas.openxmlformats.org/drawingml/2006/main">
+              <a:graphicData uri="http://schemas.openxmlformats.org/drawingml/2006/picture">
+                <pic:pic xmlns:pic="http://schemas.openxmlformats.org/drawingml/2006/picture">
+                  <pic:nvPicPr>
+                    <pic:cNvPr id="0" name="" descr=""/>
+                    <pic:cNvPicPr>
+                      <a:picLocks noChangeAspect="1" noChangeArrowheads="1"/>
+                    </pic:cNvPicPr>
+                  </pic:nvPicPr>
+                  <pic:blipFill>
+                    <a:blip r:embed="rId8" cstate="none"/>
+                    <a:srcRect/>
+                    <a:stretch>
+                      <a:fillRect/>
+                    </a:stretch>
+                  </pic:blipFill>
+                  <pic:spPr bwMode="auto">
+                    <a:xfrm>
+                      <a:off x="0" y="0"/>
+                      <a:ext cx="2476500" cy="914400"/>
+                    </a:xfrm>
+                    <a:prstGeom prst="rect">
+                      <a:avLst/>
+                    </a:prstGeom>
+                  </pic:spPr>
+                </pic:pic>
+              </a:graphicData>
+            </a:graphic>
+          </wp:inline>
+        </w:drawing>
+      </w:r>
+    </w:p>
+    <w:p>
+      <w:pPr>
         <w:bidi/>
         <w:spacing w:after="120" w:line="360"/>
         <w:jc w:val="center"/>
@@ -21,7 +67,7 @@
           <w:rtl/>
           <w:lang w:val="en-US" w:bidi="he-IL"/>
         </w:rPr>
-        <w:t xml:space="preserve">[שם המוסד האקדמי]</w:t>
+        <w:t xml:space="preserve">אוניברסיטת בר-אילן</w:t>
       </w:r>
     </w:p>
     <w:p>
@@ -175,7 +221,7 @@
           <w:rtl/>
           <w:lang w:val="en-US" w:bidi="he-IL"/>
         </w:rPr>
-        <w:t xml:space="preserve">מגיש/ה: [שם מלא], ת"ז [מספר]</w:t>
+        <w:t xml:space="preserve">מגישה: אחמד מונא, ת"ז 037094190</w:t>
       </w:r>
     </w:p>
     <w:p>

</xml_diff>